<commit_message>
docs: Mark the 22/09 fixes as committed in the report
Bugs 8 and 9 point to f186434 and bug 11 to 49468cd, the "not committed"
item leaves the open issues, the web picker is described in the file
formats page, and a note records that the "missing logo" was the capture
test hooking the page clipboard, not an app bug.

Co-Authored-By: Claude Opus 5 <noreply@anthropic.com>
</commit_message>
<xml_diff>
--- a/docs/bao-cao/Bao-cao-DQPCB-2026-09-22.docx
+++ b/docs/bao-cao/Bao-cao-DQPCB-2026-09-22.docx
@@ -1804,7 +1804,7 @@
                 <w:sz w:val="19"/>
                 <w:szCs w:val="19"/>
               </w:rPr>
-              <w:t xml:space="preserve">Đã sửa · chưa commit</w:t>
+              <w:t xml:space="preserve">Đã sửa · f186434</w:t>
             </w:r>
           </w:p>
         </w:tc>
@@ -1937,7 +1937,7 @@
                 <w:sz w:val="19"/>
                 <w:szCs w:val="19"/>
               </w:rPr>
-              <w:t xml:space="preserve">Đã sửa · chưa commit</w:t>
+              <w:t xml:space="preserve">Đã sửa · f186434</w:t>
             </w:r>
           </w:p>
         </w:tc>
@@ -2203,7 +2203,7 @@
                 <w:sz w:val="19"/>
                 <w:szCs w:val="19"/>
               </w:rPr>
-              <w:t xml:space="preserve">Đã sửa · chưa commit</w:t>
+              <w:t xml:space="preserve">Đã sửa · 49468cd</w:t>
             </w:r>
           </w:p>
         </w:tc>
@@ -6783,6 +6783,54 @@
       <w:pPr>
         <w:spacing w:after="80"/>
       </w:pPr>
+    </w:p>
+    <w:p>
+      <w:pPr>
+        <w:pStyle w:val="Heading2"/>
+        <w:spacing w:after="100" w:before="220"/>
+      </w:pPr>
+      <w:r>
+        <w:rPr>
+          <w:rFonts w:ascii="Arial" w:cs="Arial" w:eastAsia="Arial" w:hAnsi="Arial"/>
+          <w:b/>
+          <w:bCs/>
+          <w:color w:val="2E5597"/>
+          <w:sz w:val="25"/>
+          <w:szCs w:val="25"/>
+        </w:rPr>
+        <w:t xml:space="preserve">Ghi chú — "mất logo" khi chụp (không phải lỗi app)</w:t>
+      </w:r>
+    </w:p>
+    <w:p>
+      <w:pPr>
+        <w:spacing w:after="100" w:before="100" w:line="276"/>
+      </w:pPr>
+      <w:r>
+        <w:rPr>
+          <w:rFonts w:ascii="Arial" w:cs="Arial" w:eastAsia="Arial" w:hAnsi="Arial"/>
+          <w:sz w:val="21"/>
+          <w:szCs w:val="21"/>
+        </w:rPr>
+        <w:t xml:space="preserve">Khi kiểm ảnh chụp trong khung trình duyệt của Claude, hàm ghi clipboard của trang bị thay tạm để đọc ảnh ra. Dùng đúng tab đó thì bấm Copy không vào clipboard, dán ra ảnh cũ → tưởng mất logo. Tải lại tab là hết. Từ nay kiểm clipboard / ảnh chụp bằng </w:t>
+      </w:r>
+      <w:r>
+        <w:rPr>
+          <w:rFonts w:ascii="Arial" w:cs="Arial" w:eastAsia="Arial" w:hAnsi="Arial"/>
+          <w:b/>
+          <w:bCs/>
+          <w:sz w:val="21"/>
+          <w:szCs w:val="21"/>
+        </w:rPr>
+        <w:t xml:space="preserve">tab riêng</w:t>
+      </w:r>
+      <w:r>
+        <w:rPr>
+          <w:rFonts w:ascii="Arial" w:cs="Arial" w:eastAsia="Arial" w:hAnsi="Arial"/>
+          <w:sz w:val="21"/>
+          <w:szCs w:val="21"/>
+        </w:rPr>
+        <w:t xml:space="preserve">.</w:t>
+      </w:r>
     </w:p>
     <w:p>
       <w:r>
@@ -10536,7 +10584,7 @@
                 <w:sz w:val="19"/>
                 <w:szCs w:val="19"/>
               </w:rPr>
-              <w:t xml:space="preserve">DQPCB chèn dấu thập phân theo a:b (LZ bù đuôi, TZ bù đầu) — web-gerber không đọc dòng chú thích này (22/09, chưa commit)</w:t>
+              <w:t xml:space="preserve">DQPCB chèn dấu thập phân theo a:b (LZ bù đuôi, TZ bù đầu) — web-gerber không đọc dòng chú thích này (22/09, f186434)</w:t>
             </w:r>
           </w:p>
         </w:tc>
@@ -11022,7 +11070,7 @@
           <w:sz w:val="21"/>
           <w:szCs w:val="21"/>
         </w:rPr>
-        <w:t xml:space="preserve"> dựng thân bo và cho kích thước; lớp viền khác thành tài liệu "… (viền phụ)" (22/09, chưa commit).</w:t>
+        <w:t xml:space="preserve"> dựng thân bo và cho kích thước; lớp viền khác thành tài liệu "… (viền phụ)" (22/09, f186434).</w:t>
       </w:r>
     </w:p>
     <w:p>
@@ -12952,34 +13000,6 @@
           <w:szCs w:val="25"/>
         </w:rPr>
         <w:t xml:space="preserve">5.1 Vấn đề còn tồn</w:t>
-      </w:r>
-    </w:p>
-    <w:p>
-      <w:pPr>
-        <w:pStyle w:val="ListParagraph"/>
-        <w:numPr>
-          <w:ilvl w:val="0"/>
-          <w:numId w:val="2"/>
-        </w:numPr>
-        <w:spacing w:after="60" w:line="264"/>
-      </w:pPr>
-      <w:r>
-        <w:rPr>
-          <w:rFonts w:ascii="Arial" w:cs="Arial" w:eastAsia="Arial" w:hAnsi="Arial"/>
-          <w:b/>
-          <w:bCs/>
-          <w:sz w:val="21"/>
-          <w:szCs w:val="21"/>
-        </w:rPr>
-        <w:t xml:space="preserve">Chưa commit</w:t>
-      </w:r>
-      <w:r>
-        <w:rPr>
-          <w:rFonts w:ascii="Arial" w:cs="Arial" w:eastAsia="Arial" w:hAnsi="Arial"/>
-          <w:sz w:val="21"/>
-          <w:szCs w:val="21"/>
-        </w:rPr>
-        <w:t xml:space="preserve">: lỗi 8 (FILE_FORMAT), lỗi 9 (viền phụ), lỗi 11 (hộp chọn file web) và thư mục báo cáo.</w:t>
       </w:r>
     </w:p>
     <w:p>

</xml_diff>

<commit_message>
docs: Add the CHAT_BOT_4 slot fix, CAM outline colour and multi-board warning to the report
Co-Authored-By: Claude Opus 5 <noreply@anthropic.com>
</commit_message>
<xml_diff>
--- a/docs/bao-cao/Bao-cao-DQPCB-2026-09-22.docx
+++ b/docs/bao-cao/Bao-cao-DQPCB-2026-09-22.docx
@@ -2208,6 +2208,272 @@
           </w:p>
         </w:tc>
       </w:tr>
+      <w:tr>
+        <w:trPr>
+          <w:tblHeader w:val="false"/>
+        </w:trPr>
+        <w:tc>
+          <w:tcPr>
+            <w:tcW w:type="dxa" w:w="481"/>
+            <w:tcBorders>
+              <w:top w:val="single" w:color="BFBFBF" w:sz="4"/>
+              <w:left w:val="single" w:color="BFBFBF" w:sz="4"/>
+              <w:bottom w:val="single" w:color="BFBFBF" w:sz="4"/>
+              <w:right w:val="single" w:color="BFBFBF" w:sz="4"/>
+            </w:tcBorders>
+            <w:tcMar>
+              <w:top w:type="dxa" w:w="60"/>
+              <w:left w:type="dxa" w:w="100"/>
+              <w:bottom w:type="dxa" w:w="60"/>
+              <w:right w:type="dxa" w:w="100"/>
+            </w:tcMar>
+          </w:tcPr>
+          <w:p>
+            <w:pPr>
+              <w:spacing w:after="20"/>
+            </w:pPr>
+            <w:r>
+              <w:rPr>
+                <w:rFonts w:ascii="Arial" w:cs="Arial" w:eastAsia="Arial" w:hAnsi="Arial"/>
+                <w:b w:val="false"/>
+                <w:bCs w:val="false"/>
+                <w:sz w:val="19"/>
+                <w:szCs w:val="19"/>
+              </w:rPr>
+              <w:t xml:space="preserve">12</w:t>
+            </w:r>
+          </w:p>
+        </w:tc>
+        <w:tc>
+          <w:tcPr>
+            <w:tcW w:type="dxa" w:w="4047"/>
+            <w:tcBorders>
+              <w:top w:val="single" w:color="BFBFBF" w:sz="4"/>
+              <w:left w:val="single" w:color="BFBFBF" w:sz="4"/>
+              <w:bottom w:val="single" w:color="BFBFBF" w:sz="4"/>
+              <w:right w:val="single" w:color="BFBFBF" w:sz="4"/>
+            </w:tcBorders>
+            <w:tcMar>
+              <w:top w:type="dxa" w:w="60"/>
+              <w:left w:type="dxa" w:w="100"/>
+              <w:bottom w:type="dxa" w:w="60"/>
+              <w:right w:type="dxa" w:w="100"/>
+            </w:tcMar>
+          </w:tcPr>
+          <w:p>
+            <w:pPr>
+              <w:spacing w:after="20"/>
+            </w:pPr>
+            <w:r>
+              <w:rPr>
+                <w:rFonts w:ascii="Arial" w:cs="Arial" w:eastAsia="Arial" w:hAnsi="Arial"/>
+                <w:b w:val="false"/>
+                <w:bCs w:val="false"/>
+                <w:sz w:val="19"/>
+                <w:szCs w:val="19"/>
+              </w:rPr>
+              <w:t xml:space="preserve">Rãnh phay vẽ bằng một nét trong lớp viền bị bỏ, bo "đọc thiếu"</w:t>
+            </w:r>
+          </w:p>
+        </w:tc>
+        <w:tc>
+          <w:tcPr>
+            <w:tcW w:type="dxa" w:w="2891"/>
+            <w:tcBorders>
+              <w:top w:val="single" w:color="BFBFBF" w:sz="4"/>
+              <w:left w:val="single" w:color="BFBFBF" w:sz="4"/>
+              <w:bottom w:val="single" w:color="BFBFBF" w:sz="4"/>
+              <w:right w:val="single" w:color="BFBFBF" w:sz="4"/>
+            </w:tcBorders>
+            <w:tcMar>
+              <w:top w:type="dxa" w:w="60"/>
+              <w:left w:type="dxa" w:w="100"/>
+              <w:bottom w:type="dxa" w:w="60"/>
+              <w:right w:type="dxa" w:w="100"/>
+            </w:tcMar>
+          </w:tcPr>
+          <w:p>
+            <w:pPr>
+              <w:spacing w:after="20"/>
+            </w:pPr>
+            <w:r>
+              <w:rPr>
+                <w:rFonts w:ascii="Arial" w:cs="Arial" w:eastAsia="Arial" w:hAnsi="Arial"/>
+                <w:b w:val="false"/>
+                <w:bCs w:val="false"/>
+                <w:sz w:val="19"/>
+                <w:szCs w:val="19"/>
+              </w:rPr>
+              <w:t xml:space="preserve">Nguyen Van Quang — CHAT_BOT_4</w:t>
+            </w:r>
+          </w:p>
+        </w:tc>
+        <w:tc>
+          <w:tcPr>
+            <w:tcW w:type="dxa" w:w="2219"/>
+            <w:tcBorders>
+              <w:top w:val="single" w:color="BFBFBF" w:sz="4"/>
+              <w:left w:val="single" w:color="BFBFBF" w:sz="4"/>
+              <w:bottom w:val="single" w:color="BFBFBF" w:sz="4"/>
+              <w:right w:val="single" w:color="BFBFBF" w:sz="4"/>
+            </w:tcBorders>
+            <w:tcMar>
+              <w:top w:type="dxa" w:w="60"/>
+              <w:left w:type="dxa" w:w="100"/>
+              <w:bottom w:type="dxa" w:w="60"/>
+              <w:right w:type="dxa" w:w="100"/>
+            </w:tcMar>
+          </w:tcPr>
+          <w:p>
+            <w:pPr>
+              <w:spacing w:after="20"/>
+            </w:pPr>
+            <w:r>
+              <w:rPr>
+                <w:rFonts w:ascii="Arial" w:cs="Arial" w:eastAsia="Arial" w:hAnsi="Arial"/>
+                <w:b w:val="false"/>
+                <w:bCs w:val="false"/>
+                <w:sz w:val="19"/>
+                <w:szCs w:val="19"/>
+              </w:rPr>
+              <w:t xml:space="preserve">Đã sửa · 706ea9f</w:t>
+            </w:r>
+          </w:p>
+        </w:tc>
+      </w:tr>
+      <w:tr>
+        <w:trPr>
+          <w:tblHeader w:val="false"/>
+        </w:trPr>
+        <w:tc>
+          <w:tcPr>
+            <w:tcW w:type="dxa" w:w="481"/>
+            <w:tcBorders>
+              <w:top w:val="single" w:color="BFBFBF" w:sz="4"/>
+              <w:left w:val="single" w:color="BFBFBF" w:sz="4"/>
+              <w:bottom w:val="single" w:color="BFBFBF" w:sz="4"/>
+              <w:right w:val="single" w:color="BFBFBF" w:sz="4"/>
+            </w:tcBorders>
+            <w:tcMar>
+              <w:top w:type="dxa" w:w="60"/>
+              <w:left w:type="dxa" w:w="100"/>
+              <w:bottom w:type="dxa" w:w="60"/>
+              <w:right w:type="dxa" w:w="100"/>
+            </w:tcMar>
+          </w:tcPr>
+          <w:p>
+            <w:pPr>
+              <w:spacing w:after="20"/>
+            </w:pPr>
+            <w:r>
+              <w:rPr>
+                <w:rFonts w:ascii="Arial" w:cs="Arial" w:eastAsia="Arial" w:hAnsi="Arial"/>
+                <w:b w:val="false"/>
+                <w:bCs w:val="false"/>
+                <w:sz w:val="19"/>
+                <w:szCs w:val="19"/>
+              </w:rPr>
+              <w:t xml:space="preserve">13</w:t>
+            </w:r>
+          </w:p>
+        </w:tc>
+        <w:tc>
+          <w:tcPr>
+            <w:tcW w:type="dxa" w:w="4047"/>
+            <w:tcBorders>
+              <w:top w:val="single" w:color="BFBFBF" w:sz="4"/>
+              <w:left w:val="single" w:color="BFBFBF" w:sz="4"/>
+              <w:bottom w:val="single" w:color="BFBFBF" w:sz="4"/>
+              <w:right w:val="single" w:color="BFBFBF" w:sz="4"/>
+            </w:tcBorders>
+            <w:tcMar>
+              <w:top w:type="dxa" w:w="60"/>
+              <w:left w:type="dxa" w:w="100"/>
+              <w:bottom w:type="dxa" w:w="60"/>
+              <w:right w:type="dxa" w:w="100"/>
+            </w:tcMar>
+          </w:tcPr>
+          <w:p>
+            <w:pPr>
+              <w:spacing w:after="20"/>
+            </w:pPr>
+            <w:r>
+              <w:rPr>
+                <w:rFonts w:ascii="Arial" w:cs="Arial" w:eastAsia="Arial" w:hAnsi="Arial"/>
+                <w:b w:val="false"/>
+                <w:bCs w:val="false"/>
+                <w:sz w:val="19"/>
+                <w:szCs w:val="19"/>
+              </w:rPr>
+              <w:t xml:space="preserve">CAM: nét phụ của lớp viền hiện màu xanh mask</w:t>
+            </w:r>
+          </w:p>
+        </w:tc>
+        <w:tc>
+          <w:tcPr>
+            <w:tcW w:type="dxa" w:w="2891"/>
+            <w:tcBorders>
+              <w:top w:val="single" w:color="BFBFBF" w:sz="4"/>
+              <w:left w:val="single" w:color="BFBFBF" w:sz="4"/>
+              <w:bottom w:val="single" w:color="BFBFBF" w:sz="4"/>
+              <w:right w:val="single" w:color="BFBFBF" w:sz="4"/>
+            </w:tcBorders>
+            <w:tcMar>
+              <w:top w:type="dxa" w:w="60"/>
+              <w:left w:type="dxa" w:w="100"/>
+              <w:bottom w:type="dxa" w:w="60"/>
+              <w:right w:type="dxa" w:w="100"/>
+            </w:tcMar>
+          </w:tcPr>
+          <w:p>
+            <w:pPr>
+              <w:spacing w:after="20"/>
+            </w:pPr>
+            <w:r>
+              <w:rPr>
+                <w:rFonts w:ascii="Arial" w:cs="Arial" w:eastAsia="Arial" w:hAnsi="Arial"/>
+                <w:b w:val="false"/>
+                <w:bCs w:val="false"/>
+                <w:sz w:val="19"/>
+                <w:szCs w:val="19"/>
+              </w:rPr>
+              <w:t xml:space="preserve">(viewer)</w:t>
+            </w:r>
+          </w:p>
+        </w:tc>
+        <w:tc>
+          <w:tcPr>
+            <w:tcW w:type="dxa" w:w="2219"/>
+            <w:tcBorders>
+              <w:top w:val="single" w:color="BFBFBF" w:sz="4"/>
+              <w:left w:val="single" w:color="BFBFBF" w:sz="4"/>
+              <w:bottom w:val="single" w:color="BFBFBF" w:sz="4"/>
+              <w:right w:val="single" w:color="BFBFBF" w:sz="4"/>
+            </w:tcBorders>
+            <w:tcMar>
+              <w:top w:type="dxa" w:w="60"/>
+              <w:left w:type="dxa" w:w="100"/>
+              <w:bottom w:type="dxa" w:w="60"/>
+              <w:right w:type="dxa" w:w="100"/>
+            </w:tcMar>
+          </w:tcPr>
+          <w:p>
+            <w:pPr>
+              <w:spacing w:after="20"/>
+            </w:pPr>
+            <w:r>
+              <w:rPr>
+                <w:rFonts w:ascii="Arial" w:cs="Arial" w:eastAsia="Arial" w:hAnsi="Arial"/>
+                <w:b w:val="false"/>
+                <w:bCs w:val="false"/>
+                <w:sz w:val="19"/>
+                <w:szCs w:val="19"/>
+              </w:rPr>
+              <w:t xml:space="preserve">Đã sửa · 706ea9f</w:t>
+            </w:r>
+          </w:p>
+        </w:tc>
+      </w:tr>
     </w:tbl>
     <w:p>
       <w:pPr>
@@ -6798,6 +7064,972 @@
           <w:sz w:val="25"/>
           <w:szCs w:val="25"/>
         </w:rPr>
+        <w:t xml:space="preserve">Lỗi 12 — Rãnh phay vẽ bằng một nét bị bỏ (CHAT_BOT_4)</w:t>
+      </w:r>
+    </w:p>
+    <w:tbl>
+      <w:tblPr>
+        <w:tblW w:type="dxa" w:w="9638"/>
+        <w:tblBorders>
+          <w:top w:val="single" w:color="auto" w:sz="4"/>
+          <w:left w:val="single" w:color="auto" w:sz="4"/>
+          <w:bottom w:val="single" w:color="auto" w:sz="4"/>
+          <w:right w:val="single" w:color="auto" w:sz="4"/>
+          <w:insideH w:val="single" w:color="auto" w:sz="4"/>
+          <w:insideV w:val="single" w:color="auto" w:sz="4"/>
+        </w:tblBorders>
+      </w:tblPr>
+      <w:tblGrid>
+        <w:gridCol w:w="2120"/>
+        <w:gridCol w:w="7518"/>
+      </w:tblGrid>
+      <w:tr>
+        <w:trPr>
+          <w:tblHeader/>
+        </w:trPr>
+        <w:tc>
+          <w:tcPr>
+            <w:tcW w:type="dxa" w:w="2120"/>
+            <w:tcBorders>
+              <w:top w:val="single" w:color="BFBFBF" w:sz="4"/>
+              <w:left w:val="single" w:color="BFBFBF" w:sz="4"/>
+              <w:bottom w:val="single" w:color="BFBFBF" w:sz="4"/>
+              <w:right w:val="single" w:color="BFBFBF" w:sz="4"/>
+            </w:tcBorders>
+            <w:shd w:fill="DCE6F2" w:color="auto" w:val="clear"/>
+            <w:tcMar>
+              <w:top w:type="dxa" w:w="60"/>
+              <w:left w:type="dxa" w:w="100"/>
+              <w:bottom w:type="dxa" w:w="60"/>
+              <w:right w:type="dxa" w:w="100"/>
+            </w:tcMar>
+          </w:tcPr>
+          <w:p>
+            <w:pPr>
+              <w:spacing w:after="20"/>
+            </w:pPr>
+            <w:r>
+              <w:rPr>
+                <w:rFonts w:ascii="Arial" w:cs="Arial" w:eastAsia="Arial" w:hAnsi="Arial"/>
+                <w:b/>
+                <w:bCs/>
+                <w:sz w:val="19"/>
+                <w:szCs w:val="19"/>
+              </w:rPr>
+              <w:t xml:space="preserve">Mục</w:t>
+            </w:r>
+          </w:p>
+        </w:tc>
+        <w:tc>
+          <w:tcPr>
+            <w:tcW w:type="dxa" w:w="7518"/>
+            <w:tcBorders>
+              <w:top w:val="single" w:color="BFBFBF" w:sz="4"/>
+              <w:left w:val="single" w:color="BFBFBF" w:sz="4"/>
+              <w:bottom w:val="single" w:color="BFBFBF" w:sz="4"/>
+              <w:right w:val="single" w:color="BFBFBF" w:sz="4"/>
+            </w:tcBorders>
+            <w:shd w:fill="DCE6F2" w:color="auto" w:val="clear"/>
+            <w:tcMar>
+              <w:top w:type="dxa" w:w="60"/>
+              <w:left w:type="dxa" w:w="100"/>
+              <w:bottom w:type="dxa" w:w="60"/>
+              <w:right w:type="dxa" w:w="100"/>
+            </w:tcMar>
+          </w:tcPr>
+          <w:p>
+            <w:pPr>
+              <w:spacing w:after="20"/>
+            </w:pPr>
+            <w:r>
+              <w:rPr>
+                <w:rFonts w:ascii="Arial" w:cs="Arial" w:eastAsia="Arial" w:hAnsi="Arial"/>
+                <w:b/>
+                <w:bCs/>
+                <w:sz w:val="19"/>
+                <w:szCs w:val="19"/>
+              </w:rPr>
+              <w:t xml:space="preserve">Nội dung</w:t>
+            </w:r>
+          </w:p>
+        </w:tc>
+      </w:tr>
+      <w:tr>
+        <w:trPr>
+          <w:tblHeader w:val="false"/>
+        </w:trPr>
+        <w:tc>
+          <w:tcPr>
+            <w:tcW w:type="dxa" w:w="2120"/>
+            <w:tcBorders>
+              <w:top w:val="single" w:color="BFBFBF" w:sz="4"/>
+              <w:left w:val="single" w:color="BFBFBF" w:sz="4"/>
+              <w:bottom w:val="single" w:color="BFBFBF" w:sz="4"/>
+              <w:right w:val="single" w:color="BFBFBF" w:sz="4"/>
+            </w:tcBorders>
+            <w:tcMar>
+              <w:top w:type="dxa" w:w="60"/>
+              <w:left w:type="dxa" w:w="100"/>
+              <w:bottom w:type="dxa" w:w="60"/>
+              <w:right w:type="dxa" w:w="100"/>
+            </w:tcMar>
+          </w:tcPr>
+          <w:p>
+            <w:pPr>
+              <w:spacing w:after="20"/>
+            </w:pPr>
+            <w:r>
+              <w:rPr>
+                <w:rFonts w:ascii="Arial" w:cs="Arial" w:eastAsia="Arial" w:hAnsi="Arial"/>
+                <w:b w:val="false"/>
+                <w:bCs w:val="false"/>
+                <w:sz w:val="19"/>
+                <w:szCs w:val="19"/>
+              </w:rPr>
+              <w:t xml:space="preserve">Bộ file</w:t>
+            </w:r>
+          </w:p>
+        </w:tc>
+        <w:tc>
+          <w:tcPr>
+            <w:tcW w:type="dxa" w:w="7518"/>
+            <w:tcBorders>
+              <w:top w:val="single" w:color="BFBFBF" w:sz="4"/>
+              <w:left w:val="single" w:color="BFBFBF" w:sz="4"/>
+              <w:bottom w:val="single" w:color="BFBFBF" w:sz="4"/>
+              <w:right w:val="single" w:color="BFBFBF" w:sz="4"/>
+            </w:tcBorders>
+            <w:tcMar>
+              <w:top w:type="dxa" w:w="60"/>
+              <w:left w:type="dxa" w:w="100"/>
+              <w:bottom w:type="dxa" w:w="60"/>
+              <w:right w:type="dxa" w:w="100"/>
+            </w:tcMar>
+          </w:tcPr>
+          <w:p>
+            <w:pPr>
+              <w:spacing w:after="20"/>
+            </w:pPr>
+            <w:r>
+              <w:rPr>
+                <w:rFonts w:ascii="Arial" w:cs="Arial" w:eastAsia="Arial" w:hAnsi="Arial"/>
+                <w:b w:val="false"/>
+                <w:bCs w:val="false"/>
+                <w:sz w:val="19"/>
+                <w:szCs w:val="19"/>
+              </w:rPr>
+              <w:t xml:space="preserve">D:\JobDatMach\Nguyen Van Quang\2026\22-09\Nguyen Van Quang 5pcs Green Project Outputs for CHAT_BOT_4.zip</w:t>
+            </w:r>
+          </w:p>
+        </w:tc>
+      </w:tr>
+      <w:tr>
+        <w:trPr>
+          <w:tblHeader w:val="false"/>
+        </w:trPr>
+        <w:tc>
+          <w:tcPr>
+            <w:tcW w:type="dxa" w:w="2120"/>
+            <w:tcBorders>
+              <w:top w:val="single" w:color="BFBFBF" w:sz="4"/>
+              <w:left w:val="single" w:color="BFBFBF" w:sz="4"/>
+              <w:bottom w:val="single" w:color="BFBFBF" w:sz="4"/>
+              <w:right w:val="single" w:color="BFBFBF" w:sz="4"/>
+            </w:tcBorders>
+            <w:tcMar>
+              <w:top w:type="dxa" w:w="60"/>
+              <w:left w:type="dxa" w:w="100"/>
+              <w:bottom w:type="dxa" w:w="60"/>
+              <w:right w:type="dxa" w:w="100"/>
+            </w:tcMar>
+          </w:tcPr>
+          <w:p>
+            <w:pPr>
+              <w:spacing w:after="20"/>
+            </w:pPr>
+            <w:r>
+              <w:rPr>
+                <w:rFonts w:ascii="Arial" w:cs="Arial" w:eastAsia="Arial" w:hAnsi="Arial"/>
+                <w:b w:val="false"/>
+                <w:bCs w:val="false"/>
+                <w:sz w:val="19"/>
+                <w:szCs w:val="19"/>
+              </w:rPr>
+              <w:t xml:space="preserve">Hiện tượng</w:t>
+            </w:r>
+          </w:p>
+        </w:tc>
+        <w:tc>
+          <w:tcPr>
+            <w:tcW w:type="dxa" w:w="7518"/>
+            <w:tcBorders>
+              <w:top w:val="single" w:color="BFBFBF" w:sz="4"/>
+              <w:left w:val="single" w:color="BFBFBF" w:sz="4"/>
+              <w:bottom w:val="single" w:color="BFBFBF" w:sz="4"/>
+              <w:right w:val="single" w:color="BFBFBF" w:sz="4"/>
+            </w:tcBorders>
+            <w:tcMar>
+              <w:top w:type="dxa" w:w="60"/>
+              <w:left w:type="dxa" w:w="100"/>
+              <w:bottom w:type="dxa" w:w="60"/>
+              <w:right w:type="dxa" w:w="100"/>
+            </w:tcMar>
+          </w:tcPr>
+          <w:p>
+            <w:pPr>
+              <w:spacing w:after="20"/>
+            </w:pPr>
+            <w:r>
+              <w:rPr>
+                <w:rFonts w:ascii="Arial" w:cs="Arial" w:eastAsia="Arial" w:hAnsi="Arial"/>
+                <w:b w:val="false"/>
+                <w:bCs w:val="false"/>
+                <w:sz w:val="19"/>
+                <w:szCs w:val="19"/>
+              </w:rPr>
+              <w:t xml:space="preserve">4 bo ghép trong khung chữ L, giữa các bo có 3 rãnh chia bo — app không hiện rãnh nào.</w:t>
+            </w:r>
+          </w:p>
+        </w:tc>
+      </w:tr>
+      <w:tr>
+        <w:trPr>
+          <w:tblHeader w:val="false"/>
+        </w:trPr>
+        <w:tc>
+          <w:tcPr>
+            <w:tcW w:type="dxa" w:w="2120"/>
+            <w:tcBorders>
+              <w:top w:val="single" w:color="BFBFBF" w:sz="4"/>
+              <w:left w:val="single" w:color="BFBFBF" w:sz="4"/>
+              <w:bottom w:val="single" w:color="BFBFBF" w:sz="4"/>
+              <w:right w:val="single" w:color="BFBFBF" w:sz="4"/>
+            </w:tcBorders>
+            <w:tcMar>
+              <w:top w:type="dxa" w:w="60"/>
+              <w:left w:type="dxa" w:w="100"/>
+              <w:bottom w:type="dxa" w:w="60"/>
+              <w:right w:type="dxa" w:w="100"/>
+            </w:tcMar>
+          </w:tcPr>
+          <w:p>
+            <w:pPr>
+              <w:spacing w:after="20"/>
+            </w:pPr>
+            <w:r>
+              <w:rPr>
+                <w:rFonts w:ascii="Arial" w:cs="Arial" w:eastAsia="Arial" w:hAnsi="Arial"/>
+                <w:b w:val="false"/>
+                <w:bCs w:val="false"/>
+                <w:sz w:val="19"/>
+                <w:szCs w:val="19"/>
+              </w:rPr>
+              <w:t xml:space="preserve">Nguyên nhân</w:t>
+            </w:r>
+          </w:p>
+        </w:tc>
+        <w:tc>
+          <w:tcPr>
+            <w:tcW w:type="dxa" w:w="7518"/>
+            <w:tcBorders>
+              <w:top w:val="single" w:color="BFBFBF" w:sz="4"/>
+              <w:left w:val="single" w:color="BFBFBF" w:sz="4"/>
+              <w:bottom w:val="single" w:color="BFBFBF" w:sz="4"/>
+              <w:right w:val="single" w:color="BFBFBF" w:sz="4"/>
+            </w:tcBorders>
+            <w:tcMar>
+              <w:top w:type="dxa" w:w="60"/>
+              <w:left w:type="dxa" w:w="100"/>
+              <w:bottom w:type="dxa" w:w="60"/>
+              <w:right w:type="dxa" w:w="100"/>
+            </w:tcMar>
+          </w:tcPr>
+          <w:p>
+            <w:pPr>
+              <w:spacing w:after="20"/>
+            </w:pPr>
+            <w:r>
+              <w:rPr>
+                <w:rFonts w:ascii="Arial" w:cs="Arial" w:eastAsia="Arial" w:hAnsi="Arial"/>
+                <w:b w:val="false"/>
+                <w:bCs w:val="false"/>
+                <w:sz w:val="19"/>
+                <w:szCs w:val="19"/>
+              </w:rPr>
+              <w:t xml:space="preserve">GHEP_MACH.GKO vẽ khung bằng nét 0.5 mm, còn </w:t>
+            </w:r>
+            <w:r>
+              <w:rPr>
+                <w:rFonts w:ascii="Arial" w:cs="Arial" w:eastAsia="Arial" w:hAnsi="Arial"/>
+                <w:b/>
+                <w:bCs/>
+                <w:sz w:val="19"/>
+                <w:szCs w:val="19"/>
+              </w:rPr>
+              <w:t xml:space="preserve">mỗi rãnh là MỘT nét thẳng 0.8 mm</w:t>
+            </w:r>
+            <w:r>
+              <w:rPr>
+                <w:rFonts w:ascii="Arial" w:cs="Arial" w:eastAsia="Arial" w:hAnsi="Arial"/>
+                <w:b w:val="false"/>
+                <w:bCs w:val="false"/>
+                <w:sz w:val="19"/>
+                <w:szCs w:val="19"/>
+              </w:rPr>
+              <w:t xml:space="preserve"> (đường tâm dao). Bước nối viền chỉ giữ chuỗi ≥ 3 đoạn; chuỗi 1–2 đoạn bị coi là vạch lẻ và bỏ.</w:t>
+            </w:r>
+          </w:p>
+        </w:tc>
+      </w:tr>
+      <w:tr>
+        <w:trPr>
+          <w:tblHeader w:val="false"/>
+        </w:trPr>
+        <w:tc>
+          <w:tcPr>
+            <w:tcW w:type="dxa" w:w="2120"/>
+            <w:tcBorders>
+              <w:top w:val="single" w:color="BFBFBF" w:sz="4"/>
+              <w:left w:val="single" w:color="BFBFBF" w:sz="4"/>
+              <w:bottom w:val="single" w:color="BFBFBF" w:sz="4"/>
+              <w:right w:val="single" w:color="BFBFBF" w:sz="4"/>
+            </w:tcBorders>
+            <w:tcMar>
+              <w:top w:type="dxa" w:w="60"/>
+              <w:left w:type="dxa" w:w="100"/>
+              <w:bottom w:type="dxa" w:w="60"/>
+              <w:right w:type="dxa" w:w="100"/>
+            </w:tcMar>
+          </w:tcPr>
+          <w:p>
+            <w:pPr>
+              <w:spacing w:after="20"/>
+            </w:pPr>
+            <w:r>
+              <w:rPr>
+                <w:rFonts w:ascii="Arial" w:cs="Arial" w:eastAsia="Arial" w:hAnsi="Arial"/>
+                <w:b w:val="false"/>
+                <w:bCs w:val="false"/>
+                <w:sz w:val="19"/>
+                <w:szCs w:val="19"/>
+              </w:rPr>
+              <w:t xml:space="preserve">Cách giải quyết</w:t>
+            </w:r>
+          </w:p>
+        </w:tc>
+        <w:tc>
+          <w:tcPr>
+            <w:tcW w:type="dxa" w:w="7518"/>
+            <w:tcBorders>
+              <w:top w:val="single" w:color="BFBFBF" w:sz="4"/>
+              <w:left w:val="single" w:color="BFBFBF" w:sz="4"/>
+              <w:bottom w:val="single" w:color="BFBFBF" w:sz="4"/>
+              <w:right w:val="single" w:color="BFBFBF" w:sz="4"/>
+            </w:tcBorders>
+            <w:tcMar>
+              <w:top w:type="dxa" w:w="60"/>
+              <w:left w:type="dxa" w:w="100"/>
+              <w:bottom w:type="dxa" w:w="60"/>
+              <w:right w:type="dxa" w:w="100"/>
+            </w:tcMar>
+          </w:tcPr>
+          <w:p>
+            <w:pPr>
+              <w:spacing w:after="20"/>
+            </w:pPr>
+            <w:r>
+              <w:rPr>
+                <w:rFonts w:ascii="Arial" w:cs="Arial" w:eastAsia="Arial" w:hAnsi="Arial"/>
+                <w:b w:val="false"/>
+                <w:bCs w:val="false"/>
+                <w:sz w:val="19"/>
+                <w:szCs w:val="19"/>
+              </w:rPr>
+              <w:t xml:space="preserve">Nét thẳng 1–2 đoạn là </w:t>
+            </w:r>
+            <w:r>
+              <w:rPr>
+                <w:rFonts w:ascii="Arial" w:cs="Arial" w:eastAsia="Arial" w:hAnsi="Arial"/>
+                <w:b/>
+                <w:bCs/>
+                <w:sz w:val="19"/>
+                <w:szCs w:val="19"/>
+              </w:rPr>
+              <w:t xml:space="preserve">rãnh phay</w:t>
+            </w:r>
+            <w:r>
+              <w:rPr>
+                <w:rFonts w:ascii="Arial" w:cs="Arial" w:eastAsia="Arial" w:hAnsi="Arial"/>
+                <w:b w:val="false"/>
+                <w:bCs w:val="false"/>
+                <w:sz w:val="19"/>
+                <w:szCs w:val="19"/>
+              </w:rPr>
+              <w:t xml:space="preserve"> khi: nằm hẳn trong bo (cách mép ≥ 1 mm — vạch V-cut chạm mép vẫn bỏ), rộng ≥ 0.3 mm, </w:t>
+            </w:r>
+            <w:r>
+              <w:rPr>
+                <w:rFonts w:ascii="Arial" w:cs="Arial" w:eastAsia="Arial" w:hAnsi="Arial"/>
+                <w:b/>
+                <w:bCs/>
+                <w:sz w:val="19"/>
+                <w:szCs w:val="19"/>
+              </w:rPr>
+              <w:t xml:space="preserve">đứng riêng</w:t>
+            </w:r>
+            <w:r>
+              <w:rPr>
+                <w:rFonts w:ascii="Arial" w:cs="Arial" w:eastAsia="Arial" w:hAnsi="Arial"/>
+                <w:b w:val="false"/>
+                <w:bCs w:val="false"/>
+                <w:sz w:val="19"/>
+                <w:szCs w:val="19"/>
+              </w:rPr>
+              <w:t xml:space="preserve"> (không chạm nét khác), bề rộng nét không dùng cho một đường vẽ nhiều khúc.</w:t>
+            </w:r>
+          </w:p>
+          <w:p>
+            <w:pPr>
+              <w:spacing w:after="20"/>
+            </w:pPr>
+            <w:r>
+              <w:rPr>
+                <w:rFonts w:ascii="Arial" w:cs="Arial" w:eastAsia="Arial" w:hAnsi="Arial"/>
+                <w:b/>
+                <w:bCs/>
+                <w:sz w:val="19"/>
+                <w:szCs w:val="19"/>
+              </w:rPr>
+              <w:t xml:space="preserve">CAM</w:t>
+            </w:r>
+            <w:r>
+              <w:rPr>
+                <w:rFonts w:ascii="Arial" w:cs="Arial" w:eastAsia="Arial" w:hAnsi="Arial"/>
+                <w:b w:val="false"/>
+                <w:bCs w:val="false"/>
+                <w:sz w:val="19"/>
+                <w:szCs w:val="19"/>
+              </w:rPr>
+              <w:t xml:space="preserve"> vẽ đúng một nét như file khách; </w:t>
+            </w:r>
+            <w:r>
+              <w:rPr>
+                <w:rFonts w:ascii="Arial" w:cs="Arial" w:eastAsia="Arial" w:hAnsi="Arial"/>
+                <w:b/>
+                <w:bCs/>
+                <w:sz w:val="19"/>
+                <w:szCs w:val="19"/>
+              </w:rPr>
+              <w:t xml:space="preserve">2D / 3D</w:t>
+            </w:r>
+            <w:r>
+              <w:rPr>
+                <w:rFonts w:ascii="Arial" w:cs="Arial" w:eastAsia="Arial" w:hAnsi="Arial"/>
+                <w:b w:val="false"/>
+                <w:bCs w:val="false"/>
+                <w:sz w:val="19"/>
+                <w:szCs w:val="19"/>
+              </w:rPr>
+              <w:t xml:space="preserve"> khoét thủng hình thuôn rộng bằng nét.</w:t>
+            </w:r>
+          </w:p>
+        </w:tc>
+      </w:tr>
+      <w:tr>
+        <w:trPr>
+          <w:tblHeader w:val="false"/>
+        </w:trPr>
+        <w:tc>
+          <w:tcPr>
+            <w:tcW w:type="dxa" w:w="2120"/>
+            <w:tcBorders>
+              <w:top w:val="single" w:color="BFBFBF" w:sz="4"/>
+              <w:left w:val="single" w:color="BFBFBF" w:sz="4"/>
+              <w:bottom w:val="single" w:color="BFBFBF" w:sz="4"/>
+              <w:right w:val="single" w:color="BFBFBF" w:sz="4"/>
+            </w:tcBorders>
+            <w:tcMar>
+              <w:top w:type="dxa" w:w="60"/>
+              <w:left w:type="dxa" w:w="100"/>
+              <w:bottom w:type="dxa" w:w="60"/>
+              <w:right w:type="dxa" w:w="100"/>
+            </w:tcMar>
+          </w:tcPr>
+          <w:p>
+            <w:pPr>
+              <w:spacing w:after="20"/>
+            </w:pPr>
+            <w:r>
+              <w:rPr>
+                <w:rFonts w:ascii="Arial" w:cs="Arial" w:eastAsia="Arial" w:hAnsi="Arial"/>
+                <w:b w:val="false"/>
+                <w:bCs w:val="false"/>
+                <w:sz w:val="19"/>
+                <w:szCs w:val="19"/>
+              </w:rPr>
+              <w:t xml:space="preserve">Kiểm</w:t>
+            </w:r>
+          </w:p>
+        </w:tc>
+        <w:tc>
+          <w:tcPr>
+            <w:tcW w:type="dxa" w:w="7518"/>
+            <w:tcBorders>
+              <w:top w:val="single" w:color="BFBFBF" w:sz="4"/>
+              <w:left w:val="single" w:color="BFBFBF" w:sz="4"/>
+              <w:bottom w:val="single" w:color="BFBFBF" w:sz="4"/>
+              <w:right w:val="single" w:color="BFBFBF" w:sz="4"/>
+            </w:tcBorders>
+            <w:tcMar>
+              <w:top w:type="dxa" w:w="60"/>
+              <w:left w:type="dxa" w:w="100"/>
+              <w:bottom w:type="dxa" w:w="60"/>
+              <w:right w:type="dxa" w:w="100"/>
+            </w:tcMar>
+          </w:tcPr>
+          <w:p>
+            <w:pPr>
+              <w:spacing w:after="20"/>
+            </w:pPr>
+            <w:r>
+              <w:rPr>
+                <w:rFonts w:ascii="Arial" w:cs="Arial" w:eastAsia="Arial" w:hAnsi="Arial"/>
+                <w:b w:val="false"/>
+                <w:bCs w:val="false"/>
+                <w:sz w:val="19"/>
+                <w:szCs w:val="19"/>
+              </w:rPr>
+              <w:t xml:space="preserve">CHAT_BOT_4 đủ 3 rãnh, kích thước giữ 87.80 × 97.00 mm. Hồi quy corpus: lần đầu PHAONUOC (Ngoc Anh) bị nhận nhầm 15 rãnh (mảnh của đường vẽ gấp khúc 0.8 mm) → thêm điều kiện "đứng riêng" và "bề rộng". Sau sửa chỉ 6 bộ thêm rãnh, thân bo và kích thước không đổi (Hoang Long 6F E42 +7, Dinh Ngoc Tram +19, Hai Panel +2, Panel 10 +3, Phuong Ghep +2, 30pcs +4); xem hình từng bộ đều là rãnh thật. Test mới.</w:t>
+            </w:r>
+          </w:p>
+        </w:tc>
+      </w:tr>
+      <w:tr>
+        <w:trPr>
+          <w:tblHeader w:val="false"/>
+        </w:trPr>
+        <w:tc>
+          <w:tcPr>
+            <w:tcW w:type="dxa" w:w="2120"/>
+            <w:tcBorders>
+              <w:top w:val="single" w:color="BFBFBF" w:sz="4"/>
+              <w:left w:val="single" w:color="BFBFBF" w:sz="4"/>
+              <w:bottom w:val="single" w:color="BFBFBF" w:sz="4"/>
+              <w:right w:val="single" w:color="BFBFBF" w:sz="4"/>
+            </w:tcBorders>
+            <w:tcMar>
+              <w:top w:type="dxa" w:w="60"/>
+              <w:left w:type="dxa" w:w="100"/>
+              <w:bottom w:type="dxa" w:w="60"/>
+              <w:right w:type="dxa" w:w="100"/>
+            </w:tcMar>
+          </w:tcPr>
+          <w:p>
+            <w:pPr>
+              <w:spacing w:after="20"/>
+            </w:pPr>
+            <w:r>
+              <w:rPr>
+                <w:rFonts w:ascii="Arial" w:cs="Arial" w:eastAsia="Arial" w:hAnsi="Arial"/>
+                <w:b w:val="false"/>
+                <w:bCs w:val="false"/>
+                <w:sz w:val="19"/>
+                <w:szCs w:val="19"/>
+              </w:rPr>
+              <w:t xml:space="preserve">Lưu ý</w:t>
+            </w:r>
+          </w:p>
+        </w:tc>
+        <w:tc>
+          <w:tcPr>
+            <w:tcW w:type="dxa" w:w="7518"/>
+            <w:tcBorders>
+              <w:top w:val="single" w:color="BFBFBF" w:sz="4"/>
+              <w:left w:val="single" w:color="BFBFBF" w:sz="4"/>
+              <w:bottom w:val="single" w:color="BFBFBF" w:sz="4"/>
+              <w:right w:val="single" w:color="BFBFBF" w:sz="4"/>
+            </w:tcBorders>
+            <w:tcMar>
+              <w:top w:type="dxa" w:w="60"/>
+              <w:left w:type="dxa" w:w="100"/>
+              <w:bottom w:type="dxa" w:w="60"/>
+              <w:right w:type="dxa" w:w="100"/>
+            </w:tcMar>
+          </w:tcPr>
+          <w:p>
+            <w:pPr>
+              <w:spacing w:after="20"/>
+            </w:pPr>
+            <w:r>
+              <w:rPr>
+                <w:rFonts w:ascii="Arial" w:cs="Arial" w:eastAsia="Arial" w:hAnsi="Arial"/>
+                <w:b w:val="false"/>
+                <w:bCs w:val="false"/>
+                <w:sz w:val="19"/>
+                <w:szCs w:val="19"/>
+              </w:rPr>
+              <w:t xml:space="preserve">Bề rộng rãnh lấy theo nét trong file; xưởng có thể phay bằng dao của xưởng (1.0 / 1.6 mm) nên rãnh thật có thể rộng hơn hình.</w:t>
+            </w:r>
+          </w:p>
+        </w:tc>
+      </w:tr>
+    </w:tbl>
+    <w:p>
+      <w:pPr>
+        <w:spacing w:after="80"/>
+      </w:pPr>
+    </w:p>
+    <w:p>
+      <w:pPr>
+        <w:pStyle w:val="Heading2"/>
+        <w:spacing w:after="100" w:before="220"/>
+      </w:pPr>
+      <w:r>
+        <w:rPr>
+          <w:rFonts w:ascii="Arial" w:cs="Arial" w:eastAsia="Arial" w:hAnsi="Arial"/>
+          <w:b/>
+          <w:bCs/>
+          <w:color w:val="2E5597"/>
+          <w:sz w:val="25"/>
+          <w:szCs w:val="25"/>
+        </w:rPr>
+        <w:t xml:space="preserve">Lỗi 13 — CAM: nét phụ của lớp viền hiện màu xanh mask</w:t>
+      </w:r>
+    </w:p>
+    <w:tbl>
+      <w:tblPr>
+        <w:tblW w:type="dxa" w:w="9638"/>
+        <w:tblBorders>
+          <w:top w:val="single" w:color="auto" w:sz="4"/>
+          <w:left w:val="single" w:color="auto" w:sz="4"/>
+          <w:bottom w:val="single" w:color="auto" w:sz="4"/>
+          <w:right w:val="single" w:color="auto" w:sz="4"/>
+          <w:insideH w:val="single" w:color="auto" w:sz="4"/>
+          <w:insideV w:val="single" w:color="auto" w:sz="4"/>
+        </w:tblBorders>
+      </w:tblPr>
+      <w:tblGrid>
+        <w:gridCol w:w="2120"/>
+        <w:gridCol w:w="7518"/>
+      </w:tblGrid>
+      <w:tr>
+        <w:trPr>
+          <w:tblHeader/>
+        </w:trPr>
+        <w:tc>
+          <w:tcPr>
+            <w:tcW w:type="dxa" w:w="2120"/>
+            <w:tcBorders>
+              <w:top w:val="single" w:color="BFBFBF" w:sz="4"/>
+              <w:left w:val="single" w:color="BFBFBF" w:sz="4"/>
+              <w:bottom w:val="single" w:color="BFBFBF" w:sz="4"/>
+              <w:right w:val="single" w:color="BFBFBF" w:sz="4"/>
+            </w:tcBorders>
+            <w:shd w:fill="DCE6F2" w:color="auto" w:val="clear"/>
+            <w:tcMar>
+              <w:top w:type="dxa" w:w="60"/>
+              <w:left w:type="dxa" w:w="100"/>
+              <w:bottom w:type="dxa" w:w="60"/>
+              <w:right w:type="dxa" w:w="100"/>
+            </w:tcMar>
+          </w:tcPr>
+          <w:p>
+            <w:pPr>
+              <w:spacing w:after="20"/>
+            </w:pPr>
+            <w:r>
+              <w:rPr>
+                <w:rFonts w:ascii="Arial" w:cs="Arial" w:eastAsia="Arial" w:hAnsi="Arial"/>
+                <w:b/>
+                <w:bCs/>
+                <w:sz w:val="19"/>
+                <w:szCs w:val="19"/>
+              </w:rPr>
+              <w:t xml:space="preserve">Mục</w:t>
+            </w:r>
+          </w:p>
+        </w:tc>
+        <w:tc>
+          <w:tcPr>
+            <w:tcW w:type="dxa" w:w="7518"/>
+            <w:tcBorders>
+              <w:top w:val="single" w:color="BFBFBF" w:sz="4"/>
+              <w:left w:val="single" w:color="BFBFBF" w:sz="4"/>
+              <w:bottom w:val="single" w:color="BFBFBF" w:sz="4"/>
+              <w:right w:val="single" w:color="BFBFBF" w:sz="4"/>
+            </w:tcBorders>
+            <w:shd w:fill="DCE6F2" w:color="auto" w:val="clear"/>
+            <w:tcMar>
+              <w:top w:type="dxa" w:w="60"/>
+              <w:left w:type="dxa" w:w="100"/>
+              <w:bottom w:type="dxa" w:w="60"/>
+              <w:right w:type="dxa" w:w="100"/>
+            </w:tcMar>
+          </w:tcPr>
+          <w:p>
+            <w:pPr>
+              <w:spacing w:after="20"/>
+            </w:pPr>
+            <w:r>
+              <w:rPr>
+                <w:rFonts w:ascii="Arial" w:cs="Arial" w:eastAsia="Arial" w:hAnsi="Arial"/>
+                <w:b/>
+                <w:bCs/>
+                <w:sz w:val="19"/>
+                <w:szCs w:val="19"/>
+              </w:rPr>
+              <w:t xml:space="preserve">Nội dung</w:t>
+            </w:r>
+          </w:p>
+        </w:tc>
+      </w:tr>
+      <w:tr>
+        <w:trPr>
+          <w:tblHeader w:val="false"/>
+        </w:trPr>
+        <w:tc>
+          <w:tcPr>
+            <w:tcW w:type="dxa" w:w="2120"/>
+            <w:tcBorders>
+              <w:top w:val="single" w:color="BFBFBF" w:sz="4"/>
+              <w:left w:val="single" w:color="BFBFBF" w:sz="4"/>
+              <w:bottom w:val="single" w:color="BFBFBF" w:sz="4"/>
+              <w:right w:val="single" w:color="BFBFBF" w:sz="4"/>
+            </w:tcBorders>
+            <w:tcMar>
+              <w:top w:type="dxa" w:w="60"/>
+              <w:left w:type="dxa" w:w="100"/>
+              <w:bottom w:type="dxa" w:w="60"/>
+              <w:right w:type="dxa" w:w="100"/>
+            </w:tcMar>
+          </w:tcPr>
+          <w:p>
+            <w:pPr>
+              <w:spacing w:after="20"/>
+            </w:pPr>
+            <w:r>
+              <w:rPr>
+                <w:rFonts w:ascii="Arial" w:cs="Arial" w:eastAsia="Arial" w:hAnsi="Arial"/>
+                <w:b w:val="false"/>
+                <w:bCs w:val="false"/>
+                <w:sz w:val="19"/>
+                <w:szCs w:val="19"/>
+              </w:rPr>
+              <w:t xml:space="preserve">Hiện tượng</w:t>
+            </w:r>
+          </w:p>
+        </w:tc>
+        <w:tc>
+          <w:tcPr>
+            <w:tcW w:type="dxa" w:w="7518"/>
+            <w:tcBorders>
+              <w:top w:val="single" w:color="BFBFBF" w:sz="4"/>
+              <w:left w:val="single" w:color="BFBFBF" w:sz="4"/>
+              <w:bottom w:val="single" w:color="BFBFBF" w:sz="4"/>
+              <w:right w:val="single" w:color="BFBFBF" w:sz="4"/>
+            </w:tcBorders>
+            <w:tcMar>
+              <w:top w:type="dxa" w:w="60"/>
+              <w:left w:type="dxa" w:w="100"/>
+              <w:bottom w:type="dxa" w:w="60"/>
+              <w:right w:type="dxa" w:w="100"/>
+            </w:tcMar>
+          </w:tcPr>
+          <w:p>
+            <w:pPr>
+              <w:spacing w:after="20"/>
+            </w:pPr>
+            <w:r>
+              <w:rPr>
+                <w:rFonts w:ascii="Arial" w:cs="Arial" w:eastAsia="Arial" w:hAnsi="Arial"/>
+                <w:b w:val="false"/>
+                <w:bCs w:val="false"/>
+                <w:sz w:val="19"/>
+                <w:szCs w:val="19"/>
+              </w:rPr>
+              <w:t xml:space="preserve">Ở CAM, khung viền vàng nhưng rãnh / đường phay hở trong viền lại màu xanh.</w:t>
+            </w:r>
+          </w:p>
+        </w:tc>
+      </w:tr>
+      <w:tr>
+        <w:trPr>
+          <w:tblHeader w:val="false"/>
+        </w:trPr>
+        <w:tc>
+          <w:tcPr>
+            <w:tcW w:type="dxa" w:w="2120"/>
+            <w:tcBorders>
+              <w:top w:val="single" w:color="BFBFBF" w:sz="4"/>
+              <w:left w:val="single" w:color="BFBFBF" w:sz="4"/>
+              <w:bottom w:val="single" w:color="BFBFBF" w:sz="4"/>
+              <w:right w:val="single" w:color="BFBFBF" w:sz="4"/>
+            </w:tcBorders>
+            <w:tcMar>
+              <w:top w:type="dxa" w:w="60"/>
+              <w:left w:type="dxa" w:w="100"/>
+              <w:bottom w:type="dxa" w:w="60"/>
+              <w:right w:type="dxa" w:w="100"/>
+            </w:tcMar>
+          </w:tcPr>
+          <w:p>
+            <w:pPr>
+              <w:spacing w:after="20"/>
+            </w:pPr>
+            <w:r>
+              <w:rPr>
+                <w:rFonts w:ascii="Arial" w:cs="Arial" w:eastAsia="Arial" w:hAnsi="Arial"/>
+                <w:b w:val="false"/>
+                <w:bCs w:val="false"/>
+                <w:sz w:val="19"/>
+                <w:szCs w:val="19"/>
+              </w:rPr>
+              <w:t xml:space="preserve">Nguyên nhân</w:t>
+            </w:r>
+          </w:p>
+        </w:tc>
+        <w:tc>
+          <w:tcPr>
+            <w:tcW w:type="dxa" w:w="7518"/>
+            <w:tcBorders>
+              <w:top w:val="single" w:color="BFBFBF" w:sz="4"/>
+              <w:left w:val="single" w:color="BFBFBF" w:sz="4"/>
+              <w:bottom w:val="single" w:color="BFBFBF" w:sz="4"/>
+              <w:right w:val="single" w:color="BFBFBF" w:sz="4"/>
+            </w:tcBorders>
+            <w:tcMar>
+              <w:top w:type="dxa" w:w="60"/>
+              <w:left w:type="dxa" w:w="100"/>
+              <w:bottom w:type="dxa" w:w="60"/>
+              <w:right w:type="dxa" w:w="100"/>
+            </w:tcMar>
+          </w:tcPr>
+          <w:p>
+            <w:pPr>
+              <w:spacing w:after="20"/>
+            </w:pPr>
+            <w:r>
+              <w:rPr>
+                <w:rFonts w:ascii="Arial" w:cs="Arial" w:eastAsia="Arial" w:hAnsi="Arial"/>
+                <w:b w:val="false"/>
+                <w:bCs w:val="false"/>
+                <w:sz w:val="19"/>
+                <w:szCs w:val="19"/>
+              </w:rPr>
+              <w:t xml:space="preserve">web-gerber clone lớp viền làm lớp phủ mask; bản clone </w:t>
+            </w:r>
+            <w:r>
+              <w:rPr>
+                <w:rFonts w:ascii="Arial" w:cs="Arial" w:eastAsia="Arial" w:hAnsi="Arial"/>
+                <w:b/>
+                <w:bCs/>
+                <w:sz w:val="19"/>
+                <w:szCs w:val="19"/>
+              </w:rPr>
+              <w:t xml:space="preserve">dùng chung vật liệu</w:t>
+            </w:r>
+            <w:r>
+              <w:rPr>
+                <w:rFonts w:ascii="Arial" w:cs="Arial" w:eastAsia="Arial" w:hAnsi="Arial"/>
+                <w:b w:val="false"/>
+                <w:bCs w:val="false"/>
+                <w:sz w:val="19"/>
+                <w:szCs w:val="19"/>
+              </w:rPr>
+              <w:t xml:space="preserve"> với lớp gốc. App tô xanh cả lớp phủ (để panel không loang lổ) → tô luôn các nét của lớp Outline, trừ mảnh đầu tiên. Có từ trước.</w:t>
+            </w:r>
+          </w:p>
+        </w:tc>
+      </w:tr>
+      <w:tr>
+        <w:trPr>
+          <w:tblHeader w:val="false"/>
+        </w:trPr>
+        <w:tc>
+          <w:tcPr>
+            <w:tcW w:type="dxa" w:w="2120"/>
+            <w:tcBorders>
+              <w:top w:val="single" w:color="BFBFBF" w:sz="4"/>
+              <w:left w:val="single" w:color="BFBFBF" w:sz="4"/>
+              <w:bottom w:val="single" w:color="BFBFBF" w:sz="4"/>
+              <w:right w:val="single" w:color="BFBFBF" w:sz="4"/>
+            </w:tcBorders>
+            <w:tcMar>
+              <w:top w:type="dxa" w:w="60"/>
+              <w:left w:type="dxa" w:w="100"/>
+              <w:bottom w:type="dxa" w:w="60"/>
+              <w:right w:type="dxa" w:w="100"/>
+            </w:tcMar>
+          </w:tcPr>
+          <w:p>
+            <w:pPr>
+              <w:spacing w:after="20"/>
+            </w:pPr>
+            <w:r>
+              <w:rPr>
+                <w:rFonts w:ascii="Arial" w:cs="Arial" w:eastAsia="Arial" w:hAnsi="Arial"/>
+                <w:b w:val="false"/>
+                <w:bCs w:val="false"/>
+                <w:sz w:val="19"/>
+                <w:szCs w:val="19"/>
+              </w:rPr>
+              <w:t xml:space="preserve">Cách giải quyết</w:t>
+            </w:r>
+          </w:p>
+        </w:tc>
+        <w:tc>
+          <w:tcPr>
+            <w:tcW w:type="dxa" w:w="7518"/>
+            <w:tcBorders>
+              <w:top w:val="single" w:color="BFBFBF" w:sz="4"/>
+              <w:left w:val="single" w:color="BFBFBF" w:sz="4"/>
+              <w:bottom w:val="single" w:color="BFBFBF" w:sz="4"/>
+              <w:right w:val="single" w:color="BFBFBF" w:sz="4"/>
+            </w:tcBorders>
+            <w:tcMar>
+              <w:top w:type="dxa" w:w="60"/>
+              <w:left w:type="dxa" w:w="100"/>
+              <w:bottom w:type="dxa" w:w="60"/>
+              <w:right w:type="dxa" w:w="100"/>
+            </w:tcMar>
+          </w:tcPr>
+          <w:p>
+            <w:pPr>
+              <w:spacing w:after="20"/>
+            </w:pPr>
+            <w:r>
+              <w:rPr>
+                <w:rFonts w:ascii="Arial" w:cs="Arial" w:eastAsia="Arial" w:hAnsi="Arial"/>
+                <w:b w:val="false"/>
+                <w:bCs w:val="false"/>
+                <w:sz w:val="19"/>
+                <w:szCs w:val="19"/>
+              </w:rPr>
+              <w:t xml:space="preserve">Tô trên bản sao vật liệu (Viewer2D.WebGL.tsx); vật liệu mới được giải phóng cùng cảnh.</w:t>
+            </w:r>
+          </w:p>
+        </w:tc>
+      </w:tr>
+    </w:tbl>
+    <w:p>
+      <w:pPr>
+        <w:spacing w:after="80"/>
+      </w:pPr>
+    </w:p>
+    <w:p>
+      <w:pPr>
+        <w:pStyle w:val="Heading2"/>
+        <w:spacing w:after="100" w:before="220"/>
+      </w:pPr>
+      <w:r>
+        <w:rPr>
+          <w:rFonts w:ascii="Arial" w:cs="Arial" w:eastAsia="Arial" w:hAnsi="Arial"/>
+          <w:b/>
+          <w:bCs/>
+          <w:color w:val="2E5597"/>
+          <w:sz w:val="25"/>
+          <w:szCs w:val="25"/>
+        </w:rPr>
         <w:t xml:space="preserve">Ghi chú — "mất logo" khi chụp (không phải lỗi app)</w:t>
       </w:r>
     </w:p>
@@ -7355,7 +8587,25 @@
           <w:sz w:val="21"/>
           <w:szCs w:val="21"/>
         </w:rPr>
-        <w:t xml:space="preserve">Hiển thị đúng: slot/lỗ chữ nhật, lỗ khoét trong viền, panel nhiều bo chung cạnh, rail, đường phay; lấp khe dải phủ đồng CAM350.</w:t>
+        <w:t xml:space="preserve">Hiển thị đúng: slot/lỗ chữ nhật, lỗ khoét trong viền, </w:t>
+      </w:r>
+      <w:r>
+        <w:rPr>
+          <w:rFonts w:ascii="Arial" w:cs="Arial" w:eastAsia="Arial" w:hAnsi="Arial"/>
+          <w:b/>
+          <w:bCs/>
+          <w:sz w:val="21"/>
+          <w:szCs w:val="21"/>
+        </w:rPr>
+        <w:t xml:space="preserve">rãnh phay vẽ một nét</w:t>
+      </w:r>
+      <w:r>
+        <w:rPr>
+          <w:rFonts w:ascii="Arial" w:cs="Arial" w:eastAsia="Arial" w:hAnsi="Arial"/>
+          <w:sz w:val="21"/>
+          <w:szCs w:val="21"/>
+        </w:rPr>
+        <w:t xml:space="preserve"> (CAM hiện nét như file, 2D/3D khoét thủng), panel nhiều bo chung cạnh, rail, đường phay; lấp khe dải phủ đồng CAM350.</w:t>
       </w:r>
     </w:p>
     <w:p>
@@ -7851,6 +9101,52 @@
           <w:szCs w:val="21"/>
         </w:rPr>
         <w:t xml:space="preserve"> (không nhắc với mouse bite).</w:t>
+      </w:r>
+    </w:p>
+    <w:p>
+      <w:pPr>
+        <w:pStyle w:val="ListParagraph"/>
+        <w:numPr>
+          <w:ilvl w:val="0"/>
+          <w:numId w:val="2"/>
+        </w:numPr>
+        <w:spacing w:after="60" w:line="264"/>
+      </w:pPr>
+      <w:r>
+        <w:rPr>
+          <w:rFonts w:ascii="Arial" w:cs="Arial" w:eastAsia="Arial" w:hAnsi="Arial"/>
+          <w:b/>
+          <w:bCs/>
+          <w:sz w:val="21"/>
+          <w:szCs w:val="21"/>
+        </w:rPr>
+        <w:t xml:space="preserve">Nhắc file nhiều bo ghép</w:t>
+      </w:r>
+      <w:r>
+        <w:rPr>
+          <w:rFonts w:ascii="Arial" w:cs="Arial" w:eastAsia="Arial" w:hAnsi="Arial"/>
+          <w:sz w:val="21"/>
+          <w:szCs w:val="21"/>
+        </w:rPr>
+        <w:t xml:space="preserve">: viền có từ 2 bo rời trở lên (bỏ rail, mảnh vụn, khung) → cảnh báo bảng tra chỉ cho bo lẻ, nút </w:t>
+      </w:r>
+      <w:r>
+        <w:rPr>
+          <w:rFonts w:ascii="Arial" w:cs="Arial" w:eastAsia="Arial" w:hAnsi="Arial"/>
+          <w:b/>
+          <w:bCs/>
+          <w:sz w:val="21"/>
+          <w:szCs w:val="21"/>
+        </w:rPr>
+        <w:t xml:space="preserve">Dùng: file ghép sẵn N bo/set</w:t>
+      </w:r>
+      <w:r>
+        <w:rPr>
+          <w:rFonts w:ascii="Arial" w:cs="Arial" w:eastAsia="Arial" w:hAnsi="Arial"/>
+          <w:sz w:val="21"/>
+          <w:szCs w:val="21"/>
+        </w:rPr>
+        <w:t xml:space="preserve"> tự bật Ghép panel theo X × Y đọc được và quy số PCB ra số set; đã ghép mà số bo/set khác số bo trong viền cũng nhắc.</w:t>
       </w:r>
     </w:p>
     <w:p>
@@ -11554,6 +12850,75 @@
                 <w:sz w:val="19"/>
                 <w:szCs w:val="19"/>
               </w:rPr>
+              <w:t xml:space="preserve">Rãnh một nét</w:t>
+            </w:r>
+          </w:p>
+        </w:tc>
+        <w:tc>
+          <w:tcPr>
+            <w:tcW w:type="dxa" w:w="7229"/>
+            <w:tcBorders>
+              <w:top w:val="single" w:color="BFBFBF" w:sz="4"/>
+              <w:left w:val="single" w:color="BFBFBF" w:sz="4"/>
+              <w:bottom w:val="single" w:color="BFBFBF" w:sz="4"/>
+              <w:right w:val="single" w:color="BFBFBF" w:sz="4"/>
+            </w:tcBorders>
+            <w:tcMar>
+              <w:top w:type="dxa" w:w="60"/>
+              <w:left w:type="dxa" w:w="100"/>
+              <w:bottom w:type="dxa" w:w="60"/>
+              <w:right w:type="dxa" w:w="100"/>
+            </w:tcMar>
+          </w:tcPr>
+          <w:p>
+            <w:pPr>
+              <w:spacing w:after="20"/>
+            </w:pPr>
+            <w:r>
+              <w:rPr>
+                <w:rFonts w:ascii="Arial" w:cs="Arial" w:eastAsia="Arial" w:hAnsi="Arial"/>
+                <w:b w:val="false"/>
+                <w:bCs w:val="false"/>
+                <w:sz w:val="19"/>
+                <w:szCs w:val="19"/>
+              </w:rPr>
+              <w:t xml:space="preserve">Nét thẳng 1–2 đoạn nằm hẳn trong bo (≥ 1 mm từ mép), rộng ≥ 0.3 mm, đứng riêng, bề rộng không dùng cho đường vẽ nhiều khúc → hình thuôn rộng bằng nét, thành lỗ khoét (CHAT_BOT_4)</w:t>
+            </w:r>
+          </w:p>
+        </w:tc>
+      </w:tr>
+      <w:tr>
+        <w:trPr>
+          <w:tblHeader w:val="false"/>
+        </w:trPr>
+        <w:tc>
+          <w:tcPr>
+            <w:tcW w:type="dxa" w:w="2409"/>
+            <w:tcBorders>
+              <w:top w:val="single" w:color="BFBFBF" w:sz="4"/>
+              <w:left w:val="single" w:color="BFBFBF" w:sz="4"/>
+              <w:bottom w:val="single" w:color="BFBFBF" w:sz="4"/>
+              <w:right w:val="single" w:color="BFBFBF" w:sz="4"/>
+            </w:tcBorders>
+            <w:tcMar>
+              <w:top w:type="dxa" w:w="60"/>
+              <w:left w:type="dxa" w:w="100"/>
+              <w:bottom w:type="dxa" w:w="60"/>
+              <w:right w:type="dxa" w:w="100"/>
+            </w:tcMar>
+          </w:tcPr>
+          <w:p>
+            <w:pPr>
+              <w:spacing w:after="20"/>
+            </w:pPr>
+            <w:r>
+              <w:rPr>
+                <w:rFonts w:ascii="Arial" w:cs="Arial" w:eastAsia="Arial" w:hAnsi="Arial"/>
+                <w:b w:val="false"/>
+                <w:bCs w:val="false"/>
+                <w:sz w:val="19"/>
+                <w:szCs w:val="19"/>
+              </w:rPr>
               <w:t xml:space="preserve">Kích thước</w:t>
             </w:r>
           </w:p>
@@ -12949,6 +14314,107 @@
           </w:p>
         </w:tc>
       </w:tr>
+      <w:tr>
+        <w:trPr>
+          <w:tblHeader w:val="false"/>
+        </w:trPr>
+        <w:tc>
+          <w:tcPr>
+            <w:tcW w:type="dxa" w:w="2891"/>
+            <w:tcBorders>
+              <w:top w:val="single" w:color="BFBFBF" w:sz="4"/>
+              <w:left w:val="single" w:color="BFBFBF" w:sz="4"/>
+              <w:bottom w:val="single" w:color="BFBFBF" w:sz="4"/>
+              <w:right w:val="single" w:color="BFBFBF" w:sz="4"/>
+            </w:tcBorders>
+            <w:tcMar>
+              <w:top w:type="dxa" w:w="60"/>
+              <w:left w:type="dxa" w:w="100"/>
+              <w:bottom w:type="dxa" w:w="60"/>
+              <w:right w:type="dxa" w:w="100"/>
+            </w:tcMar>
+          </w:tcPr>
+          <w:p>
+            <w:pPr>
+              <w:spacing w:after="20"/>
+            </w:pPr>
+            <w:r>
+              <w:rPr>
+                <w:rFonts w:ascii="Arial" w:cs="Arial" w:eastAsia="Arial" w:hAnsi="Arial"/>
+                <w:b w:val="false"/>
+                <w:bCs w:val="false"/>
+                <w:sz w:val="19"/>
+                <w:szCs w:val="19"/>
+              </w:rPr>
+              <w:t xml:space="preserve">Rãnh một nét trong lớp viền</w:t>
+            </w:r>
+          </w:p>
+        </w:tc>
+        <w:tc>
+          <w:tcPr>
+            <w:tcW w:type="dxa" w:w="3084"/>
+            <w:tcBorders>
+              <w:top w:val="single" w:color="BFBFBF" w:sz="4"/>
+              <w:left w:val="single" w:color="BFBFBF" w:sz="4"/>
+              <w:bottom w:val="single" w:color="BFBFBF" w:sz="4"/>
+              <w:right w:val="single" w:color="BFBFBF" w:sz="4"/>
+            </w:tcBorders>
+            <w:tcMar>
+              <w:top w:type="dxa" w:w="60"/>
+              <w:left w:type="dxa" w:w="100"/>
+              <w:bottom w:type="dxa" w:w="60"/>
+              <w:right w:type="dxa" w:w="100"/>
+            </w:tcMar>
+          </w:tcPr>
+          <w:p>
+            <w:pPr>
+              <w:spacing w:after="20"/>
+            </w:pPr>
+            <w:r>
+              <w:rPr>
+                <w:rFonts w:ascii="Arial" w:cs="Arial" w:eastAsia="Arial" w:hAnsi="Arial"/>
+                <w:b w:val="false"/>
+                <w:bCs w:val="false"/>
+                <w:sz w:val="19"/>
+                <w:szCs w:val="19"/>
+              </w:rPr>
+              <w:t xml:space="preserve">Một nét thẳng = đường tâm dao</w:t>
+            </w:r>
+          </w:p>
+        </w:tc>
+        <w:tc>
+          <w:tcPr>
+            <w:tcW w:type="dxa" w:w="3663"/>
+            <w:tcBorders>
+              <w:top w:val="single" w:color="BFBFBF" w:sz="4"/>
+              <w:left w:val="single" w:color="BFBFBF" w:sz="4"/>
+              <w:bottom w:val="single" w:color="BFBFBF" w:sz="4"/>
+              <w:right w:val="single" w:color="BFBFBF" w:sz="4"/>
+            </w:tcBorders>
+            <w:tcMar>
+              <w:top w:type="dxa" w:w="60"/>
+              <w:left w:type="dxa" w:w="100"/>
+              <w:bottom w:type="dxa" w:w="60"/>
+              <w:right w:type="dxa" w:w="100"/>
+            </w:tcMar>
+          </w:tcPr>
+          <w:p>
+            <w:pPr>
+              <w:spacing w:after="20"/>
+            </w:pPr>
+            <w:r>
+              <w:rPr>
+                <w:rFonts w:ascii="Arial" w:cs="Arial" w:eastAsia="Arial" w:hAnsi="Arial"/>
+                <w:b w:val="false"/>
+                <w:bCs w:val="false"/>
+                <w:sz w:val="19"/>
+                <w:szCs w:val="19"/>
+              </w:rPr>
+              <w:t xml:space="preserve">CAM vẽ đúng nét; 2D/3D khoét hình thuôn rộng bằng nét</w:t>
+            </w:r>
+          </w:p>
+        </w:tc>
+      </w:tr>
     </w:tbl>
     <w:p>
       <w:pPr>
@@ -13075,15 +14541,15 @@
           <w:sz w:val="21"/>
           <w:szCs w:val="21"/>
         </w:rPr>
-        <w:t xml:space="preserve">Chưa nhận biết file đa thiết kế</w:t>
-      </w:r>
-      <w:r>
-        <w:rPr>
-          <w:rFonts w:ascii="Arial" w:cs="Arial" w:eastAsia="Arial" w:hAnsi="Arial"/>
-          <w:sz w:val="21"/>
-          <w:szCs w:val="21"/>
-        </w:rPr>
-        <w:t xml:space="preserve">: CHAT_BOT_1 (4 bo ghép) vẫn đi bảng tra khi chưa tích Ghép panel — app đếm được số bo trong viền, có thể tự nhắc.</w:t>
+        <w:t xml:space="preserve">Bo ghép chỉ ngăn bằng rãnh</w:t>
+      </w:r>
+      <w:r>
+        <w:rPr>
+          <w:rFonts w:ascii="Arial" w:cs="Arial" w:eastAsia="Arial" w:hAnsi="Arial"/>
+          <w:sz w:val="21"/>
+          <w:szCs w:val="21"/>
+        </w:rPr>
+        <w:t xml:space="preserve"> (CHAT_BOT_4) vẫn đếm là 1 bo nên chưa có nhắc "nhiều bo ghép" (706ea9f đã nhắc cho file nhiều viền bo rời như CHAT_BOT_1).</w:t>
       </w:r>
     </w:p>
     <w:p>
@@ -13266,7 +14732,7 @@
           <w:sz w:val="21"/>
           <w:szCs w:val="21"/>
         </w:rPr>
-        <w:t xml:space="preserve"> (tsc -b chặt hơn tsc --noEmit — lỗi build Vercel ở f12b339 là do chỉ chạy lệnh nhẹ) và npx vitest run (131 test).</w:t>
+        <w:t xml:space="preserve"> (tsc -b chặt hơn tsc --noEmit — lỗi build Vercel ở f12b339 là do chỉ chạy lệnh nhẹ) và npx vitest run (136 test).</w:t>
       </w:r>
     </w:p>
     <w:p>
@@ -13302,7 +14768,7 @@
           <w:sz w:val="21"/>
           <w:szCs w:val="21"/>
         </w:rPr>
-        <w:t xml:space="preserve">Mở lại bộ mẫu: FC_F405RGT6_Wing (KiCad 6 lớp), BOAD NUT NHAN (EasyEDA), AGVH7 (Altium inch, slot), Ceiling / Dynamic Master (panel inch), Slaver_Ceiling bản lẻ (GKO + GM1), ESP32_DR (Altium metric 4:3, RectHoles), CHAT_BOT_1 (panel 4 bo), 3W NHUA XANH (CAM350, RAR).</w:t>
+        <w:t xml:space="preserve">Mở lại bộ mẫu: FC_F405RGT6_Wing (KiCad 6 lớp), BOAD NUT NHAN (EasyEDA), AGVH7 (Altium inch, slot), Ceiling / Dynamic Master (panel inch), Slaver_Ceiling bản lẻ (GKO + GM1), ESP32_DR (Altium metric 4:3, RectHoles), CHAT_BOT_1 (panel 4 bo), CHAT_BOT_4 (rãnh một nét), PHAONUOC (đường vẽ 0.8 mm không thành rãnh), 3W NHUA XANH (CAM350, RAR).</w:t>
       </w:r>
     </w:p>
     <w:sectPr>

</xml_diff>

<commit_message>
docs: Add the OrCAD .DRD fix and hand-set layer types to the report
Co-Authored-By: Claude Opus 5 <noreply@anthropic.com>
</commit_message>
<xml_diff>
--- a/docs/bao-cao/Bao-cao-DQPCB-2026-09-22.docx
+++ b/docs/bao-cao/Bao-cao-DQPCB-2026-09-22.docx
@@ -2474,6 +2474,272 @@
           </w:p>
         </w:tc>
       </w:tr>
+      <w:tr>
+        <w:trPr>
+          <w:tblHeader w:val="false"/>
+        </w:trPr>
+        <w:tc>
+          <w:tcPr>
+            <w:tcW w:type="dxa" w:w="481"/>
+            <w:tcBorders>
+              <w:top w:val="single" w:color="BFBFBF" w:sz="4"/>
+              <w:left w:val="single" w:color="BFBFBF" w:sz="4"/>
+              <w:bottom w:val="single" w:color="BFBFBF" w:sz="4"/>
+              <w:right w:val="single" w:color="BFBFBF" w:sz="4"/>
+            </w:tcBorders>
+            <w:tcMar>
+              <w:top w:type="dxa" w:w="60"/>
+              <w:left w:type="dxa" w:w="100"/>
+              <w:bottom w:type="dxa" w:w="60"/>
+              <w:right w:type="dxa" w:w="100"/>
+            </w:tcMar>
+          </w:tcPr>
+          <w:p>
+            <w:pPr>
+              <w:spacing w:after="20"/>
+            </w:pPr>
+            <w:r>
+              <w:rPr>
+                <w:rFonts w:ascii="Arial" w:cs="Arial" w:eastAsia="Arial" w:hAnsi="Arial"/>
+                <w:b w:val="false"/>
+                <w:bCs w:val="false"/>
+                <w:sz w:val="19"/>
+                <w:szCs w:val="19"/>
+              </w:rPr>
+              <w:t xml:space="preserve">14</w:t>
+            </w:r>
+          </w:p>
+        </w:tc>
+        <w:tc>
+          <w:tcPr>
+            <w:tcW w:type="dxa" w:w="4047"/>
+            <w:tcBorders>
+              <w:top w:val="single" w:color="BFBFBF" w:sz="4"/>
+              <w:left w:val="single" w:color="BFBFBF" w:sz="4"/>
+              <w:bottom w:val="single" w:color="BFBFBF" w:sz="4"/>
+              <w:right w:val="single" w:color="BFBFBF" w:sz="4"/>
+            </w:tcBorders>
+            <w:tcMar>
+              <w:top w:type="dxa" w:w="60"/>
+              <w:left w:type="dxa" w:w="100"/>
+              <w:bottom w:type="dxa" w:w="60"/>
+              <w:right w:type="dxa" w:w="100"/>
+            </w:tcMar>
+          </w:tcPr>
+          <w:p>
+            <w:pPr>
+              <w:spacing w:after="20"/>
+            </w:pPr>
+            <w:r>
+              <w:rPr>
+                <w:rFonts w:ascii="Arial" w:cs="Arial" w:eastAsia="Arial" w:hAnsi="Arial"/>
+                <w:b w:val="false"/>
+                <w:bCs w:val="false"/>
+                <w:sz w:val="19"/>
+                <w:szCs w:val="19"/>
+              </w:rPr>
+              <w:t xml:space="preserve">OrCAD Layout: vẽ bản vẽ khoan .DRD thay cho thruhole.tap</w:t>
+            </w:r>
+          </w:p>
+        </w:tc>
+        <w:tc>
+          <w:tcPr>
+            <w:tcW w:type="dxa" w:w="2891"/>
+            <w:tcBorders>
+              <w:top w:val="single" w:color="BFBFBF" w:sz="4"/>
+              <w:left w:val="single" w:color="BFBFBF" w:sz="4"/>
+              <w:bottom w:val="single" w:color="BFBFBF" w:sz="4"/>
+              <w:right w:val="single" w:color="BFBFBF" w:sz="4"/>
+            </w:tcBorders>
+            <w:tcMar>
+              <w:top w:type="dxa" w:w="60"/>
+              <w:left w:type="dxa" w:w="100"/>
+              <w:bottom w:type="dxa" w:w="60"/>
+              <w:right w:type="dxa" w:w="100"/>
+            </w:tcMar>
+          </w:tcPr>
+          <w:p>
+            <w:pPr>
+              <w:spacing w:after="20"/>
+            </w:pPr>
+            <w:r>
+              <w:rPr>
+                <w:rFonts w:ascii="Arial" w:cs="Arial" w:eastAsia="Arial" w:hAnsi="Arial"/>
+                <w:b w:val="false"/>
+                <w:bCs w:val="false"/>
+                <w:sz w:val="19"/>
+                <w:szCs w:val="19"/>
+              </w:rPr>
+              <w:t xml:space="preserve">Dinh Anh Tuan — DA82 (+ 252 bộ OrCAD)</w:t>
+            </w:r>
+          </w:p>
+        </w:tc>
+        <w:tc>
+          <w:tcPr>
+            <w:tcW w:type="dxa" w:w="2219"/>
+            <w:tcBorders>
+              <w:top w:val="single" w:color="BFBFBF" w:sz="4"/>
+              <w:left w:val="single" w:color="BFBFBF" w:sz="4"/>
+              <w:bottom w:val="single" w:color="BFBFBF" w:sz="4"/>
+              <w:right w:val="single" w:color="BFBFBF" w:sz="4"/>
+            </w:tcBorders>
+            <w:tcMar>
+              <w:top w:type="dxa" w:w="60"/>
+              <w:left w:type="dxa" w:w="100"/>
+              <w:bottom w:type="dxa" w:w="60"/>
+              <w:right w:type="dxa" w:w="100"/>
+            </w:tcMar>
+          </w:tcPr>
+          <w:p>
+            <w:pPr>
+              <w:spacing w:after="20"/>
+            </w:pPr>
+            <w:r>
+              <w:rPr>
+                <w:rFonts w:ascii="Arial" w:cs="Arial" w:eastAsia="Arial" w:hAnsi="Arial"/>
+                <w:b w:val="false"/>
+                <w:bCs w:val="false"/>
+                <w:sz w:val="19"/>
+                <w:szCs w:val="19"/>
+              </w:rPr>
+              <w:t xml:space="preserve">Đã sửa · 11dc1bb</w:t>
+            </w:r>
+          </w:p>
+        </w:tc>
+      </w:tr>
+      <w:tr>
+        <w:trPr>
+          <w:tblHeader w:val="false"/>
+        </w:trPr>
+        <w:tc>
+          <w:tcPr>
+            <w:tcW w:type="dxa" w:w="481"/>
+            <w:tcBorders>
+              <w:top w:val="single" w:color="BFBFBF" w:sz="4"/>
+              <w:left w:val="single" w:color="BFBFBF" w:sz="4"/>
+              <w:bottom w:val="single" w:color="BFBFBF" w:sz="4"/>
+              <w:right w:val="single" w:color="BFBFBF" w:sz="4"/>
+            </w:tcBorders>
+            <w:tcMar>
+              <w:top w:type="dxa" w:w="60"/>
+              <w:left w:type="dxa" w:w="100"/>
+              <w:bottom w:type="dxa" w:w="60"/>
+              <w:right w:type="dxa" w:w="100"/>
+            </w:tcMar>
+          </w:tcPr>
+          <w:p>
+            <w:pPr>
+              <w:spacing w:after="20"/>
+            </w:pPr>
+            <w:r>
+              <w:rPr>
+                <w:rFonts w:ascii="Arial" w:cs="Arial" w:eastAsia="Arial" w:hAnsi="Arial"/>
+                <w:b w:val="false"/>
+                <w:bCs w:val="false"/>
+                <w:sz w:val="19"/>
+                <w:szCs w:val="19"/>
+              </w:rPr>
+              <w:t xml:space="preserve">15</w:t>
+            </w:r>
+          </w:p>
+        </w:tc>
+        <w:tc>
+          <w:tcPr>
+            <w:tcW w:type="dxa" w:w="4047"/>
+            <w:tcBorders>
+              <w:top w:val="single" w:color="BFBFBF" w:sz="4"/>
+              <w:left w:val="single" w:color="BFBFBF" w:sz="4"/>
+              <w:bottom w:val="single" w:color="BFBFBF" w:sz="4"/>
+              <w:right w:val="single" w:color="BFBFBF" w:sz="4"/>
+            </w:tcBorders>
+            <w:tcMar>
+              <w:top w:type="dxa" w:w="60"/>
+              <w:left w:type="dxa" w:w="100"/>
+              <w:bottom w:type="dxa" w:w="60"/>
+              <w:right w:type="dxa" w:w="100"/>
+            </w:tcMar>
+          </w:tcPr>
+          <w:p>
+            <w:pPr>
+              <w:spacing w:after="20"/>
+            </w:pPr>
+            <w:r>
+              <w:rPr>
+                <w:rFonts w:ascii="Arial" w:cs="Arial" w:eastAsia="Arial" w:hAnsi="Arial"/>
+                <w:b w:val="false"/>
+                <w:bCs w:val="false"/>
+                <w:sz w:val="19"/>
+                <w:szCs w:val="19"/>
+              </w:rPr>
+              <w:t xml:space="preserve">Lớp tài liệu / không rõ loại bật lên không có gì; không chọn tay được loại lớp</w:t>
+            </w:r>
+          </w:p>
+        </w:tc>
+        <w:tc>
+          <w:tcPr>
+            <w:tcW w:type="dxa" w:w="2891"/>
+            <w:tcBorders>
+              <w:top w:val="single" w:color="BFBFBF" w:sz="4"/>
+              <w:left w:val="single" w:color="BFBFBF" w:sz="4"/>
+              <w:bottom w:val="single" w:color="BFBFBF" w:sz="4"/>
+              <w:right w:val="single" w:color="BFBFBF" w:sz="4"/>
+            </w:tcBorders>
+            <w:tcMar>
+              <w:top w:type="dxa" w:w="60"/>
+              <w:left w:type="dxa" w:w="100"/>
+              <w:bottom w:type="dxa" w:w="60"/>
+              <w:right w:type="dxa" w:w="100"/>
+            </w:tcMar>
+          </w:tcPr>
+          <w:p>
+            <w:pPr>
+              <w:spacing w:after="20"/>
+            </w:pPr>
+            <w:r>
+              <w:rPr>
+                <w:rFonts w:ascii="Arial" w:cs="Arial" w:eastAsia="Arial" w:hAnsi="Arial"/>
+                <w:b w:val="false"/>
+                <w:bCs w:val="false"/>
+                <w:sz w:val="19"/>
+                <w:szCs w:val="19"/>
+              </w:rPr>
+              <w:t xml:space="preserve">Dinh Anh Tuan — DA82</w:t>
+            </w:r>
+          </w:p>
+        </w:tc>
+        <w:tc>
+          <w:tcPr>
+            <w:tcW w:type="dxa" w:w="2219"/>
+            <w:tcBorders>
+              <w:top w:val="single" w:color="BFBFBF" w:sz="4"/>
+              <w:left w:val="single" w:color="BFBFBF" w:sz="4"/>
+              <w:bottom w:val="single" w:color="BFBFBF" w:sz="4"/>
+              <w:right w:val="single" w:color="BFBFBF" w:sz="4"/>
+            </w:tcBorders>
+            <w:tcMar>
+              <w:top w:type="dxa" w:w="60"/>
+              <w:left w:type="dxa" w:w="100"/>
+              <w:bottom w:type="dxa" w:w="60"/>
+              <w:right w:type="dxa" w:w="100"/>
+            </w:tcMar>
+          </w:tcPr>
+          <w:p>
+            <w:pPr>
+              <w:spacing w:after="20"/>
+            </w:pPr>
+            <w:r>
+              <w:rPr>
+                <w:rFonts w:ascii="Arial" w:cs="Arial" w:eastAsia="Arial" w:hAnsi="Arial"/>
+                <w:b w:val="false"/>
+                <w:bCs w:val="false"/>
+                <w:sz w:val="19"/>
+                <w:szCs w:val="19"/>
+              </w:rPr>
+              <w:t xml:space="preserve">Đã sửa · 11dc1bb</w:t>
+            </w:r>
+          </w:p>
+        </w:tc>
+      </w:tr>
     </w:tbl>
     <w:p>
       <w:pPr>
@@ -8030,6 +8296,1011 @@
           <w:sz w:val="25"/>
           <w:szCs w:val="25"/>
         </w:rPr>
+        <w:t xml:space="preserve">Lỗi 14 — OrCAD Layout: vẽ bản vẽ khoan .DRD thay cho thruhole.tap</w:t>
+      </w:r>
+    </w:p>
+    <w:tbl>
+      <w:tblPr>
+        <w:tblW w:type="dxa" w:w="9638"/>
+        <w:tblBorders>
+          <w:top w:val="single" w:color="auto" w:sz="4"/>
+          <w:left w:val="single" w:color="auto" w:sz="4"/>
+          <w:bottom w:val="single" w:color="auto" w:sz="4"/>
+          <w:right w:val="single" w:color="auto" w:sz="4"/>
+          <w:insideH w:val="single" w:color="auto" w:sz="4"/>
+          <w:insideV w:val="single" w:color="auto" w:sz="4"/>
+        </w:tblBorders>
+      </w:tblPr>
+      <w:tblGrid>
+        <w:gridCol w:w="2120"/>
+        <w:gridCol w:w="7518"/>
+      </w:tblGrid>
+      <w:tr>
+        <w:trPr>
+          <w:tblHeader/>
+        </w:trPr>
+        <w:tc>
+          <w:tcPr>
+            <w:tcW w:type="dxa" w:w="2120"/>
+            <w:tcBorders>
+              <w:top w:val="single" w:color="BFBFBF" w:sz="4"/>
+              <w:left w:val="single" w:color="BFBFBF" w:sz="4"/>
+              <w:bottom w:val="single" w:color="BFBFBF" w:sz="4"/>
+              <w:right w:val="single" w:color="BFBFBF" w:sz="4"/>
+            </w:tcBorders>
+            <w:shd w:fill="DCE6F2" w:color="auto" w:val="clear"/>
+            <w:tcMar>
+              <w:top w:type="dxa" w:w="60"/>
+              <w:left w:type="dxa" w:w="100"/>
+              <w:bottom w:type="dxa" w:w="60"/>
+              <w:right w:type="dxa" w:w="100"/>
+            </w:tcMar>
+          </w:tcPr>
+          <w:p>
+            <w:pPr>
+              <w:spacing w:after="20"/>
+            </w:pPr>
+            <w:r>
+              <w:rPr>
+                <w:rFonts w:ascii="Arial" w:cs="Arial" w:eastAsia="Arial" w:hAnsi="Arial"/>
+                <w:b/>
+                <w:bCs/>
+                <w:sz w:val="19"/>
+                <w:szCs w:val="19"/>
+              </w:rPr>
+              <w:t xml:space="preserve">Mục</w:t>
+            </w:r>
+          </w:p>
+        </w:tc>
+        <w:tc>
+          <w:tcPr>
+            <w:tcW w:type="dxa" w:w="7518"/>
+            <w:tcBorders>
+              <w:top w:val="single" w:color="BFBFBF" w:sz="4"/>
+              <w:left w:val="single" w:color="BFBFBF" w:sz="4"/>
+              <w:bottom w:val="single" w:color="BFBFBF" w:sz="4"/>
+              <w:right w:val="single" w:color="BFBFBF" w:sz="4"/>
+            </w:tcBorders>
+            <w:shd w:fill="DCE6F2" w:color="auto" w:val="clear"/>
+            <w:tcMar>
+              <w:top w:type="dxa" w:w="60"/>
+              <w:left w:type="dxa" w:w="100"/>
+              <w:bottom w:type="dxa" w:w="60"/>
+              <w:right w:type="dxa" w:w="100"/>
+            </w:tcMar>
+          </w:tcPr>
+          <w:p>
+            <w:pPr>
+              <w:spacing w:after="20"/>
+            </w:pPr>
+            <w:r>
+              <w:rPr>
+                <w:rFonts w:ascii="Arial" w:cs="Arial" w:eastAsia="Arial" w:hAnsi="Arial"/>
+                <w:b/>
+                <w:bCs/>
+                <w:sz w:val="19"/>
+                <w:szCs w:val="19"/>
+              </w:rPr>
+              <w:t xml:space="preserve">Nội dung</w:t>
+            </w:r>
+          </w:p>
+        </w:tc>
+      </w:tr>
+      <w:tr>
+        <w:trPr>
+          <w:tblHeader w:val="false"/>
+        </w:trPr>
+        <w:tc>
+          <w:tcPr>
+            <w:tcW w:type="dxa" w:w="2120"/>
+            <w:tcBorders>
+              <w:top w:val="single" w:color="BFBFBF" w:sz="4"/>
+              <w:left w:val="single" w:color="BFBFBF" w:sz="4"/>
+              <w:bottom w:val="single" w:color="BFBFBF" w:sz="4"/>
+              <w:right w:val="single" w:color="BFBFBF" w:sz="4"/>
+            </w:tcBorders>
+            <w:tcMar>
+              <w:top w:type="dxa" w:w="60"/>
+              <w:left w:type="dxa" w:w="100"/>
+              <w:bottom w:type="dxa" w:w="60"/>
+              <w:right w:type="dxa" w:w="100"/>
+            </w:tcMar>
+          </w:tcPr>
+          <w:p>
+            <w:pPr>
+              <w:spacing w:after="20"/>
+            </w:pPr>
+            <w:r>
+              <w:rPr>
+                <w:rFonts w:ascii="Arial" w:cs="Arial" w:eastAsia="Arial" w:hAnsi="Arial"/>
+                <w:b w:val="false"/>
+                <w:bCs w:val="false"/>
+                <w:sz w:val="19"/>
+                <w:szCs w:val="19"/>
+              </w:rPr>
+              <w:t xml:space="preserve">Bộ file</w:t>
+            </w:r>
+          </w:p>
+        </w:tc>
+        <w:tc>
+          <w:tcPr>
+            <w:tcW w:type="dxa" w:w="7518"/>
+            <w:tcBorders>
+              <w:top w:val="single" w:color="BFBFBF" w:sz="4"/>
+              <w:left w:val="single" w:color="BFBFBF" w:sz="4"/>
+              <w:bottom w:val="single" w:color="BFBFBF" w:sz="4"/>
+              <w:right w:val="single" w:color="BFBFBF" w:sz="4"/>
+            </w:tcBorders>
+            <w:tcMar>
+              <w:top w:type="dxa" w:w="60"/>
+              <w:left w:type="dxa" w:w="100"/>
+              <w:bottom w:type="dxa" w:w="60"/>
+              <w:right w:type="dxa" w:w="100"/>
+            </w:tcMar>
+          </w:tcPr>
+          <w:p>
+            <w:pPr>
+              <w:spacing w:after="20"/>
+            </w:pPr>
+            <w:r>
+              <w:rPr>
+                <w:rFonts w:ascii="Arial" w:cs="Arial" w:eastAsia="Arial" w:hAnsi="Arial"/>
+                <w:b w:val="false"/>
+                <w:bCs w:val="false"/>
+                <w:sz w:val="19"/>
+                <w:szCs w:val="19"/>
+              </w:rPr>
+              <w:t xml:space="preserve">D:\JobDatMach\Dinh Anh Tuan\2026\22-09\Dinh Anh Tuan 10pcs No Step DA82.rar</w:t>
+            </w:r>
+          </w:p>
+        </w:tc>
+      </w:tr>
+      <w:tr>
+        <w:trPr>
+          <w:tblHeader w:val="false"/>
+        </w:trPr>
+        <w:tc>
+          <w:tcPr>
+            <w:tcW w:type="dxa" w:w="2120"/>
+            <w:tcBorders>
+              <w:top w:val="single" w:color="BFBFBF" w:sz="4"/>
+              <w:left w:val="single" w:color="BFBFBF" w:sz="4"/>
+              <w:bottom w:val="single" w:color="BFBFBF" w:sz="4"/>
+              <w:right w:val="single" w:color="BFBFBF" w:sz="4"/>
+            </w:tcBorders>
+            <w:tcMar>
+              <w:top w:type="dxa" w:w="60"/>
+              <w:left w:type="dxa" w:w="100"/>
+              <w:bottom w:type="dxa" w:w="60"/>
+              <w:right w:type="dxa" w:w="100"/>
+            </w:tcMar>
+          </w:tcPr>
+          <w:p>
+            <w:pPr>
+              <w:spacing w:after="20"/>
+            </w:pPr>
+            <w:r>
+              <w:rPr>
+                <w:rFonts w:ascii="Arial" w:cs="Arial" w:eastAsia="Arial" w:hAnsi="Arial"/>
+                <w:b w:val="false"/>
+                <w:bCs w:val="false"/>
+                <w:sz w:val="19"/>
+                <w:szCs w:val="19"/>
+              </w:rPr>
+              <w:t xml:space="preserve">Hiện tượng</w:t>
+            </w:r>
+          </w:p>
+        </w:tc>
+        <w:tc>
+          <w:tcPr>
+            <w:tcW w:type="dxa" w:w="7518"/>
+            <w:tcBorders>
+              <w:top w:val="single" w:color="BFBFBF" w:sz="4"/>
+              <w:left w:val="single" w:color="BFBFBF" w:sz="4"/>
+              <w:bottom w:val="single" w:color="BFBFBF" w:sz="4"/>
+              <w:right w:val="single" w:color="BFBFBF" w:sz="4"/>
+            </w:tcBorders>
+            <w:tcMar>
+              <w:top w:type="dxa" w:w="60"/>
+              <w:left w:type="dxa" w:w="100"/>
+              <w:bottom w:type="dxa" w:w="60"/>
+              <w:right w:type="dxa" w:w="100"/>
+            </w:tcMar>
+          </w:tcPr>
+          <w:p>
+            <w:pPr>
+              <w:spacing w:after="20"/>
+            </w:pPr>
+            <w:r>
+              <w:rPr>
+                <w:rFonts w:ascii="Arial" w:cs="Arial" w:eastAsia="Arial" w:hAnsi="Arial"/>
+                <w:b w:val="false"/>
+                <w:bCs w:val="false"/>
+                <w:sz w:val="19"/>
+                <w:szCs w:val="19"/>
+              </w:rPr>
+              <w:t xml:space="preserve">Lớp thruhole.tap có trong danh sách nhưng không vẽ; khoan lấy từ .DRD, 2D không có lỗ.</w:t>
+            </w:r>
+          </w:p>
+        </w:tc>
+      </w:tr>
+      <w:tr>
+        <w:trPr>
+          <w:tblHeader w:val="false"/>
+        </w:trPr>
+        <w:tc>
+          <w:tcPr>
+            <w:tcW w:type="dxa" w:w="2120"/>
+            <w:tcBorders>
+              <w:top w:val="single" w:color="BFBFBF" w:sz="4"/>
+              <w:left w:val="single" w:color="BFBFBF" w:sz="4"/>
+              <w:bottom w:val="single" w:color="BFBFBF" w:sz="4"/>
+              <w:right w:val="single" w:color="BFBFBF" w:sz="4"/>
+            </w:tcBorders>
+            <w:tcMar>
+              <w:top w:type="dxa" w:w="60"/>
+              <w:left w:type="dxa" w:w="100"/>
+              <w:bottom w:type="dxa" w:w="60"/>
+              <w:right w:type="dxa" w:w="100"/>
+            </w:tcMar>
+          </w:tcPr>
+          <w:p>
+            <w:pPr>
+              <w:spacing w:after="20"/>
+            </w:pPr>
+            <w:r>
+              <w:rPr>
+                <w:rFonts w:ascii="Arial" w:cs="Arial" w:eastAsia="Arial" w:hAnsi="Arial"/>
+                <w:b w:val="false"/>
+                <w:bCs w:val="false"/>
+                <w:sz w:val="19"/>
+                <w:szCs w:val="19"/>
+              </w:rPr>
+              <w:t xml:space="preserve">Nguyên nhân</w:t>
+            </w:r>
+          </w:p>
+        </w:tc>
+        <w:tc>
+          <w:tcPr>
+            <w:tcW w:type="dxa" w:w="7518"/>
+            <w:tcBorders>
+              <w:top w:val="single" w:color="BFBFBF" w:sz="4"/>
+              <w:left w:val="single" w:color="BFBFBF" w:sz="4"/>
+              <w:bottom w:val="single" w:color="BFBFBF" w:sz="4"/>
+              <w:right w:val="single" w:color="BFBFBF" w:sz="4"/>
+            </w:tcBorders>
+            <w:tcMar>
+              <w:top w:type="dxa" w:w="60"/>
+              <w:left w:type="dxa" w:w="100"/>
+              <w:bottom w:type="dxa" w:w="60"/>
+              <w:right w:type="dxa" w:w="100"/>
+            </w:tcMar>
+          </w:tcPr>
+          <w:p>
+            <w:pPr>
+              <w:spacing w:after="20"/>
+            </w:pPr>
+            <w:r>
+              <w:rPr>
+                <w:rFonts w:ascii="Arial" w:cs="Arial" w:eastAsia="Arial" w:hAnsi="Arial"/>
+                <w:b w:val="false"/>
+                <w:bCs w:val="false"/>
+                <w:sz w:val="19"/>
+                <w:szCs w:val="19"/>
+              </w:rPr>
+              <w:t xml:space="preserve">thruhole.tap đọc đúng (339 lỗ). .DRD của OrCAD Layout là </w:t>
+            </w:r>
+            <w:r>
+              <w:rPr>
+                <w:rFonts w:ascii="Arial" w:cs="Arial" w:eastAsia="Arial" w:hAnsi="Arial"/>
+                <w:b/>
+                <w:bCs/>
+                <w:sz w:val="19"/>
+                <w:szCs w:val="19"/>
+              </w:rPr>
+              <w:t xml:space="preserve">bản vẽ khoan</w:t>
+            </w:r>
+            <w:r>
+              <w:rPr>
+                <w:rFonts w:ascii="Arial" w:cs="Arial" w:eastAsia="Arial" w:hAnsi="Arial"/>
+                <w:b w:val="false"/>
+                <w:bCs w:val="false"/>
+                <w:sz w:val="19"/>
+                <w:szCs w:val="19"/>
+              </w:rPr>
+              <w:t xml:space="preserve"> dạng Gerber (ký hiệu lỗ + bảng chú thích). App nhận "file khoan dạng Gerber" bằng dòng %FS…X…, mà OrCAD ghi %FSLAN2X34Y34*% — thêm "N2" nên không khớp → .DRD bị coi là Excellon, là file gộp nhiều hình nhất → được chọn vẽ. </w:t>
+            </w:r>
+            <w:r>
+              <w:rPr>
+                <w:rFonts w:ascii="Arial" w:cs="Arial" w:eastAsia="Arial" w:hAnsi="Arial"/>
+                <w:b/>
+                <w:bCs/>
+                <w:sz w:val="19"/>
+                <w:szCs w:val="19"/>
+              </w:rPr>
+              <w:t xml:space="preserve">Có từ trước</w:t>
+            </w:r>
+            <w:r>
+              <w:rPr>
+                <w:rFonts w:ascii="Arial" w:cs="Arial" w:eastAsia="Arial" w:hAnsi="Arial"/>
+                <w:b w:val="false"/>
+                <w:bCs w:val="false"/>
+                <w:sz w:val="19"/>
+                <w:szCs w:val="19"/>
+              </w:rPr>
+              <w:t xml:space="preserve"> (mục ".DRD bị chọn thay THRUHOLE.tap" trong vấn đề còn tồn cũ).</w:t>
+            </w:r>
+          </w:p>
+        </w:tc>
+      </w:tr>
+      <w:tr>
+        <w:trPr>
+          <w:tblHeader w:val="false"/>
+        </w:trPr>
+        <w:tc>
+          <w:tcPr>
+            <w:tcW w:type="dxa" w:w="2120"/>
+            <w:tcBorders>
+              <w:top w:val="single" w:color="BFBFBF" w:sz="4"/>
+              <w:left w:val="single" w:color="BFBFBF" w:sz="4"/>
+              <w:bottom w:val="single" w:color="BFBFBF" w:sz="4"/>
+              <w:right w:val="single" w:color="BFBFBF" w:sz="4"/>
+            </w:tcBorders>
+            <w:tcMar>
+              <w:top w:type="dxa" w:w="60"/>
+              <w:left w:type="dxa" w:w="100"/>
+              <w:bottom w:type="dxa" w:w="60"/>
+              <w:right w:type="dxa" w:w="100"/>
+            </w:tcMar>
+          </w:tcPr>
+          <w:p>
+            <w:pPr>
+              <w:spacing w:after="20"/>
+            </w:pPr>
+            <w:r>
+              <w:rPr>
+                <w:rFonts w:ascii="Arial" w:cs="Arial" w:eastAsia="Arial" w:hAnsi="Arial"/>
+                <w:b w:val="false"/>
+                <w:bCs w:val="false"/>
+                <w:sz w:val="19"/>
+                <w:szCs w:val="19"/>
+              </w:rPr>
+              <w:t xml:space="preserve">Cách giải quyết</w:t>
+            </w:r>
+          </w:p>
+        </w:tc>
+        <w:tc>
+          <w:tcPr>
+            <w:tcW w:type="dxa" w:w="7518"/>
+            <w:tcBorders>
+              <w:top w:val="single" w:color="BFBFBF" w:sz="4"/>
+              <w:left w:val="single" w:color="BFBFBF" w:sz="4"/>
+              <w:bottom w:val="single" w:color="BFBFBF" w:sz="4"/>
+              <w:right w:val="single" w:color="BFBFBF" w:sz="4"/>
+            </w:tcBorders>
+            <w:tcMar>
+              <w:top w:type="dxa" w:w="60"/>
+              <w:left w:type="dxa" w:w="100"/>
+              <w:bottom w:type="dxa" w:w="60"/>
+              <w:right w:type="dxa" w:w="100"/>
+            </w:tcMar>
+          </w:tcPr>
+          <w:p>
+            <w:pPr>
+              <w:spacing w:after="20"/>
+            </w:pPr>
+            <w:r>
+              <w:rPr>
+                <w:rFonts w:ascii="Arial" w:cs="Arial" w:eastAsia="Arial" w:hAnsi="Arial"/>
+                <w:b w:val="false"/>
+                <w:bCs w:val="false"/>
+                <w:sz w:val="19"/>
+                <w:szCs w:val="19"/>
+              </w:rPr>
+              <w:t xml:space="preserve">Nhận thêm N / G / D / M trong header. Có Excellon thì .DRD thành tài liệu "Drill (Gerber)" (ẩn, bật xem được).</w:t>
+            </w:r>
+          </w:p>
+        </w:tc>
+      </w:tr>
+      <w:tr>
+        <w:trPr>
+          <w:tblHeader w:val="false"/>
+        </w:trPr>
+        <w:tc>
+          <w:tcPr>
+            <w:tcW w:type="dxa" w:w="2120"/>
+            <w:tcBorders>
+              <w:top w:val="single" w:color="BFBFBF" w:sz="4"/>
+              <w:left w:val="single" w:color="BFBFBF" w:sz="4"/>
+              <w:bottom w:val="single" w:color="BFBFBF" w:sz="4"/>
+              <w:right w:val="single" w:color="BFBFBF" w:sz="4"/>
+            </w:tcBorders>
+            <w:tcMar>
+              <w:top w:type="dxa" w:w="60"/>
+              <w:left w:type="dxa" w:w="100"/>
+              <w:bottom w:type="dxa" w:w="60"/>
+              <w:right w:type="dxa" w:w="100"/>
+            </w:tcMar>
+          </w:tcPr>
+          <w:p>
+            <w:pPr>
+              <w:spacing w:after="20"/>
+            </w:pPr>
+            <w:r>
+              <w:rPr>
+                <w:rFonts w:ascii="Arial" w:cs="Arial" w:eastAsia="Arial" w:hAnsi="Arial"/>
+                <w:b w:val="false"/>
+                <w:bCs w:val="false"/>
+                <w:sz w:val="19"/>
+                <w:szCs w:val="19"/>
+              </w:rPr>
+              <w:t xml:space="preserve">Kiểm</w:t>
+            </w:r>
+          </w:p>
+        </w:tc>
+        <w:tc>
+          <w:tcPr>
+            <w:tcW w:type="dxa" w:w="7518"/>
+            <w:tcBorders>
+              <w:top w:val="single" w:color="BFBFBF" w:sz="4"/>
+              <w:left w:val="single" w:color="BFBFBF" w:sz="4"/>
+              <w:bottom w:val="single" w:color="BFBFBF" w:sz="4"/>
+              <w:right w:val="single" w:color="BFBFBF" w:sz="4"/>
+            </w:tcBorders>
+            <w:tcMar>
+              <w:top w:type="dxa" w:w="60"/>
+              <w:left w:type="dxa" w:w="100"/>
+              <w:bottom w:type="dxa" w:w="60"/>
+              <w:right w:type="dxa" w:w="100"/>
+            </w:tcMar>
+          </w:tcPr>
+          <w:p>
+            <w:pPr>
+              <w:spacing w:after="20"/>
+            </w:pPr>
+            <w:r>
+              <w:rPr>
+                <w:rFonts w:ascii="Arial" w:cs="Arial" w:eastAsia="Arial" w:hAnsi="Arial"/>
+                <w:b w:val="false"/>
+                <w:bCs w:val="false"/>
+                <w:sz w:val="19"/>
+                <w:szCs w:val="19"/>
+              </w:rPr>
+              <w:t xml:space="preserve">291 bộ OrCAD Layout trong corpus: </w:t>
+            </w:r>
+            <w:r>
+              <w:rPr>
+                <w:rFonts w:ascii="Arial" w:cs="Arial" w:eastAsia="Arial" w:hAnsi="Arial"/>
+                <w:b/>
+                <w:bCs/>
+                <w:sz w:val="19"/>
+                <w:szCs w:val="19"/>
+              </w:rPr>
+              <w:t xml:space="preserve">252 bộ</w:t>
+            </w:r>
+            <w:r>
+              <w:rPr>
+                <w:rFonts w:ascii="Arial" w:cs="Arial" w:eastAsia="Arial" w:hAnsi="Arial"/>
+                <w:b w:val="false"/>
+                <w:bCs w:val="false"/>
+                <w:sz w:val="19"/>
+                <w:szCs w:val="19"/>
+              </w:rPr>
+              <w:t xml:space="preserve"> trước vẽ .DRD, giờ vẽ thruhole.tap, 100% lỗ nằm trong bo, kích thước không đổi. Còn lại: bộ vốn sai kích thước từ trước, và bộ chỉ có .DRD vẫn vẽ .DRD như cũ (số lỗ đếm sát hơn, vd 1125 → 91). Test mới.</w:t>
+            </w:r>
+          </w:p>
+        </w:tc>
+      </w:tr>
+    </w:tbl>
+    <w:p>
+      <w:pPr>
+        <w:spacing w:after="80"/>
+      </w:pPr>
+    </w:p>
+    <w:p>
+      <w:pPr>
+        <w:pStyle w:val="Heading2"/>
+        <w:spacing w:after="100" w:before="220"/>
+      </w:pPr>
+      <w:r>
+        <w:rPr>
+          <w:rFonts w:ascii="Arial" w:cs="Arial" w:eastAsia="Arial" w:hAnsi="Arial"/>
+          <w:b/>
+          <w:bCs/>
+          <w:color w:val="2E5597"/>
+          <w:sz w:val="25"/>
+          <w:szCs w:val="25"/>
+        </w:rPr>
+        <w:t xml:space="preserve">Lỗi 15 — Lớp tài liệu / không rõ loại bật lên trống; chọn tay loại lớp</w:t>
+      </w:r>
+    </w:p>
+    <w:tbl>
+      <w:tblPr>
+        <w:tblW w:type="dxa" w:w="9638"/>
+        <w:tblBorders>
+          <w:top w:val="single" w:color="auto" w:sz="4"/>
+          <w:left w:val="single" w:color="auto" w:sz="4"/>
+          <w:bottom w:val="single" w:color="auto" w:sz="4"/>
+          <w:right w:val="single" w:color="auto" w:sz="4"/>
+          <w:insideH w:val="single" w:color="auto" w:sz="4"/>
+          <w:insideV w:val="single" w:color="auto" w:sz="4"/>
+        </w:tblBorders>
+      </w:tblPr>
+      <w:tblGrid>
+        <w:gridCol w:w="2120"/>
+        <w:gridCol w:w="7518"/>
+      </w:tblGrid>
+      <w:tr>
+        <w:trPr>
+          <w:tblHeader/>
+        </w:trPr>
+        <w:tc>
+          <w:tcPr>
+            <w:tcW w:type="dxa" w:w="2120"/>
+            <w:tcBorders>
+              <w:top w:val="single" w:color="BFBFBF" w:sz="4"/>
+              <w:left w:val="single" w:color="BFBFBF" w:sz="4"/>
+              <w:bottom w:val="single" w:color="BFBFBF" w:sz="4"/>
+              <w:right w:val="single" w:color="BFBFBF" w:sz="4"/>
+            </w:tcBorders>
+            <w:shd w:fill="DCE6F2" w:color="auto" w:val="clear"/>
+            <w:tcMar>
+              <w:top w:type="dxa" w:w="60"/>
+              <w:left w:type="dxa" w:w="100"/>
+              <w:bottom w:type="dxa" w:w="60"/>
+              <w:right w:type="dxa" w:w="100"/>
+            </w:tcMar>
+          </w:tcPr>
+          <w:p>
+            <w:pPr>
+              <w:spacing w:after="20"/>
+            </w:pPr>
+            <w:r>
+              <w:rPr>
+                <w:rFonts w:ascii="Arial" w:cs="Arial" w:eastAsia="Arial" w:hAnsi="Arial"/>
+                <w:b/>
+                <w:bCs/>
+                <w:sz w:val="19"/>
+                <w:szCs w:val="19"/>
+              </w:rPr>
+              <w:t xml:space="preserve">Mục</w:t>
+            </w:r>
+          </w:p>
+        </w:tc>
+        <w:tc>
+          <w:tcPr>
+            <w:tcW w:type="dxa" w:w="7518"/>
+            <w:tcBorders>
+              <w:top w:val="single" w:color="BFBFBF" w:sz="4"/>
+              <w:left w:val="single" w:color="BFBFBF" w:sz="4"/>
+              <w:bottom w:val="single" w:color="BFBFBF" w:sz="4"/>
+              <w:right w:val="single" w:color="BFBFBF" w:sz="4"/>
+            </w:tcBorders>
+            <w:shd w:fill="DCE6F2" w:color="auto" w:val="clear"/>
+            <w:tcMar>
+              <w:top w:type="dxa" w:w="60"/>
+              <w:left w:type="dxa" w:w="100"/>
+              <w:bottom w:type="dxa" w:w="60"/>
+              <w:right w:type="dxa" w:w="100"/>
+            </w:tcMar>
+          </w:tcPr>
+          <w:p>
+            <w:pPr>
+              <w:spacing w:after="20"/>
+            </w:pPr>
+            <w:r>
+              <w:rPr>
+                <w:rFonts w:ascii="Arial" w:cs="Arial" w:eastAsia="Arial" w:hAnsi="Arial"/>
+                <w:b/>
+                <w:bCs/>
+                <w:sz w:val="19"/>
+                <w:szCs w:val="19"/>
+              </w:rPr>
+              <w:t xml:space="preserve">Nội dung</w:t>
+            </w:r>
+          </w:p>
+        </w:tc>
+      </w:tr>
+      <w:tr>
+        <w:trPr>
+          <w:tblHeader w:val="false"/>
+        </w:trPr>
+        <w:tc>
+          <w:tcPr>
+            <w:tcW w:type="dxa" w:w="2120"/>
+            <w:tcBorders>
+              <w:top w:val="single" w:color="BFBFBF" w:sz="4"/>
+              <w:left w:val="single" w:color="BFBFBF" w:sz="4"/>
+              <w:bottom w:val="single" w:color="BFBFBF" w:sz="4"/>
+              <w:right w:val="single" w:color="BFBFBF" w:sz="4"/>
+            </w:tcBorders>
+            <w:tcMar>
+              <w:top w:type="dxa" w:w="60"/>
+              <w:left w:type="dxa" w:w="100"/>
+              <w:bottom w:type="dxa" w:w="60"/>
+              <w:right w:type="dxa" w:w="100"/>
+            </w:tcMar>
+          </w:tcPr>
+          <w:p>
+            <w:pPr>
+              <w:spacing w:after="20"/>
+            </w:pPr>
+            <w:r>
+              <w:rPr>
+                <w:rFonts w:ascii="Arial" w:cs="Arial" w:eastAsia="Arial" w:hAnsi="Arial"/>
+                <w:b w:val="false"/>
+                <w:bCs w:val="false"/>
+                <w:sz w:val="19"/>
+                <w:szCs w:val="19"/>
+              </w:rPr>
+              <w:t xml:space="preserve">Hiện tượng</w:t>
+            </w:r>
+          </w:p>
+        </w:tc>
+        <w:tc>
+          <w:tcPr>
+            <w:tcW w:type="dxa" w:w="7518"/>
+            <w:tcBorders>
+              <w:top w:val="single" w:color="BFBFBF" w:sz="4"/>
+              <w:left w:val="single" w:color="BFBFBF" w:sz="4"/>
+              <w:bottom w:val="single" w:color="BFBFBF" w:sz="4"/>
+              <w:right w:val="single" w:color="BFBFBF" w:sz="4"/>
+            </w:tcBorders>
+            <w:tcMar>
+              <w:top w:type="dxa" w:w="60"/>
+              <w:left w:type="dxa" w:w="100"/>
+              <w:bottom w:type="dxa" w:w="60"/>
+              <w:right w:type="dxa" w:w="100"/>
+            </w:tcMar>
+          </w:tcPr>
+          <w:p>
+            <w:pPr>
+              <w:spacing w:after="20"/>
+            </w:pPr>
+            <w:r>
+              <w:rPr>
+                <w:rFonts w:ascii="Arial" w:cs="Arial" w:eastAsia="Arial" w:hAnsi="Arial"/>
+                <w:b w:val="false"/>
+                <w:bCs w:val="false"/>
+                <w:sz w:val="19"/>
+                <w:szCs w:val="19"/>
+              </w:rPr>
+              <w:t xml:space="preserve">DA82: .AST, .FAB, .DRD có trong danh sách, tích bật vẫn trống. App nhận sai loại thì không có cách sửa.</w:t>
+            </w:r>
+          </w:p>
+        </w:tc>
+      </w:tr>
+      <w:tr>
+        <w:trPr>
+          <w:tblHeader w:val="false"/>
+        </w:trPr>
+        <w:tc>
+          <w:tcPr>
+            <w:tcW w:type="dxa" w:w="2120"/>
+            <w:tcBorders>
+              <w:top w:val="single" w:color="BFBFBF" w:sz="4"/>
+              <w:left w:val="single" w:color="BFBFBF" w:sz="4"/>
+              <w:bottom w:val="single" w:color="BFBFBF" w:sz="4"/>
+              <w:right w:val="single" w:color="BFBFBF" w:sz="4"/>
+            </w:tcBorders>
+            <w:tcMar>
+              <w:top w:type="dxa" w:w="60"/>
+              <w:left w:type="dxa" w:w="100"/>
+              <w:bottom w:type="dxa" w:w="60"/>
+              <w:right w:type="dxa" w:w="100"/>
+            </w:tcMar>
+          </w:tcPr>
+          <w:p>
+            <w:pPr>
+              <w:spacing w:after="20"/>
+            </w:pPr>
+            <w:r>
+              <w:rPr>
+                <w:rFonts w:ascii="Arial" w:cs="Arial" w:eastAsia="Arial" w:hAnsi="Arial"/>
+                <w:b w:val="false"/>
+                <w:bCs w:val="false"/>
+                <w:sz w:val="19"/>
+                <w:szCs w:val="19"/>
+              </w:rPr>
+              <w:t xml:space="preserve">Nguyên nhân</w:t>
+            </w:r>
+          </w:p>
+        </w:tc>
+        <w:tc>
+          <w:tcPr>
+            <w:tcW w:type="dxa" w:w="7518"/>
+            <w:tcBorders>
+              <w:top w:val="single" w:color="BFBFBF" w:sz="4"/>
+              <w:left w:val="single" w:color="BFBFBF" w:sz="4"/>
+              <w:bottom w:val="single" w:color="BFBFBF" w:sz="4"/>
+              <w:right w:val="single" w:color="BFBFBF" w:sz="4"/>
+            </w:tcBorders>
+            <w:tcMar>
+              <w:top w:type="dxa" w:w="60"/>
+              <w:left w:type="dxa" w:w="100"/>
+              <w:bottom w:type="dxa" w:w="60"/>
+              <w:right w:type="dxa" w:w="100"/>
+            </w:tcMar>
+          </w:tcPr>
+          <w:p>
+            <w:pPr>
+              <w:spacing w:after="20"/>
+            </w:pPr>
+            <w:r>
+              <w:rPr>
+                <w:rFonts w:ascii="Arial" w:cs="Arial" w:eastAsia="Arial" w:hAnsi="Arial"/>
+                <w:b w:val="false"/>
+                <w:bCs w:val="false"/>
+                <w:sz w:val="19"/>
+                <w:szCs w:val="19"/>
+              </w:rPr>
+              <w:t xml:space="preserve">Viewer chỉ dựng lớp có chỗ trong bo (đồng, mask, lụa, viền, khoan được chọn); lớp tài liệu, không rõ loại, paste, file khoan không được chọn bị bỏ hẳn.</w:t>
+            </w:r>
+          </w:p>
+        </w:tc>
+      </w:tr>
+      <w:tr>
+        <w:trPr>
+          <w:tblHeader w:val="false"/>
+        </w:trPr>
+        <w:tc>
+          <w:tcPr>
+            <w:tcW w:type="dxa" w:w="2120"/>
+            <w:tcBorders>
+              <w:top w:val="single" w:color="BFBFBF" w:sz="4"/>
+              <w:left w:val="single" w:color="BFBFBF" w:sz="4"/>
+              <w:bottom w:val="single" w:color="BFBFBF" w:sz="4"/>
+              <w:right w:val="single" w:color="BFBFBF" w:sz="4"/>
+            </w:tcBorders>
+            <w:tcMar>
+              <w:top w:type="dxa" w:w="60"/>
+              <w:left w:type="dxa" w:w="100"/>
+              <w:bottom w:type="dxa" w:w="60"/>
+              <w:right w:type="dxa" w:w="100"/>
+            </w:tcMar>
+          </w:tcPr>
+          <w:p>
+            <w:pPr>
+              <w:spacing w:after="20"/>
+            </w:pPr>
+            <w:r>
+              <w:rPr>
+                <w:rFonts w:ascii="Arial" w:cs="Arial" w:eastAsia="Arial" w:hAnsi="Arial"/>
+                <w:b w:val="false"/>
+                <w:bCs w:val="false"/>
+                <w:sz w:val="19"/>
+                <w:szCs w:val="19"/>
+              </w:rPr>
+              <w:t xml:space="preserve">Cách giải quyết</w:t>
+            </w:r>
+          </w:p>
+        </w:tc>
+        <w:tc>
+          <w:tcPr>
+            <w:tcW w:type="dxa" w:w="7518"/>
+            <w:tcBorders>
+              <w:top w:val="single" w:color="BFBFBF" w:sz="4"/>
+              <w:left w:val="single" w:color="BFBFBF" w:sz="4"/>
+              <w:bottom w:val="single" w:color="BFBFBF" w:sz="4"/>
+              <w:right w:val="single" w:color="BFBFBF" w:sz="4"/>
+            </w:tcBorders>
+            <w:tcMar>
+              <w:top w:type="dxa" w:w="60"/>
+              <w:left w:type="dxa" w:w="100"/>
+              <w:bottom w:type="dxa" w:w="60"/>
+              <w:right w:type="dxa" w:w="100"/>
+            </w:tcMar>
+          </w:tcPr>
+          <w:p>
+            <w:pPr>
+              <w:spacing w:after="20"/>
+            </w:pPr>
+            <w:r>
+              <w:rPr>
+                <w:rFonts w:ascii="Arial" w:cs="Arial" w:eastAsia="Arial" w:hAnsi="Arial"/>
+                <w:b/>
+                <w:bCs/>
+                <w:sz w:val="19"/>
+                <w:szCs w:val="19"/>
+              </w:rPr>
+              <w:t xml:space="preserve">CAM vẽ hết</w:t>
+            </w:r>
+            <w:r>
+              <w:rPr>
+                <w:rFonts w:ascii="Arial" w:cs="Arial" w:eastAsia="Arial" w:hAnsi="Arial"/>
+                <w:b w:val="false"/>
+                <w:bCs w:val="false"/>
+                <w:sz w:val="19"/>
+                <w:szCs w:val="19"/>
+              </w:rPr>
+              <w:t xml:space="preserve">: lớp nào bật là hiện (chỉ dựng khi bật lần đầu, mở file không chậm đi).</w:t>
+            </w:r>
+          </w:p>
+          <w:p>
+            <w:pPr>
+              <w:spacing w:after="20"/>
+            </w:pPr>
+            <w:r>
+              <w:rPr>
+                <w:rFonts w:ascii="Arial" w:cs="Arial" w:eastAsia="Arial" w:hAnsi="Arial"/>
+                <w:b/>
+                <w:bCs/>
+                <w:sz w:val="19"/>
+                <w:szCs w:val="19"/>
+              </w:rPr>
+              <w:t xml:space="preserve">Chọn tay loại lớp</w:t>
+            </w:r>
+            <w:r>
+              <w:rPr>
+                <w:rFonts w:ascii="Arial" w:cs="Arial" w:eastAsia="Arial" w:hAnsi="Arial"/>
+                <w:b w:val="false"/>
+                <w:bCs w:val="false"/>
+                <w:sz w:val="19"/>
+                <w:szCs w:val="19"/>
+              </w:rPr>
+              <w:t xml:space="preserve">: bấm vào lớp → ô "Loại lớp". Cả bộ file đọc lại: kích thước, file khoan, viền chính tính lại. Lớp chọn tay có dấu ✎, nút ↺ Tự nhận để bỏ.</w:t>
+            </w:r>
+          </w:p>
+        </w:tc>
+      </w:tr>
+      <w:tr>
+        <w:trPr>
+          <w:tblHeader w:val="false"/>
+        </w:trPr>
+        <w:tc>
+          <w:tcPr>
+            <w:tcW w:type="dxa" w:w="2120"/>
+            <w:tcBorders>
+              <w:top w:val="single" w:color="BFBFBF" w:sz="4"/>
+              <w:left w:val="single" w:color="BFBFBF" w:sz="4"/>
+              <w:bottom w:val="single" w:color="BFBFBF" w:sz="4"/>
+              <w:right w:val="single" w:color="BFBFBF" w:sz="4"/>
+            </w:tcBorders>
+            <w:tcMar>
+              <w:top w:type="dxa" w:w="60"/>
+              <w:left w:type="dxa" w:w="100"/>
+              <w:bottom w:type="dxa" w:w="60"/>
+              <w:right w:type="dxa" w:w="100"/>
+            </w:tcMar>
+          </w:tcPr>
+          <w:p>
+            <w:pPr>
+              <w:spacing w:after="20"/>
+            </w:pPr>
+            <w:r>
+              <w:rPr>
+                <w:rFonts w:ascii="Arial" w:cs="Arial" w:eastAsia="Arial" w:hAnsi="Arial"/>
+                <w:b w:val="false"/>
+                <w:bCs w:val="false"/>
+                <w:sz w:val="19"/>
+                <w:szCs w:val="19"/>
+              </w:rPr>
+              <w:t xml:space="preserve">Kiểm</w:t>
+            </w:r>
+          </w:p>
+        </w:tc>
+        <w:tc>
+          <w:tcPr>
+            <w:tcW w:type="dxa" w:w="7518"/>
+            <w:tcBorders>
+              <w:top w:val="single" w:color="BFBFBF" w:sz="4"/>
+              <w:left w:val="single" w:color="BFBFBF" w:sz="4"/>
+              <w:bottom w:val="single" w:color="BFBFBF" w:sz="4"/>
+              <w:right w:val="single" w:color="BFBFBF" w:sz="4"/>
+            </w:tcBorders>
+            <w:tcMar>
+              <w:top w:type="dxa" w:w="60"/>
+              <w:left w:type="dxa" w:w="100"/>
+              <w:bottom w:type="dxa" w:w="60"/>
+              <w:right w:type="dxa" w:w="100"/>
+            </w:tcMar>
+          </w:tcPr>
+          <w:p>
+            <w:pPr>
+              <w:spacing w:after="20"/>
+            </w:pPr>
+            <w:r>
+              <w:rPr>
+                <w:rFonts w:ascii="Arial" w:cs="Arial" w:eastAsia="Arial" w:hAnsi="Arial"/>
+                <w:b w:val="false"/>
+                <w:bCs w:val="false"/>
+                <w:sz w:val="19"/>
+                <w:szCs w:val="19"/>
+              </w:rPr>
+              <w:t xml:space="preserve">DA82: đổi FAB thành Outline → viền lấy từ FAB, 121.16 × 85.47 → 122.55 × 87 mm; ↺ về như cũ. Test mới.</w:t>
+            </w:r>
+          </w:p>
+        </w:tc>
+      </w:tr>
+      <w:tr>
+        <w:trPr>
+          <w:tblHeader w:val="false"/>
+        </w:trPr>
+        <w:tc>
+          <w:tcPr>
+            <w:tcW w:type="dxa" w:w="2120"/>
+            <w:tcBorders>
+              <w:top w:val="single" w:color="BFBFBF" w:sz="4"/>
+              <w:left w:val="single" w:color="BFBFBF" w:sz="4"/>
+              <w:bottom w:val="single" w:color="BFBFBF" w:sz="4"/>
+              <w:right w:val="single" w:color="BFBFBF" w:sz="4"/>
+            </w:tcBorders>
+            <w:tcMar>
+              <w:top w:type="dxa" w:w="60"/>
+              <w:left w:type="dxa" w:w="100"/>
+              <w:bottom w:type="dxa" w:w="60"/>
+              <w:right w:type="dxa" w:w="100"/>
+            </w:tcMar>
+          </w:tcPr>
+          <w:p>
+            <w:pPr>
+              <w:spacing w:after="20"/>
+            </w:pPr>
+            <w:r>
+              <w:rPr>
+                <w:rFonts w:ascii="Arial" w:cs="Arial" w:eastAsia="Arial" w:hAnsi="Arial"/>
+                <w:b w:val="false"/>
+                <w:bCs w:val="false"/>
+                <w:sz w:val="19"/>
+                <w:szCs w:val="19"/>
+              </w:rPr>
+              <w:t xml:space="preserve">Lưu ý</w:t>
+            </w:r>
+          </w:p>
+        </w:tc>
+        <w:tc>
+          <w:tcPr>
+            <w:tcW w:type="dxa" w:w="7518"/>
+            <w:tcBorders>
+              <w:top w:val="single" w:color="BFBFBF" w:sz="4"/>
+              <w:left w:val="single" w:color="BFBFBF" w:sz="4"/>
+              <w:bottom w:val="single" w:color="BFBFBF" w:sz="4"/>
+              <w:right w:val="single" w:color="BFBFBF" w:sz="4"/>
+            </w:tcBorders>
+            <w:tcMar>
+              <w:top w:type="dxa" w:w="60"/>
+              <w:left w:type="dxa" w:w="100"/>
+              <w:bottom w:type="dxa" w:w="60"/>
+              <w:right w:type="dxa" w:w="100"/>
+            </w:tcMar>
+          </w:tcPr>
+          <w:p>
+            <w:pPr>
+              <w:spacing w:after="20"/>
+            </w:pPr>
+            <w:r>
+              <w:rPr>
+                <w:rFonts w:ascii="Arial" w:cs="Arial" w:eastAsia="Arial" w:hAnsi="Arial"/>
+                <w:b w:val="false"/>
+                <w:bCs w:val="false"/>
+                <w:sz w:val="19"/>
+                <w:szCs w:val="19"/>
+              </w:rPr>
+              <w:t xml:space="preserve">.DTS là báo cáo chữ (bảng mũi khoan), không có hình. DA82 không có file viền nên kích thước là viền ước lượng từ lớp đồng.</w:t>
+            </w:r>
+          </w:p>
+        </w:tc>
+      </w:tr>
+    </w:tbl>
+    <w:p>
+      <w:pPr>
+        <w:spacing w:after="80"/>
+      </w:pPr>
+    </w:p>
+    <w:p>
+      <w:pPr>
+        <w:pStyle w:val="Heading2"/>
+        <w:spacing w:after="100" w:before="220"/>
+      </w:pPr>
+      <w:r>
+        <w:rPr>
+          <w:rFonts w:ascii="Arial" w:cs="Arial" w:eastAsia="Arial" w:hAnsi="Arial"/>
+          <w:b/>
+          <w:bCs/>
+          <w:color w:val="2E5597"/>
+          <w:sz w:val="25"/>
+          <w:szCs w:val="25"/>
+        </w:rPr>
         <w:t xml:space="preserve">Ghi chú — "mất logo" khi chụp (không phải lỗi app)</w:t>
       </w:r>
     </w:p>
@@ -8451,7 +9722,53 @@
           <w:sz w:val="21"/>
           <w:szCs w:val="21"/>
         </w:rPr>
-        <w:t xml:space="preserve"> 🎯 một lớp, đổi màu lớp ở CAM. Lớp đồng giữa bo 4/6 lớp hiện ở CAM/3D.</w:t>
+        <w:t xml:space="preserve"> 🎯 một lớp, đổi màu lớp ở CAM. Lớp đồng giữa bo 4/6 lớp hiện ở CAM/3D. Ở CAM </w:t>
+      </w:r>
+      <w:r>
+        <w:rPr>
+          <w:rFonts w:ascii="Arial" w:cs="Arial" w:eastAsia="Arial" w:hAnsi="Arial"/>
+          <w:b/>
+          <w:bCs/>
+          <w:sz w:val="21"/>
+          <w:szCs w:val="21"/>
+        </w:rPr>
+        <w:t xml:space="preserve">mọi lớp</w:t>
+      </w:r>
+      <w:r>
+        <w:rPr>
+          <w:rFonts w:ascii="Arial" w:cs="Arial" w:eastAsia="Arial" w:hAnsi="Arial"/>
+          <w:sz w:val="21"/>
+          <w:szCs w:val="21"/>
+        </w:rPr>
+        <w:t xml:space="preserve"> (tài liệu, không rõ loại, paste) bật lên đều vẽ.</w:t>
+      </w:r>
+    </w:p>
+    <w:p>
+      <w:pPr>
+        <w:pStyle w:val="ListParagraph"/>
+        <w:numPr>
+          <w:ilvl w:val="0"/>
+          <w:numId w:val="2"/>
+        </w:numPr>
+        <w:spacing w:after="60" w:line="264"/>
+      </w:pPr>
+      <w:r>
+        <w:rPr>
+          <w:rFonts w:ascii="Arial" w:cs="Arial" w:eastAsia="Arial" w:hAnsi="Arial"/>
+          <w:b/>
+          <w:bCs/>
+          <w:sz w:val="21"/>
+          <w:szCs w:val="21"/>
+        </w:rPr>
+        <w:t xml:space="preserve">Chọn tay loại lớp</w:t>
+      </w:r>
+      <w:r>
+        <w:rPr>
+          <w:rFonts w:ascii="Arial" w:cs="Arial" w:eastAsia="Arial" w:hAnsi="Arial"/>
+          <w:sz w:val="21"/>
+          <w:szCs w:val="21"/>
+        </w:rPr>
+        <w:t xml:space="preserve">: bấm vào lớp → ô "Loại lớp" (đồng / mask / lụa / paste / Outline / Drill / tài liệu). App đọc lại cả bộ theo loại mới; dấu ✎ và nút ↺ Tự nhận.</w:t>
       </w:r>
     </w:p>
     <w:p>
@@ -10781,7 +12098,7 @@
                 <w:sz w:val="19"/>
                 <w:szCs w:val="19"/>
               </w:rPr>
-              <w:t xml:space="preserve">Gerber dạng file khoan (Proteus)</w:t>
+              <w:t xml:space="preserve">Gerber dạng file khoan (Proteus; .DRD OrCAD Layout)</w:t>
             </w:r>
           </w:p>
         </w:tc>
@@ -10845,7 +12162,7 @@
                 <w:sz w:val="19"/>
                 <w:szCs w:val="19"/>
               </w:rPr>
-              <w:t xml:space="preserve">Chỉ dùng khi bộ file KHÔNG có Excellon</w:t>
+              <w:t xml:space="preserve">Chỉ dùng khi bộ file KHÔNG có Excellon; nhận cả header OrCAD %FSLAN2X34Y34*%</w:t>
             </w:r>
           </w:p>
         </w:tc>
@@ -10978,6 +12295,34 @@
           <w:szCs w:val="21"/>
         </w:rPr>
         <w:t xml:space="preserve"> — phương án cuối. Không khớp gì → unknown (vẫn hiện).</w:t>
+      </w:r>
+    </w:p>
+    <w:p>
+      <w:pPr>
+        <w:pStyle w:val="ListParagraph"/>
+        <w:numPr>
+          <w:ilvl w:val="0"/>
+          <w:numId w:val="2"/>
+        </w:numPr>
+        <w:spacing w:after="60" w:line="264"/>
+      </w:pPr>
+      <w:r>
+        <w:rPr>
+          <w:rFonts w:ascii="Arial" w:cs="Arial" w:eastAsia="Arial" w:hAnsi="Arial"/>
+          <w:b/>
+          <w:bCs/>
+          <w:sz w:val="21"/>
+          <w:szCs w:val="21"/>
+        </w:rPr>
+        <w:t xml:space="preserve">Nhận sai thì chọn tay</w:t>
+      </w:r>
+      <w:r>
+        <w:rPr>
+          <w:rFonts w:ascii="Arial" w:cs="Arial" w:eastAsia="Arial" w:hAnsi="Arial"/>
+          <w:sz w:val="21"/>
+          <w:szCs w:val="21"/>
+        </w:rPr>
+        <w:t xml:space="preserve"> ở danh sách lớp (ô "Loại lớp") — cả bộ file đọc lại theo loại mới.</w:t>
       </w:r>
     </w:p>
     <w:tbl>
@@ -13513,7 +14858,7 @@
           <w:sz w:val="21"/>
           <w:szCs w:val="21"/>
         </w:rPr>
-        <w:t xml:space="preserve">Có Excellon thì bản Gerber khoan xuất đôi thành tài liệu (tránh đếm đôi). Mọi file khoan là con của một khung rỗng.</w:t>
+        <w:t xml:space="preserve">Có Excellon thì bản Gerber khoan xuất đôi (và bản vẽ khoan .DRD của OrCAD Layout) thành tài liệu. Chọn tay "Drill" thì luôn là file khoan. Mọi file khoan là con của một khung rỗng.</w:t>
       </w:r>
     </w:p>
     <w:p>
@@ -14485,15 +15830,15 @@
           <w:sz w:val="21"/>
           <w:szCs w:val="21"/>
         </w:rPr>
-        <w:t xml:space="preserve">.DRD bị chọn thay THRUHOLE.tap</w:t>
-      </w:r>
-      <w:r>
-        <w:rPr>
-          <w:rFonts w:ascii="Arial" w:cs="Arial" w:eastAsia="Arial" w:hAnsi="Arial"/>
-          <w:sz w:val="21"/>
-          <w:szCs w:val="21"/>
-        </w:rPr>
-        <w:t xml:space="preserve"> (Dinh Quang Viet, Dinh Ngoc Tram — AUTOMATION-2): .drd gán là dữ liệu khoan (Eagle) nhưng ở các bộ này có vẻ là bản vẽ khoan. Có từ trước.</w:t>
+        <w:t xml:space="preserve">Bộ OrCAD chỉ có .DRD</w:t>
+      </w:r>
+      <w:r>
+        <w:rPr>
+          <w:rFonts w:ascii="Arial" w:cs="Arial" w:eastAsia="Arial" w:hAnsi="Arial"/>
+          <w:sz w:val="21"/>
+          <w:szCs w:val="21"/>
+        </w:rPr>
+        <w:t xml:space="preserve"> (không có thruhole.tap): vẫn vẽ bản vẽ khoan làm lỗ — xem có file khoan thật không, hoặc chọn tay. (.DRD cạnh .tap đã sửa ở lỗi 14.)</w:t>
       </w:r>
     </w:p>
     <w:p>
@@ -14732,7 +16077,7 @@
           <w:sz w:val="21"/>
           <w:szCs w:val="21"/>
         </w:rPr>
-        <w:t xml:space="preserve"> (tsc -b chặt hơn tsc --noEmit — lỗi build Vercel ở f12b339 là do chỉ chạy lệnh nhẹ) và npx vitest run (136 test).</w:t>
+        <w:t xml:space="preserve"> (tsc -b chặt hơn tsc --noEmit — lỗi build Vercel ở f12b339 là do chỉ chạy lệnh nhẹ) và npx vitest run (139 test).</w:t>
       </w:r>
     </w:p>
     <w:p>
@@ -14768,7 +16113,7 @@
           <w:sz w:val="21"/>
           <w:szCs w:val="21"/>
         </w:rPr>
-        <w:t xml:space="preserve">Mở lại bộ mẫu: FC_F405RGT6_Wing (KiCad 6 lớp), BOAD NUT NHAN (EasyEDA), AGVH7 (Altium inch, slot), Ceiling / Dynamic Master (panel inch), Slaver_Ceiling bản lẻ (GKO + GM1), ESP32_DR (Altium metric 4:3, RectHoles), CHAT_BOT_1 (panel 4 bo), CHAT_BOT_4 (rãnh một nét), PHAONUOC (đường vẽ 0.8 mm không thành rãnh), 3W NHUA XANH (CAM350, RAR).</w:t>
+        <w:t xml:space="preserve">Mở lại bộ mẫu: FC_F405RGT6_Wing (KiCad 6 lớp), BOAD NUT NHAN (EasyEDA), AGVH7 (Altium inch, slot), Ceiling / Dynamic Master (panel inch), Slaver_Ceiling bản lẻ (GKO + GM1), ESP32_DR (Altium metric 4:3, RectHoles), CHAT_BOT_1 (panel 4 bo), DA82 (OrCAD Layout, thruhole.tap + .DRD), CHAT_BOT_4 (rãnh một nét), PHAONUOC (đường vẽ 0.8 mm không thành rãnh), 3W NHUA XANH (CAM350, RAR).</w:t>
       </w:r>
     </w:p>
     <w:sectPr>

</xml_diff>

<commit_message>
docs: Add the Pulsonix undeclared drill format fix (FRIWO) to the report
New bug 16 in the 21-22/09 report, the Word build and the two living docs (file formats, outline/drill/slot): cause, the board-as-ruler fix, and the corpus result (1-in-10 sample, 10 sets changed, all from 0-14 holes on the board to 100%, none worse). Also lists FRIWO 55807 under 'panel split only by V-cut still counts as 1 board' and bumps the test count to 142.

Co-Authored-By: Claude Opus 5 <noreply@anthropic.com>
</commit_message>
<xml_diff>
--- a/docs/bao-cao/Bao-cao-DQPCB-2026-09-22.docx
+++ b/docs/bao-cao/Bao-cao-DQPCB-2026-09-22.docx
@@ -2740,6 +2740,139 @@
           </w:p>
         </w:tc>
       </w:tr>
+      <w:tr>
+        <w:trPr>
+          <w:tblHeader w:val="false"/>
+        </w:trPr>
+        <w:tc>
+          <w:tcPr>
+            <w:tcW w:type="dxa" w:w="481"/>
+            <w:tcBorders>
+              <w:top w:val="single" w:color="BFBFBF" w:sz="4"/>
+              <w:left w:val="single" w:color="BFBFBF" w:sz="4"/>
+              <w:bottom w:val="single" w:color="BFBFBF" w:sz="4"/>
+              <w:right w:val="single" w:color="BFBFBF" w:sz="4"/>
+            </w:tcBorders>
+            <w:tcMar>
+              <w:top w:type="dxa" w:w="60"/>
+              <w:left w:type="dxa" w:w="100"/>
+              <w:bottom w:type="dxa" w:w="60"/>
+              <w:right w:type="dxa" w:w="100"/>
+            </w:tcMar>
+          </w:tcPr>
+          <w:p>
+            <w:pPr>
+              <w:spacing w:after="20"/>
+            </w:pPr>
+            <w:r>
+              <w:rPr>
+                <w:rFonts w:ascii="Arial" w:cs="Arial" w:eastAsia="Arial" w:hAnsi="Arial"/>
+                <w:b w:val="false"/>
+                <w:bCs w:val="false"/>
+                <w:sz w:val="19"/>
+                <w:szCs w:val="19"/>
+              </w:rPr>
+              <w:t xml:space="preserve">16</w:t>
+            </w:r>
+          </w:p>
+        </w:tc>
+        <w:tc>
+          <w:tcPr>
+            <w:tcW w:type="dxa" w:w="4047"/>
+            <w:tcBorders>
+              <w:top w:val="single" w:color="BFBFBF" w:sz="4"/>
+              <w:left w:val="single" w:color="BFBFBF" w:sz="4"/>
+              <w:bottom w:val="single" w:color="BFBFBF" w:sz="4"/>
+              <w:right w:val="single" w:color="BFBFBF" w:sz="4"/>
+            </w:tcBorders>
+            <w:tcMar>
+              <w:top w:type="dxa" w:w="60"/>
+              <w:left w:type="dxa" w:w="100"/>
+              <w:bottom w:type="dxa" w:w="60"/>
+              <w:right w:type="dxa" w:w="100"/>
+            </w:tcMar>
+          </w:tcPr>
+          <w:p>
+            <w:pPr>
+              <w:spacing w:after="20"/>
+            </w:pPr>
+            <w:r>
+              <w:rPr>
+                <w:rFonts w:ascii="Arial" w:cs="Arial" w:eastAsia="Arial" w:hAnsi="Arial"/>
+                <w:b w:val="false"/>
+                <w:bCs w:val="false"/>
+                <w:sz w:val="19"/>
+                <w:szCs w:val="19"/>
+              </w:rPr>
+              <w:t xml:space="preserve">File khoan Pulsonix INCH không khai định dạng số, lỗ co 10 lần nằm ngoài bo</w:t>
+            </w:r>
+          </w:p>
+        </w:tc>
+        <w:tc>
+          <w:tcPr>
+            <w:tcW w:type="dxa" w:w="2891"/>
+            <w:tcBorders>
+              <w:top w:val="single" w:color="BFBFBF" w:sz="4"/>
+              <w:left w:val="single" w:color="BFBFBF" w:sz="4"/>
+              <w:bottom w:val="single" w:color="BFBFBF" w:sz="4"/>
+              <w:right w:val="single" w:color="BFBFBF" w:sz="4"/>
+            </w:tcBorders>
+            <w:tcMar>
+              <w:top w:type="dxa" w:w="60"/>
+              <w:left w:type="dxa" w:w="100"/>
+              <w:bottom w:type="dxa" w:w="60"/>
+              <w:right w:type="dxa" w:w="100"/>
+            </w:tcMar>
+          </w:tcPr>
+          <w:p>
+            <w:pPr>
+              <w:spacing w:after="20"/>
+            </w:pPr>
+            <w:r>
+              <w:rPr>
+                <w:rFonts w:ascii="Arial" w:cs="Arial" w:eastAsia="Arial" w:hAnsi="Arial"/>
+                <w:b w:val="false"/>
+                <w:bCs w:val="false"/>
+                <w:sz w:val="19"/>
+                <w:szCs w:val="19"/>
+              </w:rPr>
+              <w:t xml:space="preserve">FRIWO — 55807.931-90FE</w:t>
+            </w:r>
+          </w:p>
+        </w:tc>
+        <w:tc>
+          <w:tcPr>
+            <w:tcW w:type="dxa" w:w="2219"/>
+            <w:tcBorders>
+              <w:top w:val="single" w:color="BFBFBF" w:sz="4"/>
+              <w:left w:val="single" w:color="BFBFBF" w:sz="4"/>
+              <w:bottom w:val="single" w:color="BFBFBF" w:sz="4"/>
+              <w:right w:val="single" w:color="BFBFBF" w:sz="4"/>
+            </w:tcBorders>
+            <w:tcMar>
+              <w:top w:type="dxa" w:w="60"/>
+              <w:left w:type="dxa" w:w="100"/>
+              <w:bottom w:type="dxa" w:w="60"/>
+              <w:right w:type="dxa" w:w="100"/>
+            </w:tcMar>
+          </w:tcPr>
+          <w:p>
+            <w:pPr>
+              <w:spacing w:after="20"/>
+            </w:pPr>
+            <w:r>
+              <w:rPr>
+                <w:rFonts w:ascii="Arial" w:cs="Arial" w:eastAsia="Arial" w:hAnsi="Arial"/>
+                <w:b w:val="false"/>
+                <w:bCs w:val="false"/>
+                <w:sz w:val="19"/>
+                <w:szCs w:val="19"/>
+              </w:rPr>
+              <w:t xml:space="preserve">Đã sửa · c680077</w:t>
+            </w:r>
+          </w:p>
+        </w:tc>
+      </w:tr>
     </w:tbl>
     <w:p>
       <w:pPr>
@@ -9277,6 +9410,590 @@
                 <w:szCs w:val="19"/>
               </w:rPr>
               <w:t xml:space="preserve">.DTS là báo cáo chữ (bảng mũi khoan), không có hình. DA82 không có file viền nên kích thước là viền ước lượng từ lớp đồng.</w:t>
+            </w:r>
+          </w:p>
+        </w:tc>
+      </w:tr>
+    </w:tbl>
+    <w:p>
+      <w:pPr>
+        <w:spacing w:after="80"/>
+      </w:pPr>
+    </w:p>
+    <w:p>
+      <w:pPr>
+        <w:pStyle w:val="Heading2"/>
+        <w:spacing w:after="100" w:before="220"/>
+      </w:pPr>
+      <w:r>
+        <w:rPr>
+          <w:rFonts w:ascii="Arial" w:cs="Arial" w:eastAsia="Arial" w:hAnsi="Arial"/>
+          <w:b/>
+          <w:bCs/>
+          <w:color w:val="2E5597"/>
+          <w:sz w:val="25"/>
+          <w:szCs w:val="25"/>
+        </w:rPr>
+        <w:t xml:space="preserve">Lỗi 16 — File khoan Pulsonix không khai định dạng số, lỗ co 10 lần</w:t>
+      </w:r>
+    </w:p>
+    <w:tbl>
+      <w:tblPr>
+        <w:tblW w:type="dxa" w:w="9638"/>
+        <w:tblBorders>
+          <w:top w:val="single" w:color="auto" w:sz="4"/>
+          <w:left w:val="single" w:color="auto" w:sz="4"/>
+          <w:bottom w:val="single" w:color="auto" w:sz="4"/>
+          <w:right w:val="single" w:color="auto" w:sz="4"/>
+          <w:insideH w:val="single" w:color="auto" w:sz="4"/>
+          <w:insideV w:val="single" w:color="auto" w:sz="4"/>
+        </w:tblBorders>
+      </w:tblPr>
+      <w:tblGrid>
+        <w:gridCol w:w="2120"/>
+        <w:gridCol w:w="7518"/>
+      </w:tblGrid>
+      <w:tr>
+        <w:trPr>
+          <w:tblHeader/>
+        </w:trPr>
+        <w:tc>
+          <w:tcPr>
+            <w:tcW w:type="dxa" w:w="2120"/>
+            <w:tcBorders>
+              <w:top w:val="single" w:color="BFBFBF" w:sz="4"/>
+              <w:left w:val="single" w:color="BFBFBF" w:sz="4"/>
+              <w:bottom w:val="single" w:color="BFBFBF" w:sz="4"/>
+              <w:right w:val="single" w:color="BFBFBF" w:sz="4"/>
+            </w:tcBorders>
+            <w:shd w:fill="DCE6F2" w:color="auto" w:val="clear"/>
+            <w:tcMar>
+              <w:top w:type="dxa" w:w="60"/>
+              <w:left w:type="dxa" w:w="100"/>
+              <w:bottom w:type="dxa" w:w="60"/>
+              <w:right w:type="dxa" w:w="100"/>
+            </w:tcMar>
+          </w:tcPr>
+          <w:p>
+            <w:pPr>
+              <w:spacing w:after="20"/>
+            </w:pPr>
+            <w:r>
+              <w:rPr>
+                <w:rFonts w:ascii="Arial" w:cs="Arial" w:eastAsia="Arial" w:hAnsi="Arial"/>
+                <w:b/>
+                <w:bCs/>
+                <w:sz w:val="19"/>
+                <w:szCs w:val="19"/>
+              </w:rPr>
+              <w:t xml:space="preserve">Mục</w:t>
+            </w:r>
+          </w:p>
+        </w:tc>
+        <w:tc>
+          <w:tcPr>
+            <w:tcW w:type="dxa" w:w="7518"/>
+            <w:tcBorders>
+              <w:top w:val="single" w:color="BFBFBF" w:sz="4"/>
+              <w:left w:val="single" w:color="BFBFBF" w:sz="4"/>
+              <w:bottom w:val="single" w:color="BFBFBF" w:sz="4"/>
+              <w:right w:val="single" w:color="BFBFBF" w:sz="4"/>
+            </w:tcBorders>
+            <w:shd w:fill="DCE6F2" w:color="auto" w:val="clear"/>
+            <w:tcMar>
+              <w:top w:type="dxa" w:w="60"/>
+              <w:left w:type="dxa" w:w="100"/>
+              <w:bottom w:type="dxa" w:w="60"/>
+              <w:right w:type="dxa" w:w="100"/>
+            </w:tcMar>
+          </w:tcPr>
+          <w:p>
+            <w:pPr>
+              <w:spacing w:after="20"/>
+            </w:pPr>
+            <w:r>
+              <w:rPr>
+                <w:rFonts w:ascii="Arial" w:cs="Arial" w:eastAsia="Arial" w:hAnsi="Arial"/>
+                <w:b/>
+                <w:bCs/>
+                <w:sz w:val="19"/>
+                <w:szCs w:val="19"/>
+              </w:rPr>
+              <w:t xml:space="preserve">Nội dung</w:t>
+            </w:r>
+          </w:p>
+        </w:tc>
+      </w:tr>
+      <w:tr>
+        <w:trPr>
+          <w:tblHeader w:val="false"/>
+        </w:trPr>
+        <w:tc>
+          <w:tcPr>
+            <w:tcW w:type="dxa" w:w="2120"/>
+            <w:tcBorders>
+              <w:top w:val="single" w:color="BFBFBF" w:sz="4"/>
+              <w:left w:val="single" w:color="BFBFBF" w:sz="4"/>
+              <w:bottom w:val="single" w:color="BFBFBF" w:sz="4"/>
+              <w:right w:val="single" w:color="BFBFBF" w:sz="4"/>
+            </w:tcBorders>
+            <w:tcMar>
+              <w:top w:type="dxa" w:w="60"/>
+              <w:left w:type="dxa" w:w="100"/>
+              <w:bottom w:type="dxa" w:w="60"/>
+              <w:right w:type="dxa" w:w="100"/>
+            </w:tcMar>
+          </w:tcPr>
+          <w:p>
+            <w:pPr>
+              <w:spacing w:after="20"/>
+            </w:pPr>
+            <w:r>
+              <w:rPr>
+                <w:rFonts w:ascii="Arial" w:cs="Arial" w:eastAsia="Arial" w:hAnsi="Arial"/>
+                <w:b w:val="false"/>
+                <w:bCs w:val="false"/>
+                <w:sz w:val="19"/>
+                <w:szCs w:val="19"/>
+              </w:rPr>
+              <w:t xml:space="preserve">Bộ file</w:t>
+            </w:r>
+          </w:p>
+        </w:tc>
+        <w:tc>
+          <w:tcPr>
+            <w:tcW w:type="dxa" w:w="7518"/>
+            <w:tcBorders>
+              <w:top w:val="single" w:color="BFBFBF" w:sz="4"/>
+              <w:left w:val="single" w:color="BFBFBF" w:sz="4"/>
+              <w:bottom w:val="single" w:color="BFBFBF" w:sz="4"/>
+              <w:right w:val="single" w:color="BFBFBF" w:sz="4"/>
+            </w:tcBorders>
+            <w:tcMar>
+              <w:top w:type="dxa" w:w="60"/>
+              <w:left w:type="dxa" w:w="100"/>
+              <w:bottom w:type="dxa" w:w="60"/>
+              <w:right w:type="dxa" w:w="100"/>
+            </w:tcMar>
+          </w:tcPr>
+          <w:p>
+            <w:pPr>
+              <w:spacing w:after="20"/>
+            </w:pPr>
+            <w:r>
+              <w:rPr>
+                <w:rFonts w:ascii="Arial" w:cs="Arial" w:eastAsia="Arial" w:hAnsi="Arial"/>
+                <w:b w:val="false"/>
+                <w:bCs w:val="false"/>
+                <w:sz w:val="19"/>
+                <w:szCs w:val="19"/>
+              </w:rPr>
+              <w:t xml:space="preserve">D:\JobDatMach\FRIWO\2026\22-09\FRIWO 55807.931-90FE.zip</w:t>
+            </w:r>
+          </w:p>
+        </w:tc>
+      </w:tr>
+      <w:tr>
+        <w:trPr>
+          <w:tblHeader w:val="false"/>
+        </w:trPr>
+        <w:tc>
+          <w:tcPr>
+            <w:tcW w:type="dxa" w:w="2120"/>
+            <w:tcBorders>
+              <w:top w:val="single" w:color="BFBFBF" w:sz="4"/>
+              <w:left w:val="single" w:color="BFBFBF" w:sz="4"/>
+              <w:bottom w:val="single" w:color="BFBFBF" w:sz="4"/>
+              <w:right w:val="single" w:color="BFBFBF" w:sz="4"/>
+            </w:tcBorders>
+            <w:tcMar>
+              <w:top w:type="dxa" w:w="60"/>
+              <w:left w:type="dxa" w:w="100"/>
+              <w:bottom w:type="dxa" w:w="60"/>
+              <w:right w:type="dxa" w:w="100"/>
+            </w:tcMar>
+          </w:tcPr>
+          <w:p>
+            <w:pPr>
+              <w:spacing w:after="20"/>
+            </w:pPr>
+            <w:r>
+              <w:rPr>
+                <w:rFonts w:ascii="Arial" w:cs="Arial" w:eastAsia="Arial" w:hAnsi="Arial"/>
+                <w:b w:val="false"/>
+                <w:bCs w:val="false"/>
+                <w:sz w:val="19"/>
+                <w:szCs w:val="19"/>
+              </w:rPr>
+              <w:t xml:space="preserve">Hiện tượng</w:t>
+            </w:r>
+          </w:p>
+        </w:tc>
+        <w:tc>
+          <w:tcPr>
+            <w:tcW w:type="dxa" w:w="7518"/>
+            <w:tcBorders>
+              <w:top w:val="single" w:color="BFBFBF" w:sz="4"/>
+              <w:left w:val="single" w:color="BFBFBF" w:sz="4"/>
+              <w:bottom w:val="single" w:color="BFBFBF" w:sz="4"/>
+              <w:right w:val="single" w:color="BFBFBF" w:sz="4"/>
+            </w:tcBorders>
+            <w:tcMar>
+              <w:top w:type="dxa" w:w="60"/>
+              <w:left w:type="dxa" w:w="100"/>
+              <w:bottom w:type="dxa" w:w="60"/>
+              <w:right w:type="dxa" w:w="100"/>
+            </w:tcMar>
+          </w:tcPr>
+          <w:p>
+            <w:pPr>
+              <w:spacing w:after="20"/>
+            </w:pPr>
+            <w:r>
+              <w:rPr>
+                <w:rFonts w:ascii="Arial" w:cs="Arial" w:eastAsia="Arial" w:hAnsi="Arial"/>
+                <w:b w:val="false"/>
+                <w:bCs w:val="false"/>
+                <w:sz w:val="19"/>
+                <w:szCs w:val="19"/>
+              </w:rPr>
+              <w:t xml:space="preserve">Bo (panel 4 × 2) nằm lọt thỏm góc trên phải khung nhìn; một cụm nhỏ lạc tận giữa dưới — đó là toàn bộ 2641 lỗ khoan.</w:t>
+            </w:r>
+          </w:p>
+        </w:tc>
+      </w:tr>
+      <w:tr>
+        <w:trPr>
+          <w:tblHeader w:val="false"/>
+        </w:trPr>
+        <w:tc>
+          <w:tcPr>
+            <w:tcW w:type="dxa" w:w="2120"/>
+            <w:tcBorders>
+              <w:top w:val="single" w:color="BFBFBF" w:sz="4"/>
+              <w:left w:val="single" w:color="BFBFBF" w:sz="4"/>
+              <w:bottom w:val="single" w:color="BFBFBF" w:sz="4"/>
+              <w:right w:val="single" w:color="BFBFBF" w:sz="4"/>
+            </w:tcBorders>
+            <w:tcMar>
+              <w:top w:type="dxa" w:w="60"/>
+              <w:left w:type="dxa" w:w="100"/>
+              <w:bottom w:type="dxa" w:w="60"/>
+              <w:right w:type="dxa" w:w="100"/>
+            </w:tcMar>
+          </w:tcPr>
+          <w:p>
+            <w:pPr>
+              <w:spacing w:after="20"/>
+            </w:pPr>
+            <w:r>
+              <w:rPr>
+                <w:rFonts w:ascii="Arial" w:cs="Arial" w:eastAsia="Arial" w:hAnsi="Arial"/>
+                <w:b w:val="false"/>
+                <w:bCs w:val="false"/>
+                <w:sz w:val="19"/>
+                <w:szCs w:val="19"/>
+              </w:rPr>
+              <w:t xml:space="preserve">Nguyên nhân</w:t>
+            </w:r>
+          </w:p>
+        </w:tc>
+        <w:tc>
+          <w:tcPr>
+            <w:tcW w:type="dxa" w:w="7518"/>
+            <w:tcBorders>
+              <w:top w:val="single" w:color="BFBFBF" w:sz="4"/>
+              <w:left w:val="single" w:color="BFBFBF" w:sz="4"/>
+              <w:bottom w:val="single" w:color="BFBFBF" w:sz="4"/>
+              <w:right w:val="single" w:color="BFBFBF" w:sz="4"/>
+            </w:tcBorders>
+            <w:tcMar>
+              <w:top w:type="dxa" w:w="60"/>
+              <w:left w:type="dxa" w:w="100"/>
+              <w:bottom w:type="dxa" w:w="60"/>
+              <w:right w:type="dxa" w:w="100"/>
+            </w:tcMar>
+          </w:tcPr>
+          <w:p>
+            <w:pPr>
+              <w:spacing w:after="20"/>
+            </w:pPr>
+            <w:r>
+              <w:rPr>
+                <w:rFonts w:ascii="Arial" w:cs="Arial" w:eastAsia="Arial" w:hAnsi="Arial"/>
+                <w:b w:val="false"/>
+                <w:bCs w:val="false"/>
+                <w:sz w:val="19"/>
+                <w:szCs w:val="19"/>
+              </w:rPr>
+              <w:t xml:space="preserve">Pulsonix xuất M48 / FMAT,1 / INCH trơn — không LZ/TZ, không ;FILE_FORMAT, toạ độ không dấu chấm, 8 chữ số giữ số 0 đầu (X01011283 = 10.11283 in, định dạng 3.5). Không có gì trong file nói vậy, parser áp mặc định inch 2.4 → 1.011283 in: cả cụm lỗ </w:t>
+            </w:r>
+            <w:r>
+              <w:rPr>
+                <w:rFonts w:ascii="Arial" w:cs="Arial" w:eastAsia="Arial" w:hAnsi="Arial"/>
+                <w:b/>
+                <w:bCs/>
+                <w:sz w:val="19"/>
+                <w:szCs w:val="19"/>
+              </w:rPr>
+              <w:t xml:space="preserve">nhỏ đi 10 lần</w:t>
+            </w:r>
+            <w:r>
+              <w:rPr>
+                <w:rFonts w:ascii="Arial" w:cs="Arial" w:eastAsia="Arial" w:hAnsi="Arial"/>
+                <w:b w:val="false"/>
+                <w:bCs w:val="false"/>
+                <w:sz w:val="19"/>
+                <w:szCs w:val="19"/>
+              </w:rPr>
+              <w:t xml:space="preserve">, rơi ra ngoài bo. Cùng họ lỗi 8 nhưng ở đây không có dòng khai format để đọc.</w:t>
+            </w:r>
+          </w:p>
+        </w:tc>
+      </w:tr>
+      <w:tr>
+        <w:trPr>
+          <w:tblHeader w:val="false"/>
+        </w:trPr>
+        <w:tc>
+          <w:tcPr>
+            <w:tcW w:type="dxa" w:w="2120"/>
+            <w:tcBorders>
+              <w:top w:val="single" w:color="BFBFBF" w:sz="4"/>
+              <w:left w:val="single" w:color="BFBFBF" w:sz="4"/>
+              <w:bottom w:val="single" w:color="BFBFBF" w:sz="4"/>
+              <w:right w:val="single" w:color="BFBFBF" w:sz="4"/>
+            </w:tcBorders>
+            <w:tcMar>
+              <w:top w:type="dxa" w:w="60"/>
+              <w:left w:type="dxa" w:w="100"/>
+              <w:bottom w:type="dxa" w:w="60"/>
+              <w:right w:type="dxa" w:w="100"/>
+            </w:tcMar>
+          </w:tcPr>
+          <w:p>
+            <w:pPr>
+              <w:spacing w:after="20"/>
+            </w:pPr>
+            <w:r>
+              <w:rPr>
+                <w:rFonts w:ascii="Arial" w:cs="Arial" w:eastAsia="Arial" w:hAnsi="Arial"/>
+                <w:b w:val="false"/>
+                <w:bCs w:val="false"/>
+                <w:sz w:val="19"/>
+                <w:szCs w:val="19"/>
+              </w:rPr>
+              <w:t xml:space="preserve">Cách giải quyết</w:t>
+            </w:r>
+          </w:p>
+        </w:tc>
+        <w:tc>
+          <w:tcPr>
+            <w:tcW w:type="dxa" w:w="7518"/>
+            <w:tcBorders>
+              <w:top w:val="single" w:color="BFBFBF" w:sz="4"/>
+              <w:left w:val="single" w:color="BFBFBF" w:sz="4"/>
+              <w:bottom w:val="single" w:color="BFBFBF" w:sz="4"/>
+              <w:right w:val="single" w:color="BFBFBF" w:sz="4"/>
+            </w:tcBorders>
+            <w:tcMar>
+              <w:top w:type="dxa" w:w="60"/>
+              <w:left w:type="dxa" w:w="100"/>
+              <w:bottom w:type="dxa" w:w="60"/>
+              <w:right w:type="dxa" w:w="100"/>
+            </w:tcMar>
+          </w:tcPr>
+          <w:p>
+            <w:pPr>
+              <w:spacing w:after="20"/>
+            </w:pPr>
+            <w:r>
+              <w:rPr>
+                <w:rFonts w:ascii="Arial" w:cs="Arial" w:eastAsia="Arial" w:hAnsi="Arial"/>
+                <w:b w:val="false"/>
+                <w:bCs w:val="false"/>
+                <w:sz w:val="19"/>
+                <w:szCs w:val="19"/>
+              </w:rPr>
+              <w:t xml:space="preserve">reader.ts → fixDrillScale: </w:t>
+            </w:r>
+            <w:r>
+              <w:rPr>
+                <w:rFonts w:ascii="Arial" w:cs="Arial" w:eastAsia="Arial" w:hAnsi="Arial"/>
+                <w:b/>
+                <w:bCs/>
+                <w:sz w:val="19"/>
+                <w:szCs w:val="19"/>
+              </w:rPr>
+              <w:t xml:space="preserve">lấy chính bo làm thước</w:t>
+            </w:r>
+            <w:r>
+              <w:rPr>
+                <w:rFonts w:ascii="Arial" w:cs="Arial" w:eastAsia="Arial" w:hAnsi="Arial"/>
+                <w:b w:val="false"/>
+                <w:bCs w:val="false"/>
+                <w:sz w:val="19"/>
+                <w:szCs w:val="19"/>
+              </w:rPr>
+              <w:t xml:space="preserve"> — lỗ khoan phải nằm trong viền (không có viền thì trong vùng đồng). Cụm lỗ nằm gần như hẳn ngoài bo (dưới nửa diện tích chồng lên bo) thì thử lại các cách đặt dấu thập phân hay gặp, chọn cách cho cụm lỗ nằm trong bo và phủ rộng nhất. Lỗ định vị trên rail hơi lấn viền không bị đọc lại.</w:t>
+            </w:r>
+          </w:p>
+        </w:tc>
+      </w:tr>
+      <w:tr>
+        <w:trPr>
+          <w:tblHeader w:val="false"/>
+        </w:trPr>
+        <w:tc>
+          <w:tcPr>
+            <w:tcW w:type="dxa" w:w="2120"/>
+            <w:tcBorders>
+              <w:top w:val="single" w:color="BFBFBF" w:sz="4"/>
+              <w:left w:val="single" w:color="BFBFBF" w:sz="4"/>
+              <w:bottom w:val="single" w:color="BFBFBF" w:sz="4"/>
+              <w:right w:val="single" w:color="BFBFBF" w:sz="4"/>
+            </w:tcBorders>
+            <w:tcMar>
+              <w:top w:type="dxa" w:w="60"/>
+              <w:left w:type="dxa" w:w="100"/>
+              <w:bottom w:type="dxa" w:w="60"/>
+              <w:right w:type="dxa" w:w="100"/>
+            </w:tcMar>
+          </w:tcPr>
+          <w:p>
+            <w:pPr>
+              <w:spacing w:after="20"/>
+            </w:pPr>
+            <w:r>
+              <w:rPr>
+                <w:rFonts w:ascii="Arial" w:cs="Arial" w:eastAsia="Arial" w:hAnsi="Arial"/>
+                <w:b w:val="false"/>
+                <w:bCs w:val="false"/>
+                <w:sz w:val="19"/>
+                <w:szCs w:val="19"/>
+              </w:rPr>
+              <w:t xml:space="preserve">Kiểm</w:t>
+            </w:r>
+          </w:p>
+        </w:tc>
+        <w:tc>
+          <w:tcPr>
+            <w:tcW w:type="dxa" w:w="7518"/>
+            <w:tcBorders>
+              <w:top w:val="single" w:color="BFBFBF" w:sz="4"/>
+              <w:left w:val="single" w:color="BFBFBF" w:sz="4"/>
+              <w:bottom w:val="single" w:color="BFBFBF" w:sz="4"/>
+              <w:right w:val="single" w:color="BFBFBF" w:sz="4"/>
+            </w:tcBorders>
+            <w:tcMar>
+              <w:top w:type="dxa" w:w="60"/>
+              <w:left w:type="dxa" w:w="100"/>
+              <w:bottom w:type="dxa" w:w="60"/>
+              <w:right w:type="dxa" w:w="100"/>
+            </w:tcMar>
+          </w:tcPr>
+          <w:p>
+            <w:pPr>
+              <w:spacing w:after="20"/>
+            </w:pPr>
+            <w:r>
+              <w:rPr>
+                <w:rFonts w:ascii="Arial" w:cs="Arial" w:eastAsia="Arial" w:hAnsi="Arial"/>
+                <w:b w:val="false"/>
+                <w:bCs w:val="false"/>
+                <w:sz w:val="19"/>
+                <w:szCs w:val="19"/>
+              </w:rPr>
+              <w:t xml:space="preserve">FRIWO: 2641/2641 lỗ nằm trong viền, kích thước giữ 137.4 × 147 mm. Hồi quy corpus: mẫu 1/10 kho (1.850 bộ): 541 bộ có file khoan không dấu thập phân, </w:t>
+            </w:r>
+            <w:r>
+              <w:rPr>
+                <w:rFonts w:ascii="Arial" w:cs="Arial" w:eastAsia="Arial" w:hAnsi="Arial"/>
+                <w:b/>
+                <w:bCs/>
+                <w:sz w:val="19"/>
+                <w:szCs w:val="19"/>
+              </w:rPr>
+              <w:t xml:space="preserve">10 bộ đổi — cả 10 từ 0–14 lỗ trên bo lên 100%</w:t>
+            </w:r>
+            <w:r>
+              <w:rPr>
+                <w:rFonts w:ascii="Arial" w:cs="Arial" w:eastAsia="Arial" w:hAnsi="Arial"/>
+                <w:b w:val="false"/>
+                <w:bCs w:val="false"/>
+                <w:sz w:val="19"/>
+                <w:szCs w:val="19"/>
+              </w:rPr>
+              <w:t xml:space="preserve">, kích thước không đổi, không bộ nào tệ đi (vd BoardC25v2 0→503/503, PS700W_S07 0→245/245, VGS805A 14→130/130). Ước cả kho ~100 bộ từng bị. 2 test mới.</w:t>
+            </w:r>
+          </w:p>
+        </w:tc>
+      </w:tr>
+      <w:tr>
+        <w:trPr>
+          <w:tblHeader w:val="false"/>
+        </w:trPr>
+        <w:tc>
+          <w:tcPr>
+            <w:tcW w:type="dxa" w:w="2120"/>
+            <w:tcBorders>
+              <w:top w:val="single" w:color="BFBFBF" w:sz="4"/>
+              <w:left w:val="single" w:color="BFBFBF" w:sz="4"/>
+              <w:bottom w:val="single" w:color="BFBFBF" w:sz="4"/>
+              <w:right w:val="single" w:color="BFBFBF" w:sz="4"/>
+            </w:tcBorders>
+            <w:tcMar>
+              <w:top w:type="dxa" w:w="60"/>
+              <w:left w:type="dxa" w:w="100"/>
+              <w:bottom w:type="dxa" w:w="60"/>
+              <w:right w:type="dxa" w:w="100"/>
+            </w:tcMar>
+          </w:tcPr>
+          <w:p>
+            <w:pPr>
+              <w:spacing w:after="20"/>
+            </w:pPr>
+            <w:r>
+              <w:rPr>
+                <w:rFonts w:ascii="Arial" w:cs="Arial" w:eastAsia="Arial" w:hAnsi="Arial"/>
+                <w:b w:val="false"/>
+                <w:bCs w:val="false"/>
+                <w:sz w:val="19"/>
+                <w:szCs w:val="19"/>
+              </w:rPr>
+              <w:t xml:space="preserve">Lưu ý</w:t>
+            </w:r>
+          </w:p>
+        </w:tc>
+        <w:tc>
+          <w:tcPr>
+            <w:tcW w:type="dxa" w:w="7518"/>
+            <w:tcBorders>
+              <w:top w:val="single" w:color="BFBFBF" w:sz="4"/>
+              <w:left w:val="single" w:color="BFBFBF" w:sz="4"/>
+              <w:bottom w:val="single" w:color="BFBFBF" w:sz="4"/>
+              <w:right w:val="single" w:color="BFBFBF" w:sz="4"/>
+            </w:tcBorders>
+            <w:tcMar>
+              <w:top w:type="dxa" w:w="60"/>
+              <w:left w:type="dxa" w:w="100"/>
+              <w:bottom w:type="dxa" w:w="60"/>
+              <w:right w:type="dxa" w:w="100"/>
+            </w:tcMar>
+          </w:tcPr>
+          <w:p>
+            <w:pPr>
+              <w:spacing w:after="20"/>
+            </w:pPr>
+            <w:r>
+              <w:rPr>
+                <w:rFonts w:ascii="Arial" w:cs="Arial" w:eastAsia="Arial" w:hAnsi="Arial"/>
+                <w:b w:val="false"/>
+                <w:bCs w:val="false"/>
+                <w:sz w:val="19"/>
+                <w:szCs w:val="19"/>
+              </w:rPr>
+              <w:t xml:space="preserve">Panel 4 × 2 chỉ ngăn bằng V-cut, không có viền bo riêng → app vẫn đếm 1 bo, chưa nhắc "file ghép sẵn" (vấn đề còn tồn).</w:t>
             </w:r>
           </w:p>
         </w:tc>
@@ -14912,6 +15629,60 @@
           <w:sz w:val="21"/>
           <w:szCs w:val="21"/>
         </w:rPr>
+        <w:t xml:space="preserve">File khoan </w:t>
+      </w:r>
+      <w:r>
+        <w:rPr>
+          <w:rFonts w:ascii="Arial" w:cs="Arial" w:eastAsia="Arial" w:hAnsi="Arial"/>
+          <w:b/>
+          <w:bCs/>
+          <w:sz w:val="21"/>
+          <w:szCs w:val="21"/>
+        </w:rPr>
+        <w:t xml:space="preserve">không khai định dạng số</w:t>
+      </w:r>
+      <w:r>
+        <w:rPr>
+          <w:rFonts w:ascii="Arial" w:cs="Arial" w:eastAsia="Arial" w:hAnsi="Arial"/>
+          <w:sz w:val="21"/>
+          <w:szCs w:val="21"/>
+        </w:rPr>
+        <w:t xml:space="preserve"> (Pulsonix INCH trơn, toạ độ 3.5): parser áp 2.4, nhỏ 10 lần. Nếu cụm lỗ nằm gần như hẳn ngoài bo thì </w:t>
+      </w:r>
+      <w:r>
+        <w:rPr>
+          <w:rFonts w:ascii="Arial" w:cs="Arial" w:eastAsia="Arial" w:hAnsi="Arial"/>
+          <w:b/>
+          <w:bCs/>
+          <w:sz w:val="21"/>
+          <w:szCs w:val="21"/>
+        </w:rPr>
+        <w:t xml:space="preserve">lấy bo làm thước</w:t>
+      </w:r>
+      <w:r>
+        <w:rPr>
+          <w:rFonts w:ascii="Arial" w:cs="Arial" w:eastAsia="Arial" w:hAnsi="Arial"/>
+          <w:sz w:val="21"/>
+          <w:szCs w:val="21"/>
+        </w:rPr>
+        <w:t xml:space="preserve">, thử lại các cách đặt dấu thập phân (fixDrillScale).</w:t>
+      </w:r>
+    </w:p>
+    <w:p>
+      <w:pPr>
+        <w:pStyle w:val="ListParagraph"/>
+        <w:numPr>
+          <w:ilvl w:val="0"/>
+          <w:numId w:val="2"/>
+        </w:numPr>
+        <w:spacing w:after="60" w:line="264"/>
+      </w:pPr>
+      <w:r>
+        <w:rPr>
+          <w:rFonts w:ascii="Arial" w:cs="Arial" w:eastAsia="Arial" w:hAnsi="Arial"/>
+          <w:sz w:val="21"/>
+          <w:szCs w:val="21"/>
+        </w:rPr>
         <w:t xml:space="preserve">Vẽ: 2D ép cụm khoan thành lát mỏng ngay mặt đang nhìn; 3D trụ cao đúng bề dày bo + lượng rất nhỏ.</w:t>
       </w:r>
     </w:p>
@@ -15886,15 +16657,15 @@
           <w:sz w:val="21"/>
           <w:szCs w:val="21"/>
         </w:rPr>
-        <w:t xml:space="preserve">Bo ghép chỉ ngăn bằng rãnh</w:t>
-      </w:r>
-      <w:r>
-        <w:rPr>
-          <w:rFonts w:ascii="Arial" w:cs="Arial" w:eastAsia="Arial" w:hAnsi="Arial"/>
-          <w:sz w:val="21"/>
-          <w:szCs w:val="21"/>
-        </w:rPr>
-        <w:t xml:space="preserve"> (CHAT_BOT_4) vẫn đếm là 1 bo nên chưa có nhắc "nhiều bo ghép" (706ea9f đã nhắc cho file nhiều viền bo rời như CHAT_BOT_1).</w:t>
+        <w:t xml:space="preserve">Bo ghép chỉ ngăn bằng rãnh / V-cut</w:t>
+      </w:r>
+      <w:r>
+        <w:rPr>
+          <w:rFonts w:ascii="Arial" w:cs="Arial" w:eastAsia="Arial" w:hAnsi="Arial"/>
+          <w:sz w:val="21"/>
+          <w:szCs w:val="21"/>
+        </w:rPr>
+        <w:t xml:space="preserve"> (CHAT_BOT_4, FRIWO 55807) vẫn đếm là 1 bo nên chưa có nhắc "nhiều bo ghép" (706ea9f đã nhắc cho file nhiều viền bo rời như CHAT_BOT_1).</w:t>
       </w:r>
     </w:p>
     <w:p>
@@ -16077,7 +16848,7 @@
           <w:sz w:val="21"/>
           <w:szCs w:val="21"/>
         </w:rPr>
-        <w:t xml:space="preserve"> (tsc -b chặt hơn tsc --noEmit — lỗi build Vercel ở f12b339 là do chỉ chạy lệnh nhẹ) và npx vitest run (139 test).</w:t>
+        <w:t xml:space="preserve"> (tsc -b chặt hơn tsc --noEmit — lỗi build Vercel ở f12b339 là do chỉ chạy lệnh nhẹ) và npx vitest run (142 test).</w:t>
       </w:r>
     </w:p>
     <w:p>
@@ -16113,7 +16884,7 @@
           <w:sz w:val="21"/>
           <w:szCs w:val="21"/>
         </w:rPr>
-        <w:t xml:space="preserve">Mở lại bộ mẫu: FC_F405RGT6_Wing (KiCad 6 lớp), BOAD NUT NHAN (EasyEDA), AGVH7 (Altium inch, slot), Ceiling / Dynamic Master (panel inch), Slaver_Ceiling bản lẻ (GKO + GM1), ESP32_DR (Altium metric 4:3, RectHoles), CHAT_BOT_1 (panel 4 bo), DA82 (OrCAD Layout, thruhole.tap + .DRD), CHAT_BOT_4 (rãnh một nét), PHAONUOC (đường vẽ 0.8 mm không thành rãnh), 3W NHUA XANH (CAM350, RAR).</w:t>
+        <w:t xml:space="preserve">Mở lại bộ mẫu: FC_F405RGT6_Wing (KiCad 6 lớp), BOAD NUT NHAN (EasyEDA), AGVH7 (Altium inch, slot), Ceiling / Dynamic Master (panel inch), Slaver_Ceiling bản lẻ (GKO + GM1), ESP32_DR (Altium metric 4:3, RectHoles), CHAT_BOT_1 (panel 4 bo), DA82 (OrCAD Layout, thruhole.tap + .DRD), FRIWO 55807 (Pulsonix, khoan INCH không khai format), CHAT_BOT_4 (rãnh một nét), PHAONUOC (đường vẽ 0.8 mm không thành rãnh), 3W NHUA XANH (CAM350, RAR).</w:t>
       </w:r>
     </w:p>
     <w:sectPr>

</xml_diff>

<commit_message>
docs: Rewrite bug 16 around pad matching and origin shifts
Bug 16 in the report, the Word build and the two living docs now describes both drill-file faults (undeclared digit counts, and an origin different from the Gerbers), the pad-matching fix with its false-match guards and UI warning, and the pad-based corpus result: 31 sets better out of a 1-in-10 sample, none worse, sets under 50% holes-on-pads down from 34 to 3.

Co-Authored-By: Claude Opus 5 <noreply@anthropic.com>
</commit_message>
<xml_diff>
--- a/docs/bao-cao/Bao-cao-DQPCB-2026-09-22.docx
+++ b/docs/bao-cao/Bao-cao-DQPCB-2026-09-22.docx
@@ -2804,7 +2804,7 @@
                 <w:sz w:val="19"/>
                 <w:szCs w:val="19"/>
               </w:rPr>
-              <w:t xml:space="preserve">File khoan Pulsonix INCH không khai định dạng số, lỗ co 10 lần nằm ngoài bo</w:t>
+              <w:t xml:space="preserve">File khoan không khai định dạng số (co 10 lần) hoặc lệch gốc so với Gerber</w:t>
             </w:r>
           </w:p>
         </w:tc>
@@ -2836,7 +2836,7 @@
                 <w:sz w:val="19"/>
                 <w:szCs w:val="19"/>
               </w:rPr>
-              <w:t xml:space="preserve">FRIWO — 55807.931-90FE</w:t>
+              <w:t xml:space="preserve">FRIWO — 55807.931-90FE (+ 31 bộ / 1.850 mẫu)</w:t>
             </w:r>
           </w:p>
         </w:tc>
@@ -2868,7 +2868,7 @@
                 <w:sz w:val="19"/>
                 <w:szCs w:val="19"/>
               </w:rPr>
-              <w:t xml:space="preserve">Đã sửa · c680077</w:t>
+              <w:t xml:space="preserve">Đã sửa · c680077, 3ec37c4</w:t>
             </w:r>
           </w:p>
         </w:tc>
@@ -9434,7 +9434,7 @@
           <w:sz w:val="25"/>
           <w:szCs w:val="25"/>
         </w:rPr>
-        <w:t xml:space="preserve">Lỗi 16 — File khoan Pulsonix không khai định dạng số, lỗ co 10 lần</w:t>
+        <w:t xml:space="preserve">Lỗi 16 — File khoan đọc sai tỉ lệ / lệch gốc — dò theo pad</w:t>
       </w:r>
     </w:p>
     <w:tbl>
@@ -9588,7 +9588,7 @@
                 <w:sz w:val="19"/>
                 <w:szCs w:val="19"/>
               </w:rPr>
-              <w:t xml:space="preserve">D:\JobDatMach\FRIWO\2026\22-09\FRIWO 55807.931-90FE.zip</w:t>
+              <w:t xml:space="preserve">D:\JobDatMach\FRIWO\2026\22-09\FRIWO 55807.931-90FE.zip (và các bộ lộ ra khi quét kho)</w:t>
             </w:r>
           </w:p>
         </w:tc>
@@ -9657,7 +9657,7 @@
                 <w:sz w:val="19"/>
                 <w:szCs w:val="19"/>
               </w:rPr>
-              <w:t xml:space="preserve">Bo (panel 4 × 2) nằm lọt thỏm góc trên phải khung nhìn; một cụm nhỏ lạc tận giữa dưới — đó là toàn bộ 2641 lỗ khoan.</w:t>
+              <w:t xml:space="preserve">FRIWO: bo (panel 4 × 2) nằm lọt thỏm góc trên phải khung nhìn; một cụm nhỏ lạc tận giữa dưới — đó là toàn bộ 2641 lỗ khoan.</w:t>
             </w:r>
           </w:p>
         </w:tc>
@@ -9721,32 +9721,62 @@
             <w:r>
               <w:rPr>
                 <w:rFonts w:ascii="Arial" w:cs="Arial" w:eastAsia="Arial" w:hAnsi="Arial"/>
-                <w:b w:val="false"/>
-                <w:bCs w:val="false"/>
-                <w:sz w:val="19"/>
-                <w:szCs w:val="19"/>
-              </w:rPr>
-              <w:t xml:space="preserve">Pulsonix xuất M48 / FMAT,1 / INCH trơn — không LZ/TZ, không ;FILE_FORMAT, toạ độ không dấu chấm, 8 chữ số giữ số 0 đầu (X01011283 = 10.11283 in, định dạng 3.5). Không có gì trong file nói vậy, parser áp mặc định inch 2.4 → 1.011283 in: cả cụm lỗ </w:t>
-            </w:r>
-            <w:r>
-              <w:rPr>
-                <w:rFonts w:ascii="Arial" w:cs="Arial" w:eastAsia="Arial" w:hAnsi="Arial"/>
                 <w:b/>
                 <w:bCs/>
                 <w:sz w:val="19"/>
                 <w:szCs w:val="19"/>
               </w:rPr>
-              <w:t xml:space="preserve">nhỏ đi 10 lần</w:t>
-            </w:r>
-            <w:r>
-              <w:rPr>
-                <w:rFonts w:ascii="Arial" w:cs="Arial" w:eastAsia="Arial" w:hAnsi="Arial"/>
-                <w:b w:val="false"/>
-                <w:bCs w:val="false"/>
-                <w:sz w:val="19"/>
-                <w:szCs w:val="19"/>
-              </w:rPr>
-              <w:t xml:space="preserve">, rơi ra ngoài bo. Cùng họ lỗi 8 nhưng ở đây không có dòng khai format để đọc.</w:t>
+              <w:t xml:space="preserve">Hai kiểu lỗi file khoan.</w:t>
+            </w:r>
+            <w:r>
+              <w:rPr>
+                <w:rFonts w:ascii="Arial" w:cs="Arial" w:eastAsia="Arial" w:hAnsi="Arial"/>
+                <w:b w:val="false"/>
+                <w:bCs w:val="false"/>
+                <w:sz w:val="19"/>
+                <w:szCs w:val="19"/>
+              </w:rPr>
+              <w:t xml:space="preserve"> (1) </w:t>
+            </w:r>
+            <w:r>
+              <w:rPr>
+                <w:rFonts w:ascii="Arial" w:cs="Arial" w:eastAsia="Arial" w:hAnsi="Arial"/>
+                <w:b/>
+                <w:bCs/>
+                <w:sz w:val="19"/>
+                <w:szCs w:val="19"/>
+              </w:rPr>
+              <w:t xml:space="preserve">Không khai định dạng số</w:t>
+            </w:r>
+            <w:r>
+              <w:rPr>
+                <w:rFonts w:ascii="Arial" w:cs="Arial" w:eastAsia="Arial" w:hAnsi="Arial"/>
+                <w:b w:val="false"/>
+                <w:bCs w:val="false"/>
+                <w:sz w:val="19"/>
+                <w:szCs w:val="19"/>
+              </w:rPr>
+              <w:t xml:space="preserve">: Excellon chỉ ghi dãy số liền (X01011283), phải có lời khai mới biết mấy số phần nguyên. Pulsonix xuất INCH trơn với định dạng 3.5 (10.11283 in), parser áp 2.4 → 1.011283 in: nhỏ 10 lần. (2) </w:t>
+            </w:r>
+            <w:r>
+              <w:rPr>
+                <w:rFonts w:ascii="Arial" w:cs="Arial" w:eastAsia="Arial" w:hAnsi="Arial"/>
+                <w:b/>
+                <w:bCs/>
+                <w:sz w:val="19"/>
+                <w:szCs w:val="19"/>
+              </w:rPr>
+              <w:t xml:space="preserve">Lệch gốc</w:t>
+            </w:r>
+            <w:r>
+              <w:rPr>
+                <w:rFonts w:ascii="Arial" w:cs="Arial" w:eastAsia="Arial" w:hAnsi="Arial"/>
+                <w:b w:val="false"/>
+                <w:bCs w:val="false"/>
+                <w:sz w:val="19"/>
+                <w:szCs w:val="19"/>
+              </w:rPr>
+              <w:t xml:space="preserve">: định dạng đúng nhưng file khoan xuất theo gốc khác Gerber, cả cụm lỗ bị dời (PCB_doline: +87.9, +25.5 mm) — lỗi thật của file khách, xưởng khoan theo sẽ khoan lệch.</w:t>
             </w:r>
           </w:p>
         </w:tc>
@@ -9810,32 +9840,72 @@
             <w:r>
               <w:rPr>
                 <w:rFonts w:ascii="Arial" w:cs="Arial" w:eastAsia="Arial" w:hAnsi="Arial"/>
-                <w:b w:val="false"/>
-                <w:bCs w:val="false"/>
-                <w:sz w:val="19"/>
-                <w:szCs w:val="19"/>
-              </w:rPr>
-              <w:t xml:space="preserve">reader.ts → fixDrillScale: </w:t>
-            </w:r>
-            <w:r>
-              <w:rPr>
-                <w:rFonts w:ascii="Arial" w:cs="Arial" w:eastAsia="Arial" w:hAnsi="Arial"/>
                 <w:b/>
                 <w:bCs/>
                 <w:sz w:val="19"/>
                 <w:szCs w:val="19"/>
               </w:rPr>
-              <w:t xml:space="preserve">lấy chính bo làm thước</w:t>
-            </w:r>
-            <w:r>
-              <w:rPr>
-                <w:rFonts w:ascii="Arial" w:cs="Arial" w:eastAsia="Arial" w:hAnsi="Arial"/>
-                <w:b w:val="false"/>
-                <w:bCs w:val="false"/>
-                <w:sz w:val="19"/>
-                <w:szCs w:val="19"/>
-              </w:rPr>
-              <w:t xml:space="preserve"> — lỗ khoan phải nằm trong viền (không có viền thì trong vùng đồng). Cụm lỗ nằm gần như hẳn ngoài bo (dưới nửa diện tích chồng lên bo) thì thử lại các cách đặt dấu thập phân hay gặp, chọn cách cho cụm lỗ nằm trong bo và phủ rộng nhất. Lỗ định vị trên rail hơi lấn viền không bị đọc lại.</w:t>
+              <w:t xml:space="preserve">Dò theo pad</w:t>
+            </w:r>
+            <w:r>
+              <w:rPr>
+                <w:rFonts w:ascii="Arial" w:cs="Arial" w:eastAsia="Arial" w:hAnsi="Arial"/>
+                <w:b w:val="false"/>
+                <w:bCs w:val="false"/>
+                <w:sz w:val="19"/>
+                <w:szCs w:val="19"/>
+              </w:rPr>
+              <w:t xml:space="preserve"> (reader.ts): lỗ thật nằm trên pad/via, nên cách đọc đúng là cách cho nhiều tâm lỗ trúng pad đồng nhất. Mặc định trúng ≥ 50% thì giữ; không thì thử mọi cách đặt dấu thập phân + độ dời tốt nhất (bỏ phiếu hiệu toạ độ lỗ − pad), lấy cách trúng nhiều nhất. NPTH theo file khoan cùng bộ; cuối cùng mới lấy khung bo làm thước.</w:t>
+            </w:r>
+          </w:p>
+          <w:p>
+            <w:pPr>
+              <w:spacing w:after="20"/>
+            </w:pPr>
+            <w:r>
+              <w:rPr>
+                <w:rFonts w:ascii="Arial" w:cs="Arial" w:eastAsia="Arial" w:hAnsi="Arial"/>
+                <w:b/>
+                <w:bCs/>
+                <w:sz w:val="19"/>
+                <w:szCs w:val="19"/>
+              </w:rPr>
+              <w:t xml:space="preserve">Chốt chặn khớp giả</w:t>
+            </w:r>
+            <w:r>
+              <w:rPr>
+                <w:rFonts w:ascii="Arial" w:cs="Arial" w:eastAsia="Arial" w:hAnsi="Arial"/>
+                <w:b w:val="false"/>
+                <w:bCs w:val="false"/>
+                <w:sz w:val="19"/>
+                <w:szCs w:val="19"/>
+              </w:rPr>
+              <w:t xml:space="preserve">: NPTH không dò theo pad; file khai đủ số chữ số mà lỗ nằm trong bo thì chỉ xét lệch gốc; cách đọc khác phải giữ cụm lỗ trải ≥ 25% vùng pad.</w:t>
+            </w:r>
+          </w:p>
+          <w:p>
+            <w:pPr>
+              <w:spacing w:after="20"/>
+            </w:pPr>
+            <w:r>
+              <w:rPr>
+                <w:rFonts w:ascii="Arial" w:cs="Arial" w:eastAsia="Arial" w:hAnsi="Arial"/>
+                <w:b/>
+                <w:bCs/>
+                <w:sz w:val="19"/>
+                <w:szCs w:val="19"/>
+              </w:rPr>
+              <w:t xml:space="preserve">Cảnh báo</w:t>
+            </w:r>
+            <w:r>
+              <w:rPr>
+                <w:rFonts w:ascii="Arial" w:cs="Arial" w:eastAsia="Arial" w:hAnsi="Arial"/>
+                <w:b w:val="false"/>
+                <w:bCs w:val="false"/>
+                <w:sz w:val="19"/>
+                <w:szCs w:val="19"/>
+              </w:rPr>
+              <w:t xml:space="preserve"> dưới danh sách lớp: đọc theo định dạng nào, dời bao nhiêu mm, căn cứ; lệch gốc thì nhắc báo khách.</w:t>
             </w:r>
           </w:p>
         </w:tc>
@@ -9904,7 +9974,7 @@
                 <w:sz w:val="19"/>
                 <w:szCs w:val="19"/>
               </w:rPr>
-              <w:t xml:space="preserve">FRIWO: 2641/2641 lỗ nằm trong viền, kích thước giữ 137.4 × 147 mm. Hồi quy corpus: mẫu 1/10 kho (1.850 bộ): 541 bộ có file khoan không dấu thập phân, </w:t>
+              <w:t xml:space="preserve">FRIWO: 2641 lỗ về đúng vùng bo, kích thước giữ 137.4 × 147 mm; PCB_doline, The Cold dời lại khớp 100% pad. Hồi quy corpus, đo bằng </w:t>
             </w:r>
             <w:r>
               <w:rPr>
@@ -9914,17 +9984,37 @@
                 <w:sz w:val="19"/>
                 <w:szCs w:val="19"/>
               </w:rPr>
-              <w:t xml:space="preserve">10 bộ đổi — cả 10 từ 0–14 lỗ trên bo lên 100%</w:t>
-            </w:r>
-            <w:r>
-              <w:rPr>
-                <w:rFonts w:ascii="Arial" w:cs="Arial" w:eastAsia="Arial" w:hAnsi="Arial"/>
-                <w:b w:val="false"/>
-                <w:bCs w:val="false"/>
-                <w:sz w:val="19"/>
-                <w:szCs w:val="19"/>
-              </w:rPr>
-              <w:t xml:space="preserve">, kích thước không đổi, không bộ nào tệ đi (vd BoardC25v2 0→503/503, PS700W_S07 0→245/245, VGS805A 14→130/130). Ước cả kho ~100 bộ từng bị. 2 test mới.</w:t>
+              <w:t xml:space="preserve">tỉ lệ lỗ trúng pad</w:t>
+            </w:r>
+            <w:r>
+              <w:rPr>
+                <w:rFonts w:ascii="Arial" w:cs="Arial" w:eastAsia="Arial" w:hAnsi="Arial"/>
+                <w:b w:val="false"/>
+                <w:bCs w:val="false"/>
+                <w:sz w:val="19"/>
+                <w:szCs w:val="19"/>
+              </w:rPr>
+              <w:t xml:space="preserve">: mẫu 1/10 (1.850 bộ) — </w:t>
+            </w:r>
+            <w:r>
+              <w:rPr>
+                <w:rFonts w:ascii="Arial" w:cs="Arial" w:eastAsia="Arial" w:hAnsi="Arial"/>
+                <w:b/>
+                <w:bCs/>
+                <w:sz w:val="19"/>
+                <w:szCs w:val="19"/>
+              </w:rPr>
+              <w:t xml:space="preserve">31 bộ đổi, cả 31 tốt lên, 0 tệ đi, không đổi kích thước</w:t>
+            </w:r>
+            <w:r>
+              <w:rPr>
+                <w:rFonts w:ascii="Arial" w:cs="Arial" w:eastAsia="Arial" w:hAnsi="Arial"/>
+                <w:b w:val="false"/>
+                <w:bCs w:val="false"/>
+                <w:sz w:val="19"/>
+                <w:szCs w:val="19"/>
+              </w:rPr>
+              <w:t xml:space="preserve">; bộ trúng pad &lt; 50% giảm 34 → 3. 21 bộ sai định dạng, 10 bộ lệch gốc. Bản chỉ dùng khung bo (c680077) sửa được 10. 6 test mới.</w:t>
             </w:r>
           </w:p>
         </w:tc>
@@ -9961,6 +10051,75 @@
                 <w:sz w:val="19"/>
                 <w:szCs w:val="19"/>
               </w:rPr>
+              <w:t xml:space="preserve">Còn lại</w:t>
+            </w:r>
+          </w:p>
+        </w:tc>
+        <w:tc>
+          <w:tcPr>
+            <w:tcW w:type="dxa" w:w="7518"/>
+            <w:tcBorders>
+              <w:top w:val="single" w:color="BFBFBF" w:sz="4"/>
+              <w:left w:val="single" w:color="BFBFBF" w:sz="4"/>
+              <w:bottom w:val="single" w:color="BFBFBF" w:sz="4"/>
+              <w:right w:val="single" w:color="BFBFBF" w:sz="4"/>
+            </w:tcBorders>
+            <w:tcMar>
+              <w:top w:type="dxa" w:w="60"/>
+              <w:left w:type="dxa" w:w="100"/>
+              <w:bottom w:type="dxa" w:w="60"/>
+              <w:right w:type="dxa" w:w="100"/>
+            </w:tcMar>
+          </w:tcPr>
+          <w:p>
+            <w:pPr>
+              <w:spacing w:after="20"/>
+            </w:pPr>
+            <w:r>
+              <w:rPr>
+                <w:rFonts w:ascii="Arial" w:cs="Arial" w:eastAsia="Arial" w:hAnsi="Arial"/>
+                <w:b w:val="false"/>
+                <w:bCs w:val="false"/>
+                <w:sz w:val="19"/>
+                <w:szCs w:val="19"/>
+              </w:rPr>
+              <w:t xml:space="preserve">File khoan không có pad để dò và không có file cùng bộ (chỉ có NPTH, hoặc không có lớp đồng): chỉ sửa được khi cụm lỗ nằm hẳn ngoài bo. Zip lẫn file khoan nhiều thiết kế (PCB_TEST) chỉ cải thiện một phần.</w:t>
+            </w:r>
+          </w:p>
+        </w:tc>
+      </w:tr>
+      <w:tr>
+        <w:trPr>
+          <w:tblHeader w:val="false"/>
+        </w:trPr>
+        <w:tc>
+          <w:tcPr>
+            <w:tcW w:type="dxa" w:w="2120"/>
+            <w:tcBorders>
+              <w:top w:val="single" w:color="BFBFBF" w:sz="4"/>
+              <w:left w:val="single" w:color="BFBFBF" w:sz="4"/>
+              <w:bottom w:val="single" w:color="BFBFBF" w:sz="4"/>
+              <w:right w:val="single" w:color="BFBFBF" w:sz="4"/>
+            </w:tcBorders>
+            <w:tcMar>
+              <w:top w:type="dxa" w:w="60"/>
+              <w:left w:type="dxa" w:w="100"/>
+              <w:bottom w:type="dxa" w:w="60"/>
+              <w:right w:type="dxa" w:w="100"/>
+            </w:tcMar>
+          </w:tcPr>
+          <w:p>
+            <w:pPr>
+              <w:spacing w:after="20"/>
+            </w:pPr>
+            <w:r>
+              <w:rPr>
+                <w:rFonts w:ascii="Arial" w:cs="Arial" w:eastAsia="Arial" w:hAnsi="Arial"/>
+                <w:b w:val="false"/>
+                <w:bCs w:val="false"/>
+                <w:sz w:val="19"/>
+                <w:szCs w:val="19"/>
+              </w:rPr>
               <w:t xml:space="preserve">Lưu ý</w:t>
             </w:r>
           </w:p>
@@ -9993,7 +10152,7 @@
                 <w:sz w:val="19"/>
                 <w:szCs w:val="19"/>
               </w:rPr>
-              <w:t xml:space="preserve">Panel 4 × 2 chỉ ngăn bằng V-cut, không có viền bo riêng → app vẫn đếm 1 bo, chưa nhắc "file ghép sẵn" (vấn đề còn tồn).</w:t>
+              <w:t xml:space="preserve">Panel FRIWO 4 × 2 chỉ ngăn bằng V-cut, không có viền bo riêng → app vẫn đếm 1 bo (vấn đề còn tồn).</w:t>
             </w:r>
           </w:p>
         </w:tc>
@@ -15647,7 +15806,7 @@
           <w:sz w:val="21"/>
           <w:szCs w:val="21"/>
         </w:rPr>
-        <w:t xml:space="preserve"> (Pulsonix INCH trơn, toạ độ 3.5): parser áp 2.4, nhỏ 10 lần. Nếu cụm lỗ nằm gần như hẳn ngoài bo thì </w:t>
+        <w:t xml:space="preserve"> (Pulsonix INCH trơn, 3.5) hoặc </w:t>
       </w:r>
       <w:r>
         <w:rPr>
@@ -15657,15 +15816,33 @@
           <w:sz w:val="21"/>
           <w:szCs w:val="21"/>
         </w:rPr>
-        <w:t xml:space="preserve">lấy bo làm thước</w:t>
-      </w:r>
-      <w:r>
-        <w:rPr>
-          <w:rFonts w:ascii="Arial" w:cs="Arial" w:eastAsia="Arial" w:hAnsi="Arial"/>
-          <w:sz w:val="21"/>
-          <w:szCs w:val="21"/>
-        </w:rPr>
-        <w:t xml:space="preserve">, thử lại các cách đặt dấu thập phân (fixDrillScale).</w:t>
+        <w:t xml:space="preserve">lệch gốc</w:t>
+      </w:r>
+      <w:r>
+        <w:rPr>
+          <w:rFonts w:ascii="Arial" w:cs="Arial" w:eastAsia="Arial" w:hAnsi="Arial"/>
+          <w:sz w:val="21"/>
+          <w:szCs w:val="21"/>
+        </w:rPr>
+        <w:t xml:space="preserve"> so với Gerber: </w:t>
+      </w:r>
+      <w:r>
+        <w:rPr>
+          <w:rFonts w:ascii="Arial" w:cs="Arial" w:eastAsia="Arial" w:hAnsi="Arial"/>
+          <w:b/>
+          <w:bCs/>
+          <w:sz w:val="21"/>
+          <w:szCs w:val="21"/>
+        </w:rPr>
+        <w:t xml:space="preserve">dò theo pad</w:t>
+      </w:r>
+      <w:r>
+        <w:rPr>
+          <w:rFonts w:ascii="Arial" w:cs="Arial" w:eastAsia="Arial" w:hAnsi="Arial"/>
+          <w:sz w:val="21"/>
+          <w:szCs w:val="21"/>
+        </w:rPr>
+        <w:t xml:space="preserve"> — lấy cách đọc + độ dời cho nhiều tâm lỗ trúng pad đồng nhất; NPTH theo file khoan cùng bộ; khung bo là phương án cuối. Lớp được sửa có cảnh báo trên giao diện.</w:t>
       </w:r>
     </w:p>
     <w:p>
@@ -16848,7 +17025,7 @@
           <w:sz w:val="21"/>
           <w:szCs w:val="21"/>
         </w:rPr>
-        <w:t xml:space="preserve"> (tsc -b chặt hơn tsc --noEmit — lỗi build Vercel ở f12b339 là do chỉ chạy lệnh nhẹ) và npx vitest run (142 test).</w:t>
+        <w:t xml:space="preserve"> (tsc -b chặt hơn tsc --noEmit — lỗi build Vercel ở f12b339 là do chỉ chạy lệnh nhẹ) và npx vitest run (146 test).</w:t>
       </w:r>
     </w:p>
     <w:p>
@@ -16884,7 +17061,7 @@
           <w:sz w:val="21"/>
           <w:szCs w:val="21"/>
         </w:rPr>
-        <w:t xml:space="preserve">Mở lại bộ mẫu: FC_F405RGT6_Wing (KiCad 6 lớp), BOAD NUT NHAN (EasyEDA), AGVH7 (Altium inch, slot), Ceiling / Dynamic Master (panel inch), Slaver_Ceiling bản lẻ (GKO + GM1), ESP32_DR (Altium metric 4:3, RectHoles), CHAT_BOT_1 (panel 4 bo), DA82 (OrCAD Layout, thruhole.tap + .DRD), FRIWO 55807 (Pulsonix, khoan INCH không khai format), CHAT_BOT_4 (rãnh một nét), PHAONUOC (đường vẽ 0.8 mm không thành rãnh), 3W NHUA XANH (CAM350, RAR).</w:t>
+        <w:t xml:space="preserve">Mở lại bộ mẫu: FC_F405RGT6_Wing (KiCad 6 lớp), BOAD NUT NHAN (EasyEDA), AGVH7 (Altium inch, slot), Ceiling / Dynamic Master (panel inch), Slaver_Ceiling bản lẻ (GKO + GM1), ESP32_DR (Altium metric 4:3, RectHoles), CHAT_BOT_1 (panel 4 bo), DA82 (OrCAD Layout, thruhole.tap + .DRD), FRIWO 55807 (Pulsonix, khoan INCH không khai format), PCB_doline (Altium, khoan lệch gốc), 5395_1 (EasyEDA, NPTH phải giữ nguyên), CHAT_BOT_4 (rãnh một nét), PHAONUOC (đường vẽ 0.8 mm không thành rãnh), 3W NHUA XANH (CAM350, RAR).</w:t>
       </w:r>
     </w:p>
     <w:sectPr>

</xml_diff>

<commit_message>
docs: Add the Bot Side bottom view fix to the report
Co-Authored-By: Claude Opus 5 <noreply@anthropic.com>
</commit_message>
<xml_diff>
--- a/docs/bao-cao/Bao-cao-DQPCB-2026-09-22.docx
+++ b/docs/bao-cao/Bao-cao-DQPCB-2026-09-22.docx
@@ -2873,6 +2873,139 @@
           </w:p>
         </w:tc>
       </w:tr>
+      <w:tr>
+        <w:trPr>
+          <w:tblHeader w:val="false"/>
+        </w:trPr>
+        <w:tc>
+          <w:tcPr>
+            <w:tcW w:type="dxa" w:w="481"/>
+            <w:tcBorders>
+              <w:top w:val="single" w:color="BFBFBF" w:sz="4"/>
+              <w:left w:val="single" w:color="BFBFBF" w:sz="4"/>
+              <w:bottom w:val="single" w:color="BFBFBF" w:sz="4"/>
+              <w:right w:val="single" w:color="BFBFBF" w:sz="4"/>
+            </w:tcBorders>
+            <w:tcMar>
+              <w:top w:type="dxa" w:w="60"/>
+              <w:left w:type="dxa" w:w="100"/>
+              <w:bottom w:type="dxa" w:w="60"/>
+              <w:right w:type="dxa" w:w="100"/>
+            </w:tcMar>
+          </w:tcPr>
+          <w:p>
+            <w:pPr>
+              <w:spacing w:after="20"/>
+            </w:pPr>
+            <w:r>
+              <w:rPr>
+                <w:rFonts w:ascii="Arial" w:cs="Arial" w:eastAsia="Arial" w:hAnsi="Arial"/>
+                <w:b w:val="false"/>
+                <w:bCs w:val="false"/>
+                <w:sz w:val="19"/>
+                <w:szCs w:val="19"/>
+              </w:rPr>
+              <w:t xml:space="preserve">17</w:t>
+            </w:r>
+          </w:p>
+        </w:tc>
+        <w:tc>
+          <w:tcPr>
+            <w:tcW w:type="dxa" w:w="4047"/>
+            <w:tcBorders>
+              <w:top w:val="single" w:color="BFBFBF" w:sz="4"/>
+              <w:left w:val="single" w:color="BFBFBF" w:sz="4"/>
+              <w:bottom w:val="single" w:color="BFBFBF" w:sz="4"/>
+              <w:right w:val="single" w:color="BFBFBF" w:sz="4"/>
+            </w:tcBorders>
+            <w:tcMar>
+              <w:top w:type="dxa" w:w="60"/>
+              <w:left w:type="dxa" w:w="100"/>
+              <w:bottom w:type="dxa" w:w="60"/>
+              <w:right w:type="dxa" w:w="100"/>
+            </w:tcMar>
+          </w:tcPr>
+          <w:p>
+            <w:pPr>
+              <w:spacing w:after="20"/>
+            </w:pPr>
+            <w:r>
+              <w:rPr>
+                <w:rFonts w:ascii="Arial" w:cs="Arial" w:eastAsia="Arial" w:hAnsi="Arial"/>
+                <w:b w:val="false"/>
+                <w:bCs w:val="false"/>
+                <w:sz w:val="19"/>
+                <w:szCs w:val="19"/>
+              </w:rPr>
+              <w:t xml:space="preserve">2D / 3D chọn "Bot Side" không thấy mặt dưới</w:t>
+            </w:r>
+          </w:p>
+        </w:tc>
+        <w:tc>
+          <w:tcPr>
+            <w:tcW w:type="dxa" w:w="2891"/>
+            <w:tcBorders>
+              <w:top w:val="single" w:color="BFBFBF" w:sz="4"/>
+              <w:left w:val="single" w:color="BFBFBF" w:sz="4"/>
+              <w:bottom w:val="single" w:color="BFBFBF" w:sz="4"/>
+              <w:right w:val="single" w:color="BFBFBF" w:sz="4"/>
+            </w:tcBorders>
+            <w:tcMar>
+              <w:top w:type="dxa" w:w="60"/>
+              <w:left w:type="dxa" w:w="100"/>
+              <w:bottom w:type="dxa" w:w="60"/>
+              <w:right w:type="dxa" w:w="100"/>
+            </w:tcMar>
+          </w:tcPr>
+          <w:p>
+            <w:pPr>
+              <w:spacing w:after="20"/>
+            </w:pPr>
+            <w:r>
+              <w:rPr>
+                <w:rFonts w:ascii="Arial" w:cs="Arial" w:eastAsia="Arial" w:hAnsi="Arial"/>
+                <w:b w:val="false"/>
+                <w:bCs w:val="false"/>
+                <w:sz w:val="19"/>
+                <w:szCs w:val="19"/>
+              </w:rPr>
+              <w:t xml:space="preserve">FRIWO — 55807.931-90FE</w:t>
+            </w:r>
+          </w:p>
+        </w:tc>
+        <w:tc>
+          <w:tcPr>
+            <w:tcW w:type="dxa" w:w="2219"/>
+            <w:tcBorders>
+              <w:top w:val="single" w:color="BFBFBF" w:sz="4"/>
+              <w:left w:val="single" w:color="BFBFBF" w:sz="4"/>
+              <w:bottom w:val="single" w:color="BFBFBF" w:sz="4"/>
+              <w:right w:val="single" w:color="BFBFBF" w:sz="4"/>
+            </w:tcBorders>
+            <w:tcMar>
+              <w:top w:type="dxa" w:w="60"/>
+              <w:left w:type="dxa" w:w="100"/>
+              <w:bottom w:type="dxa" w:w="60"/>
+              <w:right w:type="dxa" w:w="100"/>
+            </w:tcMar>
+          </w:tcPr>
+          <w:p>
+            <w:pPr>
+              <w:spacing w:after="20"/>
+            </w:pPr>
+            <w:r>
+              <w:rPr>
+                <w:rFonts w:ascii="Arial" w:cs="Arial" w:eastAsia="Arial" w:hAnsi="Arial"/>
+                <w:b w:val="false"/>
+                <w:bCs w:val="false"/>
+                <w:sz w:val="19"/>
+                <w:szCs w:val="19"/>
+              </w:rPr>
+              <w:t xml:space="preserve">Đã sửa · 020e8de</w:t>
+            </w:r>
+          </w:p>
+        </w:tc>
+      </w:tr>
     </w:tbl>
     <w:p>
       <w:pPr>
@@ -10177,6 +10310,461 @@
           <w:sz w:val="25"/>
           <w:szCs w:val="25"/>
         </w:rPr>
+        <w:t xml:space="preserve">Lỗi 17 — 2D / 3D chọn "Bot Side" không thấy mặt dưới</w:t>
+      </w:r>
+    </w:p>
+    <w:tbl>
+      <w:tblPr>
+        <w:tblW w:type="dxa" w:w="9638"/>
+        <w:tblBorders>
+          <w:top w:val="single" w:color="auto" w:sz="4"/>
+          <w:left w:val="single" w:color="auto" w:sz="4"/>
+          <w:bottom w:val="single" w:color="auto" w:sz="4"/>
+          <w:right w:val="single" w:color="auto" w:sz="4"/>
+          <w:insideH w:val="single" w:color="auto" w:sz="4"/>
+          <w:insideV w:val="single" w:color="auto" w:sz="4"/>
+        </w:tblBorders>
+      </w:tblPr>
+      <w:tblGrid>
+        <w:gridCol w:w="2120"/>
+        <w:gridCol w:w="7518"/>
+      </w:tblGrid>
+      <w:tr>
+        <w:trPr>
+          <w:tblHeader/>
+        </w:trPr>
+        <w:tc>
+          <w:tcPr>
+            <w:tcW w:type="dxa" w:w="2120"/>
+            <w:tcBorders>
+              <w:top w:val="single" w:color="BFBFBF" w:sz="4"/>
+              <w:left w:val="single" w:color="BFBFBF" w:sz="4"/>
+              <w:bottom w:val="single" w:color="BFBFBF" w:sz="4"/>
+              <w:right w:val="single" w:color="BFBFBF" w:sz="4"/>
+            </w:tcBorders>
+            <w:shd w:fill="DCE6F2" w:color="auto" w:val="clear"/>
+            <w:tcMar>
+              <w:top w:type="dxa" w:w="60"/>
+              <w:left w:type="dxa" w:w="100"/>
+              <w:bottom w:type="dxa" w:w="60"/>
+              <w:right w:type="dxa" w:w="100"/>
+            </w:tcMar>
+          </w:tcPr>
+          <w:p>
+            <w:pPr>
+              <w:spacing w:after="20"/>
+            </w:pPr>
+            <w:r>
+              <w:rPr>
+                <w:rFonts w:ascii="Arial" w:cs="Arial" w:eastAsia="Arial" w:hAnsi="Arial"/>
+                <w:b/>
+                <w:bCs/>
+                <w:sz w:val="19"/>
+                <w:szCs w:val="19"/>
+              </w:rPr>
+              <w:t xml:space="preserve">Mục</w:t>
+            </w:r>
+          </w:p>
+        </w:tc>
+        <w:tc>
+          <w:tcPr>
+            <w:tcW w:type="dxa" w:w="7518"/>
+            <w:tcBorders>
+              <w:top w:val="single" w:color="BFBFBF" w:sz="4"/>
+              <w:left w:val="single" w:color="BFBFBF" w:sz="4"/>
+              <w:bottom w:val="single" w:color="BFBFBF" w:sz="4"/>
+              <w:right w:val="single" w:color="BFBFBF" w:sz="4"/>
+            </w:tcBorders>
+            <w:shd w:fill="DCE6F2" w:color="auto" w:val="clear"/>
+            <w:tcMar>
+              <w:top w:type="dxa" w:w="60"/>
+              <w:left w:type="dxa" w:w="100"/>
+              <w:bottom w:type="dxa" w:w="60"/>
+              <w:right w:type="dxa" w:w="100"/>
+            </w:tcMar>
+          </w:tcPr>
+          <w:p>
+            <w:pPr>
+              <w:spacing w:after="20"/>
+            </w:pPr>
+            <w:r>
+              <w:rPr>
+                <w:rFonts w:ascii="Arial" w:cs="Arial" w:eastAsia="Arial" w:hAnsi="Arial"/>
+                <w:b/>
+                <w:bCs/>
+                <w:sz w:val="19"/>
+                <w:szCs w:val="19"/>
+              </w:rPr>
+              <w:t xml:space="preserve">Nội dung</w:t>
+            </w:r>
+          </w:p>
+        </w:tc>
+      </w:tr>
+      <w:tr>
+        <w:trPr>
+          <w:tblHeader w:val="false"/>
+        </w:trPr>
+        <w:tc>
+          <w:tcPr>
+            <w:tcW w:type="dxa" w:w="2120"/>
+            <w:tcBorders>
+              <w:top w:val="single" w:color="BFBFBF" w:sz="4"/>
+              <w:left w:val="single" w:color="BFBFBF" w:sz="4"/>
+              <w:bottom w:val="single" w:color="BFBFBF" w:sz="4"/>
+              <w:right w:val="single" w:color="BFBFBF" w:sz="4"/>
+            </w:tcBorders>
+            <w:tcMar>
+              <w:top w:type="dxa" w:w="60"/>
+              <w:left w:type="dxa" w:w="100"/>
+              <w:bottom w:type="dxa" w:w="60"/>
+              <w:right w:type="dxa" w:w="100"/>
+            </w:tcMar>
+          </w:tcPr>
+          <w:p>
+            <w:pPr>
+              <w:spacing w:after="20"/>
+            </w:pPr>
+            <w:r>
+              <w:rPr>
+                <w:rFonts w:ascii="Arial" w:cs="Arial" w:eastAsia="Arial" w:hAnsi="Arial"/>
+                <w:b w:val="false"/>
+                <w:bCs w:val="false"/>
+                <w:sz w:val="19"/>
+                <w:szCs w:val="19"/>
+              </w:rPr>
+              <w:t xml:space="preserve">Bộ file</w:t>
+            </w:r>
+          </w:p>
+        </w:tc>
+        <w:tc>
+          <w:tcPr>
+            <w:tcW w:type="dxa" w:w="7518"/>
+            <w:tcBorders>
+              <w:top w:val="single" w:color="BFBFBF" w:sz="4"/>
+              <w:left w:val="single" w:color="BFBFBF" w:sz="4"/>
+              <w:bottom w:val="single" w:color="BFBFBF" w:sz="4"/>
+              <w:right w:val="single" w:color="BFBFBF" w:sz="4"/>
+            </w:tcBorders>
+            <w:tcMar>
+              <w:top w:type="dxa" w:w="60"/>
+              <w:left w:type="dxa" w:w="100"/>
+              <w:bottom w:type="dxa" w:w="60"/>
+              <w:right w:type="dxa" w:w="100"/>
+            </w:tcMar>
+          </w:tcPr>
+          <w:p>
+            <w:pPr>
+              <w:spacing w:after="20"/>
+            </w:pPr>
+            <w:r>
+              <w:rPr>
+                <w:rFonts w:ascii="Arial" w:cs="Arial" w:eastAsia="Arial" w:hAnsi="Arial"/>
+                <w:b w:val="false"/>
+                <w:bCs w:val="false"/>
+                <w:sz w:val="19"/>
+                <w:szCs w:val="19"/>
+              </w:rPr>
+              <w:t xml:space="preserve">D:\JobDatMach\FRIWO\2026\22-09\FRIWO 55807.931-90FE.zip</w:t>
+            </w:r>
+          </w:p>
+        </w:tc>
+      </w:tr>
+      <w:tr>
+        <w:trPr>
+          <w:tblHeader w:val="false"/>
+        </w:trPr>
+        <w:tc>
+          <w:tcPr>
+            <w:tcW w:type="dxa" w:w="2120"/>
+            <w:tcBorders>
+              <w:top w:val="single" w:color="BFBFBF" w:sz="4"/>
+              <w:left w:val="single" w:color="BFBFBF" w:sz="4"/>
+              <w:bottom w:val="single" w:color="BFBFBF" w:sz="4"/>
+              <w:right w:val="single" w:color="BFBFBF" w:sz="4"/>
+            </w:tcBorders>
+            <w:tcMar>
+              <w:top w:type="dxa" w:w="60"/>
+              <w:left w:type="dxa" w:w="100"/>
+              <w:bottom w:type="dxa" w:w="60"/>
+              <w:right w:type="dxa" w:w="100"/>
+            </w:tcMar>
+          </w:tcPr>
+          <w:p>
+            <w:pPr>
+              <w:spacing w:after="20"/>
+            </w:pPr>
+            <w:r>
+              <w:rPr>
+                <w:rFonts w:ascii="Arial" w:cs="Arial" w:eastAsia="Arial" w:hAnsi="Arial"/>
+                <w:b w:val="false"/>
+                <w:bCs w:val="false"/>
+                <w:sz w:val="19"/>
+                <w:szCs w:val="19"/>
+              </w:rPr>
+              <w:t xml:space="preserve">Hiện tượng</w:t>
+            </w:r>
+          </w:p>
+        </w:tc>
+        <w:tc>
+          <w:tcPr>
+            <w:tcW w:type="dxa" w:w="7518"/>
+            <w:tcBorders>
+              <w:top w:val="single" w:color="BFBFBF" w:sz="4"/>
+              <w:left w:val="single" w:color="BFBFBF" w:sz="4"/>
+              <w:bottom w:val="single" w:color="BFBFBF" w:sz="4"/>
+              <w:right w:val="single" w:color="BFBFBF" w:sz="4"/>
+            </w:tcBorders>
+            <w:tcMar>
+              <w:top w:type="dxa" w:w="60"/>
+              <w:left w:type="dxa" w:w="100"/>
+              <w:bottom w:type="dxa" w:w="60"/>
+              <w:right w:type="dxa" w:w="100"/>
+            </w:tcMar>
+          </w:tcPr>
+          <w:p>
+            <w:pPr>
+              <w:spacing w:after="20"/>
+            </w:pPr>
+            <w:r>
+              <w:rPr>
+                <w:rFonts w:ascii="Arial" w:cs="Arial" w:eastAsia="Arial" w:hAnsi="Arial"/>
+                <w:b w:val="false"/>
+                <w:bCs w:val="false"/>
+                <w:sz w:val="19"/>
+                <w:szCs w:val="19"/>
+              </w:rPr>
+              <w:t xml:space="preserve">2D/3D, bấm lọc Bot Side: chỉ thấy mảng xanh với các lỗ, không thấy đồng và chữ in mặt dưới.</w:t>
+            </w:r>
+          </w:p>
+        </w:tc>
+      </w:tr>
+      <w:tr>
+        <w:trPr>
+          <w:tblHeader w:val="false"/>
+        </w:trPr>
+        <w:tc>
+          <w:tcPr>
+            <w:tcW w:type="dxa" w:w="2120"/>
+            <w:tcBorders>
+              <w:top w:val="single" w:color="BFBFBF" w:sz="4"/>
+              <w:left w:val="single" w:color="BFBFBF" w:sz="4"/>
+              <w:bottom w:val="single" w:color="BFBFBF" w:sz="4"/>
+              <w:right w:val="single" w:color="BFBFBF" w:sz="4"/>
+            </w:tcBorders>
+            <w:tcMar>
+              <w:top w:type="dxa" w:w="60"/>
+              <w:left w:type="dxa" w:w="100"/>
+              <w:bottom w:type="dxa" w:w="60"/>
+              <w:right w:type="dxa" w:w="100"/>
+            </w:tcMar>
+          </w:tcPr>
+          <w:p>
+            <w:pPr>
+              <w:spacing w:after="20"/>
+            </w:pPr>
+            <w:r>
+              <w:rPr>
+                <w:rFonts w:ascii="Arial" w:cs="Arial" w:eastAsia="Arial" w:hAnsi="Arial"/>
+                <w:b w:val="false"/>
+                <w:bCs w:val="false"/>
+                <w:sz w:val="19"/>
+                <w:szCs w:val="19"/>
+              </w:rPr>
+              <w:t xml:space="preserve">Nguyên nhân</w:t>
+            </w:r>
+          </w:p>
+        </w:tc>
+        <w:tc>
+          <w:tcPr>
+            <w:tcW w:type="dxa" w:w="7518"/>
+            <w:tcBorders>
+              <w:top w:val="single" w:color="BFBFBF" w:sz="4"/>
+              <w:left w:val="single" w:color="BFBFBF" w:sz="4"/>
+              <w:bottom w:val="single" w:color="BFBFBF" w:sz="4"/>
+              <w:right w:val="single" w:color="BFBFBF" w:sz="4"/>
+            </w:tcBorders>
+            <w:tcMar>
+              <w:top w:type="dxa" w:w="60"/>
+              <w:left w:type="dxa" w:w="100"/>
+              <w:bottom w:type="dxa" w:w="60"/>
+              <w:right w:type="dxa" w:w="100"/>
+            </w:tcMar>
+          </w:tcPr>
+          <w:p>
+            <w:pPr>
+              <w:spacing w:after="20"/>
+            </w:pPr>
+            <w:r>
+              <w:rPr>
+                <w:rFonts w:ascii="Arial" w:cs="Arial" w:eastAsia="Arial" w:hAnsi="Arial"/>
+                <w:b w:val="false"/>
+                <w:bCs w:val="false"/>
+                <w:sz w:val="19"/>
+                <w:szCs w:val="19"/>
+              </w:rPr>
+              <w:t xml:space="preserve">Nút lọc chỉ ẩn các lớp mặt trên, còn góc nhìn vẫn từ trên xuống. Lõi bo và lớp phủ mask che hết mặt dưới.</w:t>
+            </w:r>
+          </w:p>
+        </w:tc>
+      </w:tr>
+      <w:tr>
+        <w:trPr>
+          <w:tblHeader w:val="false"/>
+        </w:trPr>
+        <w:tc>
+          <w:tcPr>
+            <w:tcW w:type="dxa" w:w="2120"/>
+            <w:tcBorders>
+              <w:top w:val="single" w:color="BFBFBF" w:sz="4"/>
+              <w:left w:val="single" w:color="BFBFBF" w:sz="4"/>
+              <w:bottom w:val="single" w:color="BFBFBF" w:sz="4"/>
+              <w:right w:val="single" w:color="BFBFBF" w:sz="4"/>
+            </w:tcBorders>
+            <w:tcMar>
+              <w:top w:type="dxa" w:w="60"/>
+              <w:left w:type="dxa" w:w="100"/>
+              <w:bottom w:type="dxa" w:w="60"/>
+              <w:right w:type="dxa" w:w="100"/>
+            </w:tcMar>
+          </w:tcPr>
+          <w:p>
+            <w:pPr>
+              <w:spacing w:after="20"/>
+            </w:pPr>
+            <w:r>
+              <w:rPr>
+                <w:rFonts w:ascii="Arial" w:cs="Arial" w:eastAsia="Arial" w:hAnsi="Arial"/>
+                <w:b w:val="false"/>
+                <w:bCs w:val="false"/>
+                <w:sz w:val="19"/>
+                <w:szCs w:val="19"/>
+              </w:rPr>
+              <w:t xml:space="preserve">Cách giải quyết</w:t>
+            </w:r>
+          </w:p>
+        </w:tc>
+        <w:tc>
+          <w:tcPr>
+            <w:tcW w:type="dxa" w:w="7518"/>
+            <w:tcBorders>
+              <w:top w:val="single" w:color="BFBFBF" w:sz="4"/>
+              <w:left w:val="single" w:color="BFBFBF" w:sz="4"/>
+              <w:bottom w:val="single" w:color="BFBFBF" w:sz="4"/>
+              <w:right w:val="single" w:color="BFBFBF" w:sz="4"/>
+            </w:tcBorders>
+            <w:tcMar>
+              <w:top w:type="dxa" w:w="60"/>
+              <w:left w:type="dxa" w:w="100"/>
+              <w:bottom w:type="dxa" w:w="60"/>
+              <w:right w:type="dxa" w:w="100"/>
+            </w:tcMar>
+          </w:tcPr>
+          <w:p>
+            <w:pPr>
+              <w:spacing w:after="20"/>
+            </w:pPr>
+            <w:r>
+              <w:rPr>
+                <w:rFonts w:ascii="Arial" w:cs="Arial" w:eastAsia="Arial" w:hAnsi="Arial"/>
+                <w:b w:val="false"/>
+                <w:bCs w:val="false"/>
+                <w:sz w:val="19"/>
+                <w:szCs w:val="19"/>
+              </w:rPr>
+              <w:t xml:space="preserve">Chọn Bot Side ở 2D/3D thì dùng góc nhìn từ dưới lên có sẵn của khung Bot trong "2 Mặt" (lật gương). All / Top Side quay về nhìn từ trên. CAM giữ nhìn từ trên để soi file đúng toạ độ gốc.</w:t>
+            </w:r>
+          </w:p>
+        </w:tc>
+      </w:tr>
+      <w:tr>
+        <w:trPr>
+          <w:tblHeader w:val="false"/>
+        </w:trPr>
+        <w:tc>
+          <w:tcPr>
+            <w:tcW w:type="dxa" w:w="2120"/>
+            <w:tcBorders>
+              <w:top w:val="single" w:color="BFBFBF" w:sz="4"/>
+              <w:left w:val="single" w:color="BFBFBF" w:sz="4"/>
+              <w:bottom w:val="single" w:color="BFBFBF" w:sz="4"/>
+              <w:right w:val="single" w:color="BFBFBF" w:sz="4"/>
+            </w:tcBorders>
+            <w:tcMar>
+              <w:top w:type="dxa" w:w="60"/>
+              <w:left w:type="dxa" w:w="100"/>
+              <w:bottom w:type="dxa" w:w="60"/>
+              <w:right w:type="dxa" w:w="100"/>
+            </w:tcMar>
+          </w:tcPr>
+          <w:p>
+            <w:pPr>
+              <w:spacing w:after="20"/>
+            </w:pPr>
+            <w:r>
+              <w:rPr>
+                <w:rFonts w:ascii="Arial" w:cs="Arial" w:eastAsia="Arial" w:hAnsi="Arial"/>
+                <w:b w:val="false"/>
+                <w:bCs w:val="false"/>
+                <w:sz w:val="19"/>
+                <w:szCs w:val="19"/>
+              </w:rPr>
+              <w:t xml:space="preserve">Kiểm</w:t>
+            </w:r>
+          </w:p>
+        </w:tc>
+        <w:tc>
+          <w:tcPr>
+            <w:tcW w:type="dxa" w:w="7518"/>
+            <w:tcBorders>
+              <w:top w:val="single" w:color="BFBFBF" w:sz="4"/>
+              <w:left w:val="single" w:color="BFBFBF" w:sz="4"/>
+              <w:bottom w:val="single" w:color="BFBFBF" w:sz="4"/>
+              <w:right w:val="single" w:color="BFBFBF" w:sz="4"/>
+            </w:tcBorders>
+            <w:tcMar>
+              <w:top w:type="dxa" w:w="60"/>
+              <w:left w:type="dxa" w:w="100"/>
+              <w:bottom w:type="dxa" w:w="60"/>
+              <w:right w:type="dxa" w:w="100"/>
+            </w:tcMar>
+          </w:tcPr>
+          <w:p>
+            <w:pPr>
+              <w:spacing w:after="20"/>
+            </w:pPr>
+            <w:r>
+              <w:rPr>
+                <w:rFonts w:ascii="Arial" w:cs="Arial" w:eastAsia="Arial" w:hAnsi="Arial"/>
+                <w:b w:val="false"/>
+                <w:bCs w:val="false"/>
+                <w:sz w:val="19"/>
+                <w:szCs w:val="19"/>
+              </w:rPr>
+              <w:t xml:space="preserve">FRIWO: 2D + Bot Side thấy rõ đồng và chữ in mặt dưới; All về mặt Top; 3D + Bot Side mở ở góc nhìn từ dưới.</w:t>
+            </w:r>
+          </w:p>
+        </w:tc>
+      </w:tr>
+    </w:tbl>
+    <w:p>
+      <w:pPr>
+        <w:spacing w:after="80"/>
+      </w:pPr>
+    </w:p>
+    <w:p>
+      <w:pPr>
+        <w:pStyle w:val="Heading2"/>
+        <w:spacing w:after="100" w:before="220"/>
+      </w:pPr>
+      <w:r>
+        <w:rPr>
+          <w:rFonts w:ascii="Arial" w:cs="Arial" w:eastAsia="Arial" w:hAnsi="Arial"/>
+          <w:b/>
+          <w:bCs/>
+          <w:color w:val="2E5597"/>
+          <w:sz w:val="25"/>
+          <w:szCs w:val="25"/>
+        </w:rPr>
         <w:t xml:space="preserve">Ghi chú — "mất logo" khi chụp (không phải lỗi app)</w:t>
       </w:r>
     </w:p>
@@ -10580,7 +11168,25 @@
           <w:sz w:val="21"/>
           <w:szCs w:val="21"/>
         </w:rPr>
-        <w:t xml:space="preserve">Danh sách lớp: bật/tắt từng lớp, All On / All Off, lọc Top Side / Bot Side, </w:t>
+        <w:t xml:space="preserve">Danh sách lớp: bật/tắt từng lớp, All On / All Off, lọc Top Side / Bot Side (ở 2D/3D, Bot Side </w:t>
+      </w:r>
+      <w:r>
+        <w:rPr>
+          <w:rFonts w:ascii="Arial" w:cs="Arial" w:eastAsia="Arial" w:hAnsi="Arial"/>
+          <w:b/>
+          <w:bCs/>
+          <w:sz w:val="21"/>
+          <w:szCs w:val="21"/>
+        </w:rPr>
+        <w:t xml:space="preserve">nhìn từ dưới lên</w:t>
+      </w:r>
+      <w:r>
+        <w:rPr>
+          <w:rFonts w:ascii="Arial" w:cs="Arial" w:eastAsia="Arial" w:hAnsi="Arial"/>
+          <w:sz w:val="21"/>
+          <w:szCs w:val="21"/>
+        </w:rPr>
+        <w:t xml:space="preserve">, lật gương), </w:t>
       </w:r>
       <w:r>
         <w:rPr>

</xml_diff>

<commit_message>
feat: Quote panelized boards in sets and label the board picker with the unit
The quotation line already carried the set count; the board picker in the quotation still said pcs. Record the decision in the report and drop it from the open issues.

Co-Authored-By: Claude Opus 5 <noreply@anthropic.com>
</commit_message>
<xml_diff>
--- a/docs/bao-cao/Bao-cao-DQPCB-2026-09-22.docx
+++ b/docs/bao-cao/Bao-cao-DQPCB-2026-09-22.docx
@@ -12261,6 +12261,42 @@
           <w:sz w:val="21"/>
           <w:szCs w:val="21"/>
         </w:rPr>
+        <w:t xml:space="preserve">Bo ghép panel: </w:t>
+      </w:r>
+      <w:r>
+        <w:rPr>
+          <w:rFonts w:ascii="Arial" w:cs="Arial" w:eastAsia="Arial" w:hAnsi="Arial"/>
+          <w:b/>
+          <w:bCs/>
+          <w:sz w:val="21"/>
+          <w:szCs w:val="21"/>
+        </w:rPr>
+        <w:t xml:space="preserve">SL = số set</w:t>
+      </w:r>
+      <w:r>
+        <w:rPr>
+          <w:rFonts w:ascii="Arial" w:cs="Arial" w:eastAsia="Arial" w:hAnsi="Arial"/>
+          <w:sz w:val="21"/>
+          <w:szCs w:val="21"/>
+        </w:rPr>
+        <w:t xml:space="preserve"> (đã chốt 22/09), đơn giá / set, ghi chú tự điền "Panel X*Y · N set".</w:t>
+      </w:r>
+    </w:p>
+    <w:p>
+      <w:pPr>
+        <w:pStyle w:val="ListParagraph"/>
+        <w:numPr>
+          <w:ilvl w:val="0"/>
+          <w:numId w:val="2"/>
+        </w:numPr>
+        <w:spacing w:after="60" w:line="264"/>
+      </w:pPr>
+      <w:r>
+        <w:rPr>
+          <w:rFonts w:ascii="Arial" w:cs="Arial" w:eastAsia="Arial" w:hAnsi="Arial"/>
+          <w:sz w:val="21"/>
+          <w:szCs w:val="21"/>
+        </w:rPr>
         <w:t xml:space="preserve">Tổng cộng, người lập, tài khoản nhận tiền.</w:t>
       </w:r>
     </w:p>
@@ -17477,34 +17513,6 @@
           <w:szCs w:val="21"/>
         </w:rPr>
         <w:t xml:space="preserve">: chỉ nhắc nhở; công thức chưa có phí V-cut.</w:t>
-      </w:r>
-    </w:p>
-    <w:p>
-      <w:pPr>
-        <w:pStyle w:val="ListParagraph"/>
-        <w:numPr>
-          <w:ilvl w:val="0"/>
-          <w:numId w:val="2"/>
-        </w:numPr>
-        <w:spacing w:after="60" w:line="264"/>
-      </w:pPr>
-      <w:r>
-        <w:rPr>
-          <w:rFonts w:ascii="Arial" w:cs="Arial" w:eastAsia="Arial" w:hAnsi="Arial"/>
-          <w:b/>
-          <w:bCs/>
-          <w:sz w:val="21"/>
-          <w:szCs w:val="21"/>
-        </w:rPr>
-        <w:t xml:space="preserve">Báo giá ghép panel ghi số set hay số PCB</w:t>
-      </w:r>
-      <w:r>
-        <w:rPr>
-          <w:rFonts w:ascii="Arial" w:cs="Arial" w:eastAsia="Arial" w:hAnsi="Arial"/>
-          <w:sz w:val="21"/>
-          <w:szCs w:val="21"/>
-        </w:rPr>
-        <w:t xml:space="preserve"> — đang ghi số set, chờ chốt.</w:t>
       </w:r>
     </w:p>
     <w:p>

</xml_diff>

<commit_message>
docs: Add panel detection and smallest-drill badge to the report
Co-Authored-By: Claude Opus 5 <noreply@anthropic.com>
</commit_message>
<xml_diff>
--- a/docs/bao-cao/Bao-cao-DQPCB-2026-09-22.docx
+++ b/docs/bao-cao/Bao-cao-DQPCB-2026-09-22.docx
@@ -11360,6 +11360,42 @@
           <w:sz w:val="21"/>
           <w:szCs w:val="21"/>
         </w:rPr>
+        <w:t xml:space="preserve">Mũi nhỏ nhất</w:t>
+      </w:r>
+      <w:r>
+        <w:rPr>
+          <w:rFonts w:ascii="Arial" w:cs="Arial" w:eastAsia="Arial" w:hAnsi="Arial"/>
+          <w:sz w:val="21"/>
+          <w:szCs w:val="21"/>
+        </w:rPr>
+        <w:t xml:space="preserve"> (lỗ tròn + số lỗ, rãnh hẹp nhất) · </w:t>
+      </w:r>
+      <w:r>
+        <w:rPr>
+          <w:rFonts w:ascii="Arial" w:cs="Arial" w:eastAsia="Arial" w:hAnsi="Arial"/>
+          <w:b/>
+          <w:bCs/>
+          <w:sz w:val="21"/>
+          <w:szCs w:val="21"/>
+        </w:rPr>
+        <w:t xml:space="preserve">Ghép</w:t>
+      </w:r>
+      <w:r>
+        <w:rPr>
+          <w:rFonts w:ascii="Arial" w:cs="Arial" w:eastAsia="Arial" w:hAnsi="Arial"/>
+          <w:sz w:val="21"/>
+          <w:szCs w:val="21"/>
+        </w:rPr>
+        <w:t xml:space="preserve"> có / có thể / không, bao nhiêu bo, nhận ra bằng cách nào · </w:t>
+      </w:r>
+      <w:r>
+        <w:rPr>
+          <w:rFonts w:ascii="Arial" w:cs="Arial" w:eastAsia="Arial" w:hAnsi="Arial"/>
+          <w:b/>
+          <w:bCs/>
+          <w:sz w:val="21"/>
+          <w:szCs w:val="21"/>
+        </w:rPr>
         <w:t xml:space="preserve">Load</w:t>
       </w:r>
       <w:r>
@@ -11927,7 +11963,7 @@
           <w:sz w:val="21"/>
           <w:szCs w:val="21"/>
         </w:rPr>
-        <w:t xml:space="preserve">: viền có từ 2 bo rời trở lên (bỏ rail, mảnh vụn, khung) → cảnh báo bảng tra chỉ cho bo lẻ, nút </w:t>
+        <w:t xml:space="preserve">: viền có từ 2 bo rời trở lên, hoặc cả bo lặp lại (panel chỉ ngăn bằng rãnh / V-cut, xem 4.4) → cảnh báo bảng tra chỉ cho bo lẻ, nút </w:t>
       </w:r>
       <w:r>
         <w:rPr>
@@ -17365,28 +17401,6 @@
       </w:r>
     </w:p>
     <w:p>
-      <w:r>
-        <w:br w:type="page"/>
-      </w:r>
-    </w:p>
-    <w:p>
-      <w:pPr>
-        <w:pStyle w:val="Heading1"/>
-        <w:spacing w:after="160" w:before="240"/>
-      </w:pPr>
-      <w:r>
-        <w:rPr>
-          <w:rFonts w:ascii="Arial" w:cs="Arial" w:eastAsia="Arial" w:hAnsi="Arial"/>
-          <w:b/>
-          <w:bCs/>
-          <w:color w:val="1F3864"/>
-          <w:sz w:val="30"/>
-          <w:szCs w:val="30"/>
-        </w:rPr>
-        <w:t xml:space="preserve">5. Vấn đề còn tồn &amp; checklist</w:t>
-      </w:r>
-    </w:p>
-    <w:p>
       <w:pPr>
         <w:pStyle w:val="Heading2"/>
         <w:spacing w:after="100" w:before="220"/>
@@ -17400,7 +17414,591 @@
           <w:sz w:val="25"/>
           <w:szCs w:val="25"/>
         </w:rPr>
-        <w:t xml:space="preserve">5.1 Vấn đề còn tồn</w:t>
+        <w:t xml:space="preserve">4.4 Nhận biết file ghép (6249b00)</w:t>
+      </w:r>
+    </w:p>
+    <w:tbl>
+      <w:tblPr>
+        <w:tblW w:type="dxa" w:w="9638"/>
+        <w:tblBorders>
+          <w:top w:val="single" w:color="auto" w:sz="4"/>
+          <w:left w:val="single" w:color="auto" w:sz="4"/>
+          <w:bottom w:val="single" w:color="auto" w:sz="4"/>
+          <w:right w:val="single" w:color="auto" w:sz="4"/>
+          <w:insideH w:val="single" w:color="auto" w:sz="4"/>
+          <w:insideV w:val="single" w:color="auto" w:sz="4"/>
+        </w:tblBorders>
+      </w:tblPr>
+      <w:tblGrid>
+        <w:gridCol w:w="963"/>
+        <w:gridCol w:w="5975"/>
+        <w:gridCol w:w="2700"/>
+      </w:tblGrid>
+      <w:tr>
+        <w:trPr>
+          <w:tblHeader/>
+        </w:trPr>
+        <w:tc>
+          <w:tcPr>
+            <w:tcW w:type="dxa" w:w="963"/>
+            <w:tcBorders>
+              <w:top w:val="single" w:color="BFBFBF" w:sz="4"/>
+              <w:left w:val="single" w:color="BFBFBF" w:sz="4"/>
+              <w:bottom w:val="single" w:color="BFBFBF" w:sz="4"/>
+              <w:right w:val="single" w:color="BFBFBF" w:sz="4"/>
+            </w:tcBorders>
+            <w:shd w:fill="DCE6F2" w:color="auto" w:val="clear"/>
+            <w:tcMar>
+              <w:top w:type="dxa" w:w="60"/>
+              <w:left w:type="dxa" w:w="100"/>
+              <w:bottom w:type="dxa" w:w="60"/>
+              <w:right w:type="dxa" w:w="100"/>
+            </w:tcMar>
+          </w:tcPr>
+          <w:p>
+            <w:pPr>
+              <w:spacing w:after="20"/>
+            </w:pPr>
+            <w:r>
+              <w:rPr>
+                <w:rFonts w:ascii="Arial" w:cs="Arial" w:eastAsia="Arial" w:hAnsi="Arial"/>
+                <w:b/>
+                <w:bCs/>
+                <w:sz w:val="19"/>
+                <w:szCs w:val="19"/>
+              </w:rPr>
+              <w:t xml:space="preserve">Thứ tự</w:t>
+            </w:r>
+          </w:p>
+        </w:tc>
+        <w:tc>
+          <w:tcPr>
+            <w:tcW w:type="dxa" w:w="5975"/>
+            <w:tcBorders>
+              <w:top w:val="single" w:color="BFBFBF" w:sz="4"/>
+              <w:left w:val="single" w:color="BFBFBF" w:sz="4"/>
+              <w:bottom w:val="single" w:color="BFBFBF" w:sz="4"/>
+              <w:right w:val="single" w:color="BFBFBF" w:sz="4"/>
+            </w:tcBorders>
+            <w:shd w:fill="DCE6F2" w:color="auto" w:val="clear"/>
+            <w:tcMar>
+              <w:top w:type="dxa" w:w="60"/>
+              <w:left w:type="dxa" w:w="100"/>
+              <w:bottom w:type="dxa" w:w="60"/>
+              <w:right w:type="dxa" w:w="100"/>
+            </w:tcMar>
+          </w:tcPr>
+          <w:p>
+            <w:pPr>
+              <w:spacing w:after="20"/>
+            </w:pPr>
+            <w:r>
+              <w:rPr>
+                <w:rFonts w:ascii="Arial" w:cs="Arial" w:eastAsia="Arial" w:hAnsi="Arial"/>
+                <w:b/>
+                <w:bCs/>
+                <w:sz w:val="19"/>
+                <w:szCs w:val="19"/>
+              </w:rPr>
+              <w:t xml:space="preserve">Dấu hiệu</w:t>
+            </w:r>
+          </w:p>
+        </w:tc>
+        <w:tc>
+          <w:tcPr>
+            <w:tcW w:type="dxa" w:w="2700"/>
+            <w:tcBorders>
+              <w:top w:val="single" w:color="BFBFBF" w:sz="4"/>
+              <w:left w:val="single" w:color="BFBFBF" w:sz="4"/>
+              <w:bottom w:val="single" w:color="BFBFBF" w:sz="4"/>
+              <w:right w:val="single" w:color="BFBFBF" w:sz="4"/>
+            </w:tcBorders>
+            <w:shd w:fill="DCE6F2" w:color="auto" w:val="clear"/>
+            <w:tcMar>
+              <w:top w:type="dxa" w:w="60"/>
+              <w:left w:type="dxa" w:w="100"/>
+              <w:bottom w:type="dxa" w:w="60"/>
+              <w:right w:type="dxa" w:w="100"/>
+            </w:tcMar>
+          </w:tcPr>
+          <w:p>
+            <w:pPr>
+              <w:spacing w:after="20"/>
+            </w:pPr>
+            <w:r>
+              <w:rPr>
+                <w:rFonts w:ascii="Arial" w:cs="Arial" w:eastAsia="Arial" w:hAnsi="Arial"/>
+                <w:b/>
+                <w:bCs/>
+                <w:sz w:val="19"/>
+                <w:szCs w:val="19"/>
+              </w:rPr>
+              <w:t xml:space="preserve">Kết luận</w:t>
+            </w:r>
+          </w:p>
+        </w:tc>
+      </w:tr>
+      <w:tr>
+        <w:trPr>
+          <w:tblHeader w:val="false"/>
+        </w:trPr>
+        <w:tc>
+          <w:tcPr>
+            <w:tcW w:type="dxa" w:w="963"/>
+            <w:tcBorders>
+              <w:top w:val="single" w:color="BFBFBF" w:sz="4"/>
+              <w:left w:val="single" w:color="BFBFBF" w:sz="4"/>
+              <w:bottom w:val="single" w:color="BFBFBF" w:sz="4"/>
+              <w:right w:val="single" w:color="BFBFBF" w:sz="4"/>
+            </w:tcBorders>
+            <w:tcMar>
+              <w:top w:type="dxa" w:w="60"/>
+              <w:left w:type="dxa" w:w="100"/>
+              <w:bottom w:type="dxa" w:w="60"/>
+              <w:right w:type="dxa" w:w="100"/>
+            </w:tcMar>
+          </w:tcPr>
+          <w:p>
+            <w:pPr>
+              <w:spacing w:after="20"/>
+            </w:pPr>
+            <w:r>
+              <w:rPr>
+                <w:rFonts w:ascii="Arial" w:cs="Arial" w:eastAsia="Arial" w:hAnsi="Arial"/>
+                <w:b w:val="false"/>
+                <w:bCs w:val="false"/>
+                <w:sz w:val="19"/>
+                <w:szCs w:val="19"/>
+              </w:rPr>
+              <w:t xml:space="preserve">1</w:t>
+            </w:r>
+          </w:p>
+        </w:tc>
+        <w:tc>
+          <w:tcPr>
+            <w:tcW w:type="dxa" w:w="5975"/>
+            <w:tcBorders>
+              <w:top w:val="single" w:color="BFBFBF" w:sz="4"/>
+              <w:left w:val="single" w:color="BFBFBF" w:sz="4"/>
+              <w:bottom w:val="single" w:color="BFBFBF" w:sz="4"/>
+              <w:right w:val="single" w:color="BFBFBF" w:sz="4"/>
+            </w:tcBorders>
+            <w:tcMar>
+              <w:top w:type="dxa" w:w="60"/>
+              <w:left w:type="dxa" w:w="100"/>
+              <w:bottom w:type="dxa" w:w="60"/>
+              <w:right w:type="dxa" w:w="100"/>
+            </w:tcMar>
+          </w:tcPr>
+          <w:p>
+            <w:pPr>
+              <w:spacing w:after="20"/>
+            </w:pPr>
+            <w:r>
+              <w:rPr>
+                <w:rFonts w:ascii="Arial" w:cs="Arial" w:eastAsia="Arial" w:hAnsi="Arial"/>
+                <w:b/>
+                <w:bCs/>
+                <w:sz w:val="19"/>
+                <w:szCs w:val="19"/>
+              </w:rPr>
+              <w:t xml:space="preserve">Viền rời</w:t>
+            </w:r>
+            <w:r>
+              <w:rPr>
+                <w:rFonts w:ascii="Arial" w:cs="Arial" w:eastAsia="Arial" w:hAnsi="Arial"/>
+                <w:b w:val="false"/>
+                <w:bCs w:val="false"/>
+                <w:sz w:val="19"/>
+                <w:szCs w:val="19"/>
+              </w:rPr>
+              <w:t xml:space="preserve">: lớp viền có ≥ 2 bo tách nhau (bỏ rail, mảnh vụn, khung ngoài)</w:t>
+            </w:r>
+          </w:p>
+        </w:tc>
+        <w:tc>
+          <w:tcPr>
+            <w:tcW w:type="dxa" w:w="2700"/>
+            <w:tcBorders>
+              <w:top w:val="single" w:color="BFBFBF" w:sz="4"/>
+              <w:left w:val="single" w:color="BFBFBF" w:sz="4"/>
+              <w:bottom w:val="single" w:color="BFBFBF" w:sz="4"/>
+              <w:right w:val="single" w:color="BFBFBF" w:sz="4"/>
+            </w:tcBorders>
+            <w:tcMar>
+              <w:top w:type="dxa" w:w="60"/>
+              <w:left w:type="dxa" w:w="100"/>
+              <w:bottom w:type="dxa" w:w="60"/>
+              <w:right w:type="dxa" w:w="100"/>
+            </w:tcMar>
+          </w:tcPr>
+          <w:p>
+            <w:pPr>
+              <w:spacing w:after="20"/>
+            </w:pPr>
+            <w:r>
+              <w:rPr>
+                <w:rFonts w:ascii="Arial" w:cs="Arial" w:eastAsia="Arial" w:hAnsi="Arial"/>
+                <w:b w:val="false"/>
+                <w:bCs w:val="false"/>
+                <w:sz w:val="19"/>
+                <w:szCs w:val="19"/>
+              </w:rPr>
+              <w:t xml:space="preserve">Có</w:t>
+            </w:r>
+          </w:p>
+        </w:tc>
+      </w:tr>
+      <w:tr>
+        <w:trPr>
+          <w:tblHeader w:val="false"/>
+        </w:trPr>
+        <w:tc>
+          <w:tcPr>
+            <w:tcW w:type="dxa" w:w="963"/>
+            <w:tcBorders>
+              <w:top w:val="single" w:color="BFBFBF" w:sz="4"/>
+              <w:left w:val="single" w:color="BFBFBF" w:sz="4"/>
+              <w:bottom w:val="single" w:color="BFBFBF" w:sz="4"/>
+              <w:right w:val="single" w:color="BFBFBF" w:sz="4"/>
+            </w:tcBorders>
+            <w:tcMar>
+              <w:top w:type="dxa" w:w="60"/>
+              <w:left w:type="dxa" w:w="100"/>
+              <w:bottom w:type="dxa" w:w="60"/>
+              <w:right w:type="dxa" w:w="100"/>
+            </w:tcMar>
+          </w:tcPr>
+          <w:p>
+            <w:pPr>
+              <w:spacing w:after="20"/>
+            </w:pPr>
+            <w:r>
+              <w:rPr>
+                <w:rFonts w:ascii="Arial" w:cs="Arial" w:eastAsia="Arial" w:hAnsi="Arial"/>
+                <w:b w:val="false"/>
+                <w:bCs w:val="false"/>
+                <w:sz w:val="19"/>
+                <w:szCs w:val="19"/>
+              </w:rPr>
+              <w:t xml:space="preserve">2</w:t>
+            </w:r>
+          </w:p>
+        </w:tc>
+        <w:tc>
+          <w:tcPr>
+            <w:tcW w:type="dxa" w:w="5975"/>
+            <w:tcBorders>
+              <w:top w:val="single" w:color="BFBFBF" w:sz="4"/>
+              <w:left w:val="single" w:color="BFBFBF" w:sz="4"/>
+              <w:bottom w:val="single" w:color="BFBFBF" w:sz="4"/>
+              <w:right w:val="single" w:color="BFBFBF" w:sz="4"/>
+            </w:tcBorders>
+            <w:tcMar>
+              <w:top w:type="dxa" w:w="60"/>
+              <w:left w:type="dxa" w:w="100"/>
+              <w:bottom w:type="dxa" w:w="60"/>
+              <w:right w:type="dxa" w:w="100"/>
+            </w:tcMar>
+          </w:tcPr>
+          <w:p>
+            <w:pPr>
+              <w:spacing w:after="20"/>
+            </w:pPr>
+            <w:r>
+              <w:rPr>
+                <w:rFonts w:ascii="Arial" w:cs="Arial" w:eastAsia="Arial" w:hAnsi="Arial"/>
+                <w:b/>
+                <w:bCs/>
+                <w:sz w:val="19"/>
+                <w:szCs w:val="19"/>
+              </w:rPr>
+              <w:t xml:space="preserve">Cả bo lặp lại</w:t>
+            </w:r>
+            <w:r>
+              <w:rPr>
+                <w:rFonts w:ascii="Arial" w:cs="Arial" w:eastAsia="Arial" w:hAnsi="Arial"/>
+                <w:b w:val="false"/>
+                <w:bCs w:val="false"/>
+                <w:sz w:val="19"/>
+                <w:szCs w:val="19"/>
+              </w:rPr>
+              <w:t xml:space="preserve"> theo một bước cỡ một bo. Chấm bằng </w:t>
+            </w:r>
+            <w:r>
+              <w:rPr>
+                <w:rFonts w:ascii="Arial" w:cs="Arial" w:eastAsia="Arial" w:hAnsi="Arial"/>
+                <w:b/>
+                <w:bCs/>
+                <w:sz w:val="19"/>
+                <w:szCs w:val="19"/>
+              </w:rPr>
+              <w:t xml:space="preserve">chữ in lụa</w:t>
+            </w:r>
+            <w:r>
+              <w:rPr>
+                <w:rFonts w:ascii="Arial" w:cs="Arial" w:eastAsia="Arial" w:hAnsi="Arial"/>
+                <w:b w:val="false"/>
+                <w:bCs w:val="false"/>
+                <w:sz w:val="19"/>
+                <w:szCs w:val="19"/>
+              </w:rPr>
+              <w:t xml:space="preserve"> (bo ghép lặp y hệt cả tên linh kiện; kênh giống nhau trong một bo thì tên mỗi kênh khác nhau), bo không có lụa thì bằng đồng. Bước ≥ 15% cạnh ngắn của tấm. Không dùng lỗ khoan (toạ độ lỗ có thể là đoán).</w:t>
+            </w:r>
+          </w:p>
+        </w:tc>
+        <w:tc>
+          <w:tcPr>
+            <w:tcW w:type="dxa" w:w="2700"/>
+            <w:tcBorders>
+              <w:top w:val="single" w:color="BFBFBF" w:sz="4"/>
+              <w:left w:val="single" w:color="BFBFBF" w:sz="4"/>
+              <w:bottom w:val="single" w:color="BFBFBF" w:sz="4"/>
+              <w:right w:val="single" w:color="BFBFBF" w:sz="4"/>
+            </w:tcBorders>
+            <w:tcMar>
+              <w:top w:type="dxa" w:w="60"/>
+              <w:left w:type="dxa" w:w="100"/>
+              <w:bottom w:type="dxa" w:w="60"/>
+              <w:right w:type="dxa" w:w="100"/>
+            </w:tcMar>
+          </w:tcPr>
+          <w:p>
+            <w:pPr>
+              <w:spacing w:after="20"/>
+            </w:pPr>
+            <w:r>
+              <w:rPr>
+                <w:rFonts w:ascii="Arial" w:cs="Arial" w:eastAsia="Arial" w:hAnsi="Arial"/>
+                <w:b w:val="false"/>
+                <w:bCs w:val="false"/>
+                <w:sz w:val="19"/>
+                <w:szCs w:val="19"/>
+              </w:rPr>
+              <w:t xml:space="preserve">Khớp ≥ 90% → Có; 60–90% → Có thể</w:t>
+            </w:r>
+          </w:p>
+        </w:tc>
+      </w:tr>
+      <w:tr>
+        <w:trPr>
+          <w:tblHeader w:val="false"/>
+        </w:trPr>
+        <w:tc>
+          <w:tcPr>
+            <w:tcW w:type="dxa" w:w="963"/>
+            <w:tcBorders>
+              <w:top w:val="single" w:color="BFBFBF" w:sz="4"/>
+              <w:left w:val="single" w:color="BFBFBF" w:sz="4"/>
+              <w:bottom w:val="single" w:color="BFBFBF" w:sz="4"/>
+              <w:right w:val="single" w:color="BFBFBF" w:sz="4"/>
+            </w:tcBorders>
+            <w:tcMar>
+              <w:top w:type="dxa" w:w="60"/>
+              <w:left w:type="dxa" w:w="100"/>
+              <w:bottom w:type="dxa" w:w="60"/>
+              <w:right w:type="dxa" w:w="100"/>
+            </w:tcMar>
+          </w:tcPr>
+          <w:p>
+            <w:pPr>
+              <w:spacing w:after="20"/>
+            </w:pPr>
+            <w:r>
+              <w:rPr>
+                <w:rFonts w:ascii="Arial" w:cs="Arial" w:eastAsia="Arial" w:hAnsi="Arial"/>
+                <w:b w:val="false"/>
+                <w:bCs w:val="false"/>
+                <w:sz w:val="19"/>
+                <w:szCs w:val="19"/>
+              </w:rPr>
+              <w:t xml:space="preserve">3</w:t>
+            </w:r>
+          </w:p>
+        </w:tc>
+        <w:tc>
+          <w:tcPr>
+            <w:tcW w:type="dxa" w:w="5975"/>
+            <w:tcBorders>
+              <w:top w:val="single" w:color="BFBFBF" w:sz="4"/>
+              <w:left w:val="single" w:color="BFBFBF" w:sz="4"/>
+              <w:bottom w:val="single" w:color="BFBFBF" w:sz="4"/>
+              <w:right w:val="single" w:color="BFBFBF" w:sz="4"/>
+            </w:tcBorders>
+            <w:tcMar>
+              <w:top w:type="dxa" w:w="60"/>
+              <w:left w:type="dxa" w:w="100"/>
+              <w:bottom w:type="dxa" w:w="60"/>
+              <w:right w:type="dxa" w:w="100"/>
+            </w:tcMar>
+          </w:tcPr>
+          <w:p>
+            <w:pPr>
+              <w:spacing w:after="20"/>
+            </w:pPr>
+            <w:r>
+              <w:rPr>
+                <w:rFonts w:ascii="Arial" w:cs="Arial" w:eastAsia="Arial" w:hAnsi="Arial"/>
+                <w:b w:val="false"/>
+                <w:bCs w:val="false"/>
+                <w:sz w:val="19"/>
+                <w:szCs w:val="19"/>
+              </w:rPr>
+              <w:t xml:space="preserve">Tên file chứa "ghep", "panel", "array"…</w:t>
+            </w:r>
+          </w:p>
+        </w:tc>
+        <w:tc>
+          <w:tcPr>
+            <w:tcW w:type="dxa" w:w="2700"/>
+            <w:tcBorders>
+              <w:top w:val="single" w:color="BFBFBF" w:sz="4"/>
+              <w:left w:val="single" w:color="BFBFBF" w:sz="4"/>
+              <w:bottom w:val="single" w:color="BFBFBF" w:sz="4"/>
+              <w:right w:val="single" w:color="BFBFBF" w:sz="4"/>
+            </w:tcBorders>
+            <w:tcMar>
+              <w:top w:type="dxa" w:w="60"/>
+              <w:left w:type="dxa" w:w="100"/>
+              <w:bottom w:type="dxa" w:w="60"/>
+              <w:right w:type="dxa" w:w="100"/>
+            </w:tcMar>
+          </w:tcPr>
+          <w:p>
+            <w:pPr>
+              <w:spacing w:after="20"/>
+            </w:pPr>
+            <w:r>
+              <w:rPr>
+                <w:rFonts w:ascii="Arial" w:cs="Arial" w:eastAsia="Arial" w:hAnsi="Arial"/>
+                <w:b w:val="false"/>
+                <w:bCs w:val="false"/>
+                <w:sz w:val="19"/>
+                <w:szCs w:val="19"/>
+              </w:rPr>
+              <w:t xml:space="preserve">Có thể</w:t>
+            </w:r>
+          </w:p>
+        </w:tc>
+      </w:tr>
+      <w:tr>
+        <w:trPr>
+          <w:tblHeader w:val="false"/>
+        </w:trPr>
+        <w:tc>
+          <w:tcPr>
+            <w:tcW w:type="dxa" w:w="963"/>
+            <w:tcBorders>
+              <w:top w:val="single" w:color="BFBFBF" w:sz="4"/>
+              <w:left w:val="single" w:color="BFBFBF" w:sz="4"/>
+              <w:bottom w:val="single" w:color="BFBFBF" w:sz="4"/>
+              <w:right w:val="single" w:color="BFBFBF" w:sz="4"/>
+            </w:tcBorders>
+            <w:tcMar>
+              <w:top w:type="dxa" w:w="60"/>
+              <w:left w:type="dxa" w:w="100"/>
+              <w:bottom w:type="dxa" w:w="60"/>
+              <w:right w:type="dxa" w:w="100"/>
+            </w:tcMar>
+          </w:tcPr>
+          <w:p>
+            <w:pPr>
+              <w:spacing w:after="20"/>
+            </w:pPr>
+            <w:r>
+              <w:rPr>
+                <w:rFonts w:ascii="Arial" w:cs="Arial" w:eastAsia="Arial" w:hAnsi="Arial"/>
+                <w:b w:val="false"/>
+                <w:bCs w:val="false"/>
+                <w:sz w:val="19"/>
+                <w:szCs w:val="19"/>
+              </w:rPr>
+              <w:t xml:space="preserve">—</w:t>
+            </w:r>
+          </w:p>
+        </w:tc>
+        <w:tc>
+          <w:tcPr>
+            <w:tcW w:type="dxa" w:w="5975"/>
+            <w:tcBorders>
+              <w:top w:val="single" w:color="BFBFBF" w:sz="4"/>
+              <w:left w:val="single" w:color="BFBFBF" w:sz="4"/>
+              <w:bottom w:val="single" w:color="BFBFBF" w:sz="4"/>
+              <w:right w:val="single" w:color="BFBFBF" w:sz="4"/>
+            </w:tcBorders>
+            <w:tcMar>
+              <w:top w:type="dxa" w:w="60"/>
+              <w:left w:type="dxa" w:w="100"/>
+              <w:bottom w:type="dxa" w:w="60"/>
+              <w:right w:type="dxa" w:w="100"/>
+            </w:tcMar>
+          </w:tcPr>
+          <w:p>
+            <w:pPr>
+              <w:spacing w:after="20"/>
+            </w:pPr>
+            <w:r>
+              <w:rPr>
+                <w:rFonts w:ascii="Arial" w:cs="Arial" w:eastAsia="Arial" w:hAnsi="Arial"/>
+                <w:b w:val="false"/>
+                <w:bCs w:val="false"/>
+                <w:sz w:val="19"/>
+                <w:szCs w:val="19"/>
+              </w:rPr>
+              <w:t xml:space="preserve">Không có dấu hiệu nào</w:t>
+            </w:r>
+          </w:p>
+        </w:tc>
+        <w:tc>
+          <w:tcPr>
+            <w:tcW w:type="dxa" w:w="2700"/>
+            <w:tcBorders>
+              <w:top w:val="single" w:color="BFBFBF" w:sz="4"/>
+              <w:left w:val="single" w:color="BFBFBF" w:sz="4"/>
+              <w:bottom w:val="single" w:color="BFBFBF" w:sz="4"/>
+              <w:right w:val="single" w:color="BFBFBF" w:sz="4"/>
+            </w:tcBorders>
+            <w:tcMar>
+              <w:top w:type="dxa" w:w="60"/>
+              <w:left w:type="dxa" w:w="100"/>
+              <w:bottom w:type="dxa" w:w="60"/>
+              <w:right w:type="dxa" w:w="100"/>
+            </w:tcMar>
+          </w:tcPr>
+          <w:p>
+            <w:pPr>
+              <w:spacing w:after="20"/>
+            </w:pPr>
+            <w:r>
+              <w:rPr>
+                <w:rFonts w:ascii="Arial" w:cs="Arial" w:eastAsia="Arial" w:hAnsi="Arial"/>
+                <w:b w:val="false"/>
+                <w:bCs w:val="false"/>
+                <w:sz w:val="19"/>
+                <w:szCs w:val="19"/>
+              </w:rPr>
+              <w:t xml:space="preserve">Không</w:t>
+            </w:r>
+          </w:p>
+        </w:tc>
+      </w:tr>
+    </w:tbl>
+    <w:p>
+      <w:pPr>
+        <w:pStyle w:val="ListParagraph"/>
+        <w:numPr>
+          <w:ilvl w:val="0"/>
+          <w:numId w:val="2"/>
+        </w:numPr>
+        <w:spacing w:after="60" w:line="264"/>
+      </w:pPr>
+      <w:r>
+        <w:rPr>
+          <w:rFonts w:ascii="Arial" w:cs="Arial" w:eastAsia="Arial" w:hAnsi="Arial"/>
+          <w:sz w:val="21"/>
+          <w:szCs w:val="21"/>
+        </w:rPr>
+        <w:t xml:space="preserve">Kết quả: FRIWO 55807 Có — 8 bo (4×2); PHAONUOC Có — 8 bo (2×4); CHAT_BOT_1 Có — 4 bo, viền rời; CHAT_BOT_4 có thể — 3+ bo (bo thứ 4 xoay); ESP32_DR, AGVH7 không.</w:t>
       </w:r>
     </w:p>
     <w:p>
@@ -17415,20 +18013,10 @@
       <w:r>
         <w:rPr>
           <w:rFonts w:ascii="Arial" w:cs="Arial" w:eastAsia="Arial" w:hAnsi="Arial"/>
-          <w:b/>
-          <w:bCs/>
-          <w:sz w:val="21"/>
-          <w:szCs w:val="21"/>
-        </w:rPr>
-        <w:t xml:space="preserve">Bộ OrCAD chỉ có .DRD</w:t>
-      </w:r>
-      <w:r>
-        <w:rPr>
-          <w:rFonts w:ascii="Arial" w:cs="Arial" w:eastAsia="Arial" w:hAnsi="Arial"/>
-          <w:sz w:val="21"/>
-          <w:szCs w:val="21"/>
-        </w:rPr>
-        <w:t xml:space="preserve"> (không có thruhole.tap): vẫn vẽ bản vẽ khoan làm lỗ — xem có file khoan thật không, hoặc chọn tay. (.DRD cạnh .tap đã sửa ở lỗi 14.)</w:t>
+          <w:sz w:val="21"/>
+          <w:szCs w:val="21"/>
+        </w:rPr>
+        <w:t xml:space="preserve">400 bộ ngẫu nhiên trong corpus: 11 Có (8 viền rời, 3 bo lặp lại), 4 Có thể (đa số có lẽ là bo lẻ nhiều kênh). Bản đầu nhận nhầm bo có bước 10.2 / 15.2 mm (hàng chân linh kiện) — đã loại nhờ chấm bằng lụa. Mỗi bo dò tối đa ~0.3 s.</w:t>
       </w:r>
     </w:p>
     <w:p>
@@ -17448,15 +18036,54 @@
           <w:sz w:val="21"/>
           <w:szCs w:val="21"/>
         </w:rPr>
-        <w:t xml:space="preserve">Tam giác chéo sai</w:t>
-      </w:r>
-      <w:r>
-        <w:rPr>
-          <w:rFonts w:ascii="Arial" w:cs="Arial" w:eastAsia="Arial" w:hAnsi="Arial"/>
-          <w:sz w:val="21"/>
-          <w:szCs w:val="21"/>
-        </w:rPr>
-        <w:t xml:space="preserve"> ở một số panel (Rail.zip, GWLRWEX-CELLULAR, ph_analyzer…): đa giác viền tô lệch. Bản cũ cũng bị.</w:t>
+        <w:t xml:space="preserve">Mũi khoan nhỏ nhất</w:t>
+      </w:r>
+      <w:r>
+        <w:rPr>
+          <w:rFonts w:ascii="Arial" w:cs="Arial" w:eastAsia="Arial" w:hAnsi="Arial"/>
+          <w:sz w:val="21"/>
+          <w:szCs w:val="21"/>
+        </w:rPr>
+        <w:t xml:space="preserve">: lỗ tròn nhỏ nhất + số lỗ cỡ đó; rãnh hẹp nhất = 2 × bán kính cung đầu rãnh.</w:t>
+      </w:r>
+    </w:p>
+    <w:p>
+      <w:r>
+        <w:br w:type="page"/>
+      </w:r>
+    </w:p>
+    <w:p>
+      <w:pPr>
+        <w:pStyle w:val="Heading1"/>
+        <w:spacing w:after="160" w:before="240"/>
+      </w:pPr>
+      <w:r>
+        <w:rPr>
+          <w:rFonts w:ascii="Arial" w:cs="Arial" w:eastAsia="Arial" w:hAnsi="Arial"/>
+          <w:b/>
+          <w:bCs/>
+          <w:color w:val="1F3864"/>
+          <w:sz w:val="30"/>
+          <w:szCs w:val="30"/>
+        </w:rPr>
+        <w:t xml:space="preserve">5. Vấn đề còn tồn &amp; checklist</w:t>
+      </w:r>
+    </w:p>
+    <w:p>
+      <w:pPr>
+        <w:pStyle w:val="Heading2"/>
+        <w:spacing w:after="100" w:before="220"/>
+      </w:pPr>
+      <w:r>
+        <w:rPr>
+          <w:rFonts w:ascii="Arial" w:cs="Arial" w:eastAsia="Arial" w:hAnsi="Arial"/>
+          <w:b/>
+          <w:bCs/>
+          <w:color w:val="2E5597"/>
+          <w:sz w:val="25"/>
+          <w:szCs w:val="25"/>
+        </w:rPr>
+        <w:t xml:space="preserve">5.1 Vấn đề còn tồn</w:t>
       </w:r>
     </w:p>
     <w:p>
@@ -17476,15 +18103,15 @@
           <w:sz w:val="21"/>
           <w:szCs w:val="21"/>
         </w:rPr>
-        <w:t xml:space="preserve">Bo ghép chỉ ngăn bằng rãnh / V-cut</w:t>
-      </w:r>
-      <w:r>
-        <w:rPr>
-          <w:rFonts w:ascii="Arial" w:cs="Arial" w:eastAsia="Arial" w:hAnsi="Arial"/>
-          <w:sz w:val="21"/>
-          <w:szCs w:val="21"/>
-        </w:rPr>
-        <w:t xml:space="preserve"> (CHAT_BOT_4, FRIWO 55807) vẫn đếm là 1 bo nên chưa có nhắc "nhiều bo ghép" (706ea9f đã nhắc cho file nhiều viền bo rời như CHAT_BOT_1).</w:t>
+        <w:t xml:space="preserve">Bộ OrCAD chỉ có .DRD</w:t>
+      </w:r>
+      <w:r>
+        <w:rPr>
+          <w:rFonts w:ascii="Arial" w:cs="Arial" w:eastAsia="Arial" w:hAnsi="Arial"/>
+          <w:sz w:val="21"/>
+          <w:szCs w:val="21"/>
+        </w:rPr>
+        <w:t xml:space="preserve"> (không có thruhole.tap): vẫn vẽ bản vẽ khoan làm lỗ — xem có file khoan thật không, hoặc chọn tay. (.DRD cạnh .tap đã sửa ở lỗi 14.)</w:t>
       </w:r>
     </w:p>
     <w:p>
@@ -17504,15 +18131,15 @@
           <w:sz w:val="21"/>
           <w:szCs w:val="21"/>
         </w:rPr>
-        <w:t xml:space="preserve">V-cut / mouse bite chưa vào giá</w:t>
-      </w:r>
-      <w:r>
-        <w:rPr>
-          <w:rFonts w:ascii="Arial" w:cs="Arial" w:eastAsia="Arial" w:hAnsi="Arial"/>
-          <w:sz w:val="21"/>
-          <w:szCs w:val="21"/>
-        </w:rPr>
-        <w:t xml:space="preserve">: chỉ nhắc nhở; công thức chưa có phí V-cut.</w:t>
+        <w:t xml:space="preserve">Tam giác chéo sai</w:t>
+      </w:r>
+      <w:r>
+        <w:rPr>
+          <w:rFonts w:ascii="Arial" w:cs="Arial" w:eastAsia="Arial" w:hAnsi="Arial"/>
+          <w:sz w:val="21"/>
+          <w:szCs w:val="21"/>
+        </w:rPr>
+        <w:t xml:space="preserve"> ở một số panel (Rail.zip, GWLRWEX-CELLULAR, ph_analyzer…): đa giác viền tô lệch. Bản cũ cũng bị.</w:t>
       </w:r>
     </w:p>
     <w:p>
@@ -17532,15 +18159,15 @@
           <w:sz w:val="21"/>
           <w:szCs w:val="21"/>
         </w:rPr>
-        <w:t xml:space="preserve">Bo 6 lớp chưa có đơn giá</w:t>
-      </w:r>
-      <w:r>
-        <w:rPr>
-          <w:rFonts w:ascii="Arial" w:cs="Arial" w:eastAsia="Arial" w:hAnsi="Arial"/>
-          <w:sz w:val="21"/>
-          <w:szCs w:val="21"/>
-        </w:rPr>
-        <w:t xml:space="preserve"> (phương án L6).</w:t>
+        <w:t xml:space="preserve">Nhận biết file ghép mức "Có thể"</w:t>
+      </w:r>
+      <w:r>
+        <w:rPr>
+          <w:rFonts w:ascii="Arial" w:cs="Arial" w:eastAsia="Arial" w:hAnsi="Arial"/>
+          <w:sz w:val="21"/>
+          <w:szCs w:val="21"/>
+        </w:rPr>
+        <w:t xml:space="preserve"> (khớp 60–90%): app không tự phân biệt bo ghép có một bo xoay (CHAT_BOT_4) với bo lẻ có nhiều kênh giống nhau (DAQ 6AI…) — người lập tự xem. (Panel chỉ ngăn bằng rãnh / V-cut như FRIWO đã nhận được từ 6249b00.)</w:t>
       </w:r>
     </w:p>
     <w:p>
@@ -17560,32 +18187,15 @@
           <w:sz w:val="21"/>
           <w:szCs w:val="21"/>
         </w:rPr>
-        <w:t xml:space="preserve">DFM chưa có</w:t>
-      </w:r>
-      <w:r>
-        <w:rPr>
-          <w:rFonts w:ascii="Arial" w:cs="Arial" w:eastAsia="Arial" w:hAnsi="Arial"/>
-          <w:sz w:val="21"/>
-          <w:szCs w:val="21"/>
-        </w:rPr>
-        <w:t xml:space="preserve">: đồng / lỗ khoan ngoài hoặc quá sát viền (như J11 ESP32_DR), trace/space, annular ring, đo kích thước.</w:t>
-      </w:r>
-    </w:p>
-    <w:p>
-      <w:pPr>
-        <w:pStyle w:val="Heading2"/>
-        <w:spacing w:after="100" w:before="220"/>
-      </w:pPr>
-      <w:r>
-        <w:rPr>
-          <w:rFonts w:ascii="Arial" w:cs="Arial" w:eastAsia="Arial" w:hAnsi="Arial"/>
-          <w:b/>
-          <w:bCs/>
-          <w:color w:val="2E5597"/>
-          <w:sz w:val="25"/>
-          <w:szCs w:val="25"/>
-        </w:rPr>
-        <w:t xml:space="preserve">5.2 Checklist khi sửa luật đọc file</w:t>
+        <w:t xml:space="preserve">V-cut / mouse bite chưa vào giá</w:t>
+      </w:r>
+      <w:r>
+        <w:rPr>
+          <w:rFonts w:ascii="Arial" w:cs="Arial" w:eastAsia="Arial" w:hAnsi="Arial"/>
+          <w:sz w:val="21"/>
+          <w:szCs w:val="21"/>
+        </w:rPr>
+        <w:t xml:space="preserve">: chỉ nhắc nhở; công thức chưa có phí V-cut.</w:t>
       </w:r>
     </w:p>
     <w:p>
@@ -17600,10 +18210,20 @@
       <w:r>
         <w:rPr>
           <w:rFonts w:ascii="Arial" w:cs="Arial" w:eastAsia="Arial" w:hAnsi="Arial"/>
-          <w:sz w:val="21"/>
-          <w:szCs w:val="21"/>
-        </w:rPr>
-        <w:t xml:space="preserve">Viết test trong test/ dựng lại đúng dáng file thật gây lỗi.</w:t>
+          <w:b/>
+          <w:bCs/>
+          <w:sz w:val="21"/>
+          <w:szCs w:val="21"/>
+        </w:rPr>
+        <w:t xml:space="preserve">Bo 6 lớp chưa có đơn giá</w:t>
+      </w:r>
+      <w:r>
+        <w:rPr>
+          <w:rFonts w:ascii="Arial" w:cs="Arial" w:eastAsia="Arial" w:hAnsi="Arial"/>
+          <w:sz w:val="21"/>
+          <w:szCs w:val="21"/>
+        </w:rPr>
+        <w:t xml:space="preserve"> (phương án L6).</w:t>
       </w:r>
     </w:p>
     <w:p>
@@ -17618,19 +18238,82 @@
       <w:r>
         <w:rPr>
           <w:rFonts w:ascii="Arial" w:cs="Arial" w:eastAsia="Arial" w:hAnsi="Arial"/>
-          <w:sz w:val="21"/>
-          <w:szCs w:val="21"/>
-        </w:rPr>
-        <w:t xml:space="preserve">Chạy </w:t>
-      </w:r>
-      <w:r>
-        <w:rPr>
-          <w:rFonts w:ascii="Arial" w:cs="Arial" w:eastAsia="Arial" w:hAnsi="Arial"/>
           <w:b/>
           <w:bCs/>
           <w:sz w:val="21"/>
           <w:szCs w:val="21"/>
         </w:rPr>
+        <w:t xml:space="preserve">DFM chưa có</w:t>
+      </w:r>
+      <w:r>
+        <w:rPr>
+          <w:rFonts w:ascii="Arial" w:cs="Arial" w:eastAsia="Arial" w:hAnsi="Arial"/>
+          <w:sz w:val="21"/>
+          <w:szCs w:val="21"/>
+        </w:rPr>
+        <w:t xml:space="preserve">: đồng / lỗ khoan ngoài hoặc quá sát viền (như J11 ESP32_DR), trace/space, annular ring, đo kích thước.</w:t>
+      </w:r>
+    </w:p>
+    <w:p>
+      <w:pPr>
+        <w:pStyle w:val="Heading2"/>
+        <w:spacing w:after="100" w:before="220"/>
+      </w:pPr>
+      <w:r>
+        <w:rPr>
+          <w:rFonts w:ascii="Arial" w:cs="Arial" w:eastAsia="Arial" w:hAnsi="Arial"/>
+          <w:b/>
+          <w:bCs/>
+          <w:color w:val="2E5597"/>
+          <w:sz w:val="25"/>
+          <w:szCs w:val="25"/>
+        </w:rPr>
+        <w:t xml:space="preserve">5.2 Checklist khi sửa luật đọc file</w:t>
+      </w:r>
+    </w:p>
+    <w:p>
+      <w:pPr>
+        <w:pStyle w:val="ListParagraph"/>
+        <w:numPr>
+          <w:ilvl w:val="0"/>
+          <w:numId w:val="2"/>
+        </w:numPr>
+        <w:spacing w:after="60" w:line="264"/>
+      </w:pPr>
+      <w:r>
+        <w:rPr>
+          <w:rFonts w:ascii="Arial" w:cs="Arial" w:eastAsia="Arial" w:hAnsi="Arial"/>
+          <w:sz w:val="21"/>
+          <w:szCs w:val="21"/>
+        </w:rPr>
+        <w:t xml:space="preserve">Viết test trong test/ dựng lại đúng dáng file thật gây lỗi.</w:t>
+      </w:r>
+    </w:p>
+    <w:p>
+      <w:pPr>
+        <w:pStyle w:val="ListParagraph"/>
+        <w:numPr>
+          <w:ilvl w:val="0"/>
+          <w:numId w:val="2"/>
+        </w:numPr>
+        <w:spacing w:after="60" w:line="264"/>
+      </w:pPr>
+      <w:r>
+        <w:rPr>
+          <w:rFonts w:ascii="Arial" w:cs="Arial" w:eastAsia="Arial" w:hAnsi="Arial"/>
+          <w:sz w:val="21"/>
+          <w:szCs w:val="21"/>
+        </w:rPr>
+        <w:t xml:space="preserve">Chạy </w:t>
+      </w:r>
+      <w:r>
+        <w:rPr>
+          <w:rFonts w:ascii="Arial" w:cs="Arial" w:eastAsia="Arial" w:hAnsi="Arial"/>
+          <w:b/>
+          <w:bCs/>
+          <w:sz w:val="21"/>
+          <w:szCs w:val="21"/>
+        </w:rPr>
         <w:t xml:space="preserve">npm run build</w:t>
       </w:r>
       <w:r>
@@ -17639,7 +18322,7 @@
           <w:sz w:val="21"/>
           <w:szCs w:val="21"/>
         </w:rPr>
-        <w:t xml:space="preserve"> (tsc -b chặt hơn tsc --noEmit — lỗi build Vercel ở f12b339 là do chỉ chạy lệnh nhẹ) và npx vitest run (146 test).</w:t>
+        <w:t xml:space="preserve"> (tsc -b chặt hơn tsc --noEmit — lỗi build Vercel ở f12b339 là do chỉ chạy lệnh nhẹ) và npx vitest run (150 test).</w:t>
       </w:r>
     </w:p>
     <w:p>

</xml_diff>

<commit_message>
docs: Record that panelized quotation lines carry the board count
Co-Authored-By: Claude Opus 5 <noreply@anthropic.com>
</commit_message>
<xml_diff>
--- a/docs/bao-cao/Bao-cao-DQPCB-2026-09-22.docx
+++ b/docs/bao-cao/Bao-cao-DQPCB-2026-09-22.docx
@@ -12307,15 +12307,15 @@
           <w:sz w:val="21"/>
           <w:szCs w:val="21"/>
         </w:rPr>
-        <w:t xml:space="preserve">SL = số set</w:t>
-      </w:r>
-      <w:r>
-        <w:rPr>
-          <w:rFonts w:ascii="Arial" w:cs="Arial" w:eastAsia="Arial" w:hAnsi="Arial"/>
-          <w:sz w:val="21"/>
-          <w:szCs w:val="21"/>
-        </w:rPr>
-        <w:t xml:space="preserve"> (đã chốt 22/09), đơn giá / set, ghi chú tự điền "Panel X*Y · N set".</w:t>
+        <w:t xml:space="preserve">SL = số bo</w:t>
+      </w:r>
+      <w:r>
+        <w:rPr>
+          <w:rFonts w:ascii="Arial" w:cs="Arial" w:eastAsia="Arial" w:hAnsi="Arial"/>
+          <w:sz w:val="21"/>
+          <w:szCs w:val="21"/>
+        </w:rPr>
+        <w:t xml:space="preserve"> khách nhận (vd 4 × 2, 50 set → 400; chốt 22/09), đơn giá / bo, số set trong ghi chú tự điền "Panel X*Y · N set"; sửa SL thì quy ra set (làm tròn lên) rồi tính lại tiền.</w:t>
       </w:r>
     </w:p>
     <w:p>

</xml_diff>

<commit_message>
docs: Add the board-switch speed survey and fix, and drill colours, to the report
Co-Authored-By: Claude Opus 5 <noreply@anthropic.com>
</commit_message>
<xml_diff>
--- a/docs/bao-cao/Bao-cao-DQPCB-2026-09-22.docx
+++ b/docs/bao-cao/Bao-cao-DQPCB-2026-09-22.docx
@@ -3006,6 +3006,139 @@
           </w:p>
         </w:tc>
       </w:tr>
+      <w:tr>
+        <w:trPr>
+          <w:tblHeader w:val="false"/>
+        </w:trPr>
+        <w:tc>
+          <w:tcPr>
+            <w:tcW w:type="dxa" w:w="481"/>
+            <w:tcBorders>
+              <w:top w:val="single" w:color="BFBFBF" w:sz="4"/>
+              <w:left w:val="single" w:color="BFBFBF" w:sz="4"/>
+              <w:bottom w:val="single" w:color="BFBFBF" w:sz="4"/>
+              <w:right w:val="single" w:color="BFBFBF" w:sz="4"/>
+            </w:tcBorders>
+            <w:tcMar>
+              <w:top w:type="dxa" w:w="60"/>
+              <w:left w:type="dxa" w:w="100"/>
+              <w:bottom w:type="dxa" w:w="60"/>
+              <w:right w:type="dxa" w:w="100"/>
+            </w:tcMar>
+          </w:tcPr>
+          <w:p>
+            <w:pPr>
+              <w:spacing w:after="20"/>
+            </w:pPr>
+            <w:r>
+              <w:rPr>
+                <w:rFonts w:ascii="Arial" w:cs="Arial" w:eastAsia="Arial" w:hAnsi="Arial"/>
+                <w:b w:val="false"/>
+                <w:bCs w:val="false"/>
+                <w:sz w:val="19"/>
+                <w:szCs w:val="19"/>
+              </w:rPr>
+              <w:t xml:space="preserve">18</w:t>
+            </w:r>
+          </w:p>
+        </w:tc>
+        <w:tc>
+          <w:tcPr>
+            <w:tcW w:type="dxa" w:w="4047"/>
+            <w:tcBorders>
+              <w:top w:val="single" w:color="BFBFBF" w:sz="4"/>
+              <w:left w:val="single" w:color="BFBFBF" w:sz="4"/>
+              <w:bottom w:val="single" w:color="BFBFBF" w:sz="4"/>
+              <w:right w:val="single" w:color="BFBFBF" w:sz="4"/>
+            </w:tcBorders>
+            <w:tcMar>
+              <w:top w:type="dxa" w:w="60"/>
+              <w:left w:type="dxa" w:w="100"/>
+              <w:bottom w:type="dxa" w:w="60"/>
+              <w:right w:type="dxa" w:w="100"/>
+            </w:tcMar>
+          </w:tcPr>
+          <w:p>
+            <w:pPr>
+              <w:spacing w:after="20"/>
+            </w:pPr>
+            <w:r>
+              <w:rPr>
+                <w:rFonts w:ascii="Arial" w:cs="Arial" w:eastAsia="Arial" w:hAnsi="Arial"/>
+                <w:b w:val="false"/>
+                <w:bCs w:val="false"/>
+                <w:sz w:val="19"/>
+                <w:szCs w:val="19"/>
+              </w:rPr>
+              <w:t xml:space="preserve">Chuyển qua lại giữa các bo đang mở chậm 0.5–3.3 s, không báo đang tải</w:t>
+            </w:r>
+          </w:p>
+        </w:tc>
+        <w:tc>
+          <w:tcPr>
+            <w:tcW w:type="dxa" w:w="2891"/>
+            <w:tcBorders>
+              <w:top w:val="single" w:color="BFBFBF" w:sz="4"/>
+              <w:left w:val="single" w:color="BFBFBF" w:sz="4"/>
+              <w:bottom w:val="single" w:color="BFBFBF" w:sz="4"/>
+              <w:right w:val="single" w:color="BFBFBF" w:sz="4"/>
+            </w:tcBorders>
+            <w:tcMar>
+              <w:top w:type="dxa" w:w="60"/>
+              <w:left w:type="dxa" w:w="100"/>
+              <w:bottom w:type="dxa" w:w="60"/>
+              <w:right w:type="dxa" w:w="100"/>
+            </w:tcMar>
+          </w:tcPr>
+          <w:p>
+            <w:pPr>
+              <w:spacing w:after="20"/>
+            </w:pPr>
+            <w:r>
+              <w:rPr>
+                <w:rFonts w:ascii="Arial" w:cs="Arial" w:eastAsia="Arial" w:hAnsi="Arial"/>
+                <w:b w:val="false"/>
+                <w:bCs w:val="false"/>
+                <w:sz w:val="19"/>
+                <w:szCs w:val="19"/>
+              </w:rPr>
+              <w:t xml:space="preserve">FRIWO, PHAONUOC, CHAT_BOT_4</w:t>
+            </w:r>
+          </w:p>
+        </w:tc>
+        <w:tc>
+          <w:tcPr>
+            <w:tcW w:type="dxa" w:w="2219"/>
+            <w:tcBorders>
+              <w:top w:val="single" w:color="BFBFBF" w:sz="4"/>
+              <w:left w:val="single" w:color="BFBFBF" w:sz="4"/>
+              <w:bottom w:val="single" w:color="BFBFBF" w:sz="4"/>
+              <w:right w:val="single" w:color="BFBFBF" w:sz="4"/>
+            </w:tcBorders>
+            <w:tcMar>
+              <w:top w:type="dxa" w:w="60"/>
+              <w:left w:type="dxa" w:w="100"/>
+              <w:bottom w:type="dxa" w:w="60"/>
+              <w:right w:type="dxa" w:w="100"/>
+            </w:tcMar>
+          </w:tcPr>
+          <w:p>
+            <w:pPr>
+              <w:spacing w:after="20"/>
+            </w:pPr>
+            <w:r>
+              <w:rPr>
+                <w:rFonts w:ascii="Arial" w:cs="Arial" w:eastAsia="Arial" w:hAnsi="Arial"/>
+                <w:b w:val="false"/>
+                <w:bCs w:val="false"/>
+                <w:sz w:val="19"/>
+                <w:szCs w:val="19"/>
+              </w:rPr>
+              <w:t xml:space="preserve">Đã sửa · 71bf3a5</w:t>
+            </w:r>
+          </w:p>
+        </w:tc>
+      </w:tr>
     </w:tbl>
     <w:p>
       <w:pPr>
@@ -10765,6 +10898,481 @@
           <w:sz w:val="25"/>
           <w:szCs w:val="25"/>
         </w:rPr>
+        <w:t xml:space="preserve">Lỗi 18 — Chuyển qua lại giữa các bo đang mở bị chậm</w:t>
+      </w:r>
+    </w:p>
+    <w:tbl>
+      <w:tblPr>
+        <w:tblW w:type="dxa" w:w="9638"/>
+        <w:tblBorders>
+          <w:top w:val="single" w:color="auto" w:sz="4"/>
+          <w:left w:val="single" w:color="auto" w:sz="4"/>
+          <w:bottom w:val="single" w:color="auto" w:sz="4"/>
+          <w:right w:val="single" w:color="auto" w:sz="4"/>
+          <w:insideH w:val="single" w:color="auto" w:sz="4"/>
+          <w:insideV w:val="single" w:color="auto" w:sz="4"/>
+        </w:tblBorders>
+      </w:tblPr>
+      <w:tblGrid>
+        <w:gridCol w:w="2120"/>
+        <w:gridCol w:w="7518"/>
+      </w:tblGrid>
+      <w:tr>
+        <w:trPr>
+          <w:tblHeader/>
+        </w:trPr>
+        <w:tc>
+          <w:tcPr>
+            <w:tcW w:type="dxa" w:w="2120"/>
+            <w:tcBorders>
+              <w:top w:val="single" w:color="BFBFBF" w:sz="4"/>
+              <w:left w:val="single" w:color="BFBFBF" w:sz="4"/>
+              <w:bottom w:val="single" w:color="BFBFBF" w:sz="4"/>
+              <w:right w:val="single" w:color="BFBFBF" w:sz="4"/>
+            </w:tcBorders>
+            <w:shd w:fill="DCE6F2" w:color="auto" w:val="clear"/>
+            <w:tcMar>
+              <w:top w:type="dxa" w:w="60"/>
+              <w:left w:type="dxa" w:w="100"/>
+              <w:bottom w:type="dxa" w:w="60"/>
+              <w:right w:type="dxa" w:w="100"/>
+            </w:tcMar>
+          </w:tcPr>
+          <w:p>
+            <w:pPr>
+              <w:spacing w:after="20"/>
+            </w:pPr>
+            <w:r>
+              <w:rPr>
+                <w:rFonts w:ascii="Arial" w:cs="Arial" w:eastAsia="Arial" w:hAnsi="Arial"/>
+                <w:b/>
+                <w:bCs/>
+                <w:sz w:val="19"/>
+                <w:szCs w:val="19"/>
+              </w:rPr>
+              <w:t xml:space="preserve">Mục</w:t>
+            </w:r>
+          </w:p>
+        </w:tc>
+        <w:tc>
+          <w:tcPr>
+            <w:tcW w:type="dxa" w:w="7518"/>
+            <w:tcBorders>
+              <w:top w:val="single" w:color="BFBFBF" w:sz="4"/>
+              <w:left w:val="single" w:color="BFBFBF" w:sz="4"/>
+              <w:bottom w:val="single" w:color="BFBFBF" w:sz="4"/>
+              <w:right w:val="single" w:color="BFBFBF" w:sz="4"/>
+            </w:tcBorders>
+            <w:shd w:fill="DCE6F2" w:color="auto" w:val="clear"/>
+            <w:tcMar>
+              <w:top w:type="dxa" w:w="60"/>
+              <w:left w:type="dxa" w:w="100"/>
+              <w:bottom w:type="dxa" w:w="60"/>
+              <w:right w:type="dxa" w:w="100"/>
+            </w:tcMar>
+          </w:tcPr>
+          <w:p>
+            <w:pPr>
+              <w:spacing w:after="20"/>
+            </w:pPr>
+            <w:r>
+              <w:rPr>
+                <w:rFonts w:ascii="Arial" w:cs="Arial" w:eastAsia="Arial" w:hAnsi="Arial"/>
+                <w:b/>
+                <w:bCs/>
+                <w:sz w:val="19"/>
+                <w:szCs w:val="19"/>
+              </w:rPr>
+              <w:t xml:space="preserve">Nội dung</w:t>
+            </w:r>
+          </w:p>
+        </w:tc>
+      </w:tr>
+      <w:tr>
+        <w:trPr>
+          <w:tblHeader w:val="false"/>
+        </w:trPr>
+        <w:tc>
+          <w:tcPr>
+            <w:tcW w:type="dxa" w:w="2120"/>
+            <w:tcBorders>
+              <w:top w:val="single" w:color="BFBFBF" w:sz="4"/>
+              <w:left w:val="single" w:color="BFBFBF" w:sz="4"/>
+              <w:bottom w:val="single" w:color="BFBFBF" w:sz="4"/>
+              <w:right w:val="single" w:color="BFBFBF" w:sz="4"/>
+            </w:tcBorders>
+            <w:tcMar>
+              <w:top w:type="dxa" w:w="60"/>
+              <w:left w:type="dxa" w:w="100"/>
+              <w:bottom w:type="dxa" w:w="60"/>
+              <w:right w:type="dxa" w:w="100"/>
+            </w:tcMar>
+          </w:tcPr>
+          <w:p>
+            <w:pPr>
+              <w:spacing w:after="20"/>
+            </w:pPr>
+            <w:r>
+              <w:rPr>
+                <w:rFonts w:ascii="Arial" w:cs="Arial" w:eastAsia="Arial" w:hAnsi="Arial"/>
+                <w:b w:val="false"/>
+                <w:bCs w:val="false"/>
+                <w:sz w:val="19"/>
+                <w:szCs w:val="19"/>
+              </w:rPr>
+              <w:t xml:space="preserve">Hiện tượng</w:t>
+            </w:r>
+          </w:p>
+        </w:tc>
+        <w:tc>
+          <w:tcPr>
+            <w:tcW w:type="dxa" w:w="7518"/>
+            <w:tcBorders>
+              <w:top w:val="single" w:color="BFBFBF" w:sz="4"/>
+              <w:left w:val="single" w:color="BFBFBF" w:sz="4"/>
+              <w:bottom w:val="single" w:color="BFBFBF" w:sz="4"/>
+              <w:right w:val="single" w:color="BFBFBF" w:sz="4"/>
+            </w:tcBorders>
+            <w:tcMar>
+              <w:top w:type="dxa" w:w="60"/>
+              <w:left w:type="dxa" w:w="100"/>
+              <w:bottom w:type="dxa" w:w="60"/>
+              <w:right w:type="dxa" w:w="100"/>
+            </w:tcMar>
+          </w:tcPr>
+          <w:p>
+            <w:pPr>
+              <w:spacing w:after="20"/>
+            </w:pPr>
+            <w:r>
+              <w:rPr>
+                <w:rFonts w:ascii="Arial" w:cs="Arial" w:eastAsia="Arial" w:hAnsi="Arial"/>
+                <w:b w:val="false"/>
+                <w:bCs w:val="false"/>
+                <w:sz w:val="19"/>
+                <w:szCs w:val="19"/>
+              </w:rPr>
+              <w:t xml:space="preserve">Mở 3 file, đang xem file 3, bấm lại file 1 → chờ 0.5–3.3 s (FRIWO 3.3 s, bấm lại lần 2 vẫn 3.2 s), không có dấu hiệu đang tải → tưởng app treo.</w:t>
+            </w:r>
+          </w:p>
+        </w:tc>
+      </w:tr>
+      <w:tr>
+        <w:trPr>
+          <w:tblHeader w:val="false"/>
+        </w:trPr>
+        <w:tc>
+          <w:tcPr>
+            <w:tcW w:type="dxa" w:w="2120"/>
+            <w:tcBorders>
+              <w:top w:val="single" w:color="BFBFBF" w:sz="4"/>
+              <w:left w:val="single" w:color="BFBFBF" w:sz="4"/>
+              <w:bottom w:val="single" w:color="BFBFBF" w:sz="4"/>
+              <w:right w:val="single" w:color="BFBFBF" w:sz="4"/>
+            </w:tcBorders>
+            <w:tcMar>
+              <w:top w:type="dxa" w:w="60"/>
+              <w:left w:type="dxa" w:w="100"/>
+              <w:bottom w:type="dxa" w:w="60"/>
+              <w:right w:type="dxa" w:w="100"/>
+            </w:tcMar>
+          </w:tcPr>
+          <w:p>
+            <w:pPr>
+              <w:spacing w:after="20"/>
+            </w:pPr>
+            <w:r>
+              <w:rPr>
+                <w:rFonts w:ascii="Arial" w:cs="Arial" w:eastAsia="Arial" w:hAnsi="Arial"/>
+                <w:b w:val="false"/>
+                <w:bCs w:val="false"/>
+                <w:sz w:val="19"/>
+                <w:szCs w:val="19"/>
+              </w:rPr>
+              <w:t xml:space="preserve">Nguyên nhân</w:t>
+            </w:r>
+          </w:p>
+        </w:tc>
+        <w:tc>
+          <w:tcPr>
+            <w:tcW w:type="dxa" w:w="7518"/>
+            <w:tcBorders>
+              <w:top w:val="single" w:color="BFBFBF" w:sz="4"/>
+              <w:left w:val="single" w:color="BFBFBF" w:sz="4"/>
+              <w:bottom w:val="single" w:color="BFBFBF" w:sz="4"/>
+              <w:right w:val="single" w:color="BFBFBF" w:sz="4"/>
+            </w:tcBorders>
+            <w:tcMar>
+              <w:top w:type="dxa" w:w="60"/>
+              <w:left w:type="dxa" w:w="100"/>
+              <w:bottom w:type="dxa" w:w="60"/>
+              <w:right w:type="dxa" w:w="100"/>
+            </w:tcMar>
+          </w:tcPr>
+          <w:p>
+            <w:pPr>
+              <w:spacing w:after="20"/>
+            </w:pPr>
+            <w:r>
+              <w:rPr>
+                <w:rFonts w:ascii="Arial" w:cs="Arial" w:eastAsia="Arial" w:hAnsi="Arial"/>
+                <w:b w:val="false"/>
+                <w:bCs w:val="false"/>
+                <w:sz w:val="19"/>
+                <w:szCs w:val="19"/>
+              </w:rPr>
+              <w:t xml:space="preserve">Bộ nhớ hình đã dựng chỉ giữ </w:t>
+            </w:r>
+            <w:r>
+              <w:rPr>
+                <w:rFonts w:ascii="Arial" w:cs="Arial" w:eastAsia="Arial" w:hAnsi="Arial"/>
+                <w:b/>
+                <w:bCs/>
+                <w:sz w:val="19"/>
+                <w:szCs w:val="19"/>
+              </w:rPr>
+              <w:t xml:space="preserve">một</w:t>
+            </w:r>
+            <w:r>
+              <w:rPr>
+                <w:rFonts w:ascii="Arial" w:cs="Arial" w:eastAsia="Arial" w:hAnsi="Arial"/>
+                <w:b w:val="false"/>
+                <w:bCs w:val="false"/>
+                <w:sz w:val="19"/>
+                <w:szCs w:val="19"/>
+              </w:rPr>
+              <w:t xml:space="preserve"> bo — đổi bo là xoá sạch rồi dựng lại từ đầu; dựng hình chạy đồng bộ, chặn cả giao diện. File không đọc lại, chậm hoàn toàn ở bước dựng.</w:t>
+            </w:r>
+          </w:p>
+        </w:tc>
+      </w:tr>
+      <w:tr>
+        <w:trPr>
+          <w:tblHeader w:val="false"/>
+        </w:trPr>
+        <w:tc>
+          <w:tcPr>
+            <w:tcW w:type="dxa" w:w="2120"/>
+            <w:tcBorders>
+              <w:top w:val="single" w:color="BFBFBF" w:sz="4"/>
+              <w:left w:val="single" w:color="BFBFBF" w:sz="4"/>
+              <w:bottom w:val="single" w:color="BFBFBF" w:sz="4"/>
+              <w:right w:val="single" w:color="BFBFBF" w:sz="4"/>
+            </w:tcBorders>
+            <w:tcMar>
+              <w:top w:type="dxa" w:w="60"/>
+              <w:left w:type="dxa" w:w="100"/>
+              <w:bottom w:type="dxa" w:w="60"/>
+              <w:right w:type="dxa" w:w="100"/>
+            </w:tcMar>
+          </w:tcPr>
+          <w:p>
+            <w:pPr>
+              <w:spacing w:after="20"/>
+            </w:pPr>
+            <w:r>
+              <w:rPr>
+                <w:rFonts w:ascii="Arial" w:cs="Arial" w:eastAsia="Arial" w:hAnsi="Arial"/>
+                <w:b w:val="false"/>
+                <w:bCs w:val="false"/>
+                <w:sz w:val="19"/>
+                <w:szCs w:val="19"/>
+              </w:rPr>
+              <w:t xml:space="preserve">Cách giải quyết</w:t>
+            </w:r>
+          </w:p>
+        </w:tc>
+        <w:tc>
+          <w:tcPr>
+            <w:tcW w:type="dxa" w:w="7518"/>
+            <w:tcBorders>
+              <w:top w:val="single" w:color="BFBFBF" w:sz="4"/>
+              <w:left w:val="single" w:color="BFBFBF" w:sz="4"/>
+              <w:bottom w:val="single" w:color="BFBFBF" w:sz="4"/>
+              <w:right w:val="single" w:color="BFBFBF" w:sz="4"/>
+            </w:tcBorders>
+            <w:tcMar>
+              <w:top w:type="dxa" w:w="60"/>
+              <w:left w:type="dxa" w:w="100"/>
+              <w:bottom w:type="dxa" w:w="60"/>
+              <w:right w:type="dxa" w:w="100"/>
+            </w:tcMar>
+          </w:tcPr>
+          <w:p>
+            <w:pPr>
+              <w:spacing w:after="20"/>
+            </w:pPr>
+            <w:r>
+              <w:rPr>
+                <w:rFonts w:ascii="Arial" w:cs="Arial" w:eastAsia="Arial" w:hAnsi="Arial"/>
+                <w:b w:val="false"/>
+                <w:bCs w:val="false"/>
+                <w:sz w:val="19"/>
+                <w:szCs w:val="19"/>
+              </w:rPr>
+              <w:t xml:space="preserve">(1) Giữ hình theo từng bo, tối đa 5 bo gần nhất, giải phóng khi đóng bo. (2) Chuyển sang bo chưa có hình thì bật màn chờ "Đang dựng hình…" trước. (3) Dựng sẵn ở nền các bo còn lại lúc trình duyệt rảnh, mỗi lượt một lớp.</w:t>
+            </w:r>
+          </w:p>
+        </w:tc>
+      </w:tr>
+      <w:tr>
+        <w:trPr>
+          <w:tblHeader w:val="false"/>
+        </w:trPr>
+        <w:tc>
+          <w:tcPr>
+            <w:tcW w:type="dxa" w:w="2120"/>
+            <w:tcBorders>
+              <w:top w:val="single" w:color="BFBFBF" w:sz="4"/>
+              <w:left w:val="single" w:color="BFBFBF" w:sz="4"/>
+              <w:bottom w:val="single" w:color="BFBFBF" w:sz="4"/>
+              <w:right w:val="single" w:color="BFBFBF" w:sz="4"/>
+            </w:tcBorders>
+            <w:tcMar>
+              <w:top w:type="dxa" w:w="60"/>
+              <w:left w:type="dxa" w:w="100"/>
+              <w:bottom w:type="dxa" w:w="60"/>
+              <w:right w:type="dxa" w:w="100"/>
+            </w:tcMar>
+          </w:tcPr>
+          <w:p>
+            <w:pPr>
+              <w:spacing w:after="20"/>
+            </w:pPr>
+            <w:r>
+              <w:rPr>
+                <w:rFonts w:ascii="Arial" w:cs="Arial" w:eastAsia="Arial" w:hAnsi="Arial"/>
+                <w:b w:val="false"/>
+                <w:bCs w:val="false"/>
+                <w:sz w:val="19"/>
+                <w:szCs w:val="19"/>
+              </w:rPr>
+              <w:t xml:space="preserve">Kiểm</w:t>
+            </w:r>
+          </w:p>
+        </w:tc>
+        <w:tc>
+          <w:tcPr>
+            <w:tcW w:type="dxa" w:w="7518"/>
+            <w:tcBorders>
+              <w:top w:val="single" w:color="BFBFBF" w:sz="4"/>
+              <w:left w:val="single" w:color="BFBFBF" w:sz="4"/>
+              <w:bottom w:val="single" w:color="BFBFBF" w:sz="4"/>
+              <w:right w:val="single" w:color="BFBFBF" w:sz="4"/>
+            </w:tcBorders>
+            <w:tcMar>
+              <w:top w:type="dxa" w:w="60"/>
+              <w:left w:type="dxa" w:w="100"/>
+              <w:bottom w:type="dxa" w:w="60"/>
+              <w:right w:type="dxa" w:w="100"/>
+            </w:tcMar>
+          </w:tcPr>
+          <w:p>
+            <w:pPr>
+              <w:spacing w:after="20"/>
+            </w:pPr>
+            <w:r>
+              <w:rPr>
+                <w:rFonts w:ascii="Arial" w:cs="Arial" w:eastAsia="Arial" w:hAnsi="Arial"/>
+                <w:b w:val="false"/>
+                <w:bCs w:val="false"/>
+                <w:sz w:val="19"/>
+                <w:szCs w:val="19"/>
+              </w:rPr>
+              <w:t xml:space="preserve">FRIWO 3.30 → 0.06 s, PHAONUOC 1.89 → 0.05 s, CHAT_BOT_4 0.47 → 0.08 s; FRIWO ở 2D chưa từng xem (nhờ dựng sẵn) 0.055 s.</w:t>
+            </w:r>
+          </w:p>
+        </w:tc>
+      </w:tr>
+      <w:tr>
+        <w:trPr>
+          <w:tblHeader w:val="false"/>
+        </w:trPr>
+        <w:tc>
+          <w:tcPr>
+            <w:tcW w:type="dxa" w:w="2120"/>
+            <w:tcBorders>
+              <w:top w:val="single" w:color="BFBFBF" w:sz="4"/>
+              <w:left w:val="single" w:color="BFBFBF" w:sz="4"/>
+              <w:bottom w:val="single" w:color="BFBFBF" w:sz="4"/>
+              <w:right w:val="single" w:color="BFBFBF" w:sz="4"/>
+            </w:tcBorders>
+            <w:tcMar>
+              <w:top w:type="dxa" w:w="60"/>
+              <w:left w:type="dxa" w:w="100"/>
+              <w:bottom w:type="dxa" w:w="60"/>
+              <w:right w:type="dxa" w:w="100"/>
+            </w:tcMar>
+          </w:tcPr>
+          <w:p>
+            <w:pPr>
+              <w:spacing w:after="20"/>
+            </w:pPr>
+            <w:r>
+              <w:rPr>
+                <w:rFonts w:ascii="Arial" w:cs="Arial" w:eastAsia="Arial" w:hAnsi="Arial"/>
+                <w:b w:val="false"/>
+                <w:bCs w:val="false"/>
+                <w:sz w:val="19"/>
+                <w:szCs w:val="19"/>
+              </w:rPr>
+              <w:t xml:space="preserve">Còn lại</w:t>
+            </w:r>
+          </w:p>
+        </w:tc>
+        <w:tc>
+          <w:tcPr>
+            <w:tcW w:type="dxa" w:w="7518"/>
+            <w:tcBorders>
+              <w:top w:val="single" w:color="BFBFBF" w:sz="4"/>
+              <w:left w:val="single" w:color="BFBFBF" w:sz="4"/>
+              <w:bottom w:val="single" w:color="BFBFBF" w:sz="4"/>
+              <w:right w:val="single" w:color="BFBFBF" w:sz="4"/>
+            </w:tcBorders>
+            <w:tcMar>
+              <w:top w:type="dxa" w:w="60"/>
+              <w:left w:type="dxa" w:w="100"/>
+              <w:bottom w:type="dxa" w:w="60"/>
+              <w:right w:type="dxa" w:w="100"/>
+            </w:tcMar>
+          </w:tcPr>
+          <w:p>
+            <w:pPr>
+              <w:spacing w:after="20"/>
+            </w:pPr>
+            <w:r>
+              <w:rPr>
+                <w:rFonts w:ascii="Arial" w:cs="Arial" w:eastAsia="Arial" w:hAnsi="Arial"/>
+                <w:b w:val="false"/>
+                <w:bCs w:val="false"/>
+                <w:sz w:val="19"/>
+                <w:szCs w:val="19"/>
+              </w:rPr>
+              <w:t xml:space="preserve">Bấm ngay khi lớp nặng đang dựng dở ở nền thì chờ lớp đó xong (đo được 1.6 s).</w:t>
+            </w:r>
+          </w:p>
+        </w:tc>
+      </w:tr>
+    </w:tbl>
+    <w:p>
+      <w:pPr>
+        <w:spacing w:after="80"/>
+      </w:pPr>
+    </w:p>
+    <w:p>
+      <w:pPr>
+        <w:pStyle w:val="Heading2"/>
+        <w:spacing w:after="100" w:before="220"/>
+      </w:pPr>
+      <w:r>
+        <w:rPr>
+          <w:rFonts w:ascii="Arial" w:cs="Arial" w:eastAsia="Arial" w:hAnsi="Arial"/>
+          <w:b/>
+          <w:bCs/>
+          <w:color w:val="2E5597"/>
+          <w:sz w:val="25"/>
+          <w:szCs w:val="25"/>
+        </w:rPr>
         <w:t xml:space="preserve">Ghi chú — "mất logo" khi chụp (không phải lỗi app)</w:t>
       </w:r>
     </w:p>
@@ -11025,7 +11633,25 @@
           <w:sz w:val="21"/>
           <w:szCs w:val="21"/>
         </w:rPr>
-        <w:t xml:space="preserve"> cùng lúc: tab trên máy tính, dropdown trên điện thoại; phần nhập giá nhớ riêng từng bo.</w:t>
+        <w:t xml:space="preserve"> cùng lúc: tab trên máy tính, dropdown trên điện thoại; phần nhập giá nhớ riêng từng bo. </w:t>
+      </w:r>
+      <w:r>
+        <w:rPr>
+          <w:rFonts w:ascii="Arial" w:cs="Arial" w:eastAsia="Arial" w:hAnsi="Arial"/>
+          <w:b/>
+          <w:bCs/>
+          <w:sz w:val="21"/>
+          <w:szCs w:val="21"/>
+        </w:rPr>
+        <w:t xml:space="preserve">Chuyển bo tức thì</w:t>
+      </w:r>
+      <w:r>
+        <w:rPr>
+          <w:rFonts w:ascii="Arial" w:cs="Arial" w:eastAsia="Arial" w:hAnsi="Arial"/>
+          <w:sz w:val="21"/>
+          <w:szCs w:val="21"/>
+        </w:rPr>
+        <w:t xml:space="preserve">: giữ hình đã dựng của 5 bo gần nhất, dựng sẵn các bo còn lại ở nền; bo chưa dựng thì hiện màn chờ.</w:t>
       </w:r>
     </w:p>
     <w:p>
@@ -11368,7 +11994,7 @@
           <w:sz w:val="21"/>
           <w:szCs w:val="21"/>
         </w:rPr>
-        <w:t xml:space="preserve"> (lỗ tròn + số lỗ, rãnh hẹp nhất) · </w:t>
+        <w:t xml:space="preserve"> (lỗ tròn + số lỗ, rãnh hẹp nhất; dưới 0.254 mm đỏ, dưới 0.3 mm vàng) · </w:t>
       </w:r>
       <w:r>
         <w:rPr>

</xml_diff>

<commit_message>
docs: Add the Anh Nhat missing board-core fix to the report
Co-Authored-By: Claude Opus 5 <noreply@anthropic.com>
</commit_message>
<xml_diff>
--- a/docs/bao-cao/Bao-cao-DQPCB-2026-09-22.docx
+++ b/docs/bao-cao/Bao-cao-DQPCB-2026-09-22.docx
@@ -3139,6 +3139,139 @@
           </w:p>
         </w:tc>
       </w:tr>
+      <w:tr>
+        <w:trPr>
+          <w:tblHeader w:val="false"/>
+        </w:trPr>
+        <w:tc>
+          <w:tcPr>
+            <w:tcW w:type="dxa" w:w="481"/>
+            <w:tcBorders>
+              <w:top w:val="single" w:color="BFBFBF" w:sz="4"/>
+              <w:left w:val="single" w:color="BFBFBF" w:sz="4"/>
+              <w:bottom w:val="single" w:color="BFBFBF" w:sz="4"/>
+              <w:right w:val="single" w:color="BFBFBF" w:sz="4"/>
+            </w:tcBorders>
+            <w:tcMar>
+              <w:top w:type="dxa" w:w="60"/>
+              <w:left w:type="dxa" w:w="100"/>
+              <w:bottom w:type="dxa" w:w="60"/>
+              <w:right w:type="dxa" w:w="100"/>
+            </w:tcMar>
+          </w:tcPr>
+          <w:p>
+            <w:pPr>
+              <w:spacing w:after="20"/>
+            </w:pPr>
+            <w:r>
+              <w:rPr>
+                <w:rFonts w:ascii="Arial" w:cs="Arial" w:eastAsia="Arial" w:hAnsi="Arial"/>
+                <w:b w:val="false"/>
+                <w:bCs w:val="false"/>
+                <w:sz w:val="19"/>
+                <w:szCs w:val="19"/>
+              </w:rPr>
+              <w:t xml:space="preserve">19</w:t>
+            </w:r>
+          </w:p>
+        </w:tc>
+        <w:tc>
+          <w:tcPr>
+            <w:tcW w:type="dxa" w:w="4047"/>
+            <w:tcBorders>
+              <w:top w:val="single" w:color="BFBFBF" w:sz="4"/>
+              <w:left w:val="single" w:color="BFBFBF" w:sz="4"/>
+              <w:bottom w:val="single" w:color="BFBFBF" w:sz="4"/>
+              <w:right w:val="single" w:color="BFBFBF" w:sz="4"/>
+            </w:tcBorders>
+            <w:tcMar>
+              <w:top w:type="dxa" w:w="60"/>
+              <w:left w:type="dxa" w:w="100"/>
+              <w:bottom w:type="dxa" w:w="60"/>
+              <w:right w:type="dxa" w:w="100"/>
+            </w:tcMar>
+          </w:tcPr>
+          <w:p>
+            <w:pPr>
+              <w:spacing w:after="20"/>
+            </w:pPr>
+            <w:r>
+              <w:rPr>
+                <w:rFonts w:ascii="Arial" w:cs="Arial" w:eastAsia="Arial" w:hAnsi="Arial"/>
+                <w:b w:val="false"/>
+                <w:bCs w:val="false"/>
+                <w:sz w:val="19"/>
+                <w:szCs w:val="19"/>
+              </w:rPr>
+              <w:t xml:space="preserve">2D / 3D mất lõi bo: vùng tô trong lớp viền làm khung bo bị gán sai kiểu</w:t>
+            </w:r>
+          </w:p>
+        </w:tc>
+        <w:tc>
+          <w:tcPr>
+            <w:tcW w:type="dxa" w:w="2891"/>
+            <w:tcBorders>
+              <w:top w:val="single" w:color="BFBFBF" w:sz="4"/>
+              <w:left w:val="single" w:color="BFBFBF" w:sz="4"/>
+              <w:bottom w:val="single" w:color="BFBFBF" w:sz="4"/>
+              <w:right w:val="single" w:color="BFBFBF" w:sz="4"/>
+            </w:tcBorders>
+            <w:tcMar>
+              <w:top w:type="dxa" w:w="60"/>
+              <w:left w:type="dxa" w:w="100"/>
+              <w:bottom w:type="dxa" w:w="60"/>
+              <w:right w:type="dxa" w:w="100"/>
+            </w:tcMar>
+          </w:tcPr>
+          <w:p>
+            <w:pPr>
+              <w:spacing w:after="20"/>
+            </w:pPr>
+            <w:r>
+              <w:rPr>
+                <w:rFonts w:ascii="Arial" w:cs="Arial" w:eastAsia="Arial" w:hAnsi="Arial"/>
+                <w:b w:val="false"/>
+                <w:bCs w:val="false"/>
+                <w:sz w:val="19"/>
+                <w:szCs w:val="19"/>
+              </w:rPr>
+              <w:t xml:space="preserve">Anh Nhat — Gerber Anh Nhat (+ 2 bộ)</w:t>
+            </w:r>
+          </w:p>
+        </w:tc>
+        <w:tc>
+          <w:tcPr>
+            <w:tcW w:type="dxa" w:w="2219"/>
+            <w:tcBorders>
+              <w:top w:val="single" w:color="BFBFBF" w:sz="4"/>
+              <w:left w:val="single" w:color="BFBFBF" w:sz="4"/>
+              <w:bottom w:val="single" w:color="BFBFBF" w:sz="4"/>
+              <w:right w:val="single" w:color="BFBFBF" w:sz="4"/>
+            </w:tcBorders>
+            <w:tcMar>
+              <w:top w:type="dxa" w:w="60"/>
+              <w:left w:type="dxa" w:w="100"/>
+              <w:bottom w:type="dxa" w:w="60"/>
+              <w:right w:type="dxa" w:w="100"/>
+            </w:tcMar>
+          </w:tcPr>
+          <w:p>
+            <w:pPr>
+              <w:spacing w:after="20"/>
+            </w:pPr>
+            <w:r>
+              <w:rPr>
+                <w:rFonts w:ascii="Arial" w:cs="Arial" w:eastAsia="Arial" w:hAnsi="Arial"/>
+                <w:b w:val="false"/>
+                <w:bCs w:val="false"/>
+                <w:sz w:val="19"/>
+                <w:szCs w:val="19"/>
+              </w:rPr>
+              <w:t xml:space="preserve">Đã sửa · dbbea67</w:t>
+            </w:r>
+          </w:p>
+        </w:tc>
+      </w:tr>
     </w:tbl>
     <w:p>
       <w:pPr>
@@ -11349,6 +11482,521 @@
                 <w:szCs w:val="19"/>
               </w:rPr>
               <w:t xml:space="preserve">Bấm ngay khi lớp nặng đang dựng dở ở nền thì chờ lớp đó xong (đo được 1.6 s).</w:t>
+            </w:r>
+          </w:p>
+        </w:tc>
+      </w:tr>
+    </w:tbl>
+    <w:p>
+      <w:pPr>
+        <w:spacing w:after="80"/>
+      </w:pPr>
+    </w:p>
+    <w:p>
+      <w:pPr>
+        <w:pStyle w:val="Heading2"/>
+        <w:spacing w:after="100" w:before="220"/>
+      </w:pPr>
+      <w:r>
+        <w:rPr>
+          <w:rFonts w:ascii="Arial" w:cs="Arial" w:eastAsia="Arial" w:hAnsi="Arial"/>
+          <w:b/>
+          <w:bCs/>
+          <w:color w:val="2E5597"/>
+          <w:sz w:val="25"/>
+          <w:szCs w:val="25"/>
+        </w:rPr>
+        <w:t xml:space="preserve">Lỗi 19 — 2D / 3D mất lõi bo (Anh Nhat)</w:t>
+      </w:r>
+    </w:p>
+    <w:tbl>
+      <w:tblPr>
+        <w:tblW w:type="dxa" w:w="9638"/>
+        <w:tblBorders>
+          <w:top w:val="single" w:color="auto" w:sz="4"/>
+          <w:left w:val="single" w:color="auto" w:sz="4"/>
+          <w:bottom w:val="single" w:color="auto" w:sz="4"/>
+          <w:right w:val="single" w:color="auto" w:sz="4"/>
+          <w:insideH w:val="single" w:color="auto" w:sz="4"/>
+          <w:insideV w:val="single" w:color="auto" w:sz="4"/>
+        </w:tblBorders>
+      </w:tblPr>
+      <w:tblGrid>
+        <w:gridCol w:w="2120"/>
+        <w:gridCol w:w="7518"/>
+      </w:tblGrid>
+      <w:tr>
+        <w:trPr>
+          <w:tblHeader/>
+        </w:trPr>
+        <w:tc>
+          <w:tcPr>
+            <w:tcW w:type="dxa" w:w="2120"/>
+            <w:tcBorders>
+              <w:top w:val="single" w:color="BFBFBF" w:sz="4"/>
+              <w:left w:val="single" w:color="BFBFBF" w:sz="4"/>
+              <w:bottom w:val="single" w:color="BFBFBF" w:sz="4"/>
+              <w:right w:val="single" w:color="BFBFBF" w:sz="4"/>
+            </w:tcBorders>
+            <w:shd w:fill="DCE6F2" w:color="auto" w:val="clear"/>
+            <w:tcMar>
+              <w:top w:type="dxa" w:w="60"/>
+              <w:left w:type="dxa" w:w="100"/>
+              <w:bottom w:type="dxa" w:w="60"/>
+              <w:right w:type="dxa" w:w="100"/>
+            </w:tcMar>
+          </w:tcPr>
+          <w:p>
+            <w:pPr>
+              <w:spacing w:after="20"/>
+            </w:pPr>
+            <w:r>
+              <w:rPr>
+                <w:rFonts w:ascii="Arial" w:cs="Arial" w:eastAsia="Arial" w:hAnsi="Arial"/>
+                <w:b/>
+                <w:bCs/>
+                <w:sz w:val="19"/>
+                <w:szCs w:val="19"/>
+              </w:rPr>
+              <w:t xml:space="preserve">Mục</w:t>
+            </w:r>
+          </w:p>
+        </w:tc>
+        <w:tc>
+          <w:tcPr>
+            <w:tcW w:type="dxa" w:w="7518"/>
+            <w:tcBorders>
+              <w:top w:val="single" w:color="BFBFBF" w:sz="4"/>
+              <w:left w:val="single" w:color="BFBFBF" w:sz="4"/>
+              <w:bottom w:val="single" w:color="BFBFBF" w:sz="4"/>
+              <w:right w:val="single" w:color="BFBFBF" w:sz="4"/>
+            </w:tcBorders>
+            <w:shd w:fill="DCE6F2" w:color="auto" w:val="clear"/>
+            <w:tcMar>
+              <w:top w:type="dxa" w:w="60"/>
+              <w:left w:type="dxa" w:w="100"/>
+              <w:bottom w:type="dxa" w:w="60"/>
+              <w:right w:type="dxa" w:w="100"/>
+            </w:tcMar>
+          </w:tcPr>
+          <w:p>
+            <w:pPr>
+              <w:spacing w:after="20"/>
+            </w:pPr>
+            <w:r>
+              <w:rPr>
+                <w:rFonts w:ascii="Arial" w:cs="Arial" w:eastAsia="Arial" w:hAnsi="Arial"/>
+                <w:b/>
+                <w:bCs/>
+                <w:sz w:val="19"/>
+                <w:szCs w:val="19"/>
+              </w:rPr>
+              <w:t xml:space="preserve">Nội dung</w:t>
+            </w:r>
+          </w:p>
+        </w:tc>
+      </w:tr>
+      <w:tr>
+        <w:trPr>
+          <w:tblHeader w:val="false"/>
+        </w:trPr>
+        <w:tc>
+          <w:tcPr>
+            <w:tcW w:type="dxa" w:w="2120"/>
+            <w:tcBorders>
+              <w:top w:val="single" w:color="BFBFBF" w:sz="4"/>
+              <w:left w:val="single" w:color="BFBFBF" w:sz="4"/>
+              <w:bottom w:val="single" w:color="BFBFBF" w:sz="4"/>
+              <w:right w:val="single" w:color="BFBFBF" w:sz="4"/>
+            </w:tcBorders>
+            <w:tcMar>
+              <w:top w:type="dxa" w:w="60"/>
+              <w:left w:type="dxa" w:w="100"/>
+              <w:bottom w:type="dxa" w:w="60"/>
+              <w:right w:type="dxa" w:w="100"/>
+            </w:tcMar>
+          </w:tcPr>
+          <w:p>
+            <w:pPr>
+              <w:spacing w:after="20"/>
+            </w:pPr>
+            <w:r>
+              <w:rPr>
+                <w:rFonts w:ascii="Arial" w:cs="Arial" w:eastAsia="Arial" w:hAnsi="Arial"/>
+                <w:b w:val="false"/>
+                <w:bCs w:val="false"/>
+                <w:sz w:val="19"/>
+                <w:szCs w:val="19"/>
+              </w:rPr>
+              <w:t xml:space="preserve">Bộ file</w:t>
+            </w:r>
+          </w:p>
+        </w:tc>
+        <w:tc>
+          <w:tcPr>
+            <w:tcW w:type="dxa" w:w="7518"/>
+            <w:tcBorders>
+              <w:top w:val="single" w:color="BFBFBF" w:sz="4"/>
+              <w:left w:val="single" w:color="BFBFBF" w:sz="4"/>
+              <w:bottom w:val="single" w:color="BFBFBF" w:sz="4"/>
+              <w:right w:val="single" w:color="BFBFBF" w:sz="4"/>
+            </w:tcBorders>
+            <w:tcMar>
+              <w:top w:type="dxa" w:w="60"/>
+              <w:left w:type="dxa" w:w="100"/>
+              <w:bottom w:type="dxa" w:w="60"/>
+              <w:right w:type="dxa" w:w="100"/>
+            </w:tcMar>
+          </w:tcPr>
+          <w:p>
+            <w:pPr>
+              <w:spacing w:after="20"/>
+            </w:pPr>
+            <w:r>
+              <w:rPr>
+                <w:rFonts w:ascii="Arial" w:cs="Arial" w:eastAsia="Arial" w:hAnsi="Arial"/>
+                <w:b w:val="false"/>
+                <w:bCs w:val="false"/>
+                <w:sz w:val="19"/>
+                <w:szCs w:val="19"/>
+              </w:rPr>
+              <w:t xml:space="preserve">D:\JobDatMach\Anh Nhat\16-08-23\Gerber Anh Nhat.zip (Altium, inch)</w:t>
+            </w:r>
+          </w:p>
+        </w:tc>
+      </w:tr>
+      <w:tr>
+        <w:trPr>
+          <w:tblHeader w:val="false"/>
+        </w:trPr>
+        <w:tc>
+          <w:tcPr>
+            <w:tcW w:type="dxa" w:w="2120"/>
+            <w:tcBorders>
+              <w:top w:val="single" w:color="BFBFBF" w:sz="4"/>
+              <w:left w:val="single" w:color="BFBFBF" w:sz="4"/>
+              <w:bottom w:val="single" w:color="BFBFBF" w:sz="4"/>
+              <w:right w:val="single" w:color="BFBFBF" w:sz="4"/>
+            </w:tcBorders>
+            <w:tcMar>
+              <w:top w:type="dxa" w:w="60"/>
+              <w:left w:type="dxa" w:w="100"/>
+              <w:bottom w:type="dxa" w:w="60"/>
+              <w:right w:type="dxa" w:w="100"/>
+            </w:tcMar>
+          </w:tcPr>
+          <w:p>
+            <w:pPr>
+              <w:spacing w:after="20"/>
+            </w:pPr>
+            <w:r>
+              <w:rPr>
+                <w:rFonts w:ascii="Arial" w:cs="Arial" w:eastAsia="Arial" w:hAnsi="Arial"/>
+                <w:b w:val="false"/>
+                <w:bCs w:val="false"/>
+                <w:sz w:val="19"/>
+                <w:szCs w:val="19"/>
+              </w:rPr>
+              <w:t xml:space="preserve">Hiện tượng</w:t>
+            </w:r>
+          </w:p>
+        </w:tc>
+        <w:tc>
+          <w:tcPr>
+            <w:tcW w:type="dxa" w:w="7518"/>
+            <w:tcBorders>
+              <w:top w:val="single" w:color="BFBFBF" w:sz="4"/>
+              <w:left w:val="single" w:color="BFBFBF" w:sz="4"/>
+              <w:bottom w:val="single" w:color="BFBFBF" w:sz="4"/>
+              <w:right w:val="single" w:color="BFBFBF" w:sz="4"/>
+            </w:tcBorders>
+            <w:tcMar>
+              <w:top w:type="dxa" w:w="60"/>
+              <w:left w:type="dxa" w:w="100"/>
+              <w:bottom w:type="dxa" w:w="60"/>
+              <w:right w:type="dxa" w:w="100"/>
+            </w:tcMar>
+          </w:tcPr>
+          <w:p>
+            <w:pPr>
+              <w:spacing w:after="20"/>
+            </w:pPr>
+            <w:r>
+              <w:rPr>
+                <w:rFonts w:ascii="Arial" w:cs="Arial" w:eastAsia="Arial" w:hAnsi="Arial"/>
+                <w:b w:val="false"/>
+                <w:bCs w:val="false"/>
+                <w:sz w:val="19"/>
+                <w:szCs w:val="19"/>
+              </w:rPr>
+              <w:t xml:space="preserve">CAM đúng (80 × 75 mm, bo góc); 2D/3D trắng mảng lớn góc trên trái và quanh cổng USB J1 — đúng những chỗ không có đồng ở cả hai mặt: lõi bo (FR-4 + mask) không được vẽ.</w:t>
+            </w:r>
+          </w:p>
+        </w:tc>
+      </w:tr>
+      <w:tr>
+        <w:trPr>
+          <w:tblHeader w:val="false"/>
+        </w:trPr>
+        <w:tc>
+          <w:tcPr>
+            <w:tcW w:type="dxa" w:w="2120"/>
+            <w:tcBorders>
+              <w:top w:val="single" w:color="BFBFBF" w:sz="4"/>
+              <w:left w:val="single" w:color="BFBFBF" w:sz="4"/>
+              <w:bottom w:val="single" w:color="BFBFBF" w:sz="4"/>
+              <w:right w:val="single" w:color="BFBFBF" w:sz="4"/>
+            </w:tcBorders>
+            <w:tcMar>
+              <w:top w:type="dxa" w:w="60"/>
+              <w:left w:type="dxa" w:w="100"/>
+              <w:bottom w:type="dxa" w:w="60"/>
+              <w:right w:type="dxa" w:w="100"/>
+            </w:tcMar>
+          </w:tcPr>
+          <w:p>
+            <w:pPr>
+              <w:spacing w:after="20"/>
+            </w:pPr>
+            <w:r>
+              <w:rPr>
+                <w:rFonts w:ascii="Arial" w:cs="Arial" w:eastAsia="Arial" w:hAnsi="Arial"/>
+                <w:b w:val="false"/>
+                <w:bCs w:val="false"/>
+                <w:sz w:val="19"/>
+                <w:szCs w:val="19"/>
+              </w:rPr>
+              <w:t xml:space="preserve">Nguyên nhân</w:t>
+            </w:r>
+          </w:p>
+        </w:tc>
+        <w:tc>
+          <w:tcPr>
+            <w:tcW w:type="dxa" w:w="7518"/>
+            <w:tcBorders>
+              <w:top w:val="single" w:color="BFBFBF" w:sz="4"/>
+              <w:left w:val="single" w:color="BFBFBF" w:sz="4"/>
+              <w:bottom w:val="single" w:color="BFBFBF" w:sz="4"/>
+              <w:right w:val="single" w:color="BFBFBF" w:sz="4"/>
+            </w:tcBorders>
+            <w:tcMar>
+              <w:top w:type="dxa" w:w="60"/>
+              <w:left w:type="dxa" w:w="100"/>
+              <w:bottom w:type="dxa" w:w="60"/>
+              <w:right w:type="dxa" w:w="100"/>
+            </w:tcMar>
+          </w:tcPr>
+          <w:p>
+            <w:pPr>
+              <w:spacing w:after="20"/>
+            </w:pPr>
+            <w:r>
+              <w:rPr>
+                <w:rFonts w:ascii="Arial" w:cs="Arial" w:eastAsia="Arial" w:hAnsi="Arial"/>
+                <w:b w:val="false"/>
+                <w:bCs w:val="false"/>
+                <w:sz w:val="19"/>
+                <w:szCs w:val="19"/>
+              </w:rPr>
+              <w:t xml:space="preserve">BAI111.GKO có một vùng tô G36 (rãnh khoét dưới anten Module1) đứng </w:t>
+            </w:r>
+            <w:r>
+              <w:rPr>
+                <w:rFonts w:ascii="Arial" w:cs="Arial" w:eastAsia="Arial" w:hAnsi="Arial"/>
+                <w:b/>
+                <w:bCs/>
+                <w:sz w:val="19"/>
+                <w:szCs w:val="19"/>
+              </w:rPr>
+              <w:t xml:space="preserve">trước</w:t>
+            </w:r>
+            <w:r>
+              <w:rPr>
+                <w:rFonts w:ascii="Arial" w:cs="Arial" w:eastAsia="Arial" w:hAnsi="Arial"/>
+                <w:b w:val="false"/>
+                <w:bCs w:val="false"/>
+                <w:sz w:val="19"/>
+                <w:szCs w:val="19"/>
+              </w:rPr>
+              <w:t xml:space="preserve"> khung bo. Bước nối viền bọc mỗi đoạn theo mẫu = phần tử đầu tiên → 8 đoạn khung bo thành 8 "vùng tô" một đoạn; tô đặc ra </w:t>
+            </w:r>
+            <w:r>
+              <w:rPr>
+                <w:rFonts w:ascii="Arial" w:cs="Arial" w:eastAsia="Arial" w:hAnsi="Arial"/>
+                <w:b/>
+                <w:bCs/>
+                <w:sz w:val="19"/>
+                <w:szCs w:val="19"/>
+              </w:rPr>
+              <w:t xml:space="preserve">0 đỉnh</w:t>
+            </w:r>
+            <w:r>
+              <w:rPr>
+                <w:rFonts w:ascii="Arial" w:cs="Arial" w:eastAsia="Arial" w:hAnsi="Arial"/>
+                <w:b w:val="false"/>
+                <w:bCs w:val="false"/>
+                <w:sz w:val="19"/>
+                <w:szCs w:val="19"/>
+              </w:rPr>
+              <w:t xml:space="preserve">. CAM vẽ nét nên không lộ.</w:t>
+            </w:r>
+          </w:p>
+        </w:tc>
+      </w:tr>
+      <w:tr>
+        <w:trPr>
+          <w:tblHeader w:val="false"/>
+        </w:trPr>
+        <w:tc>
+          <w:tcPr>
+            <w:tcW w:type="dxa" w:w="2120"/>
+            <w:tcBorders>
+              <w:top w:val="single" w:color="BFBFBF" w:sz="4"/>
+              <w:left w:val="single" w:color="BFBFBF" w:sz="4"/>
+              <w:bottom w:val="single" w:color="BFBFBF" w:sz="4"/>
+              <w:right w:val="single" w:color="BFBFBF" w:sz="4"/>
+            </w:tcBorders>
+            <w:tcMar>
+              <w:top w:type="dxa" w:w="60"/>
+              <w:left w:type="dxa" w:w="100"/>
+              <w:bottom w:type="dxa" w:w="60"/>
+              <w:right w:type="dxa" w:w="100"/>
+            </w:tcMar>
+          </w:tcPr>
+          <w:p>
+            <w:pPr>
+              <w:spacing w:after="20"/>
+            </w:pPr>
+            <w:r>
+              <w:rPr>
+                <w:rFonts w:ascii="Arial" w:cs="Arial" w:eastAsia="Arial" w:hAnsi="Arial"/>
+                <w:b w:val="false"/>
+                <w:bCs w:val="false"/>
+                <w:sz w:val="19"/>
+                <w:szCs w:val="19"/>
+              </w:rPr>
+              <w:t xml:space="preserve">Cách giải quyết</w:t>
+            </w:r>
+          </w:p>
+        </w:tc>
+        <w:tc>
+          <w:tcPr>
+            <w:tcW w:type="dxa" w:w="7518"/>
+            <w:tcBorders>
+              <w:top w:val="single" w:color="BFBFBF" w:sz="4"/>
+              <w:left w:val="single" w:color="BFBFBF" w:sz="4"/>
+              <w:bottom w:val="single" w:color="BFBFBF" w:sz="4"/>
+              <w:right w:val="single" w:color="BFBFBF" w:sz="4"/>
+            </w:tcBorders>
+            <w:tcMar>
+              <w:top w:type="dxa" w:w="60"/>
+              <w:left w:type="dxa" w:w="100"/>
+              <w:bottom w:type="dxa" w:w="60"/>
+              <w:right w:type="dxa" w:w="100"/>
+            </w:tcMar>
+          </w:tcPr>
+          <w:p>
+            <w:pPr>
+              <w:spacing w:after="20"/>
+            </w:pPr>
+            <w:r>
+              <w:rPr>
+                <w:rFonts w:ascii="Arial" w:cs="Arial" w:eastAsia="Arial" w:hAnsi="Arial"/>
+                <w:b w:val="false"/>
+                <w:bCs w:val="false"/>
+                <w:sz w:val="19"/>
+                <w:szCs w:val="19"/>
+              </w:rPr>
+              <w:t xml:space="preserve">Mẫu lấy </w:t>
+            </w:r>
+            <w:r>
+              <w:rPr>
+                <w:rFonts w:ascii="Arial" w:cs="Arial" w:eastAsia="Arial" w:hAnsi="Arial"/>
+                <w:b/>
+                <w:bCs/>
+                <w:sz w:val="19"/>
+                <w:szCs w:val="19"/>
+              </w:rPr>
+              <w:t xml:space="preserve">nét vẽ đầu tiên</w:t>
+            </w:r>
+            <w:r>
+              <w:rPr>
+                <w:rFonts w:ascii="Arial" w:cs="Arial" w:eastAsia="Arial" w:hAnsi="Arial"/>
+                <w:b w:val="false"/>
+                <w:bCs w:val="false"/>
+                <w:sz w:val="19"/>
+                <w:szCs w:val="19"/>
+              </w:rPr>
+              <w:t xml:space="preserve"> (geometry.ts); lớp chỉ có vùng tô thì giữ như cũ. Test mới dựng lại đúng dáng file.</w:t>
+            </w:r>
+          </w:p>
+        </w:tc>
+      </w:tr>
+      <w:tr>
+        <w:trPr>
+          <w:tblHeader w:val="false"/>
+        </w:trPr>
+        <w:tc>
+          <w:tcPr>
+            <w:tcW w:type="dxa" w:w="2120"/>
+            <w:tcBorders>
+              <w:top w:val="single" w:color="BFBFBF" w:sz="4"/>
+              <w:left w:val="single" w:color="BFBFBF" w:sz="4"/>
+              <w:bottom w:val="single" w:color="BFBFBF" w:sz="4"/>
+              <w:right w:val="single" w:color="BFBFBF" w:sz="4"/>
+            </w:tcBorders>
+            <w:tcMar>
+              <w:top w:type="dxa" w:w="60"/>
+              <w:left w:type="dxa" w:w="100"/>
+              <w:bottom w:type="dxa" w:w="60"/>
+              <w:right w:type="dxa" w:w="100"/>
+            </w:tcMar>
+          </w:tcPr>
+          <w:p>
+            <w:pPr>
+              <w:spacing w:after="20"/>
+            </w:pPr>
+            <w:r>
+              <w:rPr>
+                <w:rFonts w:ascii="Arial" w:cs="Arial" w:eastAsia="Arial" w:hAnsi="Arial"/>
+                <w:b w:val="false"/>
+                <w:bCs w:val="false"/>
+                <w:sz w:val="19"/>
+                <w:szCs w:val="19"/>
+              </w:rPr>
+              <w:t xml:space="preserve">Kiểm</w:t>
+            </w:r>
+          </w:p>
+        </w:tc>
+        <w:tc>
+          <w:tcPr>
+            <w:tcW w:type="dxa" w:w="7518"/>
+            <w:tcBorders>
+              <w:top w:val="single" w:color="BFBFBF" w:sz="4"/>
+              <w:left w:val="single" w:color="BFBFBF" w:sz="4"/>
+              <w:bottom w:val="single" w:color="BFBFBF" w:sz="4"/>
+              <w:right w:val="single" w:color="BFBFBF" w:sz="4"/>
+            </w:tcBorders>
+            <w:tcMar>
+              <w:top w:type="dxa" w:w="60"/>
+              <w:left w:type="dxa" w:w="100"/>
+              <w:bottom w:type="dxa" w:w="60"/>
+              <w:right w:type="dxa" w:w="100"/>
+            </w:tcMar>
+          </w:tcPr>
+          <w:p>
+            <w:pPr>
+              <w:spacing w:after="20"/>
+            </w:pPr>
+            <w:r>
+              <w:rPr>
+                <w:rFonts w:ascii="Arial" w:cs="Arial" w:eastAsia="Arial" w:hAnsi="Arial"/>
+                <w:b w:val="false"/>
+                <w:bCs w:val="false"/>
+                <w:sz w:val="19"/>
+                <w:szCs w:val="19"/>
+              </w:rPr>
+              <w:t xml:space="preserve">Thân bo 0 → 756 đỉnh, 2D phủ kín bo, rãnh khoét vẫn là lỗ. Hồi quy 157 bộ: đúng 3 bộ đổi (Anh Nhat, Dao Quoc Thai 5pcs, CM5-gerber), cả 3 từ lõi bo rỗng → có lõi; kích thước, cách tách vòng giữ nguyên; 154 bộ không đổi.</w:t>
             </w:r>
           </w:p>
         </w:tc>
@@ -16481,6 +17129,75 @@
           </w:p>
         </w:tc>
       </w:tr>
+      <w:tr>
+        <w:trPr>
+          <w:tblHeader w:val="false"/>
+        </w:trPr>
+        <w:tc>
+          <w:tcPr>
+            <w:tcW w:type="dxa" w:w="2409"/>
+            <w:tcBorders>
+              <w:top w:val="single" w:color="BFBFBF" w:sz="4"/>
+              <w:left w:val="single" w:color="BFBFBF" w:sz="4"/>
+              <w:bottom w:val="single" w:color="BFBFBF" w:sz="4"/>
+              <w:right w:val="single" w:color="BFBFBF" w:sz="4"/>
+            </w:tcBorders>
+            <w:tcMar>
+              <w:top w:type="dxa" w:w="60"/>
+              <w:left w:type="dxa" w:w="100"/>
+              <w:bottom w:type="dxa" w:w="60"/>
+              <w:right w:type="dxa" w:w="100"/>
+            </w:tcMar>
+          </w:tcPr>
+          <w:p>
+            <w:pPr>
+              <w:spacing w:after="20"/>
+            </w:pPr>
+            <w:r>
+              <w:rPr>
+                <w:rFonts w:ascii="Arial" w:cs="Arial" w:eastAsia="Arial" w:hAnsi="Arial"/>
+                <w:b w:val="false"/>
+                <w:bCs w:val="false"/>
+                <w:sz w:val="19"/>
+                <w:szCs w:val="19"/>
+              </w:rPr>
+              <w:t xml:space="preserve">Kiểu phần tử</w:t>
+            </w:r>
+          </w:p>
+        </w:tc>
+        <w:tc>
+          <w:tcPr>
+            <w:tcW w:type="dxa" w:w="7229"/>
+            <w:tcBorders>
+              <w:top w:val="single" w:color="BFBFBF" w:sz="4"/>
+              <w:left w:val="single" w:color="BFBFBF" w:sz="4"/>
+              <w:bottom w:val="single" w:color="BFBFBF" w:sz="4"/>
+              <w:right w:val="single" w:color="BFBFBF" w:sz="4"/>
+            </w:tcBorders>
+            <w:tcMar>
+              <w:top w:type="dxa" w:w="60"/>
+              <w:left w:type="dxa" w:w="100"/>
+              <w:bottom w:type="dxa" w:w="60"/>
+              <w:right w:type="dxa" w:w="100"/>
+            </w:tcMar>
+          </w:tcPr>
+          <w:p>
+            <w:pPr>
+              <w:spacing w:after="20"/>
+            </w:pPr>
+            <w:r>
+              <w:rPr>
+                <w:rFonts w:ascii="Arial" w:cs="Arial" w:eastAsia="Arial" w:hAnsi="Arial"/>
+                <w:b w:val="false"/>
+                <w:bCs w:val="false"/>
+                <w:sz w:val="19"/>
+                <w:szCs w:val="19"/>
+              </w:rPr>
+              <w:t xml:space="preserve">Mỗi đoạn viền đã nối bọc theo nét vẽ đầu tiên, không theo vùng tô (vùng tô G36 đứng trước khung bo làm 2D/3D mất lõi bo — Anh Nhat)</w:t>
+            </w:r>
+          </w:p>
+        </w:tc>
+      </w:tr>
     </w:tbl>
     <w:p>
       <w:pPr>
@@ -18948,7 +19665,7 @@
           <w:sz w:val="21"/>
           <w:szCs w:val="21"/>
         </w:rPr>
-        <w:t xml:space="preserve"> (tsc -b chặt hơn tsc --noEmit — lỗi build Vercel ở f12b339 là do chỉ chạy lệnh nhẹ) và npx vitest run (150 test).</w:t>
+        <w:t xml:space="preserve"> (tsc -b chặt hơn tsc --noEmit — lỗi build Vercel ở f12b339 là do chỉ chạy lệnh nhẹ) và npx vitest run (151 test).</w:t>
       </w:r>
     </w:p>
     <w:p>

</xml_diff>

<commit_message>
docs: Add the Dao Quoc Thai slot, notch and outline-stroke fixes to the report
Co-Authored-By: Claude Opus 5 <noreply@anthropic.com>
</commit_message>
<xml_diff>
--- a/docs/bao-cao/Bao-cao-DQPCB-2026-09-22.docx
+++ b/docs/bao-cao/Bao-cao-DQPCB-2026-09-22.docx
@@ -3272,6 +3272,139 @@
           </w:p>
         </w:tc>
       </w:tr>
+      <w:tr>
+        <w:trPr>
+          <w:tblHeader w:val="false"/>
+        </w:trPr>
+        <w:tc>
+          <w:tcPr>
+            <w:tcW w:type="dxa" w:w="481"/>
+            <w:tcBorders>
+              <w:top w:val="single" w:color="BFBFBF" w:sz="4"/>
+              <w:left w:val="single" w:color="BFBFBF" w:sz="4"/>
+              <w:bottom w:val="single" w:color="BFBFBF" w:sz="4"/>
+              <w:right w:val="single" w:color="BFBFBF" w:sz="4"/>
+            </w:tcBorders>
+            <w:tcMar>
+              <w:top w:type="dxa" w:w="60"/>
+              <w:left w:type="dxa" w:w="100"/>
+              <w:bottom w:type="dxa" w:w="60"/>
+              <w:right w:type="dxa" w:w="100"/>
+            </w:tcMar>
+          </w:tcPr>
+          <w:p>
+            <w:pPr>
+              <w:spacing w:after="20"/>
+            </w:pPr>
+            <w:r>
+              <w:rPr>
+                <w:rFonts w:ascii="Arial" w:cs="Arial" w:eastAsia="Arial" w:hAnsi="Arial"/>
+                <w:b w:val="false"/>
+                <w:bCs w:val="false"/>
+                <w:sz w:val="19"/>
+                <w:szCs w:val="19"/>
+              </w:rPr>
+              <w:t xml:space="preserve">20</w:t>
+            </w:r>
+          </w:p>
+        </w:tc>
+        <w:tc>
+          <w:tcPr>
+            <w:tcW w:type="dxa" w:w="4047"/>
+            <w:tcBorders>
+              <w:top w:val="single" w:color="BFBFBF" w:sz="4"/>
+              <w:left w:val="single" w:color="BFBFBF" w:sz="4"/>
+              <w:bottom w:val="single" w:color="BFBFBF" w:sz="4"/>
+              <w:right w:val="single" w:color="BFBFBF" w:sz="4"/>
+            </w:tcBorders>
+            <w:tcMar>
+              <w:top w:type="dxa" w:w="60"/>
+              <w:left w:type="dxa" w:w="100"/>
+              <w:bottom w:type="dxa" w:w="60"/>
+              <w:right w:type="dxa" w:w="100"/>
+            </w:tcMar>
+          </w:tcPr>
+          <w:p>
+            <w:pPr>
+              <w:spacing w:after="20"/>
+            </w:pPr>
+            <w:r>
+              <w:rPr>
+                <w:rFonts w:ascii="Arial" w:cs="Arial" w:eastAsia="Arial" w:hAnsi="Arial"/>
+                <w:b w:val="false"/>
+                <w:bCs w:val="false"/>
+                <w:sz w:val="19"/>
+                <w:szCs w:val="19"/>
+              </w:rPr>
+              <w:t xml:space="preserve">Mất rãnh của file khoan chỉ có rãnh; khấc mép tính là thân bo; nét viền dày</w:t>
+            </w:r>
+          </w:p>
+        </w:tc>
+        <w:tc>
+          <w:tcPr>
+            <w:tcW w:type="dxa" w:w="2891"/>
+            <w:tcBorders>
+              <w:top w:val="single" w:color="BFBFBF" w:sz="4"/>
+              <w:left w:val="single" w:color="BFBFBF" w:sz="4"/>
+              <w:bottom w:val="single" w:color="BFBFBF" w:sz="4"/>
+              <w:right w:val="single" w:color="BFBFBF" w:sz="4"/>
+            </w:tcBorders>
+            <w:tcMar>
+              <w:top w:type="dxa" w:w="60"/>
+              <w:left w:type="dxa" w:w="100"/>
+              <w:bottom w:type="dxa" w:w="60"/>
+              <w:right w:type="dxa" w:w="100"/>
+            </w:tcMar>
+          </w:tcPr>
+          <w:p>
+            <w:pPr>
+              <w:spacing w:after="20"/>
+            </w:pPr>
+            <w:r>
+              <w:rPr>
+                <w:rFonts w:ascii="Arial" w:cs="Arial" w:eastAsia="Arial" w:hAnsi="Arial"/>
+                <w:b w:val="false"/>
+                <w:bCs w:val="false"/>
+                <w:sz w:val="19"/>
+                <w:szCs w:val="19"/>
+              </w:rPr>
+              <w:t xml:space="preserve">Dao Quoc Thai 5pcs (+ 3 bộ thiếu rãnh, 5 bộ đổi kích thước)</w:t>
+            </w:r>
+          </w:p>
+        </w:tc>
+        <w:tc>
+          <w:tcPr>
+            <w:tcW w:type="dxa" w:w="2219"/>
+            <w:tcBorders>
+              <w:top w:val="single" w:color="BFBFBF" w:sz="4"/>
+              <w:left w:val="single" w:color="BFBFBF" w:sz="4"/>
+              <w:bottom w:val="single" w:color="BFBFBF" w:sz="4"/>
+              <w:right w:val="single" w:color="BFBFBF" w:sz="4"/>
+            </w:tcBorders>
+            <w:tcMar>
+              <w:top w:type="dxa" w:w="60"/>
+              <w:left w:type="dxa" w:w="100"/>
+              <w:bottom w:type="dxa" w:w="60"/>
+              <w:right w:type="dxa" w:w="100"/>
+            </w:tcMar>
+          </w:tcPr>
+          <w:p>
+            <w:pPr>
+              <w:spacing w:after="20"/>
+            </w:pPr>
+            <w:r>
+              <w:rPr>
+                <w:rFonts w:ascii="Arial" w:cs="Arial" w:eastAsia="Arial" w:hAnsi="Arial"/>
+                <w:b w:val="false"/>
+                <w:bCs w:val="false"/>
+                <w:sz w:val="19"/>
+                <w:szCs w:val="19"/>
+              </w:rPr>
+              <w:t xml:space="preserve">Đã sửa · 5a8b10f</w:t>
+            </w:r>
+          </w:p>
+        </w:tc>
+      </w:tr>
     </w:tbl>
     <w:p>
       <w:pPr>
@@ -11997,6 +12130,550 @@
                 <w:szCs w:val="19"/>
               </w:rPr>
               <w:t xml:space="preserve">Thân bo 0 → 756 đỉnh, 2D phủ kín bo, rãnh khoét vẫn là lỗ. Hồi quy 157 bộ: đúng 3 bộ đổi (Anh Nhat, Dao Quoc Thai 5pcs, CM5-gerber), cả 3 từ lõi bo rỗng → có lõi; kích thước, cách tách vòng giữ nguyên; 154 bộ không đổi.</w:t>
+            </w:r>
+          </w:p>
+        </w:tc>
+      </w:tr>
+    </w:tbl>
+    <w:p>
+      <w:pPr>
+        <w:spacing w:after="80"/>
+      </w:pPr>
+    </w:p>
+    <w:p>
+      <w:pPr>
+        <w:pStyle w:val="Heading2"/>
+        <w:spacing w:after="100" w:before="220"/>
+      </w:pPr>
+      <w:r>
+        <w:rPr>
+          <w:rFonts w:ascii="Arial" w:cs="Arial" w:eastAsia="Arial" w:hAnsi="Arial"/>
+          <w:b/>
+          <w:bCs/>
+          <w:color w:val="2E5597"/>
+          <w:sz w:val="25"/>
+          <w:szCs w:val="25"/>
+        </w:rPr>
+        <w:t xml:space="preserve">Lỗi 20 — Dao Quoc Thai 5pcs: mất rãnh, khấc mép, nét viền dày</w:t>
+      </w:r>
+    </w:p>
+    <w:tbl>
+      <w:tblPr>
+        <w:tblW w:type="dxa" w:w="9638"/>
+        <w:tblBorders>
+          <w:top w:val="single" w:color="auto" w:sz="4"/>
+          <w:left w:val="single" w:color="auto" w:sz="4"/>
+          <w:bottom w:val="single" w:color="auto" w:sz="4"/>
+          <w:right w:val="single" w:color="auto" w:sz="4"/>
+          <w:insideH w:val="single" w:color="auto" w:sz="4"/>
+          <w:insideV w:val="single" w:color="auto" w:sz="4"/>
+        </w:tblBorders>
+      </w:tblPr>
+      <w:tblGrid>
+        <w:gridCol w:w="2120"/>
+        <w:gridCol w:w="7518"/>
+      </w:tblGrid>
+      <w:tr>
+        <w:trPr>
+          <w:tblHeader/>
+        </w:trPr>
+        <w:tc>
+          <w:tcPr>
+            <w:tcW w:type="dxa" w:w="2120"/>
+            <w:tcBorders>
+              <w:top w:val="single" w:color="BFBFBF" w:sz="4"/>
+              <w:left w:val="single" w:color="BFBFBF" w:sz="4"/>
+              <w:bottom w:val="single" w:color="BFBFBF" w:sz="4"/>
+              <w:right w:val="single" w:color="BFBFBF" w:sz="4"/>
+            </w:tcBorders>
+            <w:shd w:fill="DCE6F2" w:color="auto" w:val="clear"/>
+            <w:tcMar>
+              <w:top w:type="dxa" w:w="60"/>
+              <w:left w:type="dxa" w:w="100"/>
+              <w:bottom w:type="dxa" w:w="60"/>
+              <w:right w:type="dxa" w:w="100"/>
+            </w:tcMar>
+          </w:tcPr>
+          <w:p>
+            <w:pPr>
+              <w:spacing w:after="20"/>
+            </w:pPr>
+            <w:r>
+              <w:rPr>
+                <w:rFonts w:ascii="Arial" w:cs="Arial" w:eastAsia="Arial" w:hAnsi="Arial"/>
+                <w:b/>
+                <w:bCs/>
+                <w:sz w:val="19"/>
+                <w:szCs w:val="19"/>
+              </w:rPr>
+              <w:t xml:space="preserve">Mục</w:t>
+            </w:r>
+          </w:p>
+        </w:tc>
+        <w:tc>
+          <w:tcPr>
+            <w:tcW w:type="dxa" w:w="7518"/>
+            <w:tcBorders>
+              <w:top w:val="single" w:color="BFBFBF" w:sz="4"/>
+              <w:left w:val="single" w:color="BFBFBF" w:sz="4"/>
+              <w:bottom w:val="single" w:color="BFBFBF" w:sz="4"/>
+              <w:right w:val="single" w:color="BFBFBF" w:sz="4"/>
+            </w:tcBorders>
+            <w:shd w:fill="DCE6F2" w:color="auto" w:val="clear"/>
+            <w:tcMar>
+              <w:top w:type="dxa" w:w="60"/>
+              <w:left w:type="dxa" w:w="100"/>
+              <w:bottom w:type="dxa" w:w="60"/>
+              <w:right w:type="dxa" w:w="100"/>
+            </w:tcMar>
+          </w:tcPr>
+          <w:p>
+            <w:pPr>
+              <w:spacing w:after="20"/>
+            </w:pPr>
+            <w:r>
+              <w:rPr>
+                <w:rFonts w:ascii="Arial" w:cs="Arial" w:eastAsia="Arial" w:hAnsi="Arial"/>
+                <w:b/>
+                <w:bCs/>
+                <w:sz w:val="19"/>
+                <w:szCs w:val="19"/>
+              </w:rPr>
+              <w:t xml:space="preserve">Nội dung</w:t>
+            </w:r>
+          </w:p>
+        </w:tc>
+      </w:tr>
+      <w:tr>
+        <w:trPr>
+          <w:tblHeader w:val="false"/>
+        </w:trPr>
+        <w:tc>
+          <w:tcPr>
+            <w:tcW w:type="dxa" w:w="2120"/>
+            <w:tcBorders>
+              <w:top w:val="single" w:color="BFBFBF" w:sz="4"/>
+              <w:left w:val="single" w:color="BFBFBF" w:sz="4"/>
+              <w:bottom w:val="single" w:color="BFBFBF" w:sz="4"/>
+              <w:right w:val="single" w:color="BFBFBF" w:sz="4"/>
+            </w:tcBorders>
+            <w:tcMar>
+              <w:top w:type="dxa" w:w="60"/>
+              <w:left w:type="dxa" w:w="100"/>
+              <w:bottom w:type="dxa" w:w="60"/>
+              <w:right w:type="dxa" w:w="100"/>
+            </w:tcMar>
+          </w:tcPr>
+          <w:p>
+            <w:pPr>
+              <w:spacing w:after="20"/>
+            </w:pPr>
+            <w:r>
+              <w:rPr>
+                <w:rFonts w:ascii="Arial" w:cs="Arial" w:eastAsia="Arial" w:hAnsi="Arial"/>
+                <w:b w:val="false"/>
+                <w:bCs w:val="false"/>
+                <w:sz w:val="19"/>
+                <w:szCs w:val="19"/>
+              </w:rPr>
+              <w:t xml:space="preserve">Bộ file</w:t>
+            </w:r>
+          </w:p>
+        </w:tc>
+        <w:tc>
+          <w:tcPr>
+            <w:tcW w:type="dxa" w:w="7518"/>
+            <w:tcBorders>
+              <w:top w:val="single" w:color="BFBFBF" w:sz="4"/>
+              <w:left w:val="single" w:color="BFBFBF" w:sz="4"/>
+              <w:bottom w:val="single" w:color="BFBFBF" w:sz="4"/>
+              <w:right w:val="single" w:color="BFBFBF" w:sz="4"/>
+            </w:tcBorders>
+            <w:tcMar>
+              <w:top w:type="dxa" w:w="60"/>
+              <w:left w:type="dxa" w:w="100"/>
+              <w:bottom w:type="dxa" w:w="60"/>
+              <w:right w:type="dxa" w:w="100"/>
+            </w:tcMar>
+          </w:tcPr>
+          <w:p>
+            <w:pPr>
+              <w:spacing w:after="20"/>
+            </w:pPr>
+            <w:r>
+              <w:rPr>
+                <w:rFonts w:ascii="Arial" w:cs="Arial" w:eastAsia="Arial" w:hAnsi="Arial"/>
+                <w:b w:val="false"/>
+                <w:bCs w:val="false"/>
+                <w:sz w:val="19"/>
+                <w:szCs w:val="19"/>
+              </w:rPr>
+              <w:t xml:space="preserve">D:\JobDatMach\Dao Quoc Thai\2025\01-11\Dao Quoc Thai 5pcs.zip</w:t>
+            </w:r>
+          </w:p>
+        </w:tc>
+      </w:tr>
+      <w:tr>
+        <w:trPr>
+          <w:tblHeader w:val="false"/>
+        </w:trPr>
+        <w:tc>
+          <w:tcPr>
+            <w:tcW w:type="dxa" w:w="2120"/>
+            <w:tcBorders>
+              <w:top w:val="single" w:color="BFBFBF" w:sz="4"/>
+              <w:left w:val="single" w:color="BFBFBF" w:sz="4"/>
+              <w:bottom w:val="single" w:color="BFBFBF" w:sz="4"/>
+              <w:right w:val="single" w:color="BFBFBF" w:sz="4"/>
+            </w:tcBorders>
+            <w:tcMar>
+              <w:top w:type="dxa" w:w="60"/>
+              <w:left w:type="dxa" w:w="100"/>
+              <w:bottom w:type="dxa" w:w="60"/>
+              <w:right w:type="dxa" w:w="100"/>
+            </w:tcMar>
+          </w:tcPr>
+          <w:p>
+            <w:pPr>
+              <w:spacing w:after="20"/>
+            </w:pPr>
+            <w:r>
+              <w:rPr>
+                <w:rFonts w:ascii="Arial" w:cs="Arial" w:eastAsia="Arial" w:hAnsi="Arial"/>
+                <w:b w:val="false"/>
+                <w:bCs w:val="false"/>
+                <w:sz w:val="19"/>
+                <w:szCs w:val="19"/>
+              </w:rPr>
+              <w:t xml:space="preserve">Mất rãnh</w:t>
+            </w:r>
+          </w:p>
+        </w:tc>
+        <w:tc>
+          <w:tcPr>
+            <w:tcW w:type="dxa" w:w="7518"/>
+            <w:tcBorders>
+              <w:top w:val="single" w:color="BFBFBF" w:sz="4"/>
+              <w:left w:val="single" w:color="BFBFBF" w:sz="4"/>
+              <w:bottom w:val="single" w:color="BFBFBF" w:sz="4"/>
+              <w:right w:val="single" w:color="BFBFBF" w:sz="4"/>
+            </w:tcBorders>
+            <w:tcMar>
+              <w:top w:type="dxa" w:w="60"/>
+              <w:left w:type="dxa" w:w="100"/>
+              <w:bottom w:type="dxa" w:w="60"/>
+              <w:right w:type="dxa" w:w="100"/>
+            </w:tcMar>
+          </w:tcPr>
+          <w:p>
+            <w:pPr>
+              <w:spacing w:after="20"/>
+            </w:pPr>
+            <w:r>
+              <w:rPr>
+                <w:rFonts w:ascii="Arial" w:cs="Arial" w:eastAsia="Arial" w:hAnsi="Arial"/>
+                <w:b w:val="false"/>
+                <w:bCs w:val="false"/>
+                <w:sz w:val="19"/>
+                <w:szCs w:val="19"/>
+              </w:rPr>
+              <w:t xml:space="preserve">SqDrl.txt chỉ chứa 3 rãnh phay (dao 0.8 mm); tên không khớp luật round/slot/rect/square nên bị coi là file gộp, thua Drl.txt → không vẽ. Sửa: file khoan chỉ có rãnh luôn vẽ kèm file gộp (trừ khi file gộp đã có rãnh). Cùng lỗi ở Ghep (Slot.txt), Gateway (SlotHoles.TXT), Thu Van (RectHoles.TXT) — giờ vẽ.</w:t>
+            </w:r>
+          </w:p>
+        </w:tc>
+      </w:tr>
+      <w:tr>
+        <w:trPr>
+          <w:tblHeader w:val="false"/>
+        </w:trPr>
+        <w:tc>
+          <w:tcPr>
+            <w:tcW w:type="dxa" w:w="2120"/>
+            <w:tcBorders>
+              <w:top w:val="single" w:color="BFBFBF" w:sz="4"/>
+              <w:left w:val="single" w:color="BFBFBF" w:sz="4"/>
+              <w:bottom w:val="single" w:color="BFBFBF" w:sz="4"/>
+              <w:right w:val="single" w:color="BFBFBF" w:sz="4"/>
+            </w:tcBorders>
+            <w:tcMar>
+              <w:top w:type="dxa" w:w="60"/>
+              <w:left w:type="dxa" w:w="100"/>
+              <w:bottom w:type="dxa" w:w="60"/>
+              <w:right w:type="dxa" w:w="100"/>
+            </w:tcMar>
+          </w:tcPr>
+          <w:p>
+            <w:pPr>
+              <w:spacing w:after="20"/>
+            </w:pPr>
+            <w:r>
+              <w:rPr>
+                <w:rFonts w:ascii="Arial" w:cs="Arial" w:eastAsia="Arial" w:hAnsi="Arial"/>
+                <w:b w:val="false"/>
+                <w:bCs w:val="false"/>
+                <w:sz w:val="19"/>
+                <w:szCs w:val="19"/>
+              </w:rPr>
+              <w:t xml:space="preserve">Khấc mép</w:t>
+            </w:r>
+          </w:p>
+        </w:tc>
+        <w:tc>
+          <w:tcPr>
+            <w:tcW w:type="dxa" w:w="7518"/>
+            <w:tcBorders>
+              <w:top w:val="single" w:color="BFBFBF" w:sz="4"/>
+              <w:left w:val="single" w:color="BFBFBF" w:sz="4"/>
+              <w:bottom w:val="single" w:color="BFBFBF" w:sz="4"/>
+              <w:right w:val="single" w:color="BFBFBF" w:sz="4"/>
+            </w:tcBorders>
+            <w:tcMar>
+              <w:top w:type="dxa" w:w="60"/>
+              <w:left w:type="dxa" w:w="100"/>
+              <w:bottom w:type="dxa" w:w="60"/>
+              <w:right w:type="dxa" w:w="100"/>
+            </w:tcMar>
+          </w:tcPr>
+          <w:p>
+            <w:pPr>
+              <w:spacing w:after="20"/>
+            </w:pPr>
+            <w:r>
+              <w:rPr>
+                <w:rFonts w:ascii="Arial" w:cs="Arial" w:eastAsia="Arial" w:hAnsi="Arial"/>
+                <w:b w:val="false"/>
+                <w:bCs w:val="false"/>
+                <w:sz w:val="19"/>
+                <w:szCs w:val="19"/>
+              </w:rPr>
+              <w:t xml:space="preserve">Vùng 6.3 × 18 mm vắt ngang mép phải bị coi là thân bo thứ hai → bo 70.01 mm. Sửa: vòng nhỏ (≤ 10%) vắt ngang mép vòng lớn hơn là khấc phay bỏ (lỗ khoét), không tính vào kích thước → </w:t>
+            </w:r>
+            <w:r>
+              <w:rPr>
+                <w:rFonts w:ascii="Arial" w:cs="Arial" w:eastAsia="Arial" w:hAnsi="Arial"/>
+                <w:b/>
+                <w:bCs/>
+                <w:sz w:val="19"/>
+                <w:szCs w:val="19"/>
+              </w:rPr>
+              <w:t xml:space="preserve">66.28 mm</w:t>
+            </w:r>
+            <w:r>
+              <w:rPr>
+                <w:rFonts w:ascii="Arial" w:cs="Arial" w:eastAsia="Arial" w:hAnsi="Arial"/>
+                <w:b w:val="false"/>
+                <w:bCs w:val="false"/>
+                <w:sz w:val="19"/>
+                <w:szCs w:val="19"/>
+              </w:rPr>
+              <w:t xml:space="preserve">.</w:t>
+            </w:r>
+          </w:p>
+        </w:tc>
+      </w:tr>
+      <w:tr>
+        <w:trPr>
+          <w:tblHeader w:val="false"/>
+        </w:trPr>
+        <w:tc>
+          <w:tcPr>
+            <w:tcW w:type="dxa" w:w="2120"/>
+            <w:tcBorders>
+              <w:top w:val="single" w:color="BFBFBF" w:sz="4"/>
+              <w:left w:val="single" w:color="BFBFBF" w:sz="4"/>
+              <w:bottom w:val="single" w:color="BFBFBF" w:sz="4"/>
+              <w:right w:val="single" w:color="BFBFBF" w:sz="4"/>
+            </w:tcBorders>
+            <w:tcMar>
+              <w:top w:type="dxa" w:w="60"/>
+              <w:left w:type="dxa" w:w="100"/>
+              <w:bottom w:type="dxa" w:w="60"/>
+              <w:right w:type="dxa" w:w="100"/>
+            </w:tcMar>
+          </w:tcPr>
+          <w:p>
+            <w:pPr>
+              <w:spacing w:after="20"/>
+            </w:pPr>
+            <w:r>
+              <w:rPr>
+                <w:rFonts w:ascii="Arial" w:cs="Arial" w:eastAsia="Arial" w:hAnsi="Arial"/>
+                <w:b w:val="false"/>
+                <w:bCs w:val="false"/>
+                <w:sz w:val="19"/>
+                <w:szCs w:val="19"/>
+              </w:rPr>
+              <w:t xml:space="preserve">Nét viền dày</w:t>
+            </w:r>
+          </w:p>
+        </w:tc>
+        <w:tc>
+          <w:tcPr>
+            <w:tcW w:type="dxa" w:w="7518"/>
+            <w:tcBorders>
+              <w:top w:val="single" w:color="BFBFBF" w:sz="4"/>
+              <w:left w:val="single" w:color="BFBFBF" w:sz="4"/>
+              <w:bottom w:val="single" w:color="BFBFBF" w:sz="4"/>
+              <w:right w:val="single" w:color="BFBFBF" w:sz="4"/>
+            </w:tcBorders>
+            <w:tcMar>
+              <w:top w:type="dxa" w:w="60"/>
+              <w:left w:type="dxa" w:w="100"/>
+              <w:bottom w:type="dxa" w:w="60"/>
+              <w:right w:type="dxa" w:w="100"/>
+            </w:tcMar>
+          </w:tcPr>
+          <w:p>
+            <w:pPr>
+              <w:spacing w:after="20"/>
+            </w:pPr>
+            <w:r>
+              <w:rPr>
+                <w:rFonts w:ascii="Arial" w:cs="Arial" w:eastAsia="Arial" w:hAnsi="Arial"/>
+                <w:b w:val="false"/>
+                <w:bCs w:val="false"/>
+                <w:sz w:val="19"/>
+                <w:szCs w:val="19"/>
+              </w:rPr>
+              <w:t xml:space="preserve">Viền dùng aperture D37 không khai báo, web-gerber tự cho 1.75 mm. Sửa: aperture chưa khai trong lớp viền → nét 0.1 mm.</w:t>
+            </w:r>
+          </w:p>
+        </w:tc>
+      </w:tr>
+      <w:tr>
+        <w:trPr>
+          <w:tblHeader w:val="false"/>
+        </w:trPr>
+        <w:tc>
+          <w:tcPr>
+            <w:tcW w:type="dxa" w:w="2120"/>
+            <w:tcBorders>
+              <w:top w:val="single" w:color="BFBFBF" w:sz="4"/>
+              <w:left w:val="single" w:color="BFBFBF" w:sz="4"/>
+              <w:bottom w:val="single" w:color="BFBFBF" w:sz="4"/>
+              <w:right w:val="single" w:color="BFBFBF" w:sz="4"/>
+            </w:tcBorders>
+            <w:tcMar>
+              <w:top w:type="dxa" w:w="60"/>
+              <w:left w:type="dxa" w:w="100"/>
+              <w:bottom w:type="dxa" w:w="60"/>
+              <w:right w:type="dxa" w:w="100"/>
+            </w:tcMar>
+          </w:tcPr>
+          <w:p>
+            <w:pPr>
+              <w:spacing w:after="20"/>
+            </w:pPr>
+            <w:r>
+              <w:rPr>
+                <w:rFonts w:ascii="Arial" w:cs="Arial" w:eastAsia="Arial" w:hAnsi="Arial"/>
+                <w:b w:val="false"/>
+                <w:bCs w:val="false"/>
+                <w:sz w:val="19"/>
+                <w:szCs w:val="19"/>
+              </w:rPr>
+              <w:t xml:space="preserve">Kiểm</w:t>
+            </w:r>
+          </w:p>
+        </w:tc>
+        <w:tc>
+          <w:tcPr>
+            <w:tcW w:type="dxa" w:w="7518"/>
+            <w:tcBorders>
+              <w:top w:val="single" w:color="BFBFBF" w:sz="4"/>
+              <w:left w:val="single" w:color="BFBFBF" w:sz="4"/>
+              <w:bottom w:val="single" w:color="BFBFBF" w:sz="4"/>
+              <w:right w:val="single" w:color="BFBFBF" w:sz="4"/>
+            </w:tcBorders>
+            <w:tcMar>
+              <w:top w:type="dxa" w:w="60"/>
+              <w:left w:type="dxa" w:w="100"/>
+              <w:bottom w:type="dxa" w:w="60"/>
+              <w:right w:type="dxa" w:w="100"/>
+            </w:tcMar>
+          </w:tcPr>
+          <w:p>
+            <w:pPr>
+              <w:spacing w:after="20"/>
+            </w:pPr>
+            <w:r>
+              <w:rPr>
+                <w:rFonts w:ascii="Arial" w:cs="Arial" w:eastAsia="Arial" w:hAnsi="Arial"/>
+                <w:b w:val="false"/>
+                <w:bCs w:val="false"/>
+                <w:sz w:val="19"/>
+                <w:szCs w:val="19"/>
+              </w:rPr>
+              <w:t xml:space="preserve">Hồi quy 523 bộ: 505 không đổi; 18 đổi — 4 bộ vẽ thêm file rãnh / lỗ chữ nhật trước bị bỏ, 5 bộ kích thước bỏ phần lỗ khoét thò ra ngoài mép ra số tròn (90 × 80, 130 × 95, 110 × 100, 203.2 × 88.9…), 6 bộ chỉ đổi thứ tự file khoan. Bản đầu bắt nhầm panel PHAONUOC V3.9 và Driver_Lift → thêm giới hạn 10%. 3 test mới.</w:t>
+            </w:r>
+          </w:p>
+        </w:tc>
+      </w:tr>
+      <w:tr>
+        <w:trPr>
+          <w:tblHeader w:val="false"/>
+        </w:trPr>
+        <w:tc>
+          <w:tcPr>
+            <w:tcW w:type="dxa" w:w="2120"/>
+            <w:tcBorders>
+              <w:top w:val="single" w:color="BFBFBF" w:sz="4"/>
+              <w:left w:val="single" w:color="BFBFBF" w:sz="4"/>
+              <w:bottom w:val="single" w:color="BFBFBF" w:sz="4"/>
+              <w:right w:val="single" w:color="BFBFBF" w:sz="4"/>
+            </w:tcBorders>
+            <w:tcMar>
+              <w:top w:type="dxa" w:w="60"/>
+              <w:left w:type="dxa" w:w="100"/>
+              <w:bottom w:type="dxa" w:w="60"/>
+              <w:right w:type="dxa" w:w="100"/>
+            </w:tcMar>
+          </w:tcPr>
+          <w:p>
+            <w:pPr>
+              <w:spacing w:after="20"/>
+            </w:pPr>
+            <w:r>
+              <w:rPr>
+                <w:rFonts w:ascii="Arial" w:cs="Arial" w:eastAsia="Arial" w:hAnsi="Arial"/>
+                <w:b w:val="false"/>
+                <w:bCs w:val="false"/>
+                <w:sz w:val="19"/>
+                <w:szCs w:val="19"/>
+              </w:rPr>
+              <w:t xml:space="preserve">Còn lại</w:t>
+            </w:r>
+          </w:p>
+        </w:tc>
+        <w:tc>
+          <w:tcPr>
+            <w:tcW w:type="dxa" w:w="7518"/>
+            <w:tcBorders>
+              <w:top w:val="single" w:color="BFBFBF" w:sz="4"/>
+              <w:left w:val="single" w:color="BFBFBF" w:sz="4"/>
+              <w:bottom w:val="single" w:color="BFBFBF" w:sz="4"/>
+              <w:right w:val="single" w:color="BFBFBF" w:sz="4"/>
+            </w:tcBorders>
+            <w:tcMar>
+              <w:top w:type="dxa" w:w="60"/>
+              <w:left w:type="dxa" w:w="100"/>
+              <w:bottom w:type="dxa" w:w="60"/>
+              <w:right w:type="dxa" w:w="100"/>
+            </w:tcMar>
+          </w:tcPr>
+          <w:p>
+            <w:pPr>
+              <w:spacing w:after="20"/>
+            </w:pPr>
+            <w:r>
+              <w:rPr>
+                <w:rFonts w:ascii="Arial" w:cs="Arial" w:eastAsia="Arial" w:hAnsi="Arial"/>
+                <w:b w:val="false"/>
+                <w:bCs w:val="false"/>
+                <w:sz w:val="19"/>
+                <w:szCs w:val="19"/>
+              </w:rPr>
+              <w:t xml:space="preserve">Phần khấc thò ra ngoài mép vẫn vẽ thành ô trắng nhạt ngoài bo ở 2D (chỉ là hình).</w:t>
             </w:r>
           </w:p>
         </w:tc>
@@ -17404,6 +18081,75 @@
                 <w:sz w:val="19"/>
                 <w:szCs w:val="19"/>
               </w:rPr>
+              <w:t xml:space="preserve">Khấc mép</w:t>
+            </w:r>
+          </w:p>
+        </w:tc>
+        <w:tc>
+          <w:tcPr>
+            <w:tcW w:type="dxa" w:w="6940"/>
+            <w:tcBorders>
+              <w:top w:val="single" w:color="BFBFBF" w:sz="4"/>
+              <w:left w:val="single" w:color="BFBFBF" w:sz="4"/>
+              <w:bottom w:val="single" w:color="BFBFBF" w:sz="4"/>
+              <w:right w:val="single" w:color="BFBFBF" w:sz="4"/>
+            </w:tcBorders>
+            <w:tcMar>
+              <w:top w:type="dxa" w:w="60"/>
+              <w:left w:type="dxa" w:w="100"/>
+              <w:bottom w:type="dxa" w:w="60"/>
+              <w:right w:type="dxa" w:w="100"/>
+            </w:tcMar>
+          </w:tcPr>
+          <w:p>
+            <w:pPr>
+              <w:spacing w:after="20"/>
+            </w:pPr>
+            <w:r>
+              <w:rPr>
+                <w:rFonts w:ascii="Arial" w:cs="Arial" w:eastAsia="Arial" w:hAnsi="Arial"/>
+                <w:b w:val="false"/>
+                <w:bCs w:val="false"/>
+                <w:sz w:val="19"/>
+                <w:szCs w:val="19"/>
+              </w:rPr>
+              <w:t xml:space="preserve">Vòng nhỏ (≤ 10%) vắt ngang mép vòng lớn hơn → lỗ khoét, không tính vào kích thước (Dao Quoc Thai 70.01 → 66.28 mm)</w:t>
+            </w:r>
+          </w:p>
+        </w:tc>
+      </w:tr>
+      <w:tr>
+        <w:trPr>
+          <w:tblHeader w:val="false"/>
+        </w:trPr>
+        <w:tc>
+          <w:tcPr>
+            <w:tcW w:type="dxa" w:w="2698"/>
+            <w:tcBorders>
+              <w:top w:val="single" w:color="BFBFBF" w:sz="4"/>
+              <w:left w:val="single" w:color="BFBFBF" w:sz="4"/>
+              <w:bottom w:val="single" w:color="BFBFBF" w:sz="4"/>
+              <w:right w:val="single" w:color="BFBFBF" w:sz="4"/>
+            </w:tcBorders>
+            <w:tcMar>
+              <w:top w:type="dxa" w:w="60"/>
+              <w:left w:type="dxa" w:w="100"/>
+              <w:bottom w:type="dxa" w:w="60"/>
+              <w:right w:type="dxa" w:w="100"/>
+            </w:tcMar>
+          </w:tcPr>
+          <w:p>
+            <w:pPr>
+              <w:spacing w:after="20"/>
+            </w:pPr>
+            <w:r>
+              <w:rPr>
+                <w:rFonts w:ascii="Arial" w:cs="Arial" w:eastAsia="Arial" w:hAnsi="Arial"/>
+                <w:b w:val="false"/>
+                <w:bCs w:val="false"/>
+                <w:sz w:val="19"/>
+                <w:szCs w:val="19"/>
+              </w:rPr>
               <w:t xml:space="preserve">"Nằm trong"</w:t>
             </w:r>
           </w:p>
@@ -17755,7 +18501,7 @@
           <w:sz w:val="21"/>
           <w:szCs w:val="21"/>
         </w:rPr>
-        <w:t xml:space="preserve">Có Excellon thì bản Gerber khoan xuất đôi (và bản vẽ khoan .DRD của OrCAD Layout) thành tài liệu. Chọn tay "Drill" thì luôn là file khoan. Mọi file khoan là con của một khung rỗng.</w:t>
+        <w:t xml:space="preserve">Có Excellon thì bản Gerber khoan xuất đôi (và bản vẽ khoan .DRD của OrCAD Layout) thành tài liệu. Chọn tay "Drill" thì luôn là file khoan. File khoan chỉ có rãnh phay (bất kể tên) luôn vẽ kèm file gộp. Lớp viền dùng aperture chưa khai → nét 0.1 mm. Mọi file khoan là con của một khung rỗng.</w:t>
       </w:r>
     </w:p>
     <w:p>
@@ -19665,7 +20411,7 @@
           <w:sz w:val="21"/>
           <w:szCs w:val="21"/>
         </w:rPr>
-        <w:t xml:space="preserve"> (tsc -b chặt hơn tsc --noEmit — lỗi build Vercel ở f12b339 là do chỉ chạy lệnh nhẹ) và npx vitest run (151 test).</w:t>
+        <w:t xml:space="preserve"> (tsc -b chặt hơn tsc --noEmit — lỗi build Vercel ở f12b339 là do chỉ chạy lệnh nhẹ) và npx vitest run (154 test).</w:t>
       </w:r>
     </w:p>
     <w:p>

</xml_diff>

<commit_message>
fix: Stop the board-box drill fallback from moving holes without a pad gain
The board box is used as a ruler only when it raises the pad hit rate by
at least 20 points; shapes over 20 mm (logos, copper pours) no longer
count as pads. A drill file left outside the board with no reading that
matches pads is kept as is and flagged in red under the layer list.

Full corpus (18,496 zips): 314 sets change, 302 better, 0 worse; sets
under 50% pad hits drop from 315 to 23. Report #16 updated.

Co-Authored-By: Claude Opus 5 <noreply@anthropic.com>
</commit_message>
<xml_diff>
--- a/docs/bao-cao/Bao-cao-DQPCB-2026-09-22.docx
+++ b/docs/bao-cao/Bao-cao-DQPCB-2026-09-22.docx
@@ -2836,7 +2836,7 @@
                 <w:sz w:val="19"/>
                 <w:szCs w:val="19"/>
               </w:rPr>
-              <w:t xml:space="preserve">FRIWO — 55807.931-90FE (+ 31 bộ / 1.850 mẫu)</w:t>
+              <w:t xml:space="preserve">FRIWO — 55807.931-90FE (+ 302 bộ / 18.496 bộ)</w:t>
             </w:r>
           </w:p>
         </w:tc>
@@ -10546,7 +10546,27 @@
                 <w:sz w:val="19"/>
                 <w:szCs w:val="19"/>
               </w:rPr>
-              <w:t xml:space="preserve">; bộ trúng pad &lt; 50% giảm 34 → 3. 21 bộ sai định dạng, 10 bộ lệch gốc. Bản chỉ dùng khung bo (c680077) sửa được 10. 6 test mới.</w:t>
+              <w:t xml:space="preserve">; bộ trúng pad &lt; 50% giảm 34 → 3. 21 bộ sai định dạng, 10 bộ lệch gốc. Bản chỉ dùng khung bo (c680077) sửa được 10. </w:t>
+            </w:r>
+            <w:r>
+              <w:rPr>
+                <w:rFonts w:ascii="Arial" w:cs="Arial" w:eastAsia="Arial" w:hAnsi="Arial"/>
+                <w:b/>
+                <w:bCs/>
+                <w:sz w:val="19"/>
+                <w:szCs w:val="19"/>
+              </w:rPr>
+              <w:t xml:space="preserve">Quét toàn kho (18.496 zip): 314 bộ đổi — 302 tốt lên, 0 tệ đi</w:t>
+            </w:r>
+            <w:r>
+              <w:rPr>
+                <w:rFonts w:ascii="Arial" w:cs="Arial" w:eastAsia="Arial" w:hAnsi="Arial"/>
+                <w:b w:val="false"/>
+                <w:bCs w:val="false"/>
+                <w:sz w:val="19"/>
+                <w:szCs w:val="19"/>
+              </w:rPr>
+              <w:t xml:space="preserve">; bộ trúng pad &lt; 50% giảm 315 → 23; 8 bộ đổi kích thước không do phần khoan (sửa viền ở commit khác hoặc lệch khi chạy chung). Chốt thêm: khung bo làm thước chỉ nhận khi trúng pad tăng ≥ 20 điểm; hình &gt; 20 mm không tính là pad; file khoan ngoài bo không cách đọc nào khớp thì cảnh báo đỏ. 6 test mới.</w:t>
             </w:r>
           </w:p>
         </w:tc>

</xml_diff>

<commit_message>
docs: Add the FRIWO 23/09 fixes to the report
Co-Authored-By: Claude Opus 5 <noreply@anthropic.com>
</commit_message>
<xml_diff>
--- a/docs/bao-cao/Bao-cao-DQPCB-2026-09-22.docx
+++ b/docs/bao-cao/Bao-cao-DQPCB-2026-09-22.docx
@@ -3405,6 +3405,139 @@
           </w:p>
         </w:tc>
       </w:tr>
+      <w:tr>
+        <w:trPr>
+          <w:tblHeader w:val="false"/>
+        </w:trPr>
+        <w:tc>
+          <w:tcPr>
+            <w:tcW w:type="dxa" w:w="481"/>
+            <w:tcBorders>
+              <w:top w:val="single" w:color="BFBFBF" w:sz="4"/>
+              <w:left w:val="single" w:color="BFBFBF" w:sz="4"/>
+              <w:bottom w:val="single" w:color="BFBFBF" w:sz="4"/>
+              <w:right w:val="single" w:color="BFBFBF" w:sz="4"/>
+            </w:tcBorders>
+            <w:tcMar>
+              <w:top w:type="dxa" w:w="60"/>
+              <w:left w:type="dxa" w:w="100"/>
+              <w:bottom w:type="dxa" w:w="60"/>
+              <w:right w:type="dxa" w:w="100"/>
+            </w:tcMar>
+          </w:tcPr>
+          <w:p>
+            <w:pPr>
+              <w:spacing w:after="20"/>
+            </w:pPr>
+            <w:r>
+              <w:rPr>
+                <w:rFonts w:ascii="Arial" w:cs="Arial" w:eastAsia="Arial" w:hAnsi="Arial"/>
+                <w:b w:val="false"/>
+                <w:bCs w:val="false"/>
+                <w:sz w:val="19"/>
+                <w:szCs w:val="19"/>
+              </w:rPr>
+              <w:t xml:space="preserve">21</w:t>
+            </w:r>
+          </w:p>
+        </w:tc>
+        <w:tc>
+          <w:tcPr>
+            <w:tcW w:type="dxa" w:w="4047"/>
+            <w:tcBorders>
+              <w:top w:val="single" w:color="BFBFBF" w:sz="4"/>
+              <w:left w:val="single" w:color="BFBFBF" w:sz="4"/>
+              <w:bottom w:val="single" w:color="BFBFBF" w:sz="4"/>
+              <w:right w:val="single" w:color="BFBFBF" w:sz="4"/>
+            </w:tcBorders>
+            <w:tcMar>
+              <w:top w:type="dxa" w:w="60"/>
+              <w:left w:type="dxa" w:w="100"/>
+              <w:bottom w:type="dxa" w:w="60"/>
+              <w:right w:type="dxa" w:w="100"/>
+            </w:tcMar>
+          </w:tcPr>
+          <w:p>
+            <w:pPr>
+              <w:spacing w:after="20"/>
+            </w:pPr>
+            <w:r>
+              <w:rPr>
+                <w:rFonts w:ascii="Arial" w:cs="Arial" w:eastAsia="Arial" w:hAnsi="Arial"/>
+                <w:b w:val="false"/>
+                <w:bCs w:val="false"/>
+                <w:sz w:val="19"/>
+                <w:szCs w:val="19"/>
+              </w:rPr>
+              <w:t xml:space="preserve">Lớp in lụa 150k hình treo app; bo một mặt ghi 2 lớp; khung bao bo tính là bo; chữ trong lớp viền cộng vào kích thước</w:t>
+            </w:r>
+          </w:p>
+        </w:tc>
+        <w:tc>
+          <w:tcPr>
+            <w:tcW w:type="dxa" w:w="2891"/>
+            <w:tcBorders>
+              <w:top w:val="single" w:color="BFBFBF" w:sz="4"/>
+              <w:left w:val="single" w:color="BFBFBF" w:sz="4"/>
+              <w:bottom w:val="single" w:color="BFBFBF" w:sz="4"/>
+              <w:right w:val="single" w:color="BFBFBF" w:sz="4"/>
+            </w:tcBorders>
+            <w:tcMar>
+              <w:top w:type="dxa" w:w="60"/>
+              <w:left w:type="dxa" w:w="100"/>
+              <w:bottom w:type="dxa" w:w="60"/>
+              <w:right w:type="dxa" w:w="100"/>
+            </w:tcMar>
+          </w:tcPr>
+          <w:p>
+            <w:pPr>
+              <w:spacing w:after="20"/>
+            </w:pPr>
+            <w:r>
+              <w:rPr>
+                <w:rFonts w:ascii="Arial" w:cs="Arial" w:eastAsia="Arial" w:hAnsi="Arial"/>
+                <w:b w:val="false"/>
+                <w:bCs w:val="false"/>
+                <w:sz w:val="19"/>
+                <w:szCs w:val="19"/>
+              </w:rPr>
+              <w:t xml:space="preserve">FRIWO 23/09 (3 bộ)</w:t>
+            </w:r>
+          </w:p>
+        </w:tc>
+        <w:tc>
+          <w:tcPr>
+            <w:tcW w:type="dxa" w:w="2219"/>
+            <w:tcBorders>
+              <w:top w:val="single" w:color="BFBFBF" w:sz="4"/>
+              <w:left w:val="single" w:color="BFBFBF" w:sz="4"/>
+              <w:bottom w:val="single" w:color="BFBFBF" w:sz="4"/>
+              <w:right w:val="single" w:color="BFBFBF" w:sz="4"/>
+            </w:tcBorders>
+            <w:tcMar>
+              <w:top w:type="dxa" w:w="60"/>
+              <w:left w:type="dxa" w:w="100"/>
+              <w:bottom w:type="dxa" w:w="60"/>
+              <w:right w:type="dxa" w:w="100"/>
+            </w:tcMar>
+          </w:tcPr>
+          <w:p>
+            <w:pPr>
+              <w:spacing w:after="20"/>
+            </w:pPr>
+            <w:r>
+              <w:rPr>
+                <w:rFonts w:ascii="Arial" w:cs="Arial" w:eastAsia="Arial" w:hAnsi="Arial"/>
+                <w:b w:val="false"/>
+                <w:bCs w:val="false"/>
+                <w:sz w:val="19"/>
+                <w:szCs w:val="19"/>
+              </w:rPr>
+              <w:t xml:space="preserve">Đã sửa · 7b90b45, e52458f</w:t>
+            </w:r>
+          </w:p>
+        </w:tc>
+      </w:tr>
     </w:tbl>
     <w:p>
       <w:pPr>
@@ -12694,6 +12827,728 @@
                 <w:szCs w:val="19"/>
               </w:rPr>
               <w:t xml:space="preserve">Phần khấc thò ra ngoài mép vẫn vẽ thành ô trắng nhạt ngoài bo ở 2D (chỉ là hình).</w:t>
+            </w:r>
+          </w:p>
+        </w:tc>
+      </w:tr>
+    </w:tbl>
+    <w:p>
+      <w:pPr>
+        <w:spacing w:after="80"/>
+      </w:pPr>
+    </w:p>
+    <w:p>
+      <w:pPr>
+        <w:pStyle w:val="Heading2"/>
+        <w:spacing w:after="100" w:before="220"/>
+      </w:pPr>
+      <w:r>
+        <w:rPr>
+          <w:rFonts w:ascii="Arial" w:cs="Arial" w:eastAsia="Arial" w:hAnsi="Arial"/>
+          <w:b/>
+          <w:bCs/>
+          <w:color w:val="2E5597"/>
+          <w:sz w:val="25"/>
+          <w:szCs w:val="25"/>
+        </w:rPr>
+        <w:t xml:space="preserve">Lỗi 21 — Ba bộ FRIWO ngày 23/09</w:t>
+      </w:r>
+    </w:p>
+    <w:tbl>
+      <w:tblPr>
+        <w:tblW w:type="dxa" w:w="9638"/>
+        <w:tblBorders>
+          <w:top w:val="single" w:color="auto" w:sz="4"/>
+          <w:left w:val="single" w:color="auto" w:sz="4"/>
+          <w:bottom w:val="single" w:color="auto" w:sz="4"/>
+          <w:right w:val="single" w:color="auto" w:sz="4"/>
+          <w:insideH w:val="single" w:color="auto" w:sz="4"/>
+          <w:insideV w:val="single" w:color="auto" w:sz="4"/>
+        </w:tblBorders>
+      </w:tblPr>
+      <w:tblGrid>
+        <w:gridCol w:w="2120"/>
+        <w:gridCol w:w="7518"/>
+      </w:tblGrid>
+      <w:tr>
+        <w:trPr>
+          <w:tblHeader/>
+        </w:trPr>
+        <w:tc>
+          <w:tcPr>
+            <w:tcW w:type="dxa" w:w="2120"/>
+            <w:tcBorders>
+              <w:top w:val="single" w:color="BFBFBF" w:sz="4"/>
+              <w:left w:val="single" w:color="BFBFBF" w:sz="4"/>
+              <w:bottom w:val="single" w:color="BFBFBF" w:sz="4"/>
+              <w:right w:val="single" w:color="BFBFBF" w:sz="4"/>
+            </w:tcBorders>
+            <w:shd w:fill="DCE6F2" w:color="auto" w:val="clear"/>
+            <w:tcMar>
+              <w:top w:type="dxa" w:w="60"/>
+              <w:left w:type="dxa" w:w="100"/>
+              <w:bottom w:type="dxa" w:w="60"/>
+              <w:right w:type="dxa" w:w="100"/>
+            </w:tcMar>
+          </w:tcPr>
+          <w:p>
+            <w:pPr>
+              <w:spacing w:after="20"/>
+            </w:pPr>
+            <w:r>
+              <w:rPr>
+                <w:rFonts w:ascii="Arial" w:cs="Arial" w:eastAsia="Arial" w:hAnsi="Arial"/>
+                <w:b/>
+                <w:bCs/>
+                <w:sz w:val="19"/>
+                <w:szCs w:val="19"/>
+              </w:rPr>
+              <w:t xml:space="preserve">Mục</w:t>
+            </w:r>
+          </w:p>
+        </w:tc>
+        <w:tc>
+          <w:tcPr>
+            <w:tcW w:type="dxa" w:w="7518"/>
+            <w:tcBorders>
+              <w:top w:val="single" w:color="BFBFBF" w:sz="4"/>
+              <w:left w:val="single" w:color="BFBFBF" w:sz="4"/>
+              <w:bottom w:val="single" w:color="BFBFBF" w:sz="4"/>
+              <w:right w:val="single" w:color="BFBFBF" w:sz="4"/>
+            </w:tcBorders>
+            <w:shd w:fill="DCE6F2" w:color="auto" w:val="clear"/>
+            <w:tcMar>
+              <w:top w:type="dxa" w:w="60"/>
+              <w:left w:type="dxa" w:w="100"/>
+              <w:bottom w:type="dxa" w:w="60"/>
+              <w:right w:type="dxa" w:w="100"/>
+            </w:tcMar>
+          </w:tcPr>
+          <w:p>
+            <w:pPr>
+              <w:spacing w:after="20"/>
+            </w:pPr>
+            <w:r>
+              <w:rPr>
+                <w:rFonts w:ascii="Arial" w:cs="Arial" w:eastAsia="Arial" w:hAnsi="Arial"/>
+                <w:b/>
+                <w:bCs/>
+                <w:sz w:val="19"/>
+                <w:szCs w:val="19"/>
+              </w:rPr>
+              <w:t xml:space="preserve">Nội dung</w:t>
+            </w:r>
+          </w:p>
+        </w:tc>
+      </w:tr>
+      <w:tr>
+        <w:trPr>
+          <w:tblHeader w:val="false"/>
+        </w:trPr>
+        <w:tc>
+          <w:tcPr>
+            <w:tcW w:type="dxa" w:w="2120"/>
+            <w:tcBorders>
+              <w:top w:val="single" w:color="BFBFBF" w:sz="4"/>
+              <w:left w:val="single" w:color="BFBFBF" w:sz="4"/>
+              <w:bottom w:val="single" w:color="BFBFBF" w:sz="4"/>
+              <w:right w:val="single" w:color="BFBFBF" w:sz="4"/>
+            </w:tcBorders>
+            <w:tcMar>
+              <w:top w:type="dxa" w:w="60"/>
+              <w:left w:type="dxa" w:w="100"/>
+              <w:bottom w:type="dxa" w:w="60"/>
+              <w:right w:type="dxa" w:w="100"/>
+            </w:tcMar>
+          </w:tcPr>
+          <w:p>
+            <w:pPr>
+              <w:spacing w:after="20"/>
+            </w:pPr>
+            <w:r>
+              <w:rPr>
+                <w:rFonts w:ascii="Arial" w:cs="Arial" w:eastAsia="Arial" w:hAnsi="Arial"/>
+                <w:b w:val="false"/>
+                <w:bCs w:val="false"/>
+                <w:sz w:val="19"/>
+                <w:szCs w:val="19"/>
+              </w:rPr>
+              <w:t xml:space="preserve">Bộ file</w:t>
+            </w:r>
+          </w:p>
+        </w:tc>
+        <w:tc>
+          <w:tcPr>
+            <w:tcW w:type="dxa" w:w="7518"/>
+            <w:tcBorders>
+              <w:top w:val="single" w:color="BFBFBF" w:sz="4"/>
+              <w:left w:val="single" w:color="BFBFBF" w:sz="4"/>
+              <w:bottom w:val="single" w:color="BFBFBF" w:sz="4"/>
+              <w:right w:val="single" w:color="BFBFBF" w:sz="4"/>
+            </w:tcBorders>
+            <w:tcMar>
+              <w:top w:type="dxa" w:w="60"/>
+              <w:left w:type="dxa" w:w="100"/>
+              <w:bottom w:type="dxa" w:w="60"/>
+              <w:right w:type="dxa" w:w="100"/>
+            </w:tcMar>
+          </w:tcPr>
+          <w:p>
+            <w:pPr>
+              <w:spacing w:after="20"/>
+            </w:pPr>
+            <w:r>
+              <w:rPr>
+                <w:rFonts w:ascii="Arial" w:cs="Arial" w:eastAsia="Arial" w:hAnsi="Arial"/>
+                <w:b w:val="false"/>
+                <w:bCs w:val="false"/>
+                <w:sz w:val="19"/>
+                <w:szCs w:val="19"/>
+              </w:rPr>
+              <w:t xml:space="preserve">D:\JobDatMach\FRIWO\2026\23-09\FRIWO\ — 55807.930-90FE, P84241-S02, P84390-S02 (Pulsonix, kèm ảnh *spec*.png của khách)</w:t>
+            </w:r>
+          </w:p>
+        </w:tc>
+      </w:tr>
+      <w:tr>
+        <w:trPr>
+          <w:tblHeader w:val="false"/>
+        </w:trPr>
+        <w:tc>
+          <w:tcPr>
+            <w:tcW w:type="dxa" w:w="2120"/>
+            <w:tcBorders>
+              <w:top w:val="single" w:color="BFBFBF" w:sz="4"/>
+              <w:left w:val="single" w:color="BFBFBF" w:sz="4"/>
+              <w:bottom w:val="single" w:color="BFBFBF" w:sz="4"/>
+              <w:right w:val="single" w:color="BFBFBF" w:sz="4"/>
+            </w:tcBorders>
+            <w:tcMar>
+              <w:top w:type="dxa" w:w="60"/>
+              <w:left w:type="dxa" w:w="100"/>
+              <w:bottom w:type="dxa" w:w="60"/>
+              <w:right w:type="dxa" w:w="100"/>
+            </w:tcMar>
+          </w:tcPr>
+          <w:p>
+            <w:pPr>
+              <w:spacing w:after="20"/>
+            </w:pPr>
+            <w:r>
+              <w:rPr>
+                <w:rFonts w:ascii="Arial" w:cs="Arial" w:eastAsia="Arial" w:hAnsi="Arial"/>
+                <w:b w:val="false"/>
+                <w:bCs w:val="false"/>
+                <w:sz w:val="19"/>
+                <w:szCs w:val="19"/>
+              </w:rPr>
+              <w:t xml:space="preserve">Treo app</w:t>
+            </w:r>
+          </w:p>
+        </w:tc>
+        <w:tc>
+          <w:tcPr>
+            <w:tcW w:type="dxa" w:w="7518"/>
+            <w:tcBorders>
+              <w:top w:val="single" w:color="BFBFBF" w:sz="4"/>
+              <w:left w:val="single" w:color="BFBFBF" w:sz="4"/>
+              <w:bottom w:val="single" w:color="BFBFBF" w:sz="4"/>
+              <w:right w:val="single" w:color="BFBFBF" w:sz="4"/>
+            </w:tcBorders>
+            <w:tcMar>
+              <w:top w:type="dxa" w:w="60"/>
+              <w:left w:type="dxa" w:w="100"/>
+              <w:bottom w:type="dxa" w:w="60"/>
+              <w:right w:type="dxa" w:w="100"/>
+            </w:tcMar>
+          </w:tcPr>
+          <w:p>
+            <w:pPr>
+              <w:spacing w:after="20"/>
+            </w:pPr>
+            <w:r>
+              <w:rPr>
+                <w:rFonts w:ascii="Arial" w:cs="Arial" w:eastAsia="Arial" w:hAnsi="Arial"/>
+                <w:b w:val="false"/>
+                <w:bCs w:val="false"/>
+                <w:sz w:val="19"/>
+                <w:szCs w:val="19"/>
+              </w:rPr>
+              <w:t xml:space="preserve">P84390-S02 có lớp in lụa 150.500 hình: dựng hết bộ nhớ và mất 198 s, app đứng hình. Sửa: lớp &gt; 50.000 hình không dựng, badge ghi tên + nút "Vẽ luôn" (hỏi xác nhận); lớp &gt; 120.000 hình không cho vẽ (bấm thử: bộ nhớ trang chạm trần 4.4 GB, 6 phút không xong). Mở bộ này còn </w:t>
+            </w:r>
+            <w:r>
+              <w:rPr>
+                <w:rFonts w:ascii="Arial" w:cs="Arial" w:eastAsia="Arial" w:hAnsi="Arial"/>
+                <w:b/>
+                <w:bCs/>
+                <w:sz w:val="19"/>
+                <w:szCs w:val="19"/>
+              </w:rPr>
+              <w:t xml:space="preserve">9.3 s</w:t>
+            </w:r>
+            <w:r>
+              <w:rPr>
+                <w:rFonts w:ascii="Arial" w:cs="Arial" w:eastAsia="Arial" w:hAnsi="Arial"/>
+                <w:b w:val="false"/>
+                <w:bCs w:val="false"/>
+                <w:sz w:val="19"/>
+                <w:szCs w:val="19"/>
+              </w:rPr>
+              <w:t xml:space="preserve">.</w:t>
+            </w:r>
+          </w:p>
+        </w:tc>
+      </w:tr>
+      <w:tr>
+        <w:trPr>
+          <w:tblHeader w:val="false"/>
+        </w:trPr>
+        <w:tc>
+          <w:tcPr>
+            <w:tcW w:type="dxa" w:w="2120"/>
+            <w:tcBorders>
+              <w:top w:val="single" w:color="BFBFBF" w:sz="4"/>
+              <w:left w:val="single" w:color="BFBFBF" w:sz="4"/>
+              <w:bottom w:val="single" w:color="BFBFBF" w:sz="4"/>
+              <w:right w:val="single" w:color="BFBFBF" w:sz="4"/>
+            </w:tcBorders>
+            <w:tcMar>
+              <w:top w:type="dxa" w:w="60"/>
+              <w:left w:type="dxa" w:w="100"/>
+              <w:bottom w:type="dxa" w:w="60"/>
+              <w:right w:type="dxa" w:w="100"/>
+            </w:tcMar>
+          </w:tcPr>
+          <w:p>
+            <w:pPr>
+              <w:spacing w:after="20"/>
+            </w:pPr>
+            <w:r>
+              <w:rPr>
+                <w:rFonts w:ascii="Arial" w:cs="Arial" w:eastAsia="Arial" w:hAnsi="Arial"/>
+                <w:b w:val="false"/>
+                <w:bCs w:val="false"/>
+                <w:sz w:val="19"/>
+                <w:szCs w:val="19"/>
+              </w:rPr>
+              <w:t xml:space="preserve">Số lớp</w:t>
+            </w:r>
+          </w:p>
+        </w:tc>
+        <w:tc>
+          <w:tcPr>
+            <w:tcW w:type="dxa" w:w="7518"/>
+            <w:tcBorders>
+              <w:top w:val="single" w:color="BFBFBF" w:sz="4"/>
+              <w:left w:val="single" w:color="BFBFBF" w:sz="4"/>
+              <w:bottom w:val="single" w:color="BFBFBF" w:sz="4"/>
+              <w:right w:val="single" w:color="BFBFBF" w:sz="4"/>
+            </w:tcBorders>
+            <w:tcMar>
+              <w:top w:type="dxa" w:w="60"/>
+              <w:left w:type="dxa" w:w="100"/>
+              <w:bottom w:type="dxa" w:w="60"/>
+              <w:right w:type="dxa" w:w="100"/>
+            </w:tcMar>
+          </w:tcPr>
+          <w:p>
+            <w:pPr>
+              <w:spacing w:after="20"/>
+            </w:pPr>
+            <w:r>
+              <w:rPr>
+                <w:rFonts w:ascii="Arial" w:cs="Arial" w:eastAsia="Arial" w:hAnsi="Arial"/>
+                <w:b w:val="false"/>
+                <w:bCs w:val="false"/>
+                <w:sz w:val="19"/>
+                <w:szCs w:val="19"/>
+              </w:rPr>
+              <w:t xml:space="preserve">Bo một mặt (P84241-S02) vẫn ghi 2 lớp → giá tính như bo 2 lớp. Sửa: số lớp theo số lớp đồng đọc được → </w:t>
+            </w:r>
+            <w:r>
+              <w:rPr>
+                <w:rFonts w:ascii="Arial" w:cs="Arial" w:eastAsia="Arial" w:hAnsi="Arial"/>
+                <w:b/>
+                <w:bCs/>
+                <w:sz w:val="19"/>
+                <w:szCs w:val="19"/>
+              </w:rPr>
+              <w:t xml:space="preserve">1 lớp</w:t>
+            </w:r>
+            <w:r>
+              <w:rPr>
+                <w:rFonts w:ascii="Arial" w:cs="Arial" w:eastAsia="Arial" w:hAnsi="Arial"/>
+                <w:b w:val="false"/>
+                <w:bCs w:val="false"/>
+                <w:sz w:val="19"/>
+                <w:szCs w:val="19"/>
+              </w:rPr>
+              <w:t xml:space="preserve"> (khớp ảnh thông số của khách và JLC).</w:t>
+            </w:r>
+          </w:p>
+        </w:tc>
+      </w:tr>
+      <w:tr>
+        <w:trPr>
+          <w:tblHeader w:val="false"/>
+        </w:trPr>
+        <w:tc>
+          <w:tcPr>
+            <w:tcW w:type="dxa" w:w="2120"/>
+            <w:tcBorders>
+              <w:top w:val="single" w:color="BFBFBF" w:sz="4"/>
+              <w:left w:val="single" w:color="BFBFBF" w:sz="4"/>
+              <w:bottom w:val="single" w:color="BFBFBF" w:sz="4"/>
+              <w:right w:val="single" w:color="BFBFBF" w:sz="4"/>
+            </w:tcBorders>
+            <w:tcMar>
+              <w:top w:type="dxa" w:w="60"/>
+              <w:left w:type="dxa" w:w="100"/>
+              <w:bottom w:type="dxa" w:w="60"/>
+              <w:right w:type="dxa" w:w="100"/>
+            </w:tcMar>
+          </w:tcPr>
+          <w:p>
+            <w:pPr>
+              <w:spacing w:after="20"/>
+            </w:pPr>
+            <w:r>
+              <w:rPr>
+                <w:rFonts w:ascii="Arial" w:cs="Arial" w:eastAsia="Arial" w:hAnsi="Arial"/>
+                <w:b w:val="false"/>
+                <w:bCs w:val="false"/>
+                <w:sz w:val="19"/>
+                <w:szCs w:val="19"/>
+              </w:rPr>
+              <w:t xml:space="preserve">Đếm bo</w:t>
+            </w:r>
+          </w:p>
+        </w:tc>
+        <w:tc>
+          <w:tcPr>
+            <w:tcW w:type="dxa" w:w="7518"/>
+            <w:tcBorders>
+              <w:top w:val="single" w:color="BFBFBF" w:sz="4"/>
+              <w:left w:val="single" w:color="BFBFBF" w:sz="4"/>
+              <w:bottom w:val="single" w:color="BFBFBF" w:sz="4"/>
+              <w:right w:val="single" w:color="BFBFBF" w:sz="4"/>
+            </w:tcBorders>
+            <w:tcMar>
+              <w:top w:type="dxa" w:w="60"/>
+              <w:left w:type="dxa" w:w="100"/>
+              <w:bottom w:type="dxa" w:w="60"/>
+              <w:right w:type="dxa" w:w="100"/>
+            </w:tcMar>
+          </w:tcPr>
+          <w:p>
+            <w:pPr>
+              <w:spacing w:after="20"/>
+            </w:pPr>
+            <w:r>
+              <w:rPr>
+                <w:rFonts w:ascii="Arial" w:cs="Arial" w:eastAsia="Arial" w:hAnsi="Arial"/>
+                <w:b w:val="false"/>
+                <w:bCs w:val="false"/>
+                <w:sz w:val="19"/>
+                <w:szCs w:val="19"/>
+              </w:rPr>
+              <w:t xml:space="preserve">Khung bao quanh một bo bị tính là bo thứ hai → nhắc nhầm "file ghép sẵn". Sửa: khung bao TRỌN một bo không phải bo.</w:t>
+            </w:r>
+          </w:p>
+        </w:tc>
+      </w:tr>
+      <w:tr>
+        <w:trPr>
+          <w:tblHeader w:val="false"/>
+        </w:trPr>
+        <w:tc>
+          <w:tcPr>
+            <w:tcW w:type="dxa" w:w="2120"/>
+            <w:tcBorders>
+              <w:top w:val="single" w:color="BFBFBF" w:sz="4"/>
+              <w:left w:val="single" w:color="BFBFBF" w:sz="4"/>
+              <w:bottom w:val="single" w:color="BFBFBF" w:sz="4"/>
+              <w:right w:val="single" w:color="BFBFBF" w:sz="4"/>
+            </w:tcBorders>
+            <w:tcMar>
+              <w:top w:type="dxa" w:w="60"/>
+              <w:left w:type="dxa" w:w="100"/>
+              <w:bottom w:type="dxa" w:w="60"/>
+              <w:right w:type="dxa" w:w="100"/>
+            </w:tcMar>
+          </w:tcPr>
+          <w:p>
+            <w:pPr>
+              <w:spacing w:after="20"/>
+            </w:pPr>
+            <w:r>
+              <w:rPr>
+                <w:rFonts w:ascii="Arial" w:cs="Arial" w:eastAsia="Arial" w:hAnsi="Arial"/>
+                <w:b w:val="false"/>
+                <w:bCs w:val="false"/>
+                <w:sz w:val="19"/>
+                <w:szCs w:val="19"/>
+              </w:rPr>
+              <w:t xml:space="preserve">Kích thước</w:t>
+            </w:r>
+          </w:p>
+        </w:tc>
+        <w:tc>
+          <w:tcPr>
+            <w:tcW w:type="dxa" w:w="7518"/>
+            <w:tcBorders>
+              <w:top w:val="single" w:color="BFBFBF" w:sz="4"/>
+              <w:left w:val="single" w:color="BFBFBF" w:sz="4"/>
+              <w:bottom w:val="single" w:color="BFBFBF" w:sz="4"/>
+              <w:right w:val="single" w:color="BFBFBF" w:sz="4"/>
+            </w:tcBorders>
+            <w:tcMar>
+              <w:top w:type="dxa" w:w="60"/>
+              <w:left w:type="dxa" w:w="100"/>
+              <w:bottom w:type="dxa" w:w="60"/>
+              <w:right w:type="dxa" w:w="100"/>
+            </w:tcMar>
+          </w:tcPr>
+          <w:p>
+            <w:pPr>
+              <w:spacing w:after="20"/>
+            </w:pPr>
+            <w:r>
+              <w:rPr>
+                <w:rFonts w:ascii="Arial" w:cs="Arial" w:eastAsia="Arial" w:hAnsi="Arial"/>
+                <w:b w:val="false"/>
+                <w:bCs w:val="false"/>
+                <w:sz w:val="19"/>
+                <w:szCs w:val="19"/>
+              </w:rPr>
+              <w:t xml:space="preserve">Chữ và nét chú thích vẽ trong lớp viền cộng vào kích thước (P84390 185.23 × 205.66). Sửa: chỉ tính theo vòng thân bo → </w:t>
+            </w:r>
+            <w:r>
+              <w:rPr>
+                <w:rFonts w:ascii="Arial" w:cs="Arial" w:eastAsia="Arial" w:hAnsi="Arial"/>
+                <w:b/>
+                <w:bCs/>
+                <w:sz w:val="19"/>
+                <w:szCs w:val="19"/>
+              </w:rPr>
+              <w:t xml:space="preserve">170.00 × 199.00 mm</w:t>
+            </w:r>
+            <w:r>
+              <w:rPr>
+                <w:rFonts w:ascii="Arial" w:cs="Arial" w:eastAsia="Arial" w:hAnsi="Arial"/>
+                <w:b w:val="false"/>
+                <w:bCs w:val="false"/>
+                <w:sz w:val="19"/>
+                <w:szCs w:val="19"/>
+              </w:rPr>
+              <w:t xml:space="preserve">.</w:t>
+            </w:r>
+          </w:p>
+        </w:tc>
+      </w:tr>
+      <w:tr>
+        <w:trPr>
+          <w:tblHeader w:val="false"/>
+        </w:trPr>
+        <w:tc>
+          <w:tcPr>
+            <w:tcW w:type="dxa" w:w="2120"/>
+            <w:tcBorders>
+              <w:top w:val="single" w:color="BFBFBF" w:sz="4"/>
+              <w:left w:val="single" w:color="BFBFBF" w:sz="4"/>
+              <w:bottom w:val="single" w:color="BFBFBF" w:sz="4"/>
+              <w:right w:val="single" w:color="BFBFBF" w:sz="4"/>
+            </w:tcBorders>
+            <w:tcMar>
+              <w:top w:type="dxa" w:w="60"/>
+              <w:left w:type="dxa" w:w="100"/>
+              <w:bottom w:type="dxa" w:w="60"/>
+              <w:right w:type="dxa" w:w="100"/>
+            </w:tcMar>
+          </w:tcPr>
+          <w:p>
+            <w:pPr>
+              <w:spacing w:after="20"/>
+            </w:pPr>
+            <w:r>
+              <w:rPr>
+                <w:rFonts w:ascii="Arial" w:cs="Arial" w:eastAsia="Arial" w:hAnsi="Arial"/>
+                <w:b w:val="false"/>
+                <w:bCs w:val="false"/>
+                <w:sz w:val="19"/>
+                <w:szCs w:val="19"/>
+              </w:rPr>
+              <w:t xml:space="preserve">Ảnh thông số</w:t>
+            </w:r>
+          </w:p>
+        </w:tc>
+        <w:tc>
+          <w:tcPr>
+            <w:tcW w:type="dxa" w:w="7518"/>
+            <w:tcBorders>
+              <w:top w:val="single" w:color="BFBFBF" w:sz="4"/>
+              <w:left w:val="single" w:color="BFBFBF" w:sz="4"/>
+              <w:bottom w:val="single" w:color="BFBFBF" w:sz="4"/>
+              <w:right w:val="single" w:color="BFBFBF" w:sz="4"/>
+            </w:tcBorders>
+            <w:tcMar>
+              <w:top w:type="dxa" w:w="60"/>
+              <w:left w:type="dxa" w:w="100"/>
+              <w:bottom w:type="dxa" w:w="60"/>
+              <w:right w:type="dxa" w:w="100"/>
+            </w:tcMar>
+          </w:tcPr>
+          <w:p>
+            <w:pPr>
+              <w:spacing w:after="20"/>
+            </w:pPr>
+            <w:r>
+              <w:rPr>
+                <w:rFonts w:ascii="Arial" w:cs="Arial" w:eastAsia="Arial" w:hAnsi="Arial"/>
+                <w:b w:val="false"/>
+                <w:bCs w:val="false"/>
+                <w:sz w:val="19"/>
+                <w:szCs w:val="19"/>
+              </w:rPr>
+              <w:t xml:space="preserve">Ảnh *spec*.png của khách trước bị bỏ qua; nay giữ lại, thẻ thông tin bo có nút "Xem ảnh thông số của khách" (app không đọc chữ trong ảnh).</w:t>
+            </w:r>
+          </w:p>
+        </w:tc>
+      </w:tr>
+      <w:tr>
+        <w:trPr>
+          <w:tblHeader w:val="false"/>
+        </w:trPr>
+        <w:tc>
+          <w:tcPr>
+            <w:tcW w:type="dxa" w:w="2120"/>
+            <w:tcBorders>
+              <w:top w:val="single" w:color="BFBFBF" w:sz="4"/>
+              <w:left w:val="single" w:color="BFBFBF" w:sz="4"/>
+              <w:bottom w:val="single" w:color="BFBFBF" w:sz="4"/>
+              <w:right w:val="single" w:color="BFBFBF" w:sz="4"/>
+            </w:tcBorders>
+            <w:tcMar>
+              <w:top w:type="dxa" w:w="60"/>
+              <w:left w:type="dxa" w:w="100"/>
+              <w:bottom w:type="dxa" w:w="60"/>
+              <w:right w:type="dxa" w:w="100"/>
+            </w:tcMar>
+          </w:tcPr>
+          <w:p>
+            <w:pPr>
+              <w:spacing w:after="20"/>
+            </w:pPr>
+            <w:r>
+              <w:rPr>
+                <w:rFonts w:ascii="Arial" w:cs="Arial" w:eastAsia="Arial" w:hAnsi="Arial"/>
+                <w:b w:val="false"/>
+                <w:bCs w:val="false"/>
+                <w:sz w:val="19"/>
+                <w:szCs w:val="19"/>
+              </w:rPr>
+              <w:t xml:space="preserve">Kiểm</w:t>
+            </w:r>
+          </w:p>
+        </w:tc>
+        <w:tc>
+          <w:tcPr>
+            <w:tcW w:type="dxa" w:w="7518"/>
+            <w:tcBorders>
+              <w:top w:val="single" w:color="BFBFBF" w:sz="4"/>
+              <w:left w:val="single" w:color="BFBFBF" w:sz="4"/>
+              <w:bottom w:val="single" w:color="BFBFBF" w:sz="4"/>
+              <w:right w:val="single" w:color="BFBFBF" w:sz="4"/>
+            </w:tcBorders>
+            <w:tcMar>
+              <w:top w:type="dxa" w:w="60"/>
+              <w:left w:type="dxa" w:w="100"/>
+              <w:bottom w:type="dxa" w:w="60"/>
+              <w:right w:type="dxa" w:w="100"/>
+            </w:tcMar>
+          </w:tcPr>
+          <w:p>
+            <w:pPr>
+              <w:spacing w:after="20"/>
+            </w:pPr>
+            <w:r>
+              <w:rPr>
+                <w:rFonts w:ascii="Arial" w:cs="Arial" w:eastAsia="Arial" w:hAnsi="Arial"/>
+                <w:b w:val="false"/>
+                <w:bCs w:val="false"/>
+                <w:sz w:val="19"/>
+                <w:szCs w:val="19"/>
+              </w:rPr>
+              <w:t xml:space="preserve">Hồi quy 521 bộ: 495 không đổi; 26 đổi — 12 bộ bo một mặt về 1 lớp, vài bộ kích thước bỏ phần chú thích (TDM2409 63.13 → 50.95; butterfly_panel 114.01 → 100.00), khung không còn tính là bo, 2 bộ trước đếm bo hỏng nay ra 3. 186 test. Checklist giao diện điện thoại 375 / 360 và khung 1366 sạch.</w:t>
+            </w:r>
+          </w:p>
+        </w:tc>
+      </w:tr>
+      <w:tr>
+        <w:trPr>
+          <w:tblHeader w:val="false"/>
+        </w:trPr>
+        <w:tc>
+          <w:tcPr>
+            <w:tcW w:type="dxa" w:w="2120"/>
+            <w:tcBorders>
+              <w:top w:val="single" w:color="BFBFBF" w:sz="4"/>
+              <w:left w:val="single" w:color="BFBFBF" w:sz="4"/>
+              <w:bottom w:val="single" w:color="BFBFBF" w:sz="4"/>
+              <w:right w:val="single" w:color="BFBFBF" w:sz="4"/>
+            </w:tcBorders>
+            <w:tcMar>
+              <w:top w:type="dxa" w:w="60"/>
+              <w:left w:type="dxa" w:w="100"/>
+              <w:bottom w:type="dxa" w:w="60"/>
+              <w:right w:type="dxa" w:w="100"/>
+            </w:tcMar>
+          </w:tcPr>
+          <w:p>
+            <w:pPr>
+              <w:spacing w:after="20"/>
+            </w:pPr>
+            <w:r>
+              <w:rPr>
+                <w:rFonts w:ascii="Arial" w:cs="Arial" w:eastAsia="Arial" w:hAnsi="Arial"/>
+                <w:b w:val="false"/>
+                <w:bCs w:val="false"/>
+                <w:sz w:val="19"/>
+                <w:szCs w:val="19"/>
+              </w:rPr>
+              <w:t xml:space="preserve">Còn lại</w:t>
+            </w:r>
+          </w:p>
+        </w:tc>
+        <w:tc>
+          <w:tcPr>
+            <w:tcW w:type="dxa" w:w="7518"/>
+            <w:tcBorders>
+              <w:top w:val="single" w:color="BFBFBF" w:sz="4"/>
+              <w:left w:val="single" w:color="BFBFBF" w:sz="4"/>
+              <w:bottom w:val="single" w:color="BFBFBF" w:sz="4"/>
+              <w:right w:val="single" w:color="BFBFBF" w:sz="4"/>
+            </w:tcBorders>
+            <w:tcMar>
+              <w:top w:type="dxa" w:w="60"/>
+              <w:left w:type="dxa" w:w="100"/>
+              <w:bottom w:type="dxa" w:w="60"/>
+              <w:right w:type="dxa" w:w="100"/>
+            </w:tcMar>
+          </w:tcPr>
+          <w:p>
+            <w:pPr>
+              <w:spacing w:after="20"/>
+            </w:pPr>
+            <w:r>
+              <w:rPr>
+                <w:rFonts w:ascii="Arial" w:cs="Arial" w:eastAsia="Arial" w:hAnsi="Arial"/>
+                <w:b w:val="false"/>
+                <w:bCs w:val="false"/>
+                <w:sz w:val="19"/>
+                <w:szCs w:val="19"/>
+              </w:rPr>
+              <w:t xml:space="preserve">Lụa 150.500 hình vẫn không xem được — muốn xem phải giảm số hình khi xuất file.</w:t>
             </w:r>
           </w:p>
         </w:tc>
@@ -17821,7 +18676,7 @@
                 <w:sz w:val="19"/>
                 <w:szCs w:val="19"/>
               </w:rPr>
-              <w:t xml:space="preserve">Ô bao các vòng đã nối + nửa nét — không dùng số thô</w:t>
+              <w:t xml:space="preserve">Ô bao các VÒNG THÂN BO + nửa nét — không tính lỗ khoét, khấc phay bỏ, chữ / nét chú thích trong lớp viền (FRIWO P84390: 185 × 206 → 170 × 199 mm)</w:t>
             </w:r>
           </w:p>
         </w:tc>
@@ -20431,7 +21286,7 @@
           <w:sz w:val="21"/>
           <w:szCs w:val="21"/>
         </w:rPr>
-        <w:t xml:space="preserve"> (tsc -b chặt hơn tsc --noEmit — lỗi build Vercel ở f12b339 là do chỉ chạy lệnh nhẹ) và npx vitest run (154 test).</w:t>
+        <w:t xml:space="preserve"> (tsc -b chặt hơn tsc --noEmit — lỗi build Vercel ở f12b339 là do chỉ chạy lệnh nhẹ) và npx vitest run (186 test).</w:t>
       </w:r>
     </w:p>
     <w:p>

</xml_diff>

<commit_message>
docs: Record that heavy layers now draw in background chunks
Co-Authored-By: Claude Opus 5 <noreply@anthropic.com>
</commit_message>
<xml_diff>
--- a/docs/bao-cao/Bao-cao-DQPCB-2026-09-22.docx
+++ b/docs/bao-cao/Bao-cao-DQPCB-2026-09-22.docx
@@ -13074,27 +13074,7 @@
                 <w:sz w:val="19"/>
                 <w:szCs w:val="19"/>
               </w:rPr>
-              <w:t xml:space="preserve">P84390-S02 có lớp in lụa 150.500 hình: dựng hết bộ nhớ và mất 198 s, app đứng hình. Sửa: lớp &gt; 50.000 hình không dựng, badge ghi tên + nút "Vẽ luôn" (hỏi xác nhận); lớp &gt; 120.000 hình không cho vẽ (bấm thử: bộ nhớ trang chạm trần 4.4 GB, 6 phút không xong). Mở bộ này còn </w:t>
-            </w:r>
-            <w:r>
-              <w:rPr>
-                <w:rFonts w:ascii="Arial" w:cs="Arial" w:eastAsia="Arial" w:hAnsi="Arial"/>
-                <w:b/>
-                <w:bCs/>
-                <w:sz w:val="19"/>
-                <w:szCs w:val="19"/>
-              </w:rPr>
-              <w:t xml:space="preserve">9.3 s</w:t>
-            </w:r>
-            <w:r>
-              <w:rPr>
-                <w:rFonts w:ascii="Arial" w:cs="Arial" w:eastAsia="Arial" w:hAnsi="Arial"/>
-                <w:b w:val="false"/>
-                <w:bCs w:val="false"/>
-                <w:sz w:val="19"/>
-                <w:szCs w:val="19"/>
-              </w:rPr>
-              <w:t xml:space="preserve">.</w:t>
+              <w:t xml:space="preserve">P84390-S02 có lớp in lụa 150.500 hình: dựng hết bộ nhớ và mất 198 s, app đứng hình. Sửa: dựng theo mẻ 20.000 hình, lớp &gt; 50.000 hình vẽ dần lúc máy rảnh vào object đã đặt sẵn trong cảnh (e9b048d). Bo hiện sau 3.1 s, lụa hiện dần ~20 s, giao diện phản hồi 1–5 ms, cuối cùng vẽ ĐỦ cả hai lớp lụa (28.8 triệu đỉnh). Bo có tổng lớp nặng ≤ 250k hình tự vẽ; trên mức đó có nút "Vẽ luôn".</w:t>
             </w:r>
           </w:p>
         </w:tc>
@@ -13548,7 +13528,7 @@
                 <w:sz w:val="19"/>
                 <w:szCs w:val="19"/>
               </w:rPr>
-              <w:t xml:space="preserve">Lụa 150.500 hình vẫn không xem được — muốn xem phải giảm số hình khi xuất file.</w:t>
+              <w:t xml:space="preserve">Vẽ đủ bo nặng cỡ này ngốn ~10 GB bộ nhớ trang — máy yếu nên tránh mở nhiều bo như vậy cùng lúc.</w:t>
             </w:r>
           </w:p>
         </w:tc>

</xml_diff>

<commit_message>
docs: Record the fast mesh numbers for huge layers
Replaces the background-chunk wording with what the app does now
(bf511b8): the bottom silk of FRIWO P84390 drops from 102.5 million to
758,766 vertices, the set opens in 9.0 s instead of 75.3 s and page
memory is 1.2 GB instead of 4.5 GB. Both silk layers draw in full.

Co-Authored-By: Claude Opus 5 <noreply@anthropic.com>
</commit_message>
<xml_diff>
--- a/docs/bao-cao/Bao-cao-DQPCB-2026-09-22.docx
+++ b/docs/bao-cao/Bao-cao-DQPCB-2026-09-22.docx
@@ -13074,7 +13074,7 @@
                 <w:sz w:val="19"/>
                 <w:szCs w:val="19"/>
               </w:rPr>
-              <w:t xml:space="preserve">P84390-S02 có lớp in lụa 150.500 hình: dựng hết bộ nhớ và mất 198 s, app đứng hình. Sửa: dựng theo mẻ 20.000 hình, lớp &gt; 50.000 hình vẽ dần lúc máy rảnh vào object đã đặt sẵn trong cảnh (e9b048d). Bo hiện sau 3.1 s, lụa hiện dần ~20 s, giao diện phản hồi 1–5 ms, cuối cùng vẽ ĐỦ cả hai lớp lụa (28.8 triệu đỉnh). Bo có tổng lớp nặng ≤ 250k hình tự vẽ; trên mức đó có nút "Vẽ luôn".</w:t>
+              <w:t xml:space="preserve">P84390-S02 có lớp in lụa 150.220 vùng tô: renderThree dựng mỗi hình một khối nên ra 180 triệu đỉnh, hết bộ nhớ và mất 198 s, app đứng hình. Sửa: lớp &gt; 50.000 hình tự ráp MỘT lưới tam giác cho cả lớp (bf511b8, fastLayer.ts). Lụa mặt dưới 85.570 hình: 102,5 triệu đỉnh → 758.766 đỉnh; mở cả bộ 75,3 s → 9,0 s; bộ nhớ trang 4,5 GB → 1,2 GB. Vẽ ĐỦ cả hai lớp lụa, phóng to đọc được chữ. Đánh đổi: đầu nét vuông, hình phẳng, bỏ hình đảo cực.</w:t>
             </w:r>
           </w:p>
         </w:tc>
@@ -13528,7 +13528,7 @@
                 <w:sz w:val="19"/>
                 <w:szCs w:val="19"/>
               </w:rPr>
-              <w:t xml:space="preserve">Vẽ đủ bo nặng cỡ này ngốn ~10 GB bộ nhớ trang — máy yếu nên tránh mở nhiều bo như vậy cùng lúc.</w:t>
+              <w:t xml:space="preserve">Lụa vẽ ở chế độ nhẹ hơi khác bản thật ở chỗ đầu nét — chỉ để xem, không dùng để đo.</w:t>
             </w:r>
           </w:p>
         </w:tc>

</xml_diff>

<commit_message>
docs: Note the two fast-layer drawing bugs and their fix
Records what went wrong in the first version (2316510): fan-filling
concave stroke regions filled in the letters - 3.6x the real area on the
top silk - and a bare Mesh in the Scene always drew first, so 2 Mặt, 2D
and 3D showed no silkscreen at all.

Co-Authored-By: Claude Opus 5 <noreply@anthropic.com>
</commit_message>
<xml_diff>
--- a/docs/bao-cao/Bao-cao-DQPCB-2026-09-22.docx
+++ b/docs/bao-cao/Bao-cao-DQPCB-2026-09-22.docx
@@ -13074,7 +13074,7 @@
                 <w:sz w:val="19"/>
                 <w:szCs w:val="19"/>
               </w:rPr>
-              <w:t xml:space="preserve">P84390-S02 có lớp in lụa 150.220 vùng tô: renderThree dựng mỗi hình một khối nên ra 180 triệu đỉnh, hết bộ nhớ và mất 198 s, app đứng hình. Sửa: lớp &gt; 50.000 hình tự ráp MỘT lưới tam giác cho cả lớp (bf511b8, fastLayer.ts). Lụa mặt dưới 85.570 hình: 102,5 triệu đỉnh → 758.766 đỉnh; mở cả bộ 75,3 s → 9,0 s; bộ nhớ trang 4,5 GB → 1,2 GB. Vẽ ĐỦ cả hai lớp lụa, phóng to đọc được chữ. Đánh đổi: đầu nét vuông, hình phẳng, bỏ hình đảo cực.</w:t>
+              <w:t xml:space="preserve">P84390-S02 có lớp in lụa 150.220 vùng tô: renderThree dựng mỗi hình một khối nên ra 180 triệu đỉnh, hết bộ nhớ và mất 198 s, app đứng hình. Sửa: lớp &gt; 50.000 hình tự ráp MỘT lưới tam giác cho cả lớp (bf511b8, fastLayer.ts). Lụa mặt dưới 85.570 hình: 102,5 triệu đỉnh → 758.766 đỉnh; mở cả bộ 75,3 s → 9,0 s; bộ nhớ trang 4,5 GB → 1,2 GB. Vẽ ĐỦ cả hai lớp lụa ở cả bốn chế độ xem, phóng to đọc được chữ. Đánh đổi: hình phẳng, bỏ hình đảo cực. Sửa tiếp 2316510: vùng tô lõm phải cắt tai chứ không chia quạt (chia quạt làm đầy ruột chữ — diện tích gấp 3,6 lần thật, chữ bết thành cục) và lưới phải bọc trong Group (three xếp thứ tự vẽ theo groupOrder trước, Mesh trần bị mask/đồng đè nên 2 Mặt / 2D / 3D không thấy in lụa).</w:t>
             </w:r>
           </w:p>
         </w:tc>
@@ -13528,7 +13528,7 @@
                 <w:sz w:val="19"/>
                 <w:szCs w:val="19"/>
               </w:rPr>
-              <w:t xml:space="preserve">Lụa vẽ ở chế độ nhẹ hơi khác bản thật ở chỗ đầu nét — chỉ để xem, không dùng để đo.</w:t>
+              <w:t xml:space="preserve">Lụa vẽ ở chế độ nhẹ là hình phẳng, không có bề dày như lớp thường — chỉ để xem, không dùng để đo.</w:t>
             </w:r>
           </w:p>
         </w:tc>

</xml_diff>